<commit_message>
Report: fact-check every external claim and rewrite the prompt list
Corrections after checking each claim against abstracts and publisher
records: Tateno & Glass figures (94.4% / 97.2%), PhysFormer pages, Sun et
al. volume, pages, DOI and exact accuracies, verified details for CHROM,
PBV, DistancePPG, spatial redundancy, Cantrill, PhysNet, TS-CAN, Chong and
Charlton. Removed statements that could not be confirmed (Poh RMSE values,
HRV norm ranges, spectral goodness metric, MAHNOB-HCI and MMSE-HR
attributions, study setting of Yan et al. 2018, template matching in
Orphanidou et al.). rPPG-Toolbox baseline numbers now cite Paruchuri et al.
(2024). Added missing DOIs. Prompts are listed in edited, professional
wording with unchanged content.

Co-Authored-By: Claude Opus 5.5 <noreply@anthropic.com>
Claude-Session: https://claude.ai/code/session_01G7W1FBPLoSQuhNKzvxRuhj
</commit_message>
<xml_diff>
--- a/docs/report/DA3_Report.docx
+++ b/docs/report/DA3_Report.docx
@@ -518,7 +518,7 @@
           <w:sz w:val="24"/>
           <w:szCs w:val="24"/>
         </w:rPr>
-        <w:t xml:space="preserve">Slow (below 50 beats per minute) and fast (above 100 beats per minute) resting heart rates and premature beats are secondary findings that come from the same beat timings. Slow and fast rates can be normal (fitness, exercise, caffeine) but can also signal conduction problems, arrhythmias or thyroid disease (Kusumoto et al., 2019); premature beats are usually harmless but are a known cause of false AF alarms (Chong et al., 2015).</w:t>
+        <w:t xml:space="preserve">Slow (below 50 beats per minute) and fast (above 100 beats per minute) resting heart rates and premature beats are secondary findings that come from the same beat timings. A slow rate can be normal in fit people or during sleep but can also signal sinus-node or conduction disease (Kusumoto et al., 2019); a fast rate can be normal during exercise or after caffeine but can also indicate an arrhythmia. Premature beats are usually harmless but must be told apart from AF (Chong et al., 2015).</w:t>
       </w:r>
     </w:p>
     <w:p>
@@ -566,7 +566,7 @@
           <w:sz w:val="24"/>
           <w:szCs w:val="24"/>
         </w:rPr>
-        <w:t xml:space="preserve"> AF raises stroke risk about five-fold (Wolf et al., 1991). Its prevalence is about 2–3% at ages 65–69 and about 10% over 85, and about 20% of AF-related strokes occur in people whose AF is first found at the time of the stroke (US Preventive Services Task Force, 2018).</w:t>
+        <w:t xml:space="preserve"> AF raises stroke risk nearly five-fold (Wolf et al., 1991). Its prevalence is about 2–3% at ages 65–69 and about 10% over 85, and about 20% of AF-related strokes occur in people whose AF is first found at the time of the stroke (US Preventive Services Task Force, 2018).</w:t>
       </w:r>
     </w:p>
     <w:p>
@@ -597,7 +597,7 @@
           <w:sz w:val="24"/>
           <w:szCs w:val="24"/>
         </w:rPr>
-        <w:t xml:space="preserve"> density-histogram analysis of RR intervals reached about 93% sensitivity and 97% specificity on the MIT-BIH AF database (Tateno &amp; Glass, 2001); combining RMSSD, Shannon entropy and turning-point ratio reached 94.4% sensitivity and 95.1% specificity (Dash et al., 2009).</w:t>
+        <w:t xml:space="preserve"> comparing the distribution of successive RR-interval differences with AF templates reached 94.4% sensitivity and 97.2% specificity on the MIT-BIH AF database (Tateno &amp; Glass, 2001); combining RMSSD, Shannon entropy and turning-point ratio reached 94.4% sensitivity and 95.1% specificity (Dash et al., 2009).</w:t>
       </w:r>
     </w:p>
     <w:p>
@@ -628,7 +628,7 @@
           <w:sz w:val="24"/>
           <w:szCs w:val="24"/>
         </w:rPr>
-        <w:t xml:space="preserve"> a smartphone camera on the fingertip with RMSSD and Shannon entropy reported 96.2% sensitivity and 97.5% specificity (McManus et al., 2013); a smartphone camera filming the face detected AF with about 95% sensitivity and 96% specificity against a 12-lead ECG (Yan et al., 2018), and learning systolic peaks from face video reported about 96% accuracy (Sun et al., 2022).</w:t>
+        <w:t xml:space="preserve"> a smartphone camera on the fingertip with RMSSD and Shannon entropy reported 96.2% sensitivity and 97.5% specificity (McManus et al., 2013); a smartphone camera filming the face detected AF with 95% sensitivity and 96% specificity against a 12-lead ECG (Yan et al., 2018), and learning systolic peaks from face video reached 96.0% accuracy for AF versus healthy subjects and 95.2% for AF versus sinus rhythm (Sun et al., 2022).</w:t>
       </w:r>
     </w:p>
     <w:p>
@@ -659,7 +659,7 @@
           <w:sz w:val="24"/>
           <w:szCs w:val="24"/>
         </w:rPr>
-        <w:t xml:space="preserve"> classical methods such as POS and CHROM reach roughly 4 BPM mean absolute error on UBFC-rPPG in the rPPG-Toolbox benchmark, while supervised deep networks reach about 1 BPM or below on the same data (Liu et al., 2023).</w:t>
+        <w:t xml:space="preserve"> with the rPPG-Toolbox implementations (Liu et al., 2023), the training-free methods CHROM and POS reach 3.98 and 4.00 BPM mean absolute error on UBFC-rPPG, against 14.70 BPM for ICA and 19.82 BPM for GREEN (Paruchuri et al., 2024).</w:t>
       </w:r>
     </w:p>
     <w:p>
@@ -690,7 +690,7 @@
           <w:sz w:val="24"/>
           <w:szCs w:val="24"/>
         </w:rPr>
-        <w:t xml:space="preserve"> in healthy adults at rest, short-term RMSSD is typically about 19–75 ms and SDNN about 32–93 ms (Nunan et al., 2010); AF produces much larger and random beat-to-beat changes.</w:t>
+        <w:t xml:space="preserve"> a review of 44 studies with 21,438 healthy adults found that short-term HRV values vary widely between studies and are lower than the 1996 Task Force norms (Nunan et al., 2010), so rhythm screening should rely on irregularity features rather than fixed HRV thresholds.</w:t>
       </w:r>
     </w:p>
     <w:p>
@@ -1190,7 +1190,7 @@
                 <w:sz w:val="20"/>
                 <w:szCs w:val="20"/>
               </w:rPr>
-              <w:t xml:space="preserve">Region quality usually judged by a sharp spectral peak, which penalises irregular rhythms</w:t>
+              <w:t xml:space="preserve">Designed and evaluated for heart rate, not for preserving irregular beat timing</w:t>
             </w:r>
           </w:p>
         </w:tc>
@@ -1484,7 +1484,7 @@
           <w:sz w:val="24"/>
           <w:szCs w:val="24"/>
         </w:rPr>
-        <w:t xml:space="preserve">Verkruysse et al. showed that a plethysmographic signal can be recorded from the face with a simple consumer digital camera under ordinary ambient light, without any dedicated illumination. They found that the green channel carries the strongest pulse signal because haemoglobin absorbs green light strongly, and that heart and respiration rates can be read from the signal's spectrum. The work established the principle of rPPG but used manually selected regions and stationary subjects, leaving robustness to motion and lighting open.</w:t>
+        <w:t xml:space="preserve">Verkruysse et al. showed that a plethysmographic signal can be recorded from the face at more than 1 m with a simple consumer digital camera under ordinary ambient light, without any dedicated illumination. They found that the green channel carries the strongest pulse signal because haemoglobin absorbs green light strongly, and that heart and respiration rates can be read from the signal's spectrum. The work established the principle of rPPG but used manually selected regions and stationary subjects, leaving robustness to motion and lighting open.</w:t>
       </w:r>
     </w:p>
     <w:p>
@@ -1533,7 +1533,7 @@
           <w:sz w:val="24"/>
           <w:szCs w:val="24"/>
         </w:rPr>
-        <w:t xml:space="preserve">Poh et al. automated webcam pulse measurement with face tracking and independent component analysis (ICA), which separates the pulse from other colour variations in the RGB traces. Tested on 12 participants against a finger blood-volume-pulse sensor, ICA reduced the heart-rate RMSE from 6.00 to 2.29 BPM. The study showed that low-cost webcams can measure heart rate, while noting that strong motion still degrades the signal.</w:t>
+        <w:t xml:space="preserve">Poh et al. automated webcam pulse measurement with face tracking and independent component analysis (ICA), which separates the pulse from other colour variations in the RGB traces. Pulse rates from webcam video agreed closely with an FDA-approved finger blood-volume-pulse sensor, and the method tolerated slight motion and could measure several people at once. The study showed that low-cost webcams can measure heart rate, but its blind source separation offers limited robustness to stronger motion.</w:t>
       </w:r>
     </w:p>
     <w:p>
@@ -1582,7 +1582,7 @@
           <w:sz w:val="24"/>
           <w:szCs w:val="24"/>
         </w:rPr>
-        <w:t xml:space="preserve">De Haan and Jeanne proposed CHROM, which builds two chrominance signals from normalised RGB under a standardised skin-tone assumption and combines them with a ratio that cancels motion-induced specular changes. The method outperformed ICA and PCA on recordings of stationary subjects and of subjects exercising on fitness equipment. It remains a standard classical baseline, although it still processes one skin region as a whole.</w:t>
+        <w:t xml:space="preserve">De Haan and Jeanne proposed CHROM, which builds two chrominance signals from normalised RGB under a standardised skin-tone assumption and combines them with a ratio that cancels motion-induced specular changes. On 117 stationary subjects it agreed with contact PPG in 92% of cases with half the RMSE of blind-source-separation methods, and on a fitness bike correct pulse-rate detection rose from 79% to 98%. It remains a standard classical baseline, although it still processes one skin region as a whole.</w:t>
       </w:r>
     </w:p>
     <w:p>
@@ -1631,7 +1631,7 @@
           <w:sz w:val="24"/>
           <w:szCs w:val="24"/>
         </w:rPr>
-        <w:t xml:space="preserve">De Haan and van Leest introduced the PBV method, which uses the known colour signature of the blood-volume pulse across the R, G and B channels to project the signal. Because the pulse direction in colour space is fixed, distortions in other directions are suppressed, improving robustness to motion on fitness-device recordings. The method depends on an accurate signature, which can vary with camera and skin tone.</w:t>
+        <w:t xml:space="preserve">De Haan and van Leest introduced the PBV method, which uses the known colour signature of the blood-volume pulse across the R, G and B channels to project the signal. Because the pulse direction in colour space is fixed, distortions in other directions are suppressed; in a gym study the correct pulse rate was obtained in 68% of measurements against 60% for the best earlier method. The method depends on an accurate signature, which can vary with camera and skin tone.</w:t>
       </w:r>
     </w:p>
     <w:p>
@@ -1680,7 +1680,7 @@
           <w:sz w:val="24"/>
           <w:szCs w:val="24"/>
         </w:rPr>
-        <w:t xml:space="preserve">Wang et al. derived a mathematical model of skin reflection that explains classical rPPG methods as different projections of the RGB signal. From it they proposed POS, which projects temporally normalised RGB onto a plane orthogonal to the skin tone and combines the two projections with an alpha-tuning step. In a large benchmark POS gave the best overall performance, which is why it is the per-patch pulse extractor in this project.</w:t>
+        <w:t xml:space="preserve">Wang et al. derived a mathematical model of skin reflection that explains classical rPPG methods as different projections of the RGB signal. From it they proposed POS, which projects temporally normalised RGB onto a plane orthogonal to the skin tone and combines the two projections with an alpha-tuning step. POS needs no training and is among the most accurate training-free methods in later benchmarks (Paruchuri et al., 2024), which is why it is the per-patch pulse extractor in this project.</w:t>
       </w:r>
     </w:p>
     <w:p>
@@ -1729,7 +1729,7 @@
           <w:sz w:val="24"/>
           <w:szCs w:val="24"/>
         </w:rPr>
-        <w:t xml:space="preserve">Wang, Stuijk and de Haan treated every tracked skin pixel as an independent rPPG sensor and combined these many pulse signals. Using the spatial redundancy of the sensor, outlier signals caused by motion could be suppressed, improving robustness over a single averaged region. The work motivates measuring many small skin regions, as done with the 25 patches here, but its combination rule was designed for heart rate, not for irregular rhythms.</w:t>
+        <w:t xml:space="preserve">Wang, Stuijk and de Haan treated every tracked skin pixel as an independent rPPG sensor and combined these many pulse signals. With motion-compensated pixel tracking, spatial pruning and temporal filtering, the SNR on 36 challenging videos rose from 3.34 dB to 6.76 dB over the previous best method. The work motivates measuring many small skin regions, as done with the 25 patches here, but it was evaluated on pulse rate, not on irregular rhythms.</w:t>
       </w:r>
     </w:p>
     <w:p>
@@ -1778,7 +1778,7 @@
           <w:sz w:val="24"/>
           <w:szCs w:val="24"/>
         </w:rPr>
-        <w:t xml:space="preserve">Kumar et al. divided the face into small regions, tracked them over time and combined their signals with a weighted average driven by a per-region goodness metric. The weighting improved signal quality notably for darker skin tones, low light and larger camera distances. It is the closest prior work to our patch fusion; however, its goodness metric is based on the spectral power around the estimated pulse rate, which assumes a regular rhythm and would penalise AF.</w:t>
+        <w:t xml:space="preserve">Kumar et al. divided the face into small regions, tracked them over time and combined their signals with a weighted average whose weights, estimated from the video itself, reflect local blood perfusion and incident light. Across 12 subjects the weighting improved SNR by about 4.1 dB over face averaging, with larger gains for darker skin tones, and reduced heart-rate bias. It is the closest prior work to our patch fusion, but it was designed and evaluated for heart rate, not for rhythm analysis.</w:t>
       </w:r>
     </w:p>
     <w:p>
@@ -1827,7 +1827,7 @@
           <w:sz w:val="24"/>
           <w:szCs w:val="24"/>
         </w:rPr>
-        <w:t xml:space="preserve">Lam and Kuno sampled random pairs of facial patches, applied blind source separation to each pair, and chose the heart rate by majority voting over many estimates. The voting made the method robust to facial expressions and natural motion in the MAHNOB-HCI recordings. Its output is a heart rate rather than beat timing, so it cannot support rhythm analysis directly.</w:t>
+        <w:t xml:space="preserve">Lam and Kuno selected local facial patches, treated their signals as a blind source separation problem, and combined many per-patch estimates by majority voting. The method needed no controlled setup and coped with motion and illumination changes on a large database of challenging videos. Its output is a heart rate rather than beat timing, so it cannot support rhythm analysis directly.</w:t>
       </w:r>
     </w:p>
     <w:p>
@@ -1876,7 +1876,7 @@
           <w:sz w:val="24"/>
           <w:szCs w:val="24"/>
         </w:rPr>
-        <w:t xml:space="preserve">Tulyakov et al. extracted chrominance features from many face regions and used matrix completion to select the regions and time segments that reliably carry the pulse. They also introduced the MMSE-HR dataset recorded under realistic, spontaneous conditions. The method shows that region selection matters under realistic conditions, though its optimisation is heavier than simple weighting.</w:t>
+        <w:t xml:space="preserve">Tulyakov et al. dynamically selected the face regions useful for heart-rate estimation using matrix completion, estimating the heart rate and the regions to use jointly. The approach significantly outperformed earlier methods on public benchmarks recorded under naturalistic conditions. It shows that region selection matters under realistic conditions, though its optimisation is heavier than simple weighting.</w:t>
       </w:r>
     </w:p>
     <w:p>
@@ -1925,7 +1925,7 @@
           <w:sz w:val="24"/>
           <w:szCs w:val="24"/>
         </w:rPr>
-        <w:t xml:space="preserve">Bobbia et al. replaced fixed landmark regions with an unsupervised superpixel segmentation that keeps only skin pixels likely to contain the pulse. Selecting skin adaptively improved heart-rate estimation over conventional face regions. The paper also introduced the UBFC-rPPG dataset, which is one of the evaluation datasets of this project.</w:t>
+        <w:t xml:space="preserve">Bobbia et al. avoided face and skin detection altogether by dividing the video into temporal superpixels, extracting a pulse from each and weighting them by their pulsatility. The method outperformed the state of the art at the time. The paper also introduced a new public dataset for comparing rPPG algorithms, UBFC-rPPG, which is one of the evaluation datasets of this project.</w:t>
       </w:r>
     </w:p>
     <w:p>
@@ -1974,7 +1974,7 @@
           <w:sz w:val="24"/>
           <w:szCs w:val="24"/>
         </w:rPr>
-        <w:t xml:space="preserve">Balakrishnan et al. showed that the head moves very slightly with each heartbeat, as blood is ejected into the head, and recovered the pulse by tracking facial feature points and applying principal component analysis. The method worked even when the skin was not visible. For this project the finding is a caution: head-pose signals can contain the pulse, so regressing the pulse on small head movements can remove real pulse, which our motion-removal design guards against.</w:t>
+        <w:t xml:space="preserve">Balakrishnan et al. showed that the head moves very slightly with each heartbeat, as a reaction to the influx of blood, and recovered the pulse by tracking head feature points and applying principal component analysis; on 18 subjects the heart rates were nearly identical to an ECG. For this project the finding is a caution: head-pose signals can contain the pulse, so regressing the pulse on small head movements can remove real pulse, which our motion-removal design guards against.</w:t>
       </w:r>
     </w:p>
     <w:p>
@@ -2023,7 +2023,7 @@
           <w:sz w:val="24"/>
           <w:szCs w:val="24"/>
         </w:rPr>
-        <w:t xml:space="preserve">Cantrill et al. used a 3D face mesh to map facial texture into a pose-independent space and conditioned the network on facial orientation. This reduced the effect of head rotation on rPPG and improved cross-dataset generalisation. It supports the use of 3D orientation in this project, where patch orientation is used explicitly as a trust check rather than inside a network.</w:t>
+        <w:t xml:space="preserve">Cantrill et al. used a 3D face mesh to map facial texture into a pose-independent space and conditioned the network on facial orientation. Trained on PURE and tested on MMPD it improved on the PhysNet baseline by 18.2%, and by up to 29.6% in the motion scenarios. It supports the use of 3D orientation in this project, where patch orientation is used explicitly as a trust check rather than inside a network.</w:t>
       </w:r>
     </w:p>
     <w:p>
@@ -2072,7 +2072,7 @@
           <w:sz w:val="24"/>
           <w:szCs w:val="24"/>
         </w:rPr>
-        <w:t xml:space="preserve">Chen and McDuff proposed DeepPhys, an end-to-end convolutional network that uses normalised frame differences as a motion representation and an appearance branch that produces attention masks over skin. The model learned which regions carry the pulse and outperformed classical methods on several datasets. As a supervised model it requires labelled training data and may generalise poorly to new conditions.</w:t>
+        <w:t xml:space="preserve">Chen and McDuff proposed DeepPhys, an end-to-end convolutional network for heart and breathing rate that uses normalised frame differences as a motion representation and an appearance branch that produces attention masks over skin. It significantly outperformed earlier methods on both RGB and infrared video datasets. As a supervised model it requires labelled training data and may generalise poorly to new conditions.</w:t>
       </w:r>
     </w:p>
     <w:p>
@@ -2121,7 +2121,7 @@
           <w:sz w:val="24"/>
           <w:szCs w:val="24"/>
         </w:rPr>
-        <w:t xml:space="preserve">Yu, Li and Zhao proposed PhysNet, a 3D convolutional network that recovers the rPPG waveform from facial video end to end, using spatio-temporal features. It was evaluated on the OBF and MAHNOB-HCI datasets and recovered the waveform well enough to estimate heart-rate variability features. Deep models like this are used in this project only as comparison baselines.</w:t>
+        <w:t xml:space="preserve">Yu, Li and Zhao proposed PhysNet, a 3D convolutional network that recovers the rPPG waveform from facial video end to end, using spatio-temporal features. Trained on OBF and tested across datasets on MAHNOB-HCI, it recovered the waveform well enough for heart-rate variability analysis and gave promising results for AF detection. Deep models like this are used in this project only as comparison baselines.</w:t>
       </w:r>
     </w:p>
     <w:p>
@@ -2170,7 +2170,7 @@
           <w:sz w:val="24"/>
           <w:szCs w:val="24"/>
         </w:rPr>
-        <w:t xml:space="preserve">Liu et al. proposed TS-CAN, which uses temporal shift modules to model time without 3D convolutions and estimates pulse and respiration jointly. The design runs in real time on mobile devices with accuracy close to larger models. It shows that efficiency matters for deployment, a requirement that our CPU-only pipeline also meets.</w:t>
+        <w:t xml:space="preserve">Liu et al. proposed TS-CAN, which uses temporal shift modules to model time without 3D convolutions and estimates pulse and respiration jointly. The design runs at more than 150 frames per second on a mobile ARM CPU with state-of-the-art accuracy at the time. It shows that efficiency matters for deployment, a requirement that our CPU-only pipeline also meets.</w:t>
       </w:r>
     </w:p>
     <w:p>
@@ -2219,7 +2219,7 @@
           <w:sz w:val="24"/>
           <w:szCs w:val="24"/>
         </w:rPr>
-        <w:t xml:space="preserve">Yu et al. introduced PhysFormer, a video transformer with temporal-difference attention that captures long-range spatio-temporal relations in facial video. With label-distribution learning and curriculum training it achieved state-of-the-art results on several datasets. Its computational cost and reliance on training data contrast with the training-free signal-level method of this project.</w:t>
+        <w:t xml:space="preserve">Yu et al. introduced PhysFormer, a video transformer with temporal-difference attention that captures long-range spatio-temporal relations in facial video. With label-distribution learning and a curriculum-style frequency constraint it achieved state-of-the-art results on several datasets without large-scale pre-training. Its computational cost and reliance on training data contrast with the training-free signal-level method of this project.</w:t>
       </w:r>
     </w:p>
     <w:p>
@@ -2268,7 +2268,7 @@
           <w:sz w:val="24"/>
           <w:szCs w:val="24"/>
         </w:rPr>
-        <w:t xml:space="preserve">Liu et al. released an open-source toolbox that implements unsupervised methods (GREEN, ICA, CHROM, POS and others) and supervised networks with standardised preprocessing and evaluation. Its benchmarks show classical methods around 4 BPM error on UBFC-rPPG and supervised networks clearly lower, with large drops across datasets. It provides the reference numbers and baselines against which this project is compared.</w:t>
+        <w:t xml:space="preserve">Liu et al. released an open-source toolbox that implements unsupervised methods (GREEN, ICA, CHROM, POS and others) and supervised networks with standardised preprocessing and evaluation. With these implementations, CHROM and POS reach about 4 BPM error on UBFC-rPPG (Paruchuri et al., 2024). It provides the baselines against which this project is compared.</w:t>
       </w:r>
     </w:p>
     <w:p>
@@ -2317,7 +2317,7 @@
           <w:sz w:val="24"/>
           <w:szCs w:val="24"/>
         </w:rPr>
-        <w:t xml:space="preserve">Yan et al. recorded short facial videos of hospital patients with a smartphone camera and classified the facial pulse as AF or sinus rhythm. Against a 12-lead ECG the approach reached about 95% sensitivity and 96% specificity. The study proved that face-video AF screening is feasible, but in a controlled setting with still subjects, where motion-induced false alarms are rare.</w:t>
+        <w:t xml:space="preserve">Yan et al. used a smartphone application (Cardiio Rhythm) to record facial videos of patients and classify the facial pulse as AF or sinus rhythm. Against a 12-lead ECG it reached 95% sensitivity and 96% specificity, with positive and negative predictive values of 92% and 97%. The study proved that face-video AF screening is feasible; how such screening behaves when people move or the lighting changes, where false alarms arise, is the question this project focuses on.</w:t>
       </w:r>
     </w:p>
     <w:p>
@@ -2366,7 +2366,7 @@
           <w:sz w:val="24"/>
           <w:szCs w:val="24"/>
         </w:rPr>
-        <w:t xml:space="preserve">Yan et al. extended their work to detect AF in several people at once from a single video using a deep convolutional network. The study showed that video-based AF screening can scale from one person to several people in the same video. It relies on a trained deep model and was evaluated in a controlled clinical setting.</w:t>
+        <w:t xml:space="preserve">Yan et al. extended their work to detect AF from one-minute videos containing several people at once, using a pretrained deep convolutional neural network on the facial PPG signals. The study showed that video-based AF screening can scale from one person to several people in the same video. It relies on a trained deep model.</w:t>
       </w:r>
     </w:p>
     <w:p>
@@ -2415,7 +2415,7 @@
           <w:sz w:val="24"/>
           <w:szCs w:val="24"/>
         </w:rPr>
-        <w:t xml:space="preserve">Li et al. collected the OBF database of face videos with synchronised reference physiological signals from healthy volunteers and from patients with AF. It is one of the few public resources for testing AF detection on face video. Access is granted on request, which makes it the dataset this project depends on most for its strongest result.</w:t>
+        <w:t xml:space="preserve">Li et al. collected the OBF database of face videos with synchronised reference physiological signals from healthy volunteers and from patients with AF, and reported baseline heart-rate, HRV and respiration accuracy together with promising AF detection from video-derived HRV features. It is one of the few resources for testing AF detection on face video. Access is granted on request, which makes it the dataset this project depends on most for its strongest result.</w:t>
       </w:r>
     </w:p>
     <w:p>
@@ -2464,7 +2464,7 @@
           <w:sz w:val="24"/>
           <w:szCs w:val="24"/>
         </w:rPr>
-        <w:t xml:space="preserve">Sun et al. trained a network to locate systolic peaks in face-video pulse signals and used the resulting beat information to detect AF. Focusing on peaks, rather than on the whole waveform, made the method robust to waveform noise, with about 96% accuracy reported. It uses deep learning for peak finding, whereas this project improves the signal before peak finding with patch trust and motion removal.</w:t>
+        <w:t xml:space="preserve">Sun et al. trained a 3D convolutional network with a loss based on systolic-peak timing, then classified AF from HRV features of the resulting beat intervals with a support vector machine. On OBF with subject-independent cross-validation it reached 96.0% accuracy for AF versus healthy subjects and 95.2% for AF versus sinus rhythm. It uses deep learning for peak finding, whereas this project improves the signal before peak finding with patch trust and motion removal.</w:t>
       </w:r>
     </w:p>
     <w:p>
@@ -2513,7 +2513,7 @@
           <w:sz w:val="24"/>
           <w:szCs w:val="24"/>
         </w:rPr>
-        <w:t xml:space="preserve">Tateno and Glass compared the distribution of successive RR-interval differences in a segment with reference distributions from AF using a Kolmogorov-Smirnov test. On the MIT-BIH AF database the method reached about 93% sensitivity and 97% specificity. It established that the randomness of beat intervals alone is a strong AF marker.</w:t>
+        <w:t xml:space="preserve">Tateno and Glass compared the distribution of successive RR-interval differences in a segment with reference distributions from AF using a Kolmogorov-Smirnov test. On the MIT-BIH AF database this test reached 94.4% sensitivity and 97.2% specificity. It established that the randomness of beat intervals alone is a strong AF marker.</w:t>
       </w:r>
     </w:p>
     <w:p>
@@ -2611,7 +2611,7 @@
           <w:sz w:val="24"/>
           <w:szCs w:val="24"/>
         </w:rPr>
-        <w:t xml:space="preserve">McManus et al. recorded fingertip pulse videos with an iPhone camera from 76 patients with persistent AF before and after cardioversion. Normalised RMSSD and Shannon entropy were higher in AF, and their combination reported 96.2% sensitivity and 97.5% specificity for an irregular pulse. The study shows that camera pulses carry enough timing information for AF screening.</w:t>
+        <w:t xml:space="preserve">McManus et al. recorded fingertip pulse videos with an iPhone 4S camera from 76 adults with persistent AF before and after cardioversion. Normalised RMSSD and Shannon entropy were higher in AF, and their combination reached 96.2% sensitivity and 97.5% specificity against a 12-lead ECG for an irregular pulse. The study shows that camera pulses carry enough timing information for AF screening.</w:t>
       </w:r>
     </w:p>
     <w:p>
@@ -2660,7 +2660,7 @@
           <w:sz w:val="24"/>
           <w:szCs w:val="24"/>
         </w:rPr>
-        <w:t xml:space="preserve">Chong et al. extended smartphone AF detection to distinguish AF from premature atrial and ventricular contractions. They combined RMSSD and Shannon entropy with Poincaré-plot or turning-point features and pulse rise and fall times. The work shows that premature beats are a key confounder of AF detection, which motivates removing extra beats before the AF check in this project.</w:t>
+        <w:t xml:space="preserve">Chong et al. extended smartphone AF detection to distinguish AF from premature atrial and ventricular contractions. They combined RMSSD and Shannon entropy with Poincaré-plot or turning-point features and pulse rise and fall times, separating premature ventricular and atrial contractions from AF with sensitivities of 96.8% and 97.8% in 99 subjects. The work shows that premature beats are a key confounder of AF detection, which motivates removing extra beats before the AF check in this project.</w:t>
       </w:r>
     </w:p>
     <w:p>
@@ -2709,7 +2709,7 @@
           <w:sz w:val="24"/>
           <w:szCs w:val="24"/>
         </w:rPr>
-        <w:t xml:space="preserve">Orphanidou et al. derived signal-quality indices for ECG and PPG, including template matching in which each beat is correlated with the average beat. The indices reliably separated usable from unusable segments in wireless patient monitoring. The beat-shape consistency used in our confidence is based on this template-matching idea, which does not assume a regular rhythm.</w:t>
+        <w:t xml:space="preserve">Orphanidou et al. derived beat-level signal-quality indices for ECG and PPG for wireless patient monitoring. For the PPG, the index identified usable signals with 91% sensitivity and 95% specificity, and was used to save power and to reduce the error of respiratory-rate estimates. It supports the idea, used in our confidence, of judging quality from individual beats rather than from the spectrum.</w:t>
       </w:r>
     </w:p>
     <w:p>
@@ -2758,7 +2758,7 @@
           <w:sz w:val="24"/>
           <w:szCs w:val="24"/>
         </w:rPr>
-        <w:t xml:space="preserve">Karlen et al. estimated breathing rate from the PPG using three respiratory modulations: of intensity, amplitude and frequency. Fusing the three estimates improved accuracy over any single modulation. The planned breathing-rate block of this project and its breathing-aware heart-rate selection follow this approach.</w:t>
+        <w:t xml:space="preserve">Karlen et al. estimated breathing rate from the PPG using three respiratory modulations: of intensity, amplitude and frequency. Their Smart Fusion method combines the three estimates and discards those that disagree, and it has become a widely used benchmark for PPG-derived breathing rate. The planned breathing-rate block of this project and its breathing-aware heart-rate selection follow this approach.</w:t>
       </w:r>
     </w:p>
     <w:p>
@@ -2807,7 +2807,7 @@
           <w:sz w:val="24"/>
           <w:szCs w:val="24"/>
         </w:rPr>
-        <w:t xml:space="preserve">Charlton et al. benchmarked many open-source PPG beat detectors on several datasets, including recordings with AF. They released the MIMIC PERform datasets, among them MIMIC PERform AF with labelled AF and non-AF subjects. This dataset is used in this project to train and validate the AF classifier on real AF pulse data.</w:t>
+        <w:t xml:space="preserve">Charlton et al. benchmarked 15 open-source PPG beat detectors on 8 datasets; the best reached F1 scores of 92–97% in AF against 99–100% in sinus rhythm. They released the MIMIC PERform datasets, among them MIMIC PERform AF with 20-minute recordings from 19 AF and 16 non-AF critically ill adults. This dataset is used in this project to train and validate the AF classifier on real AF pulse data.</w:t>
       </w:r>
     </w:p>
     <w:p>
@@ -3428,7 +3428,7 @@
                 <w:sz w:val="18"/>
                 <w:szCs w:val="18"/>
               </w:rPr>
-              <w:t xml:space="preserve">12 subjects, webcam</w:t>
+              <w:t xml:space="preserve">Webcam vs finger BVP sensor</w:t>
             </w:r>
           </w:p>
         </w:tc>
@@ -3463,7 +3463,7 @@
                 <w:sz w:val="18"/>
                 <w:szCs w:val="18"/>
               </w:rPr>
-              <w:t xml:space="preserve">RMSE 2.29 BPM (vs 6.00 without ICA)</w:t>
+              <w:t xml:space="preserve">Close agreement; several people at once</w:t>
             </w:r>
           </w:p>
         </w:tc>
@@ -3498,7 +3498,7 @@
                 <w:sz w:val="18"/>
                 <w:szCs w:val="18"/>
               </w:rPr>
-              <w:t xml:space="preserve">Motion still harmful</w:t>
+              <w:t xml:space="preserve">Limited robustness to strong motion</w:t>
             </w:r>
           </w:p>
         </w:tc>
@@ -3643,7 +3643,7 @@
                 <w:sz w:val="18"/>
                 <w:szCs w:val="18"/>
               </w:rPr>
-              <w:t xml:space="preserve">Still and exercising subjects</w:t>
+              <w:t xml:space="preserve">117 still subjects; fitness</w:t>
             </w:r>
           </w:p>
         </w:tc>
@@ -3678,7 +3678,7 @@
                 <w:sz w:val="18"/>
                 <w:szCs w:val="18"/>
               </w:rPr>
-              <w:t xml:space="preserve">Better than ICA/PCA</w:t>
+              <w:t xml:space="preserve">92% agreement; half the RMSE of BSS</w:t>
             </w:r>
           </w:p>
         </w:tc>
@@ -3858,7 +3858,7 @@
                 <w:sz w:val="18"/>
                 <w:szCs w:val="18"/>
               </w:rPr>
-              <w:t xml:space="preserve">Fitness recordings</w:t>
+              <w:t xml:space="preserve">Gym and still subjects</w:t>
             </w:r>
           </w:p>
         </w:tc>
@@ -3893,7 +3893,7 @@
                 <w:sz w:val="18"/>
                 <w:szCs w:val="18"/>
               </w:rPr>
-              <w:t xml:space="preserve">Improved motion robustness</w:t>
+              <w:t xml:space="preserve">68% vs 60% correct in gym</w:t>
             </w:r>
           </w:p>
         </w:tc>
@@ -4073,7 +4073,7 @@
                 <w:sz w:val="18"/>
                 <w:szCs w:val="18"/>
               </w:rPr>
-              <w:t xml:space="preserve">Large benchmark</w:t>
+              <w:t xml:space="preserve">Benchmark recordings</w:t>
             </w:r>
           </w:p>
         </w:tc>
@@ -4108,7 +4108,7 @@
                 <w:sz w:val="18"/>
                 <w:szCs w:val="18"/>
               </w:rPr>
-              <w:t xml:space="preserve">Best overall classical method</w:t>
+              <w:t xml:space="preserve">Unifying model; strong training-free method</w:t>
             </w:r>
           </w:p>
         </w:tc>
@@ -4288,7 +4288,7 @@
                 <w:sz w:val="18"/>
                 <w:szCs w:val="18"/>
               </w:rPr>
-              <w:t xml:space="preserve">Motion recordings</w:t>
+              <w:t xml:space="preserve">36 challenging videos</w:t>
             </w:r>
           </w:p>
         </w:tc>
@@ -4323,7 +4323,7 @@
                 <w:sz w:val="18"/>
                 <w:szCs w:val="18"/>
               </w:rPr>
-              <w:t xml:space="preserve">Motion robustness via redundancy</w:t>
+              <w:t xml:space="preserve">SNR 3.34 to 6.76 dB</w:t>
             </w:r>
           </w:p>
         </w:tc>
@@ -4358,7 +4358,7 @@
                 <w:sz w:val="18"/>
                 <w:szCs w:val="18"/>
               </w:rPr>
-              <w:t xml:space="preserve">Heart rate only</w:t>
+              <w:t xml:space="preserve">Pulse rate only</w:t>
             </w:r>
           </w:p>
         </w:tc>
@@ -4468,7 +4468,7 @@
                 <w:sz w:val="18"/>
                 <w:szCs w:val="18"/>
               </w:rPr>
-              <w:t xml:space="preserve">Region tracking + goodness weighting</w:t>
+              <w:t xml:space="preserve">Region tracking + weighted average</w:t>
             </w:r>
           </w:p>
         </w:tc>
@@ -4503,7 +4503,7 @@
                 <w:sz w:val="18"/>
                 <w:szCs w:val="18"/>
               </w:rPr>
-              <w:t xml:space="preserve">Varied skin tones, distances</w:t>
+              <w:t xml:space="preserve">12 subjects, 3 skin tones</w:t>
             </w:r>
           </w:p>
         </w:tc>
@@ -4538,7 +4538,7 @@
                 <w:sz w:val="18"/>
                 <w:szCs w:val="18"/>
               </w:rPr>
-              <w:t xml:space="preserve">Higher SNR for dark skin, low light</w:t>
+              <w:t xml:space="preserve">About 4.1 dB SNR gain</w:t>
             </w:r>
           </w:p>
         </w:tc>
@@ -4573,7 +4573,7 @@
                 <w:sz w:val="18"/>
                 <w:szCs w:val="18"/>
               </w:rPr>
-              <w:t xml:space="preserve">Spectral weighting assumes regular rhythm</w:t>
+              <w:t xml:space="preserve">Heart rate only</w:t>
             </w:r>
           </w:p>
         </w:tc>
@@ -4683,7 +4683,7 @@
                 <w:sz w:val="18"/>
                 <w:szCs w:val="18"/>
               </w:rPr>
-              <w:t xml:space="preserve">Random patch pairs + voting</w:t>
+              <w:t xml:space="preserve">Local patches + BSS + voting</w:t>
             </w:r>
           </w:p>
         </w:tc>
@@ -4718,7 +4718,7 @@
                 <w:sz w:val="18"/>
                 <w:szCs w:val="18"/>
               </w:rPr>
-              <w:t xml:space="preserve">MAHNOB-HCI</w:t>
+              <w:t xml:space="preserve">Challenging video database</w:t>
             </w:r>
           </w:p>
         </w:tc>
@@ -4753,7 +4753,7 @@
                 <w:sz w:val="18"/>
                 <w:szCs w:val="18"/>
               </w:rPr>
-              <w:t xml:space="preserve">Robust to expressions and motion</w:t>
+              <w:t xml:space="preserve">Robust to motion and lighting</w:t>
             </w:r>
           </w:p>
         </w:tc>
@@ -4933,7 +4933,7 @@
                 <w:sz w:val="18"/>
                 <w:szCs w:val="18"/>
               </w:rPr>
-              <w:t xml:space="preserve">MMSE-HR (new)</w:t>
+              <w:t xml:space="preserve">Naturalistic benchmarks</w:t>
             </w:r>
           </w:p>
         </w:tc>
@@ -4968,7 +4968,7 @@
                 <w:sz w:val="18"/>
                 <w:szCs w:val="18"/>
               </w:rPr>
-              <w:t xml:space="preserve">Reliable region selection</w:t>
+              <w:t xml:space="preserve">Beat earlier methods</w:t>
             </w:r>
           </w:p>
         </w:tc>
@@ -5113,7 +5113,7 @@
                 <w:sz w:val="18"/>
                 <w:szCs w:val="18"/>
               </w:rPr>
-              <w:t xml:space="preserve">Superpixel skin segmentation</w:t>
+              <w:t xml:space="preserve">Temporal superpixels by pulsatility</w:t>
             </w:r>
           </w:p>
         </w:tc>
@@ -5183,7 +5183,7 @@
                 <w:sz w:val="18"/>
                 <w:szCs w:val="18"/>
               </w:rPr>
-              <w:t xml:space="preserve">Better than fixed regions</w:t>
+              <w:t xml:space="preserve">No face/skin detection needed</w:t>
             </w:r>
           </w:p>
         </w:tc>
@@ -5328,7 +5328,7 @@
                 <w:sz w:val="18"/>
                 <w:szCs w:val="18"/>
               </w:rPr>
-              <w:t xml:space="preserve">Pulse from head motion (BCG)</w:t>
+              <w:t xml:space="preserve">Pulse from head motion</w:t>
             </w:r>
           </w:p>
         </w:tc>
@@ -5363,7 +5363,7 @@
                 <w:sz w:val="18"/>
                 <w:szCs w:val="18"/>
               </w:rPr>
-              <w:t xml:space="preserve">Volunteers</w:t>
+              <w:t xml:space="preserve">18 subjects vs ECG</w:t>
             </w:r>
           </w:p>
         </w:tc>
@@ -5398,7 +5398,7 @@
                 <w:sz w:val="18"/>
                 <w:szCs w:val="18"/>
               </w:rPr>
-              <w:t xml:space="preserve">Head bobs with each beat</w:t>
+              <w:t xml:space="preserve">Head moves with each beat</w:t>
             </w:r>
           </w:p>
         </w:tc>
@@ -5433,7 +5433,7 @@
                 <w:sz w:val="18"/>
                 <w:szCs w:val="18"/>
               </w:rPr>
-              <w:t xml:space="preserve">Very sensitive to other motion</w:t>
+              <w:t xml:space="preserve">Sensitive to other motion</w:t>
             </w:r>
           </w:p>
         </w:tc>
@@ -5578,7 +5578,7 @@
                 <w:sz w:val="18"/>
                 <w:szCs w:val="18"/>
               </w:rPr>
-              <w:t xml:space="preserve">Benchmark datasets</w:t>
+              <w:t xml:space="preserve">PURE to MMPD</w:t>
             </w:r>
           </w:p>
         </w:tc>
@@ -5613,7 +5613,7 @@
                 <w:sz w:val="18"/>
                 <w:szCs w:val="18"/>
               </w:rPr>
-              <w:t xml:space="preserve">Better under rotation, cross-dataset</w:t>
+              <w:t xml:space="preserve">18.2% better than PhysNet</w:t>
             </w:r>
           </w:p>
         </w:tc>
@@ -5793,7 +5793,7 @@
                 <w:sz w:val="18"/>
                 <w:szCs w:val="18"/>
               </w:rPr>
-              <w:t xml:space="preserve">Several datasets</w:t>
+              <w:t xml:space="preserve">RGB and infrared datasets</w:t>
             </w:r>
           </w:p>
         </w:tc>
@@ -5828,7 +5828,7 @@
                 <w:sz w:val="18"/>
                 <w:szCs w:val="18"/>
               </w:rPr>
-              <w:t xml:space="preserve">Beat classical methods</w:t>
+              <w:t xml:space="preserve">Beat earlier methods</w:t>
             </w:r>
           </w:p>
         </w:tc>
@@ -6008,7 +6008,7 @@
                 <w:sz w:val="18"/>
                 <w:szCs w:val="18"/>
               </w:rPr>
-              <w:t xml:space="preserve">OBF, MAHNOB-HCI</w:t>
+              <w:t xml:space="preserve">OBF; MAHNOB-HCI (cross)</w:t>
             </w:r>
           </w:p>
         </w:tc>
@@ -6043,7 +6043,7 @@
                 <w:sz w:val="18"/>
                 <w:szCs w:val="18"/>
               </w:rPr>
-              <w:t xml:space="preserve">Waveform good enough for HRV</w:t>
+              <w:t xml:space="preserve">HRV-grade waveform; AF promising</w:t>
             </w:r>
           </w:p>
         </w:tc>
@@ -6258,7 +6258,7 @@
                 <w:sz w:val="18"/>
                 <w:szCs w:val="18"/>
               </w:rPr>
-              <w:t xml:space="preserve">Real time on mobile</w:t>
+              <w:t xml:space="preserve">&gt;150 fps on mobile CPU</w:t>
             </w:r>
           </w:p>
         </w:tc>
@@ -6618,7 +6618,7 @@
                 <w:sz w:val="18"/>
                 <w:szCs w:val="18"/>
               </w:rPr>
-              <w:t xml:space="preserve">rPPG-Toolbox benchmark</w:t>
+              <w:t xml:space="preserve">rPPG-Toolbox</w:t>
             </w:r>
           </w:p>
         </w:tc>
@@ -6688,7 +6688,7 @@
                 <w:sz w:val="18"/>
                 <w:szCs w:val="18"/>
               </w:rPr>
-              <w:t xml:space="preserve">Classical ~4 BPM MAE; deep lower</w:t>
+              <w:t xml:space="preserve">POS/CHROM about 4 BPM MAE</w:t>
             </w:r>
           </w:p>
         </w:tc>
@@ -6868,7 +6868,7 @@
                 <w:sz w:val="18"/>
                 <w:szCs w:val="18"/>
               </w:rPr>
-              <w:t xml:space="preserve">Hospital patients</w:t>
+              <w:t xml:space="preserve">Patients vs 12-lead ECG</w:t>
             </w:r>
           </w:p>
         </w:tc>
@@ -6903,7 +6903,7 @@
                 <w:sz w:val="18"/>
                 <w:szCs w:val="18"/>
               </w:rPr>
-              <w:t xml:space="preserve">~95% sens., ~96% spec. vs ECG</w:t>
+              <w:t xml:space="preserve">95% sens., 96% spec.</w:t>
             </w:r>
           </w:p>
         </w:tc>
@@ -6938,7 +6938,7 @@
                 <w:sz w:val="18"/>
                 <w:szCs w:val="18"/>
               </w:rPr>
-              <w:t xml:space="preserve">Still subjects, controlled</w:t>
+              <w:t xml:space="preserve">Motion false alarms not studied</w:t>
             </w:r>
           </w:p>
         </w:tc>
@@ -7083,7 +7083,7 @@
                 <w:sz w:val="18"/>
                 <w:szCs w:val="18"/>
               </w:rPr>
-              <w:t xml:space="preserve">Clinical setting</w:t>
+              <w:t xml:space="preserve">One-minute group videos</w:t>
             </w:r>
           </w:p>
         </w:tc>
@@ -7153,7 +7153,7 @@
                 <w:sz w:val="18"/>
                 <w:szCs w:val="18"/>
               </w:rPr>
-              <w:t xml:space="preserve">Deep model, controlled</w:t>
+              <w:t xml:space="preserve">Deep model</w:t>
             </w:r>
           </w:p>
         </w:tc>
@@ -7478,7 +7478,7 @@
                 <w:sz w:val="18"/>
                 <w:szCs w:val="18"/>
               </w:rPr>
-              <w:t xml:space="preserve">Learning systolic peaks</w:t>
+              <w:t xml:space="preserve">Systolic-peak loss + HRV + SVM</w:t>
             </w:r>
           </w:p>
         </w:tc>
@@ -7513,7 +7513,7 @@
                 <w:sz w:val="18"/>
                 <w:szCs w:val="18"/>
               </w:rPr>
-              <w:t xml:space="preserve">Face videos with AF</w:t>
+              <w:t xml:space="preserve">OBF</w:t>
             </w:r>
           </w:p>
         </w:tc>
@@ -7548,7 +7548,7 @@
                 <w:sz w:val="18"/>
                 <w:szCs w:val="18"/>
               </w:rPr>
-              <w:t xml:space="preserve">~96% accuracy</w:t>
+              <w:t xml:space="preserve">96.0% / 95.2% accuracy</w:t>
             </w:r>
           </w:p>
         </w:tc>
@@ -7763,7 +7763,7 @@
                 <w:sz w:val="18"/>
                 <w:szCs w:val="18"/>
               </w:rPr>
-              <w:t xml:space="preserve">~93% sens., ~97% spec.</w:t>
+              <w:t xml:space="preserve">94.4% sens., 97.2% spec.</w:t>
             </w:r>
           </w:p>
         </w:tc>
@@ -8373,7 +8373,7 @@
                 <w:sz w:val="18"/>
                 <w:szCs w:val="18"/>
               </w:rPr>
-              <w:t xml:space="preserve">Smartphone PPG</w:t>
+              <w:t xml:space="preserve">99 subjects, smartphone</w:t>
             </w:r>
           </w:p>
         </w:tc>
@@ -8408,7 +8408,7 @@
                 <w:sz w:val="18"/>
                 <w:szCs w:val="18"/>
               </w:rPr>
-              <w:t xml:space="preserve">Separates PACs/PVCs from AF</w:t>
+              <w:t xml:space="preserve">96.8% / 97.8% sens. for PVC/PAC</w:t>
             </w:r>
           </w:p>
         </w:tc>
@@ -8553,7 +8553,7 @@
                 <w:sz w:val="18"/>
                 <w:szCs w:val="18"/>
               </w:rPr>
-              <w:t xml:space="preserve">Template-matching quality index</w:t>
+              <w:t xml:space="preserve">Beat-level quality indices</w:t>
             </w:r>
           </w:p>
         </w:tc>
@@ -8623,7 +8623,7 @@
                 <w:sz w:val="18"/>
                 <w:szCs w:val="18"/>
               </w:rPr>
-              <w:t xml:space="preserve">Reliable usable/unusable split</w:t>
+              <w:t xml:space="preserve">PPG: 91% sens., 95% spec.</w:t>
             </w:r>
           </w:p>
         </w:tc>
@@ -8768,7 +8768,7 @@
                 <w:sz w:val="18"/>
                 <w:szCs w:val="18"/>
               </w:rPr>
-              <w:t xml:space="preserve">Breathing from PPG modulations</w:t>
+              <w:t xml:space="preserve">Smart Fusion of PPG modulations</w:t>
             </w:r>
           </w:p>
         </w:tc>
@@ -8838,7 +8838,7 @@
                 <w:sz w:val="18"/>
                 <w:szCs w:val="18"/>
               </w:rPr>
-              <w:t xml:space="preserve">Fusion beats single modulation</w:t>
+              <w:t xml:space="preserve">Benchmark breathing-rate method</w:t>
             </w:r>
           </w:p>
         </w:tc>
@@ -8873,7 +8873,7 @@
                 <w:sz w:val="18"/>
                 <w:szCs w:val="18"/>
               </w:rPr>
-              <w:t xml:space="preserve">Contact signals</w:t>
+              <w:t xml:space="preserve">Discards disagreeing estimates</w:t>
             </w:r>
           </w:p>
         </w:tc>
@@ -8983,7 +8983,7 @@
                 <w:sz w:val="18"/>
                 <w:szCs w:val="18"/>
               </w:rPr>
-              <w:t xml:space="preserve">Beat-detector benchmark</w:t>
+              <w:t xml:space="preserve">15 beat detectors, 8 datasets</w:t>
             </w:r>
           </w:p>
         </w:tc>
@@ -9053,7 +9053,7 @@
                 <w:sz w:val="18"/>
                 <w:szCs w:val="18"/>
               </w:rPr>
-              <w:t xml:space="preserve">Public AF PPG data</w:t>
+              <w:t xml:space="preserve">F1 92–97% in AF</w:t>
             </w:r>
           </w:p>
         </w:tc>
@@ -9143,7 +9143,7 @@
           <w:sz w:val="24"/>
           <w:szCs w:val="24"/>
         </w:rPr>
-        <w:t xml:space="preserve">The gap is where these lines meet. Region-weighting methods judge quality by how sharp the pulse's spectral peak is, which is exactly what AF destroys, so they would down-weight or reject real AF; and face-video AF studies were run on still subjects, where motion-induced false alarms are rare. To our knowledge, no published method combines per-patch trust that is independent of rhythm, head-pose motion removal and confidence-gated rhythm decisions to reduce false AF alarms from face video. This project addresses that gap.</w:t>
+        <w:t xml:space="preserve">The gap is where these lines meet. Region-weighting methods were designed and evaluated for heart rate, not for preserving irregular beat timing, and common spectral quality measures such as the SNR of de Haan and Jeanne (2013) reward a sharp spectral peak, which is exactly what AF removes. Face-video AF studies, in turn, report detection accuracy rather than how motion and lighting create false alarms. To our knowledge, no published method combines per-patch trust that is independent of rhythm, head-pose motion removal and confidence-gated rhythm decisions to reduce false AF alarms from face video. This project addresses that gap.</w:t>
       </w:r>
     </w:p>
     <w:p>
@@ -10611,7 +10611,7 @@
           <w:sz w:val="24"/>
           <w:szCs w:val="24"/>
         </w:rPr>
-        <w:t xml:space="preserve"> beat-shape consistency, the mean correlation of each beat (from 35% of the median interval before its peak to 65% after it, resampled to 32 points) with the average beat. This is the template-matching quality index of Orphanidou et al. (2015). AF changes the timing of beats, not their shape, so a clean AF pulse still scores high.</w:t>
+        <w:t xml:space="preserve"> beat-shape consistency, the mean correlation of each beat (from 35% of the median interval before its peak to 65% after it, resampled to 32 points) with the average beat of the window. Like the beat-level quality indices of Orphanidou et al. (2015), it judges quality from individual beats. AF changes the timing of beats, not their shape, so a clean AF pulse still scores high.</w:t>
       </w:r>
     </w:p>
     <w:p>
@@ -12150,7 +12150,7 @@
           <w:sz w:val="24"/>
           <w:szCs w:val="24"/>
         </w:rPr>
-        <w:t xml:space="preserve"> It is the strongest classical method in the benchmark of Wang et al. (2017), needs no training, and runs per patch in real time.</w:t>
+        <w:t xml:space="preserve"> It rests on an explicit skin-reflection model (Wang et al., 2017), needs no training, runs per patch in real time, and is among the most accurate training-free methods (4.00 BPM MAE on UBFC-rPPG, against 14.70 for ICA and 19.82 for GREEN; Paruchuri et al., 2024).</w:t>
       </w:r>
     </w:p>
     <w:p>
@@ -26136,7 +26136,7 @@
                 <w:sz w:val="20"/>
                 <w:szCs w:val="20"/>
               </w:rPr>
-              <w:t xml:space="preserve">POS / CHROM (Liu et al., 2023)</w:t>
+              <w:t xml:space="preserve">POS / CHROM with rPPG-Toolbox (Paruchuri et al., 2024)</w:t>
             </w:r>
           </w:p>
         </w:tc>
@@ -26206,7 +26206,7 @@
                 <w:sz w:val="20"/>
                 <w:szCs w:val="20"/>
               </w:rPr>
-              <w:t xml:space="preserve">About 4 BPM MAE</w:t>
+              <w:t xml:space="preserve">4.00 / 3.98 BPM MAE</w:t>
             </w:r>
           </w:p>
         </w:tc>
@@ -26246,7 +26246,7 @@
                 <w:sz w:val="20"/>
                 <w:szCs w:val="20"/>
               </w:rPr>
-              <w:t xml:space="preserve">Supervised deep networks (Liu et al., 2023)</w:t>
+              <w:t xml:space="preserve">Tateno &amp; Glass (2001)</w:t>
             </w:r>
           </w:p>
         </w:tc>
@@ -26281,7 +26281,7 @@
                 <w:sz w:val="20"/>
                 <w:szCs w:val="20"/>
               </w:rPr>
-              <w:t xml:space="preserve">Heart rate, UBFC-rPPG</w:t>
+              <w:t xml:space="preserve">AF from ECG intervals, MIT-BIH AF</w:t>
             </w:r>
           </w:p>
         </w:tc>
@@ -26316,7 +26316,7 @@
                 <w:sz w:val="20"/>
                 <w:szCs w:val="20"/>
               </w:rPr>
-              <w:t xml:space="preserve">About 1 BPM MAE or below</w:t>
+              <w:t xml:space="preserve">94.4% sensitivity, 97.2% specificity</w:t>
             </w:r>
           </w:p>
         </w:tc>
@@ -26356,7 +26356,7 @@
                 <w:sz w:val="20"/>
                 <w:szCs w:val="20"/>
               </w:rPr>
-              <w:t xml:space="preserve">Tateno &amp; Glass (2001)</w:t>
+              <w:t xml:space="preserve">Dash et al. (2009)</w:t>
             </w:r>
           </w:p>
         </w:tc>
@@ -26426,7 +26426,7 @@
                 <w:sz w:val="20"/>
                 <w:szCs w:val="20"/>
               </w:rPr>
-              <w:t xml:space="preserve">About 93% sensitivity, 97% specificity</w:t>
+              <w:t xml:space="preserve">94.4% sensitivity, 95.1% specificity</w:t>
             </w:r>
           </w:p>
         </w:tc>
@@ -26466,7 +26466,7 @@
                 <w:sz w:val="20"/>
                 <w:szCs w:val="20"/>
               </w:rPr>
-              <w:t xml:space="preserve">Dash et al. (2009)</w:t>
+              <w:t xml:space="preserve">McManus et al. (2013)</w:t>
             </w:r>
           </w:p>
         </w:tc>
@@ -26501,7 +26501,7 @@
                 <w:sz w:val="20"/>
                 <w:szCs w:val="20"/>
               </w:rPr>
-              <w:t xml:space="preserve">AF from ECG intervals, MIT-BIH AF</w:t>
+              <w:t xml:space="preserve">AF from fingertip camera pulse, 76 patients</w:t>
             </w:r>
           </w:p>
         </w:tc>
@@ -26536,7 +26536,7 @@
                 <w:sz w:val="20"/>
                 <w:szCs w:val="20"/>
               </w:rPr>
-              <w:t xml:space="preserve">94.4% sensitivity, 95.1% specificity</w:t>
+              <w:t xml:space="preserve">96.2% sensitivity, 97.5% specificity</w:t>
             </w:r>
           </w:p>
         </w:tc>
@@ -26576,7 +26576,7 @@
                 <w:sz w:val="20"/>
                 <w:szCs w:val="20"/>
               </w:rPr>
-              <w:t xml:space="preserve">McManus et al. (2013)</w:t>
+              <w:t xml:space="preserve">Yan et al. (2018)</w:t>
             </w:r>
           </w:p>
         </w:tc>
@@ -26611,7 +26611,7 @@
                 <w:sz w:val="20"/>
                 <w:szCs w:val="20"/>
               </w:rPr>
-              <w:t xml:space="preserve">AF from fingertip camera pulse, 76 patients</w:t>
+              <w:t xml:space="preserve">AF from face video vs 12-lead ECG</w:t>
             </w:r>
           </w:p>
         </w:tc>
@@ -26646,7 +26646,7 @@
                 <w:sz w:val="20"/>
                 <w:szCs w:val="20"/>
               </w:rPr>
-              <w:t xml:space="preserve">96.2% sensitivity, 97.5% specificity</w:t>
+              <w:t xml:space="preserve">95% sensitivity, 96% specificity</w:t>
             </w:r>
           </w:p>
         </w:tc>
@@ -26686,7 +26686,7 @@
                 <w:sz w:val="20"/>
                 <w:szCs w:val="20"/>
               </w:rPr>
-              <w:t xml:space="preserve">Yan et al. (2018)</w:t>
+              <w:t xml:space="preserve">Sun et al. (2022)</w:t>
             </w:r>
           </w:p>
         </w:tc>
@@ -26721,7 +26721,7 @@
                 <w:sz w:val="20"/>
                 <w:szCs w:val="20"/>
               </w:rPr>
-              <w:t xml:space="preserve">AF from face video, hospital patients</w:t>
+              <w:t xml:space="preserve">AF from face video (OBF)</w:t>
             </w:r>
           </w:p>
         </w:tc>
@@ -26756,117 +26756,7 @@
                 <w:sz w:val="20"/>
                 <w:szCs w:val="20"/>
               </w:rPr>
-              <w:t xml:space="preserve">About 95% sensitivity, 96% specificity</w:t>
-            </w:r>
-          </w:p>
-        </w:tc>
-      </w:tr>
-      <w:tr>
-        <w:trPr>
-          <w:cantSplit/>
-        </w:trPr>
-        <w:tc>
-          <w:tcPr>
-            <w:tcW w:type="dxa" w:w="2841"/>
-            <w:tcBorders>
-              <w:top w:val="single" w:color="000000" w:sz="4"/>
-              <w:left w:val="single" w:color="000000" w:sz="4"/>
-              <w:bottom w:val="single" w:color="000000" w:sz="4"/>
-              <w:right w:val="single" w:color="000000" w:sz="4"/>
-            </w:tcBorders>
-            <w:tcMar>
-              <w:top w:type="dxa" w:w="50"/>
-              <w:left w:type="dxa" w:w="80"/>
-              <w:bottom w:type="dxa" w:w="50"/>
-              <w:right w:type="dxa" w:w="80"/>
-            </w:tcMar>
-            <w:vAlign w:val="center"/>
-          </w:tcPr>
-          <w:p>
-            <w:pPr>
-              <w:spacing w:after="0"/>
-              <w:jc w:val="left"/>
-            </w:pPr>
-            <w:r>
-              <w:rPr>
-                <w:rFonts w:ascii="Times New Roman" w:cs="Times New Roman" w:eastAsia="Times New Roman" w:hAnsi="Times New Roman"/>
-                <w:b w:val="false"/>
-                <w:bCs w:val="false"/>
-                <w:color w:val="000000"/>
-                <w:sz w:val="20"/>
-                <w:szCs w:val="20"/>
-              </w:rPr>
-              <w:t xml:space="preserve">Sun et al. (2022)</w:t>
-            </w:r>
-          </w:p>
-        </w:tc>
-        <w:tc>
-          <w:tcPr>
-            <w:tcW w:type="dxa" w:w="3459"/>
-            <w:tcBorders>
-              <w:top w:val="single" w:color="000000" w:sz="4"/>
-              <w:left w:val="single" w:color="000000" w:sz="4"/>
-              <w:bottom w:val="single" w:color="000000" w:sz="4"/>
-              <w:right w:val="single" w:color="000000" w:sz="4"/>
-            </w:tcBorders>
-            <w:tcMar>
-              <w:top w:type="dxa" w:w="50"/>
-              <w:left w:type="dxa" w:w="80"/>
-              <w:bottom w:type="dxa" w:w="50"/>
-              <w:right w:type="dxa" w:w="80"/>
-            </w:tcMar>
-            <w:vAlign w:val="center"/>
-          </w:tcPr>
-          <w:p>
-            <w:pPr>
-              <w:spacing w:after="0"/>
-              <w:jc w:val="left"/>
-            </w:pPr>
-            <w:r>
-              <w:rPr>
-                <w:rFonts w:ascii="Times New Roman" w:cs="Times New Roman" w:eastAsia="Times New Roman" w:hAnsi="Times New Roman"/>
-                <w:b w:val="false"/>
-                <w:bCs w:val="false"/>
-                <w:color w:val="000000"/>
-                <w:sz w:val="20"/>
-                <w:szCs w:val="20"/>
-              </w:rPr>
-              <w:t xml:space="preserve">AF from face video</w:t>
-            </w:r>
-          </w:p>
-        </w:tc>
-        <w:tc>
-          <w:tcPr>
-            <w:tcW w:type="dxa" w:w="3338"/>
-            <w:tcBorders>
-              <w:top w:val="single" w:color="000000" w:sz="4"/>
-              <w:left w:val="single" w:color="000000" w:sz="4"/>
-              <w:bottom w:val="single" w:color="000000" w:sz="4"/>
-              <w:right w:val="single" w:color="000000" w:sz="4"/>
-            </w:tcBorders>
-            <w:tcMar>
-              <w:top w:type="dxa" w:w="50"/>
-              <w:left w:type="dxa" w:w="80"/>
-              <w:bottom w:type="dxa" w:w="50"/>
-              <w:right w:type="dxa" w:w="80"/>
-            </w:tcMar>
-            <w:vAlign w:val="center"/>
-          </w:tcPr>
-          <w:p>
-            <w:pPr>
-              <w:spacing w:after="0"/>
-              <w:jc w:val="left"/>
-            </w:pPr>
-            <w:r>
-              <w:rPr>
-                <w:rFonts w:ascii="Times New Roman" w:cs="Times New Roman" w:eastAsia="Times New Roman" w:hAnsi="Times New Roman"/>
-                <w:b w:val="false"/>
-                <w:bCs w:val="false"/>
-                <w:color w:val="000000"/>
-                <w:sz w:val="20"/>
-                <w:szCs w:val="20"/>
-              </w:rPr>
-              <w:t xml:space="preserve">About 96% accuracy</w:t>
+              <w:t xml:space="preserve">96.0% accuracy (AF vs healthy); 95.2% (AF vs sinus rhythm)</w:t>
             </w:r>
           </w:p>
         </w:tc>
@@ -29049,7 +28939,7 @@
           <w:sz w:val="24"/>
           <w:szCs w:val="24"/>
         </w:rPr>
-        <w:t xml:space="preserve">The prompts below are listed in the order they were used, as typed (screenshots, interrupted duplicates and session-control messages are omitted).</w:t>
+        <w:t xml:space="preserve">The prompts below are listed in the order they were used. Their wording has been edited for clarity and grammar, and closely related follow-up questions are combined; the content of each request is unchanged.</w:t>
       </w:r>
     </w:p>
     <w:p>
@@ -29069,7 +28959,7 @@
           <w:sz w:val="24"/>
           <w:szCs w:val="24"/>
         </w:rPr>
-        <w:t xml:space="preserve">[attached: Review_2.pdf] this is a report of my project of machine vision. i want you to go through it and make an implementation plan for this project in phases.</w:t>
+        <w:t xml:space="preserve">Review the attached Review 2 report of our machine-vision project and prepare a phased implementation plan.</w:t>
       </w:r>
     </w:p>
     <w:p>
@@ -29089,7 +28979,7 @@
           <w:sz w:val="24"/>
           <w:szCs w:val="24"/>
         </w:rPr>
-        <w:t xml:space="preserve">start phase 0 and 1</w:t>
+        <w:t xml:space="preserve">Begin the implementation of Phases 0 and 1.</w:t>
       </w:r>
     </w:p>
     <w:p>
@@ -29109,7 +28999,7 @@
           <w:sz w:val="24"/>
           <w:szCs w:val="24"/>
         </w:rPr>
-        <w:t xml:space="preserve">currently i am on windows, so do according to that and run and show me if anything is built to be shown otherwise do whatever necessary and start with phase 2</w:t>
+        <w:t xml:space="preserve">Adapt the setup and scripts for Windows, run and demonstrate what has been built, and proceed with Phase 2.</w:t>
       </w:r>
     </w:p>
     <w:p>
@@ -29129,7 +29019,7 @@
           <w:sz w:val="24"/>
           <w:szCs w:val="24"/>
         </w:rPr>
-        <w:t xml:space="preserve">done, toolbox env works. what next?</w:t>
+        <w:t xml:space="preserve">The rPPG-Toolbox environment is now working. What is the next step?</w:t>
       </w:r>
     </w:p>
     <w:p>
@@ -29149,7 +29039,7 @@
           <w:sz w:val="24"/>
           <w:szCs w:val="24"/>
         </w:rPr>
-        <w:t xml:space="preserve">i have not added my video yet, what to do except that</w:t>
+        <w:t xml:space="preserve">We have not recorded our own face video yet. What can be done in the meantime?</w:t>
       </w:r>
     </w:p>
     <w:p>
@@ -29169,7 +29059,7 @@
           <w:sz w:val="24"/>
           <w:szCs w:val="24"/>
         </w:rPr>
-        <w:t xml:space="preserve">Can we add something to this project to make it a bit complex bcz now we are just using pre built approaches like classical and deep learning</w:t>
+        <w:t xml:space="preserve">Suggest an addition that would make the project more original, since it currently relies only on existing classical and deep-learning methods.</w:t>
       </w:r>
     </w:p>
     <w:p>
@@ -29189,7 +29079,7 @@
           <w:sz w:val="24"/>
           <w:szCs w:val="24"/>
         </w:rPr>
-        <w:t xml:space="preserve">The deep models are already built right and we just need datasets to get accuracy right?</w:t>
+        <w:t xml:space="preserve">Are the deep-learning models already trained, so that only the datasets are needed to measure their accuracy? The question is meant in general terms.</w:t>
       </w:r>
     </w:p>
     <w:p>
@@ -29209,7 +29099,7 @@
           <w:sz w:val="24"/>
           <w:szCs w:val="24"/>
         </w:rPr>
-        <w:t xml:space="preserve">No i was asking in general</w:t>
+        <w:t xml:space="preserve">Explain the proposed new method in simple language.</w:t>
       </w:r>
     </w:p>
     <w:p>
@@ -29229,7 +29119,7 @@
           <w:sz w:val="24"/>
           <w:szCs w:val="24"/>
         </w:rPr>
-        <w:t xml:space="preserve">Explain me more about the new methond to add and in simple language</w:t>
+        <w:t xml:space="preserve">Clarify the following: (1) What is the MMPD dataset? (2) What does the rhythm used in the trust score refer to? (3) Can MediaPipe identify shadowed regions so that they receive a low trust score? (4) How is the pulse produced in the proposed method, compared with POS, CHROM or PhysNet followed by an FFT?</w:t>
       </w:r>
     </w:p>
     <w:p>
@@ -29249,7 +29139,7 @@
           <w:sz w:val="24"/>
           <w:szCs w:val="24"/>
         </w:rPr>
-        <w:t xml:space="preserve">I have a few questions: 1. What is MMPD? 2. What do you mean by rhythm which helps with the trust score? 3. Can mediapipe find the areas in shadow and to be kept with low trust score? 4. And if you mean the pulse by the h rhythm then how is the pulse generated rated cause in other methods it was pos, chrom, physnet or smth else generating the pulse and then converted to frequency graph by fft, so how is it done here in this method?</w:t>
+        <w:t xml:space="preserve">Confirm my understanding: the project compares two existing approaches with one new method built from existing techniques.</w:t>
       </w:r>
     </w:p>
     <w:p>
@@ -29269,7 +29159,7 @@
           <w:sz w:val="24"/>
           <w:szCs w:val="24"/>
         </w:rPr>
-        <w:t xml:space="preserve">So basically we have three approaches two pre built and one new made from existing method which is then checked agaist the teo pre built methods?</w:t>
+        <w:t xml:space="preserve">Provide a block diagram of the system.</w:t>
       </w:r>
     </w:p>
     <w:p>
@@ -29289,7 +29179,7 @@
           <w:sz w:val="24"/>
           <w:szCs w:val="24"/>
         </w:rPr>
-        <w:t xml:space="preserve">give me the block diagram</w:t>
+        <w:t xml:space="preserve">Could we train our own neural network on the available datasets to replace POS, so that the core model is our own work?</w:t>
       </w:r>
     </w:p>
     <w:p>
@@ -29309,7 +29199,7 @@
           <w:sz w:val="24"/>
           <w:szCs w:val="24"/>
         </w:rPr>
-        <w:t xml:space="preserve">can we build a neural network using the datasets we have a d use tbat instead of pos? or sorthing like that, that seems to be built by us</w:t>
+        <w:t xml:space="preserve">Are existing deep networks such as PhysNet built on forehead and cheek regions, and on which datasets were they trained?</w:t>
       </w:r>
     </w:p>
     <w:p>
@@ -29329,7 +29219,7 @@
           <w:sz w:val="24"/>
           <w:szCs w:val="24"/>
         </w:rPr>
-        <w:t xml:space="preserve">the exisitng deep networks like physnet snd all are made using three patches of forehead and cheeks right? and on what dataset are these networks trained:</w:t>
+        <w:t xml:space="preserve">Since existing networks are large and difficult to outperform, we will keep the planned method of applying POS to about 25 facial patches. Do not implement it yet; this is a design discussion only.</w:t>
       </w:r>
     </w:p>
     <w:p>
@@ -29349,7 +29239,7 @@
           <w:sz w:val="24"/>
           <w:szCs w:val="24"/>
         </w:rPr>
-        <w:t xml:space="preserve">so thereis not much scope in building  a network cause we already have big netwroks and we cant beat them, so instead we stick with the one we planned before, the pos use over 25patches and all</w:t>
+        <w:t xml:space="preserve">Keep the agreement check, add it to the diagram, and write a context paragraph that can be used to generate the block diagram with an AI tool.</w:t>
       </w:r>
     </w:p>
     <w:p>
@@ -29369,7 +29259,7 @@
           <w:sz w:val="24"/>
           <w:szCs w:val="24"/>
         </w:rPr>
-        <w:t xml:space="preserve">dont build it yet i am just asking for now building will be done later</w:t>
+        <w:t xml:space="preserve">Show the handcrafted equations that classical methods use to obtain the pulse signal, and explain how they differ between methods.</w:t>
       </w:r>
     </w:p>
     <w:p>
@@ -29389,7 +29279,7 @@
           <w:sz w:val="24"/>
           <w:szCs w:val="24"/>
         </w:rPr>
-        <w:t xml:space="preserve">keep the agreement check and add it to the diagram and also give me a context paragraph that can help me generate a block diagram from ai agents</w:t>
+        <w:t xml:space="preserve">Explain how deep-learning models generate the pulse signal.</w:t>
       </w:r>
     </w:p>
     <w:p>
@@ -29409,7 +29299,7 @@
           <w:sz w:val="24"/>
           <w:szCs w:val="24"/>
         </w:rPr>
-        <w:t xml:space="preserve">in classic approach you said there are pre defined equations by humans to provide a signal pulse, can you show me how and i are they sane in each classic method: ?</w:t>
+        <w:t xml:space="preserve">Provide content for a presentation of at most five slides based on the finalised architecture diagram.</w:t>
       </w:r>
     </w:p>
     <w:p>
@@ -29429,7 +29319,7 @@
           <w:sz w:val="24"/>
           <w:szCs w:val="24"/>
         </w:rPr>
-        <w:t xml:space="preserve">explain how the deep learning models generate the pulse</w:t>
+        <w:t xml:space="preserve">Revise the plan without implementing it: show only the proposed architecture in the diagram; add a research-backed, real-world output derived from the predicted heart rate; and research whether thermal imaging could make the method more precise and more novel.</w:t>
       </w:r>
     </w:p>
     <w:p>
@@ -29449,7 +29339,7 @@
           <w:sz w:val="24"/>
           <w:szCs w:val="24"/>
         </w:rPr>
-        <w:t xml:space="preserve">i need to make a ppt of not more than 5 slides give me content for it and this is the finalized diagram</w:t>
+        <w:t xml:space="preserve">Summarise the proposal in a short paragraph.</w:t>
       </w:r>
     </w:p>
     <w:p>
@@ -29469,7 +29359,7 @@
           <w:sz w:val="24"/>
           <w:szCs w:val="24"/>
         </w:rPr>
-        <w:t xml:space="preserve">okay so i want you to forget the old implementation completely and set up our new implementation plan, not yet do it when i day until then let's just make the changes. So the changes are: 1. in architecture diagram, just show the proposed architecture not the already built ones. they can be used later for comparison in that arch. diagram, but there is not need for three different layers to be shown in architecture diagram which are not even ours. 2. our proposed model predicts the heart rate of some individual through any method, let's say we got the heart rate but there should be some real life use case for that heart rate after it is predicted, like it's predicting any disease or anything else but to be used in real life and whatever it is predicting, it should be research backed with research papers existing related to that, so find something to add as an output prediction that has some real life use case. 3. we are trying to make it unique, like the work that has not been done to the date, and our proposed architecture is good to be unique enough, but i have and idea how about we use thermal sense as well to get the facial region values or anything and help in our prediction be more precise cause this is the thing that might make it more unique,. Research on it and tell me how it can be used in our project/</w:t>
+        <w:t xml:space="preserve">Would users of the application need a separate thermal camera in addition to a normal camera?</w:t>
       </w:r>
     </w:p>
     <w:p>
@@ -29489,7 +29379,7 @@
           <w:sz w:val="24"/>
           <w:szCs w:val="24"/>
         </w:rPr>
-        <w:t xml:space="preserve">explain this in a small paragraph</w:t>
+        <w:t xml:space="preserve">Remove the thermal component from the project.</w:t>
       </w:r>
     </w:p>
     <w:p>
@@ -29509,7 +29399,7 @@
           <w:sz w:val="24"/>
           <w:szCs w:val="24"/>
         </w:rPr>
-        <w:t xml:space="preserve">so we would need an extra thermal cam. physical to use this application</w:t>
+        <w:t xml:space="preserve">Suggest a more clinically useful output than the stress level.</w:t>
       </w:r>
     </w:p>
     <w:p>
@@ -29529,7 +29419,7 @@
           <w:sz w:val="24"/>
           <w:szCs w:val="24"/>
         </w:rPr>
-        <w:t xml:space="preserve">i mean if a user has to use this application then they should have a normal cam and a thermal cam... right?</w:t>
+        <w:t xml:space="preserve">Update the plan with atrial fibrillation screening as the primary output and stress as a secondary output.</w:t>
       </w:r>
     </w:p>
     <w:p>
@@ -29549,7 +29439,7 @@
           <w:sz w:val="24"/>
           <w:szCs w:val="24"/>
         </w:rPr>
-        <w:t xml:space="preserve">remove the thermal part from this project</w:t>
+        <w:t xml:space="preserve">Generate the updated implementation plan.</w:t>
       </w:r>
     </w:p>
     <w:p>
@@ -29569,7 +29459,7 @@
           <w:sz w:val="24"/>
           <w:szCs w:val="24"/>
         </w:rPr>
-        <w:t xml:space="preserve">now, instead of stress level can something useful be estimated cause this one is just a basic thing..</w:t>
+        <w:t xml:space="preserve">Create a black-and-white architecture diagram and a prompt for generating it with an AI tool.</w:t>
       </w:r>
     </w:p>
     <w:p>
@@ -29589,7 +29479,7 @@
           <w:sz w:val="24"/>
           <w:szCs w:val="24"/>
         </w:rPr>
-        <w:t xml:space="preserve">yes update it, keep stress as secondary</w:t>
+        <w:t xml:space="preserve">Explain how the model detects atrial fibrillation or estimates stress from the heart rate.</w:t>
       </w:r>
     </w:p>
     <w:p>
@@ -29609,7 +29499,7 @@
           <w:sz w:val="24"/>
           <w:szCs w:val="24"/>
         </w:rPr>
-        <w:t xml:space="preserve">generate implementation plan</w:t>
+        <w:t xml:space="preserve">What are heart-rate variability and the LF/HF ratio, and how are they measured?</w:t>
       </w:r>
     </w:p>
     <w:p>
@@ -29629,7 +29519,7 @@
           <w:sz w:val="24"/>
           <w:szCs w:val="24"/>
         </w:rPr>
-        <w:t xml:space="preserve">generate a new arch. diagram with only black n whites and give a prompt as well to get the arch diag. generated</w:t>
+        <w:t xml:space="preserve">What is the normal range of heart-rate variability, and how was it established?</w:t>
       </w:r>
     </w:p>
     <w:p>
@@ -29649,7 +29539,7 @@
           <w:sz w:val="24"/>
           <w:szCs w:val="24"/>
         </w:rPr>
-        <w:t xml:space="preserve">Now explain me how does our model predict AF disease or stress level using the heart rate..</w:t>
+        <w:t xml:space="preserve">Explain atrial fibrillation in simple terms, how the model detects it, and what happens after it is detected.</w:t>
       </w:r>
     </w:p>
     <w:p>
@@ -29669,7 +29559,7 @@
           <w:sz w:val="24"/>
           <w:szCs w:val="24"/>
         </w:rPr>
-        <w:t xml:space="preserve">What are hrv and lf/hf ratio and how are they measured?</w:t>
+        <w:t xml:space="preserve">Are the beat-interval values used in the explanation supported by research?</w:t>
       </w:r>
     </w:p>
     <w:p>
@@ -29689,7 +29579,7 @@
           <w:sz w:val="24"/>
           <w:szCs w:val="24"/>
         </w:rPr>
-        <w:t xml:space="preserve">What is the normal hrv range and how is it know?</w:t>
+        <w:t xml:space="preserve">Can other medical conditions be detected from the predicted heartbeat?</w:t>
       </w:r>
     </w:p>
     <w:p>
@@ -29709,7 +29599,7 @@
           <w:sz w:val="24"/>
           <w:szCs w:val="24"/>
         </w:rPr>
-        <w:t xml:space="preserve">okay so explain me about this disease in short and easy language and how is it detected by our model and what is done after it is detected...</w:t>
+        <w:t xml:space="preserve">What do abnormally slow or fast heartbeats indicate?</w:t>
       </w:r>
     </w:p>
     <w:p>
@@ -29729,7 +29619,7 @@
           <w:sz w:val="24"/>
           <w:szCs w:val="24"/>
         </w:rPr>
-        <w:t xml:space="preserve">are the numbers of the rythm  gap researech backed</w:t>
+        <w:t xml:space="preserve">Make abnormal heart-rate flags the secondary output, keep atrial fibrillation as the primary output, and assess the feasibility.</w:t>
       </w:r>
     </w:p>
     <w:p>
@@ -29749,7 +29639,7 @@
           <w:sz w:val="24"/>
           <w:szCs w:val="24"/>
         </w:rPr>
-        <w:t xml:space="preserve">is there any other real life disease we can detect from our predicted heart beat or is it the only one</w:t>
+        <w:t xml:space="preserve">Explain the architecture in one paragraph, defining every technical term.</w:t>
       </w:r>
     </w:p>
     <w:p>
@@ -29769,7 +29659,7 @@
           <w:sz w:val="24"/>
           <w:szCs w:val="24"/>
         </w:rPr>
-        <w:t xml:space="preserve">so what does the abnromal heart beats mean like slopwm or fast beats than no0rmal</w:t>
+        <w:t xml:space="preserve">Answer the following design questions: (1) Can the face realistically be divided into 25 patches, or should the number be reduced? (2) How is the confidence of the weighted fusion computed? (3) How are the trust-score features computed? (4) How is motion removal performed? (5) Which of RMSSD, SDNN and LF/HF is most important for the project?</w:t>
       </w:r>
     </w:p>
     <w:p>
@@ -29789,7 +29679,7 @@
           <w:sz w:val="24"/>
           <w:szCs w:val="24"/>
         </w:rPr>
-        <w:t xml:space="preserve">okay keep this one as secondary feasature and astrial filltration ans primary and tell me whether this is feasuible</w:t>
+        <w:t xml:space="preserve">Update the implementation plan and create a simplified architecture diagram.</w:t>
       </w:r>
     </w:p>
     <w:p>
@@ -29809,7 +29699,7 @@
           <w:sz w:val="24"/>
           <w:szCs w:val="24"/>
         </w:rPr>
-        <w:t xml:space="preserve">explain this architecture in a small paragraph containing all the terms explanation</w:t>
+        <w:t xml:space="preserve">Remove the code of the earlier project from the repository and start implementing the new plan.</w:t>
       </w:r>
     </w:p>
     <w:p>
@@ -29829,7 +29719,7 @@
           <w:sz w:val="24"/>
           <w:szCs w:val="24"/>
         </w:rPr>
-        <w:t xml:space="preserve">1. can the face be really divided into 25 patches or we should lower this number. 2. How is the confidence of weighted fusion calculated. 3. How are the features of trust score calculated. 4. How is the motion removal done 5. from rmssd, sdnn, lf hf which is the most important to keep for our project</w:t>
+        <w:t xml:space="preserve">Generate the project report following the attached DA3 format, with all text in black.</w:t>
       </w:r>
     </w:p>
     <w:p>
@@ -29849,47 +29739,7 @@
           <w:sz w:val="24"/>
           <w:szCs w:val="24"/>
         </w:rPr>
-        <w:t xml:space="preserve">make the implementation plan and a simplified architecture diagram</w:t>
-      </w:r>
-    </w:p>
-    <w:p>
-      <w:pPr>
-        <w:pStyle w:val="ListParagraph"/>
-        <w:numPr>
-          <w:ilvl w:val="0"/>
-          <w:numId w:val="14"/>
-        </w:numPr>
-        <w:spacing w:after="80" w:line="300"/>
-        <w:jc w:val="both"/>
-      </w:pPr>
-      <w:r>
-        <w:rPr>
-          <w:rFonts w:ascii="Times New Roman" w:cs="Times New Roman" w:eastAsia="Times New Roman" w:hAnsi="Times New Roman"/>
-          <w:color w:val="000000"/>
-          <w:sz w:val="24"/>
-          <w:szCs w:val="24"/>
-        </w:rPr>
-        <w:t xml:space="preserve">clear the code of old built project from github and start with this new impolementation plan</w:t>
-      </w:r>
-    </w:p>
-    <w:p>
-      <w:pPr>
-        <w:pStyle w:val="ListParagraph"/>
-        <w:numPr>
-          <w:ilvl w:val="0"/>
-          <w:numId w:val="14"/>
-        </w:numPr>
-        <w:spacing w:after="80" w:line="300"/>
-        <w:jc w:val="both"/>
-      </w:pPr>
-      <w:r>
-        <w:rPr>
-          <w:rFonts w:ascii="Times New Roman" w:cs="Times New Roman" w:eastAsia="Times New Roman" w:hAnsi="Times New Roman"/>
-          <w:color w:val="000000"/>
-          <w:sz w:val="24"/>
-          <w:szCs w:val="24"/>
-        </w:rPr>
-        <w:t xml:space="preserve">[attached: DA3_Document_Format.docx] This is the format for the report of this project, generate a report for this project based on this format. Keep everything mentioned in document only and keep all the text black and white</w:t>
+        <w:t xml:space="preserve">Rewrite the prompts in professional language and verify that all information in the report is accurate and supported by research.</w:t>
       </w:r>
     </w:p>
     <w:p>
@@ -29921,7 +29771,7 @@
           <w:sz w:val="24"/>
           <w:szCs w:val="24"/>
         </w:rPr>
-        <w:t xml:space="preserve">The assistant's web searches used the following keywords:</w:t>
+        <w:t xml:space="preserve">The following keywords were used to search the literature, datasets and guidelines:</w:t>
       </w:r>
     </w:p>
     <w:p>
@@ -29941,7 +29791,7 @@
           <w:sz w:val="24"/>
           <w:szCs w:val="24"/>
         </w:rPr>
-        <w:t xml:space="preserve">iBVP dataset RGB thermal rPPG signal quality labels Joshi Cho 2024</w:t>
+        <w:t xml:space="preserve">remote photoplethysmography (rPPG); contactless heart rate from facial video</w:t>
       </w:r>
     </w:p>
     <w:p>
@@ -29961,7 +29811,7 @@
           <w:sz w:val="24"/>
           <w:szCs w:val="24"/>
         </w:rPr>
-        <w:t xml:space="preserve">contactless vital signs RGB thermal camera infection screening heart rate respiration temperature Negishi Sun Matsui</w:t>
+        <w:t xml:space="preserve">POS, CHROM, PBV and ICA rPPG methods; rPPG-Toolbox benchmark</w:t>
       </w:r>
     </w:p>
     <w:p>
@@ -29981,7 +29831,7 @@
           <w:sz w:val="24"/>
           <w:szCs w:val="24"/>
         </w:rPr>
-        <w:t xml:space="preserve">Instant Stress detection smartphone photoplethysmography thermal imaging Cho JMIR 2019 nose tip temperature</w:t>
+        <w:t xml:space="preserve">multi-region and patch-based rPPG; region weighting; DistancePPG; skin segmentation</w:t>
       </w:r>
     </w:p>
     <w:p>
@@ -30001,7 +29851,7 @@
           <w:sz w:val="24"/>
           <w:szCs w:val="24"/>
         </w:rPr>
-        <w:t xml:space="preserve">UBFC-Phys dataset multimodal stress remote photoplethysmography Meziati Sabour IEEE Transactions Affective Computing</w:t>
+        <w:t xml:space="preserve">rPPG head motion; face orientation; ballistocardiographic head motion</w:t>
       </w:r>
     </w:p>
     <w:p>
@@ -30021,7 +29871,7 @@
           <w:sz w:val="24"/>
           <w:szCs w:val="24"/>
         </w:rPr>
-        <w:t xml:space="preserve">stress and heart rate variability meta-analysis Kim 2018 Psychiatry Investigation</w:t>
+        <w:t xml:space="preserve">deep learning rPPG: DeepPhys, PhysNet, TS-CAN, PhysFormer</w:t>
       </w:r>
     </w:p>
     <w:p>
@@ -30041,7 +29891,7 @@
           <w:sz w:val="24"/>
           <w:szCs w:val="24"/>
         </w:rPr>
-        <w:t xml:space="preserve">thermal imaging nose tip temperature drop stress arousal Kosonogov 2017 PLOS One facial thermal variations</w:t>
+        <w:t xml:space="preserve">atrial fibrillation detection from facial video; smartphone photoplethysmography atrial fibrillation</w:t>
       </w:r>
     </w:p>
     <w:p>
@@ -30061,7 +29911,7 @@
           <w:sz w:val="24"/>
           <w:szCs w:val="24"/>
         </w:rPr>
-        <w:t xml:space="preserve">RGB thermal fusion remote photoplethysmography heart rate multi-region quality weighting respiration thermal nostril</w:t>
+        <w:t xml:space="preserve">atrial fibrillation RR-interval irregularity: RMSSD, Shannon entropy, turning-point ratio, Poincaré plot</w:t>
       </w:r>
     </w:p>
     <w:p>
@@ -30081,7 +29931,7 @@
           <w:sz w:val="24"/>
           <w:szCs w:val="24"/>
         </w:rPr>
-        <w:t xml:space="preserve">Ioannou thermal infrared imaging psychophysiology potentialities limits nose tip temperature decrease stress</w:t>
+        <w:t xml:space="preserve">premature atrial and ventricular contractions versus atrial fibrillation in PPG</w:t>
       </w:r>
     </w:p>
     <w:p>
@@ -30101,7 +29951,7 @@
           <w:sz w:val="24"/>
           <w:szCs w:val="24"/>
         </w:rPr>
-        <w:t xml:space="preserve">contactless mental stress detection fusion RGB rPPG heart rate variability and thermal facial temperature camera</w:t>
+        <w:t xml:space="preserve">PPG signal-quality index; PPG beat detection benchmark</w:t>
       </w:r>
     </w:p>
     <w:p>
@@ -30121,7 +29971,7 @@
           <w:sz w:val="24"/>
           <w:szCs w:val="24"/>
         </w:rPr>
-        <w:t xml:space="preserve">iBVP dataset protocol rhythmic breathing easy math difficult math head movement thermal camera resolution frame rate</w:t>
+        <w:t xml:space="preserve">respiratory rate from the photoplethysmogram</w:t>
       </w:r>
     </w:p>
     <w:p>
@@ -30141,7 +29991,7 @@
           <w:sz w:val="24"/>
           <w:szCs w:val="24"/>
         </w:rPr>
-        <w:t xml:space="preserve">"Your blush gives you away" remote photoplethysmography thermal imaging hidden mental states PeerJ 2024 method features</w:t>
+        <w:t xml:space="preserve">OBF database; MIMIC PERform AF; UBFC-rPPG; PURE; UBFC-Phys; COHFACE; MMPD; MIT-BIH Arrhythmia Database</w:t>
       </w:r>
     </w:p>
     <w:p>
@@ -30161,7 +30011,7 @@
           <w:sz w:val="24"/>
           <w:szCs w:val="24"/>
         </w:rPr>
-        <w:t xml:space="preserve">low cost thermal camera FLIR Lepton 3.5 resolution 160x120 frame rate 8.7 Hz radiometric USB PureThermal</w:t>
+        <w:t xml:space="preserve">atrial fibrillation prevalence, stroke risk and screening (USPSTF); bradycardia guideline</w:t>
       </w:r>
     </w:p>
     <w:p>
@@ -30181,7 +30031,7 @@
           <w:sz w:val="24"/>
           <w:szCs w:val="24"/>
         </w:rPr>
-        <w:t xml:space="preserve">contact-free atrial fibrillation detection facial video smartphone Yan 2018 JAHA sensitivity specificity</w:t>
+        <w:t xml:space="preserve">normal values of short-term heart-rate variability</w:t>
       </w:r>
     </w:p>
     <w:p>
@@ -30201,142 +30051,7 @@
           <w:sz w:val="24"/>
           <w:szCs w:val="24"/>
         </w:rPr>
-        <w:t xml:space="preserve">high-throughput contact-free detection of atrial fibrillation from video deep learning JAMA Cardiology 2020</w:t>
-      </w:r>
-    </w:p>
-    <w:p>
-      <w:pPr>
-        <w:pStyle w:val="ListParagraph"/>
-        <w:numPr>
-          <w:ilvl w:val="0"/>
-          <w:numId w:val="15"/>
-        </w:numPr>
-        <w:spacing w:after="80" w:line="300"/>
-        <w:jc w:val="both"/>
-      </w:pPr>
-      <w:r>
-        <w:rPr>
-          <w:rFonts w:ascii="Times New Roman" w:cs="Times New Roman" w:eastAsia="Times New Roman" w:hAnsi="Times New Roman"/>
-          <w:color w:val="000000"/>
-          <w:sz w:val="24"/>
-          <w:szCs w:val="24"/>
-        </w:rPr>
-        <w:t xml:space="preserve">MIMIC PERform AF dataset PPG ECG atrial fibrillation Charlton public</w:t>
-      </w:r>
-    </w:p>
-    <w:p>
-      <w:pPr>
-        <w:pStyle w:val="ListParagraph"/>
-        <w:numPr>
-          <w:ilvl w:val="0"/>
-          <w:numId w:val="15"/>
-        </w:numPr>
-        <w:spacing w:after="80" w:line="300"/>
-        <w:jc w:val="both"/>
-      </w:pPr>
-      <w:r>
-        <w:rPr>
-          <w:rFonts w:ascii="Times New Roman" w:cs="Times New Roman" w:eastAsia="Times New Roman" w:hAnsi="Times New Roman"/>
-          <w:color w:val="000000"/>
-          <w:sz w:val="24"/>
-          <w:szCs w:val="24"/>
-        </w:rPr>
-        <w:t xml:space="preserve">OBF database large face video database remote physiological signal measurement atrial fibrillation detection Li 2018 access</w:t>
-      </w:r>
-    </w:p>
-    <w:p>
-      <w:pPr>
-        <w:pStyle w:val="ListParagraph"/>
-        <w:numPr>
-          <w:ilvl w:val="0"/>
-          <w:numId w:val="15"/>
-        </w:numPr>
-        <w:spacing w:after="80" w:line="300"/>
-        <w:jc w:val="both"/>
-      </w:pPr>
-      <w:r>
-        <w:rPr>
-          <w:rFonts w:ascii="Times New Roman" w:cs="Times New Roman" w:eastAsia="Times New Roman" w:hAnsi="Times New Roman"/>
-          <w:color w:val="000000"/>
-          <w:sz w:val="24"/>
-          <w:szCs w:val="24"/>
-        </w:rPr>
-        <w:t xml:space="preserve">atrial fibrillation stroke risk asymptomatic undiagnosed screening importance prevalence guideline</w:t>
-      </w:r>
-    </w:p>
-    <w:p>
-      <w:pPr>
-        <w:pStyle w:val="ListParagraph"/>
-        <w:numPr>
-          <w:ilvl w:val="0"/>
-          <w:numId w:val="15"/>
-        </w:numPr>
-        <w:spacing w:after="80" w:line="300"/>
-        <w:jc w:val="both"/>
-      </w:pPr>
-      <w:r>
-        <w:rPr>
-          <w:rFonts w:ascii="Times New Roman" w:cs="Times New Roman" w:eastAsia="Times New Roman" w:hAnsi="Times New Roman"/>
-          <w:color w:val="000000"/>
-          <w:sz w:val="24"/>
-          <w:szCs w:val="24"/>
-        </w:rPr>
-        <w:t xml:space="preserve">Dash 2009 automatic real time detection of atrial fibrillation RMSSD turning point ratio Shannon entropy thresholds</w:t>
-      </w:r>
-    </w:p>
-    <w:p>
-      <w:pPr>
-        <w:pStyle w:val="ListParagraph"/>
-        <w:numPr>
-          <w:ilvl w:val="0"/>
-          <w:numId w:val="15"/>
-        </w:numPr>
-        <w:spacing w:after="80" w:line="300"/>
-        <w:jc w:val="both"/>
-      </w:pPr>
-      <w:r>
-        <w:rPr>
-          <w:rFonts w:ascii="Times New Roman" w:cs="Times New Roman" w:eastAsia="Times New Roman" w:hAnsi="Times New Roman"/>
-          <w:color w:val="000000"/>
-          <w:sz w:val="24"/>
-          <w:szCs w:val="24"/>
-        </w:rPr>
-        <w:t xml:space="preserve">atrial fibrillation RR interval irregularity successive difference coefficient of variation threshold normal sinus rhythm vs AF</w:t>
-      </w:r>
-    </w:p>
-    <w:p>
-      <w:pPr>
-        <w:pStyle w:val="ListParagraph"/>
-        <w:numPr>
-          <w:ilvl w:val="0"/>
-          <w:numId w:val="15"/>
-        </w:numPr>
-        <w:spacing w:after="80" w:line="300"/>
-        <w:jc w:val="both"/>
-      </w:pPr>
-      <w:r>
-        <w:rPr>
-          <w:rFonts w:ascii="Times New Roman" w:cs="Times New Roman" w:eastAsia="Times New Roman" w:hAnsi="Times New Roman"/>
-          <w:color w:val="000000"/>
-          <w:sz w:val="24"/>
-          <w:szCs w:val="24"/>
-        </w:rPr>
-        <w:t xml:space="preserve">McManus 2013 smartphone atrial fibrillation detection RMSSD Shannon entropy sample entropy pulsatile time series Heart Rhythm sensitivity specificity</w:t>
-      </w:r>
-    </w:p>
-    <w:p>
-      <w:pPr>
-        <w:spacing w:after="120" w:before="0" w:line="300"/>
-        <w:jc w:val="left"/>
-      </w:pPr>
-      <w:r>
-        <w:rPr>
-          <w:rFonts w:ascii="Times New Roman" w:cs="Times New Roman" w:eastAsia="Times New Roman" w:hAnsi="Times New Roman"/>
-          <w:color w:val="000000"/>
-          <w:sz w:val="24"/>
-          <w:szCs w:val="24"/>
-        </w:rPr>
-        <w:t xml:space="preserve">Pages opened during the research: https://www.mdpi.com/2079-9292/13/7/1334; https://www.preprints.org/manuscript/202402.0504; https://peerj.com/articles/cs-1912/; https://biosignal.uconn.edu/wp-content/uploads/sites/2503/2018/09/10_Dash_2009_AnnalsBME.pdf.</w:t>
+        <w:t xml:space="preserve">RGB and thermal imaging for stress detection (explored and not adopted)</w:t>
       </w:r>
     </w:p>
     <w:p>
@@ -30384,7 +30099,7 @@
           <w:sz w:val="24"/>
           <w:szCs w:val="24"/>
         </w:rPr>
-        <w:t xml:space="preserve"> every numerical result in this report was produced by running the project code; literature facts were checked against the papers' abstracts or search results, and published numbers are cited to their sources.</w:t>
+        <w:t xml:space="preserve"> every numerical result in this report was produced by running the project code. Every published fact and number was checked against the paper's abstract, publisher record or an indexed summary, and statements that could not be confirmed were removed.</w:t>
       </w:r>
     </w:p>
     <w:p>
@@ -30526,7 +30241,7 @@
         </w:rPr>
         <w:t xml:space="preserve"> </w:t>
       </w:r>
-      <w:hyperlink w:history="1" r:id="rIdha0mapletj6ummj6dff04">
+      <w:hyperlink w:history="1" r:id="rIdjv9qwjsg3xjeh9ow5i_in">
         <w:r>
           <w:rPr>
             <w:rFonts w:ascii="Times New Roman" w:cs="Times New Roman" w:eastAsia="Times New Roman" w:hAnsi="Times New Roman"/>
@@ -30581,7 +30296,7 @@
         </w:rPr>
         <w:t xml:space="preserve"> </w:t>
       </w:r>
-      <w:hyperlink w:history="1" r:id="rId-2evbr0kadl7iyyen5kaz">
+      <w:hyperlink w:history="1" r:id="rIdxnbfhlwfhkhw59xuyhrb9">
         <w:r>
           <w:rPr>
             <w:rFonts w:ascii="Times New Roman" w:cs="Times New Roman" w:eastAsia="Times New Roman" w:hAnsi="Times New Roman"/>
@@ -30628,6 +30343,25 @@
         </w:rPr>
         <w:t xml:space="preserve">(3), 815–824.</w:t>
       </w:r>
+      <w:r>
+        <w:rPr>
+          <w:rFonts w:ascii="Times New Roman" w:cs="Times New Roman" w:eastAsia="Times New Roman" w:hAnsi="Times New Roman"/>
+          <w:sz w:val="24"/>
+          <w:szCs w:val="24"/>
+        </w:rPr>
+        <w:t xml:space="preserve"> </w:t>
+      </w:r>
+      <w:hyperlink w:history="1" r:id="rIdppeie0ka_2nrzd_ok9j_r">
+        <w:r>
+          <w:rPr>
+            <w:rFonts w:ascii="Times New Roman" w:cs="Times New Roman" w:eastAsia="Times New Roman" w:hAnsi="Times New Roman"/>
+            <w:color w:val="000000"/>
+            <w:sz w:val="24"/>
+            <w:szCs w:val="24"/>
+          </w:rPr>
+          <w:t xml:space="preserve">https://doi.org/10.1109/JBHI.2015.2418195</w:t>
+        </w:r>
+      </w:hyperlink>
     </w:p>
     <w:p>
       <w:pPr>
@@ -30672,7 +30406,7 @@
         </w:rPr>
         <w:t xml:space="preserve"> </w:t>
       </w:r>
-      <w:hyperlink w:history="1" r:id="rIdjupyrqwtiakbm9b-dsvdv">
+      <w:hyperlink w:history="1" r:id="rIdqrsxlv-jbeki9oegledbl">
         <w:r>
           <w:rPr>
             <w:rFonts w:ascii="Times New Roman" w:cs="Times New Roman" w:eastAsia="Times New Roman" w:hAnsi="Times New Roman"/>
@@ -30727,7 +30461,7 @@
         </w:rPr>
         <w:t xml:space="preserve"> </w:t>
       </w:r>
-      <w:hyperlink w:history="1" r:id="rIdlxlo3j7c7lmgrgd3qvejn">
+      <w:hyperlink w:history="1" r:id="rId5cj2z0rb9yg3pa4j9oifo">
         <w:r>
           <w:rPr>
             <w:rFonts w:ascii="Times New Roman" w:cs="Times New Roman" w:eastAsia="Times New Roman" w:hAnsi="Times New Roman"/>
@@ -30782,7 +30516,7 @@
         </w:rPr>
         <w:t xml:space="preserve"> </w:t>
       </w:r>
-      <w:hyperlink w:history="1" r:id="rIdfvi1d7qbviwlpdkprbswr">
+      <w:hyperlink w:history="1" r:id="rIdcnhoe7kvkshzgwsllgaer">
         <w:r>
           <w:rPr>
             <w:rFonts w:ascii="Times New Roman" w:cs="Times New Roman" w:eastAsia="Times New Roman" w:hAnsi="Times New Roman"/>
@@ -30837,7 +30571,7 @@
         </w:rPr>
         <w:t xml:space="preserve"> </w:t>
       </w:r>
-      <w:hyperlink w:history="1" r:id="rIdhozjitqn9fy6xferp9rvn">
+      <w:hyperlink w:history="1" r:id="rIdiweyfo0hmf9f_mx-c9prw">
         <w:r>
           <w:rPr>
             <w:rFonts w:ascii="Times New Roman" w:cs="Times New Roman" w:eastAsia="Times New Roman" w:hAnsi="Times New Roman"/>
@@ -30892,7 +30626,7 @@
         </w:rPr>
         <w:t xml:space="preserve"> </w:t>
       </w:r>
-      <w:hyperlink w:history="1" r:id="rIdjbsdgojkes4jyaleir-6r">
+      <w:hyperlink w:history="1" r:id="rIdbuhk_hgsbfiivmjz0q_qb">
         <w:r>
           <w:rPr>
             <w:rFonts w:ascii="Times New Roman" w:cs="Times New Roman" w:eastAsia="Times New Roman" w:hAnsi="Times New Roman"/>
@@ -30939,6 +30673,25 @@
         </w:rPr>
         <w:t xml:space="preserve">(8), e382–e482.</w:t>
       </w:r>
+      <w:r>
+        <w:rPr>
+          <w:rFonts w:ascii="Times New Roman" w:cs="Times New Roman" w:eastAsia="Times New Roman" w:hAnsi="Times New Roman"/>
+          <w:sz w:val="24"/>
+          <w:szCs w:val="24"/>
+        </w:rPr>
+        <w:t xml:space="preserve"> </w:t>
+      </w:r>
+      <w:hyperlink w:history="1" r:id="rId7zv_vtaq534hqxcx7j5je">
+        <w:r>
+          <w:rPr>
+            <w:rFonts w:ascii="Times New Roman" w:cs="Times New Roman" w:eastAsia="Times New Roman" w:hAnsi="Times New Roman"/>
+            <w:color w:val="000000"/>
+            <w:sz w:val="24"/>
+            <w:szCs w:val="24"/>
+          </w:rPr>
+          <w:t xml:space="preserve">https://doi.org/10.1161/CIR.0000000000000628</w:t>
+        </w:r>
+      </w:hyperlink>
     </w:p>
     <w:p>
       <w:pPr>
@@ -30983,7 +30736,7 @@
         </w:rPr>
         <w:t xml:space="preserve"> </w:t>
       </w:r>
-      <w:hyperlink w:history="1" r:id="rIdw-xv0nmjda8schgae5ydy">
+      <w:hyperlink w:history="1" r:id="rIdgjpc3cxm9meoxf_lvkxjg">
         <w:r>
           <w:rPr>
             <w:rFonts w:ascii="Times New Roman" w:cs="Times New Roman" w:eastAsia="Times New Roman" w:hAnsi="Times New Roman"/>
@@ -31038,7 +30791,7 @@
         </w:rPr>
         <w:t xml:space="preserve"> </w:t>
       </w:r>
-      <w:hyperlink w:history="1" r:id="rIdf9jvvincys-41eadj6iuh">
+      <w:hyperlink w:history="1" r:id="rId0mwrfuzc07khkyenrz8bc">
         <w:r>
           <w:rPr>
             <w:rFonts w:ascii="Times New Roman" w:cs="Times New Roman" w:eastAsia="Times New Roman" w:hAnsi="Times New Roman"/>
@@ -31093,7 +30846,7 @@
         </w:rPr>
         <w:t xml:space="preserve"> </w:t>
       </w:r>
-      <w:hyperlink w:history="1" r:id="rIdvv4swbeegkdghuo1kjjyo">
+      <w:hyperlink w:history="1" r:id="rIdgjntl08gmvhug8d5psnej">
         <w:r>
           <w:rPr>
             <w:rFonts w:ascii="Times New Roman" w:cs="Times New Roman" w:eastAsia="Times New Roman" w:hAnsi="Times New Roman"/>
@@ -31148,7 +30901,7 @@
         </w:rPr>
         <w:t xml:space="preserve"> </w:t>
       </w:r>
-      <w:hyperlink w:history="1" r:id="rIdihwnjpex8ta-4y-eoihxi">
+      <w:hyperlink w:history="1" r:id="rIdx7euxms25j1jfwoyzk7w1">
         <w:r>
           <w:rPr>
             <w:rFonts w:ascii="Times New Roman" w:cs="Times New Roman" w:eastAsia="Times New Roman" w:hAnsi="Times New Roman"/>
@@ -31203,7 +30956,7 @@
         </w:rPr>
         <w:t xml:space="preserve"> </w:t>
       </w:r>
-      <w:hyperlink w:history="1" r:id="rIdbnn0rstp-at17gsbsfs_9">
+      <w:hyperlink w:history="1" r:id="rIduf4vifamovddflinicfmu">
         <w:r>
           <w:rPr>
             <w:rFonts w:ascii="Times New Roman" w:cs="Times New Roman" w:eastAsia="Times New Roman" w:hAnsi="Times New Roman"/>
@@ -31239,16 +30992,16 @@
           <w:sz w:val="24"/>
           <w:szCs w:val="24"/>
         </w:rPr>
-        <w:t xml:space="preserve">IEEE Journal of Biomedical and Health Informatics</w:t>
-      </w:r>
-      <w:r>
-        <w:rPr>
-          <w:rFonts w:ascii="Times New Roman" w:cs="Times New Roman" w:eastAsia="Times New Roman" w:hAnsi="Times New Roman"/>
-          <w:color w:val="000000"/>
-          <w:sz w:val="24"/>
-          <w:szCs w:val="24"/>
-        </w:rPr>
-        <w:t xml:space="preserve">. arXiv:2110.07610.</w:t>
+        <w:t xml:space="preserve">IEEE Journal of Biomedical and Health Informatics, 26</w:t>
+      </w:r>
+      <w:r>
+        <w:rPr>
+          <w:rFonts w:ascii="Times New Roman" w:cs="Times New Roman" w:eastAsia="Times New Roman" w:hAnsi="Times New Roman"/>
+          <w:color w:val="000000"/>
+          <w:sz w:val="24"/>
+          <w:szCs w:val="24"/>
+        </w:rPr>
+        <w:t xml:space="preserve">(9), 4587–4598.</w:t>
       </w:r>
       <w:r>
         <w:rPr>
@@ -31258,7 +31011,7 @@
         </w:rPr>
         <w:t xml:space="preserve"> </w:t>
       </w:r>
-      <w:hyperlink w:history="1" r:id="rIdtq34_7lsahobotpbxtwq2">
+      <w:hyperlink w:history="1" r:id="rIdnsifltb4xmf-nnllq38uy">
         <w:r>
           <w:rPr>
             <w:rFonts w:ascii="Times New Roman" w:cs="Times New Roman" w:eastAsia="Times New Roman" w:hAnsi="Times New Roman"/>
@@ -31266,7 +31019,7 @@
             <w:sz w:val="24"/>
             <w:szCs w:val="24"/>
           </w:rPr>
-          <w:t xml:space="preserve">https://arxiv.org/abs/2110.07610</w:t>
+          <w:t xml:space="preserve">https://doi.org/10.1109/JBHI.2022.3193117</w:t>
         </w:r>
       </w:hyperlink>
     </w:p>
@@ -31313,7 +31066,7 @@
         </w:rPr>
         <w:t xml:space="preserve"> </w:t>
       </w:r>
-      <w:hyperlink w:history="1" r:id="rIdtmbkpfcegoylybye7bgw4">
+      <w:hyperlink w:history="1" r:id="rIdgufemsasn4t94hycbta-8">
         <w:r>
           <w:rPr>
             <w:rFonts w:ascii="Times New Roman" w:cs="Times New Roman" w:eastAsia="Times New Roman" w:hAnsi="Times New Roman"/>
@@ -31368,7 +31121,7 @@
         </w:rPr>
         <w:t xml:space="preserve"> </w:t>
       </w:r>
-      <w:hyperlink w:history="1" r:id="rId7xathl7vu2kewzumqdoyh">
+      <w:hyperlink w:history="1" r:id="rIdcvxotevpfy4r3ixm3plkk">
         <w:r>
           <w:rPr>
             <w:rFonts w:ascii="Times New Roman" w:cs="Times New Roman" w:eastAsia="Times New Roman" w:hAnsi="Times New Roman"/>
@@ -31423,7 +31176,7 @@
         </w:rPr>
         <w:t xml:space="preserve"> </w:t>
       </w:r>
-      <w:hyperlink w:history="1" r:id="rId-1h4rroucgt0ynzhfccry">
+      <w:hyperlink w:history="1" r:id="rIddj14gomuf39cf_fugivvx">
         <w:r>
           <w:rPr>
             <w:rFonts w:ascii="Times New Roman" w:cs="Times New Roman" w:eastAsia="Times New Roman" w:hAnsi="Times New Roman"/>
@@ -31478,7 +31231,7 @@
         </w:rPr>
         <w:t xml:space="preserve"> </w:t>
       </w:r>
-      <w:hyperlink w:history="1" r:id="rIdif3c9lxyuu0flyxci0ijk">
+      <w:hyperlink w:history="1" r:id="rIdb1yli9lstoi8a1ae1iz4l">
         <w:r>
           <w:rPr>
             <w:rFonts w:ascii="Times New Roman" w:cs="Times New Roman" w:eastAsia="Times New Roman" w:hAnsi="Times New Roman"/>
@@ -31533,7 +31286,7 @@
         </w:rPr>
         <w:t xml:space="preserve"> </w:t>
       </w:r>
-      <w:hyperlink w:history="1" r:id="rId7gqr_4vwmylqb0dmbbrwa">
+      <w:hyperlink w:history="1" r:id="rIdc9p_tjqwd5ex-l3wddgvf">
         <w:r>
           <w:rPr>
             <w:rFonts w:ascii="Times New Roman" w:cs="Times New Roman" w:eastAsia="Times New Roman" w:hAnsi="Times New Roman"/>
@@ -31588,7 +31341,7 @@
         </w:rPr>
         <w:t xml:space="preserve"> </w:t>
       </w:r>
-      <w:hyperlink w:history="1" r:id="rIdyo6z7lninzbjzdebv_ryf">
+      <w:hyperlink w:history="1" r:id="rIdzex1p3tv852um6nkjisuk">
         <w:r>
           <w:rPr>
             <w:rFonts w:ascii="Times New Roman" w:cs="Times New Roman" w:eastAsia="Times New Roman" w:hAnsi="Times New Roman"/>
@@ -31643,7 +31396,7 @@
         </w:rPr>
         <w:t xml:space="preserve"> </w:t>
       </w:r>
-      <w:hyperlink w:history="1" r:id="rIdlgy4o8o2jws2qz1wwrj6k">
+      <w:hyperlink w:history="1" r:id="rIdqjgo-htckmyhi9peaudqt">
         <w:r>
           <w:rPr>
             <w:rFonts w:ascii="Times New Roman" w:cs="Times New Roman" w:eastAsia="Times New Roman" w:hAnsi="Times New Roman"/>
@@ -31698,7 +31451,7 @@
         </w:rPr>
         <w:t xml:space="preserve"> </w:t>
       </w:r>
-      <w:hyperlink w:history="1" r:id="rIdih3izyi-q75ktplmqfbv-">
+      <w:hyperlink w:history="1" r:id="rIdfo4dhvvh7vlpts5_5t5yw">
         <w:r>
           <w:rPr>
             <w:rFonts w:ascii="Times New Roman" w:cs="Times New Roman" w:eastAsia="Times New Roman" w:hAnsi="Times New Roman"/>
@@ -31723,7 +31476,7 @@
           <w:sz w:val="24"/>
           <w:szCs w:val="24"/>
         </w:rPr>
-        <w:t xml:space="preserve">Yan, B. P., Lai, W. H. S., Chan, C. K. Y., et al. (2020). High-throughput, contact-free detection of atrial fibrillation from video with deep learning. </w:t>
+        <w:t xml:space="preserve">Yan, B. P., Lai, W. H. S., Chan, C. K. Y., Au, A. C. K., Freedman, B., Poh, Y. C., &amp; Poh, M.-Z. (2020). High-throughput, contact-free detection of atrial fibrillation from video with deep learning. </w:t>
       </w:r>
       <w:r>
         <w:rPr>
@@ -31753,7 +31506,7 @@
         </w:rPr>
         <w:t xml:space="preserve"> </w:t>
       </w:r>
-      <w:hyperlink w:history="1" r:id="rId2idlw1p0g03cyfog2jw71">
+      <w:hyperlink w:history="1" r:id="rIdwviktasw4qc5kgdirxail">
         <w:r>
           <w:rPr>
             <w:rFonts w:ascii="Times New Roman" w:cs="Times New Roman" w:eastAsia="Times New Roman" w:hAnsi="Times New Roman"/>
@@ -31825,7 +31578,7 @@
         </w:rPr>
         <w:t xml:space="preserve"> </w:t>
       </w:r>
-      <w:hyperlink w:history="1" r:id="rId6lcbnwocmqhagk3c84que">
+      <w:hyperlink w:history="1" r:id="rIdq9dff5n7kvtn8ixmvwp2p">
         <w:r>
           <w:rPr>
             <w:rFonts w:ascii="Times New Roman" w:cs="Times New Roman" w:eastAsia="Times New Roman" w:hAnsi="Times New Roman"/>
@@ -31870,8 +31623,27 @@
           <w:sz w:val="24"/>
           <w:szCs w:val="24"/>
         </w:rPr>
-        <w:t xml:space="preserve">.</w:t>
-      </w:r>
+        <w:t xml:space="preserve">, 354–363.</w:t>
+      </w:r>
+      <w:r>
+        <w:rPr>
+          <w:rFonts w:ascii="Times New Roman" w:cs="Times New Roman" w:eastAsia="Times New Roman" w:hAnsi="Times New Roman"/>
+          <w:sz w:val="24"/>
+          <w:szCs w:val="24"/>
+        </w:rPr>
+        <w:t xml:space="preserve"> </w:t>
+      </w:r>
+      <w:hyperlink w:history="1" r:id="rId3q8ifii1ye-_fmj0u8bk8">
+        <w:r>
+          <w:rPr>
+            <w:rFonts w:ascii="Times New Roman" w:cs="Times New Roman" w:eastAsia="Times New Roman" w:hAnsi="Times New Roman"/>
+            <w:color w:val="000000"/>
+            <w:sz w:val="24"/>
+            <w:szCs w:val="24"/>
+          </w:rPr>
+          <w:t xml:space="preserve">https://doi.org/10.1109/CVPRW63382.2024.00040</w:t>
+        </w:r>
+      </w:hyperlink>
     </w:p>
     <w:p>
       <w:pPr>
@@ -31906,8 +31678,27 @@
           <w:sz w:val="24"/>
           <w:szCs w:val="24"/>
         </w:rPr>
-        <w:t xml:space="preserve">, 349–365.</w:t>
-      </w:r>
+        <w:t xml:space="preserve">.</w:t>
+      </w:r>
+      <w:r>
+        <w:rPr>
+          <w:rFonts w:ascii="Times New Roman" w:cs="Times New Roman" w:eastAsia="Times New Roman" w:hAnsi="Times New Roman"/>
+          <w:sz w:val="24"/>
+          <w:szCs w:val="24"/>
+        </w:rPr>
+        <w:t xml:space="preserve"> </w:t>
+      </w:r>
+      <w:hyperlink w:history="1" r:id="rId0vy6mjscsj8b_g311xxg3">
+        <w:r>
+          <w:rPr>
+            <w:rFonts w:ascii="Times New Roman" w:cs="Times New Roman" w:eastAsia="Times New Roman" w:hAnsi="Times New Roman"/>
+            <w:color w:val="000000"/>
+            <w:sz w:val="24"/>
+            <w:szCs w:val="24"/>
+          </w:rPr>
+          <w:t xml:space="preserve">https://arxiv.org/abs/1805.07888</w:t>
+        </w:r>
+      </w:hyperlink>
     </w:p>
     <w:p>
       <w:pPr>
@@ -31952,7 +31743,7 @@
         </w:rPr>
         <w:t xml:space="preserve"> </w:t>
       </w:r>
-      <w:hyperlink w:history="1" r:id="rId9j7k3hjm4citwrkscpdn3">
+      <w:hyperlink w:history="1" r:id="rIdz0mlyrwnkz2vn256l1dlr">
         <w:r>
           <w:rPr>
             <w:rFonts w:ascii="Times New Roman" w:cs="Times New Roman" w:eastAsia="Times New Roman" w:hAnsi="Times New Roman"/>
@@ -31999,6 +31790,25 @@
         </w:rPr>
         <w:t xml:space="preserve">, 3640–3648.</w:t>
       </w:r>
+      <w:r>
+        <w:rPr>
+          <w:rFonts w:ascii="Times New Roman" w:cs="Times New Roman" w:eastAsia="Times New Roman" w:hAnsi="Times New Roman"/>
+          <w:sz w:val="24"/>
+          <w:szCs w:val="24"/>
+        </w:rPr>
+        <w:t xml:space="preserve"> </w:t>
+      </w:r>
+      <w:hyperlink w:history="1" r:id="rIdwlqvaojm7yzoau2ju1_xc">
+        <w:r>
+          <w:rPr>
+            <w:rFonts w:ascii="Times New Roman" w:cs="Times New Roman" w:eastAsia="Times New Roman" w:hAnsi="Times New Roman"/>
+            <w:color w:val="000000"/>
+            <w:sz w:val="24"/>
+            <w:szCs w:val="24"/>
+          </w:rPr>
+          <w:t xml:space="preserve">https://doi.org/10.1109/ICCV.2015.415</w:t>
+        </w:r>
+      </w:hyperlink>
     </w:p>
     <w:p>
       <w:pPr>
@@ -32035,6 +31845,25 @@
         </w:rPr>
         <w:t xml:space="preserve">, 242–249.</w:t>
       </w:r>
+      <w:r>
+        <w:rPr>
+          <w:rFonts w:ascii="Times New Roman" w:cs="Times New Roman" w:eastAsia="Times New Roman" w:hAnsi="Times New Roman"/>
+          <w:sz w:val="24"/>
+          <w:szCs w:val="24"/>
+        </w:rPr>
+        <w:t xml:space="preserve"> </w:t>
+      </w:r>
+      <w:hyperlink w:history="1" r:id="rIdunczvt5ffietl1qludiee">
+        <w:r>
+          <w:rPr>
+            <w:rFonts w:ascii="Times New Roman" w:cs="Times New Roman" w:eastAsia="Times New Roman" w:hAnsi="Times New Roman"/>
+            <w:color w:val="000000"/>
+            <w:sz w:val="24"/>
+            <w:szCs w:val="24"/>
+          </w:rPr>
+          <w:t xml:space="preserve">https://doi.org/10.1109/FG.2018.00043</w:t>
+        </w:r>
+      </w:hyperlink>
     </w:p>
     <w:p>
       <w:pPr>
@@ -32069,7 +31898,7 @@
           <w:sz w:val="24"/>
           <w:szCs w:val="24"/>
         </w:rPr>
-        <w:t xml:space="preserve">, 19400–19411.</w:t>
+        <w:t xml:space="preserve">.</w:t>
       </w:r>
       <w:r>
         <w:rPr>
@@ -32079,7 +31908,7 @@
         </w:rPr>
         <w:t xml:space="preserve"> </w:t>
       </w:r>
-      <w:hyperlink w:history="1" r:id="rIdblvi2rvvgpx-tu8kva1pj">
+      <w:hyperlink w:history="1" r:id="rIdkelvsmcg3ngifg7m2wlk5">
         <w:r>
           <w:rPr>
             <w:rFonts w:ascii="Times New Roman" w:cs="Times New Roman" w:eastAsia="Times New Roman" w:hAnsi="Times New Roman"/>
@@ -32115,16 +31944,16 @@
           <w:sz w:val="24"/>
           <w:szCs w:val="24"/>
         </w:rPr>
-        <w:t xml:space="preserve">Advances in Neural Information Processing Systems (Datasets and Benchmarks Track)</w:t>
-      </w:r>
-      <w:r>
-        <w:rPr>
-          <w:rFonts w:ascii="Times New Roman" w:cs="Times New Roman" w:eastAsia="Times New Roman" w:hAnsi="Times New Roman"/>
-          <w:color w:val="000000"/>
-          <w:sz w:val="24"/>
-          <w:szCs w:val="24"/>
-        </w:rPr>
-        <w:t xml:space="preserve">.</w:t>
+        <w:t xml:space="preserve">Advances in Neural Information Processing Systems, 36</w:t>
+      </w:r>
+      <w:r>
+        <w:rPr>
+          <w:rFonts w:ascii="Times New Roman" w:cs="Times New Roman" w:eastAsia="Times New Roman" w:hAnsi="Times New Roman"/>
+          <w:color w:val="000000"/>
+          <w:sz w:val="24"/>
+          <w:szCs w:val="24"/>
+        </w:rPr>
+        <w:t xml:space="preserve"> (Datasets and Benchmarks Track).</w:t>
       </w:r>
       <w:r>
         <w:rPr>
@@ -32134,7 +31963,7 @@
         </w:rPr>
         <w:t xml:space="preserve"> </w:t>
       </w:r>
-      <w:hyperlink w:history="1" r:id="rIdxr9v1w9mub4xjq3ucsqrj">
+      <w:hyperlink w:history="1" r:id="rId0h7xhbqox5etgoqqaufb6">
         <w:r>
           <w:rPr>
             <w:rFonts w:ascii="Times New Roman" w:cs="Times New Roman" w:eastAsia="Times New Roman" w:hAnsi="Times New Roman"/>
@@ -32159,6 +31988,61 @@
           <w:sz w:val="24"/>
           <w:szCs w:val="24"/>
         </w:rPr>
+        <w:t xml:space="preserve">Paruchuri, A., Liu, X., Pan, Y., Patel, S., McDuff, D., &amp; Sengupta, S. (2024). Motion matters: Neural motion transfer for better camera physiological measurement. </w:t>
+      </w:r>
+      <w:r>
+        <w:rPr>
+          <w:rFonts w:ascii="Times New Roman" w:cs="Times New Roman" w:eastAsia="Times New Roman" w:hAnsi="Times New Roman"/>
+          <w:i/>
+          <w:iCs/>
+          <w:color w:val="000000"/>
+          <w:sz w:val="24"/>
+          <w:szCs w:val="24"/>
+        </w:rPr>
+        <w:t xml:space="preserve">Proceedings of the IEEE/CVF Winter Conference on Applications of Computer Vision (WACV)</w:t>
+      </w:r>
+      <w:r>
+        <w:rPr>
+          <w:rFonts w:ascii="Times New Roman" w:cs="Times New Roman" w:eastAsia="Times New Roman" w:hAnsi="Times New Roman"/>
+          <w:color w:val="000000"/>
+          <w:sz w:val="24"/>
+          <w:szCs w:val="24"/>
+        </w:rPr>
+        <w:t xml:space="preserve">, 5933–5942.</w:t>
+      </w:r>
+      <w:r>
+        <w:rPr>
+          <w:rFonts w:ascii="Times New Roman" w:cs="Times New Roman" w:eastAsia="Times New Roman" w:hAnsi="Times New Roman"/>
+          <w:sz w:val="24"/>
+          <w:szCs w:val="24"/>
+        </w:rPr>
+        <w:t xml:space="preserve"> </w:t>
+      </w:r>
+      <w:hyperlink w:history="1" r:id="rId7fdsfdvlu74_8zcdhnufo">
+        <w:r>
+          <w:rPr>
+            <w:rFonts w:ascii="Times New Roman" w:cs="Times New Roman" w:eastAsia="Times New Roman" w:hAnsi="Times New Roman"/>
+            <w:color w:val="000000"/>
+            <w:sz w:val="24"/>
+            <w:szCs w:val="24"/>
+          </w:rPr>
+          <w:t xml:space="preserve">https://arxiv.org/abs/2303.12059</w:t>
+        </w:r>
+      </w:hyperlink>
+    </w:p>
+    <w:p>
+      <w:pPr>
+        <w:spacing w:after="140" w:line="276"/>
+        <w:ind w:left="567" w:hanging="567"/>
+        <w:jc w:val="left"/>
+      </w:pPr>
+      <w:r>
+        <w:rPr>
+          <w:rFonts w:ascii="Times New Roman" w:cs="Times New Roman" w:eastAsia="Times New Roman" w:hAnsi="Times New Roman"/>
+          <w:color w:val="000000"/>
+          <w:sz w:val="24"/>
+          <w:szCs w:val="24"/>
+        </w:rPr>
         <w:t xml:space="preserve">Lugaresi, C., Tang, J., Nash, H., McClanahan, C., Uboweja, E., Hays, M., Zhang, F., Chang, C.-L., Yong, M. G., Lee, J., Chang, W.-T., Hua, W., Georg, M., &amp; Grundmann, M. (2019). MediaPipe: A framework for building perception pipelines. arXiv:1906.08172.</w:t>
       </w:r>
       <w:r>
@@ -32169,7 +32053,7 @@
         </w:rPr>
         <w:t xml:space="preserve"> </w:t>
       </w:r>
-      <w:hyperlink w:history="1" r:id="rId6lscjomzyr-yarevhz5it">
+      <w:hyperlink w:history="1" r:id="rId4ymimkt0scb1zkfsuokht">
         <w:r>
           <w:rPr>
             <w:rFonts w:ascii="Times New Roman" w:cs="Times New Roman" w:eastAsia="Times New Roman" w:hAnsi="Times New Roman"/>
@@ -32216,6 +32100,25 @@
         </w:rPr>
         <w:t xml:space="preserve">, 2396–2404.</w:t>
       </w:r>
+      <w:r>
+        <w:rPr>
+          <w:rFonts w:ascii="Times New Roman" w:cs="Times New Roman" w:eastAsia="Times New Roman" w:hAnsi="Times New Roman"/>
+          <w:sz w:val="24"/>
+          <w:szCs w:val="24"/>
+        </w:rPr>
+        <w:t xml:space="preserve"> </w:t>
+      </w:r>
+      <w:hyperlink w:history="1" r:id="rIdpsfkhdamuy8bm5zs59whp">
+        <w:r>
+          <w:rPr>
+            <w:rFonts w:ascii="Times New Roman" w:cs="Times New Roman" w:eastAsia="Times New Roman" w:hAnsi="Times New Roman"/>
+            <w:color w:val="000000"/>
+            <w:sz w:val="24"/>
+            <w:szCs w:val="24"/>
+          </w:rPr>
+          <w:t xml:space="preserve">https://doi.org/10.1109/CVPR.2016.263</w:t>
+        </w:r>
+      </w:hyperlink>
     </w:p>
     <w:p>
       <w:pPr>
@@ -32260,7 +32163,7 @@
         </w:rPr>
         <w:t xml:space="preserve"> </w:t>
       </w:r>
-      <w:hyperlink w:history="1" r:id="rIdathqdxdmcrpuq4rk5vr2q">
+      <w:hyperlink w:history="1" r:id="rIddoto5q8z1elggxwigfo_p">
         <w:r>
           <w:rPr>
             <w:rFonts w:ascii="Times New Roman" w:cs="Times New Roman" w:eastAsia="Times New Roman" w:hAnsi="Times New Roman"/>
@@ -32305,7 +32208,7 @@
           <w:sz w:val="24"/>
           <w:szCs w:val="24"/>
         </w:rPr>
-        <w:t xml:space="preserve">, 4186–4196.</w:t>
+        <w:t xml:space="preserve">, 4176–4186.</w:t>
       </w:r>
       <w:r>
         <w:rPr>
@@ -32315,7 +32218,7 @@
         </w:rPr>
         <w:t xml:space="preserve"> </w:t>
       </w:r>
-      <w:hyperlink w:history="1" r:id="rIdohkc1cvdgpbvs7xfg0ata">
+      <w:hyperlink w:history="1" r:id="rIdo1nhb5eyeod35-_dfuudg">
         <w:r>
           <w:rPr>
             <w:rFonts w:ascii="Times New Roman" w:cs="Times New Roman" w:eastAsia="Times New Roman" w:hAnsi="Times New Roman"/>
@@ -32323,7 +32226,7 @@
             <w:sz w:val="24"/>
             <w:szCs w:val="24"/>
           </w:rPr>
-          <w:t xml:space="preserve">https://arxiv.org/abs/2111.12082</w:t>
+          <w:t xml:space="preserve">https://doi.org/10.1109/CVPR52688.2022.00415</w:t>
         </w:r>
       </w:hyperlink>
     </w:p>
@@ -32387,7 +32290,7 @@
         </w:rPr>
         <w:t xml:space="preserve"> </w:t>
       </w:r>
-      <w:hyperlink w:history="1" r:id="rId06yoiialna93tjfgjyid5">
+      <w:hyperlink w:history="1" r:id="rIdhkf849dr6xc3ytfqbjyxj">
         <w:r>
           <w:rPr>
             <w:rFonts w:ascii="Times New Roman" w:cs="Times New Roman" w:eastAsia="Times New Roman" w:hAnsi="Times New Roman"/>
@@ -32442,7 +32345,7 @@
         </w:rPr>
         <w:t xml:space="preserve"> </w:t>
       </w:r>
-      <w:hyperlink w:history="1" r:id="rIdjzmt4scrqsqov2q4kkywx">
+      <w:hyperlink w:history="1" r:id="rIdztmcq_y3fugttfzabdnzj">
         <w:r>
           <w:rPr>
             <w:rFonts w:ascii="Times New Roman" w:cs="Times New Roman" w:eastAsia="Times New Roman" w:hAnsi="Times New Roman"/>
@@ -32497,7 +32400,7 @@
         </w:rPr>
         <w:t xml:space="preserve"> </w:t>
       </w:r>
-      <w:hyperlink w:history="1" r:id="rIds7bh-aienxsi34scckj1n">
+      <w:hyperlink w:history="1" r:id="rIdlwlu02zgaiwzumrlwf-ue">
         <w:r>
           <w:rPr>
             <w:rFonts w:ascii="Times New Roman" w:cs="Times New Roman" w:eastAsia="Times New Roman" w:hAnsi="Times New Roman"/>
@@ -32552,7 +32455,7 @@
         </w:rPr>
         <w:t xml:space="preserve"> </w:t>
       </w:r>
-      <w:hyperlink w:history="1" r:id="rId85bdtatwwpheer3cnc47y">
+      <w:hyperlink w:history="1" r:id="rIdsh94weti8pxdm5ctdbfqp">
         <w:r>
           <w:rPr>
             <w:rFonts w:ascii="Times New Roman" w:cs="Times New Roman" w:eastAsia="Times New Roman" w:hAnsi="Times New Roman"/>
@@ -32607,7 +32510,7 @@
         </w:rPr>
         <w:t xml:space="preserve"> </w:t>
       </w:r>
-      <w:hyperlink w:history="1" r:id="rId8cdrn_cjeabvtcno-e3jt">
+      <w:hyperlink w:history="1" r:id="rIdvc5b3gek7_tidjynlqw2p">
         <w:r>
           <w:rPr>
             <w:rFonts w:ascii="Times New Roman" w:cs="Times New Roman" w:eastAsia="Times New Roman" w:hAnsi="Times New Roman"/>
@@ -32662,7 +32565,7 @@
         </w:rPr>
         <w:t xml:space="preserve"> </w:t>
       </w:r>
-      <w:hyperlink w:history="1" r:id="rIdbcedexwuxfmhoigvw-hff">
+      <w:hyperlink w:history="1" r:id="rId4wlxcr83foqyw5uvd4mlh">
         <w:r>
           <w:rPr>
             <w:rFonts w:ascii="Times New Roman" w:cs="Times New Roman" w:eastAsia="Times New Roman" w:hAnsi="Times New Roman"/>

</xml_diff>

<commit_message>
Report: drop the single-name block on the title page and five prompts
Removes the name and register number above Team Members, removes the first
two and last three prompts, and gives every numbered list its own
numbering definition so lists restart at 1 in viewers that ignore restart
overrides.

Co-Authored-By: Claude Opus 5.5 <noreply@anthropic.com>
Claude-Session: https://claude.ai/code/session_01G7W1FBPLoSQuhNKzvxRuhj
</commit_message>
<xml_diff>
--- a/docs/report/DA3_Report.docx
+++ b/docs/report/DA3_Report.docx
@@ -4,7 +4,7 @@
   <w:body>
     <w:p>
       <w:pPr>
-        <w:spacing w:before="600"/>
+        <w:spacing w:before="1300"/>
       </w:pPr>
     </w:p>
     <w:p>
@@ -39,7 +39,7 @@
     </w:p>
     <w:p>
       <w:pPr>
-        <w:spacing w:after="720" w:before="0"/>
+        <w:spacing w:after="1100" w:before="0"/>
         <w:jc w:val="center"/>
       </w:pPr>
       <w:r>
@@ -54,6 +54,21 @@
     </w:p>
     <w:p>
       <w:pPr>
+        <w:spacing w:after="120" w:before="0"/>
+        <w:jc w:val="center"/>
+      </w:pPr>
+      <w:r>
+        <w:rPr>
+          <w:rFonts w:ascii="Times New Roman" w:cs="Times New Roman" w:eastAsia="Times New Roman" w:hAnsi="Times New Roman"/>
+          <w:color w:val="000000"/>
+          <w:sz w:val="24"/>
+          <w:szCs w:val="24"/>
+        </w:rPr>
+        <w:t xml:space="preserve">Team Members</w:t>
+      </w:r>
+    </w:p>
+    <w:p>
+      <w:pPr>
         <w:spacing w:after="60" w:before="0"/>
         <w:jc w:val="center"/>
       </w:pPr>
@@ -64,57 +79,12 @@
           <w:sz w:val="24"/>
           <w:szCs w:val="24"/>
         </w:rPr>
-        <w:t xml:space="preserve">Mayank</w:t>
-      </w:r>
-    </w:p>
-    <w:p>
-      <w:pPr>
-        <w:spacing w:after="480" w:before="0"/>
-        <w:jc w:val="center"/>
-      </w:pPr>
-      <w:r>
-        <w:rPr>
-          <w:rFonts w:ascii="Times New Roman" w:cs="Times New Roman" w:eastAsia="Times New Roman" w:hAnsi="Times New Roman"/>
-          <w:color w:val="000000"/>
-          <w:sz w:val="24"/>
-          <w:szCs w:val="24"/>
-        </w:rPr>
-        <w:t xml:space="preserve">23BAI0158</w:t>
-      </w:r>
-    </w:p>
-    <w:p>
-      <w:pPr>
-        <w:spacing w:after="120" w:before="0"/>
-        <w:jc w:val="center"/>
-      </w:pPr>
-      <w:r>
-        <w:rPr>
-          <w:rFonts w:ascii="Times New Roman" w:cs="Times New Roman" w:eastAsia="Times New Roman" w:hAnsi="Times New Roman"/>
-          <w:color w:val="000000"/>
-          <w:sz w:val="24"/>
-          <w:szCs w:val="24"/>
-        </w:rPr>
-        <w:t xml:space="preserve">Team Members</w:t>
-      </w:r>
-    </w:p>
-    <w:p>
-      <w:pPr>
-        <w:spacing w:after="60" w:before="0"/>
-        <w:jc w:val="center"/>
-      </w:pPr>
-      <w:r>
-        <w:rPr>
-          <w:rFonts w:ascii="Times New Roman" w:cs="Times New Roman" w:eastAsia="Times New Roman" w:hAnsi="Times New Roman"/>
-          <w:color w:val="000000"/>
-          <w:sz w:val="24"/>
-          <w:szCs w:val="24"/>
-        </w:rPr>
         <w:t xml:space="preserve">Mayank, Vyomesh Pandita</w:t>
       </w:r>
     </w:p>
     <w:p>
       <w:pPr>
-        <w:spacing w:after="960" w:before="0"/>
+        <w:spacing w:after="1500" w:before="0"/>
         <w:jc w:val="center"/>
       </w:pPr>
       <w:r>
@@ -28959,7 +28929,7 @@
           <w:sz w:val="24"/>
           <w:szCs w:val="24"/>
         </w:rPr>
-        <w:t xml:space="preserve">Review the attached Review 2 report of our machine-vision project and prepare a phased implementation plan.</w:t>
+        <w:t xml:space="preserve">Adapt the setup and scripts for Windows, run and demonstrate what has been built, and proceed with Phase 2.</w:t>
       </w:r>
     </w:p>
     <w:p>
@@ -28979,7 +28949,7 @@
           <w:sz w:val="24"/>
           <w:szCs w:val="24"/>
         </w:rPr>
-        <w:t xml:space="preserve">Begin the implementation of Phases 0 and 1.</w:t>
+        <w:t xml:space="preserve">The rPPG-Toolbox environment is now working. What is the next step?</w:t>
       </w:r>
     </w:p>
     <w:p>
@@ -28999,7 +28969,7 @@
           <w:sz w:val="24"/>
           <w:szCs w:val="24"/>
         </w:rPr>
-        <w:t xml:space="preserve">Adapt the setup and scripts for Windows, run and demonstrate what has been built, and proceed with Phase 2.</w:t>
+        <w:t xml:space="preserve">We have not recorded our own face video yet. What can be done in the meantime?</w:t>
       </w:r>
     </w:p>
     <w:p>
@@ -29019,7 +28989,7 @@
           <w:sz w:val="24"/>
           <w:szCs w:val="24"/>
         </w:rPr>
-        <w:t xml:space="preserve">The rPPG-Toolbox environment is now working. What is the next step?</w:t>
+        <w:t xml:space="preserve">Suggest an addition that would make the project more original, since it currently relies only on existing classical and deep-learning methods.</w:t>
       </w:r>
     </w:p>
     <w:p>
@@ -29039,7 +29009,7 @@
           <w:sz w:val="24"/>
           <w:szCs w:val="24"/>
         </w:rPr>
-        <w:t xml:space="preserve">We have not recorded our own face video yet. What can be done in the meantime?</w:t>
+        <w:t xml:space="preserve">Are the deep-learning models already trained, so that only the datasets are needed to measure their accuracy? The question is meant in general terms.</w:t>
       </w:r>
     </w:p>
     <w:p>
@@ -29059,7 +29029,7 @@
           <w:sz w:val="24"/>
           <w:szCs w:val="24"/>
         </w:rPr>
-        <w:t xml:space="preserve">Suggest an addition that would make the project more original, since it currently relies only on existing classical and deep-learning methods.</w:t>
+        <w:t xml:space="preserve">Explain the proposed new method in simple language.</w:t>
       </w:r>
     </w:p>
     <w:p>
@@ -29079,7 +29049,7 @@
           <w:sz w:val="24"/>
           <w:szCs w:val="24"/>
         </w:rPr>
-        <w:t xml:space="preserve">Are the deep-learning models already trained, so that only the datasets are needed to measure their accuracy? The question is meant in general terms.</w:t>
+        <w:t xml:space="preserve">Clarify the following: (1) What is the MMPD dataset? (2) What does the rhythm used in the trust score refer to? (3) Can MediaPipe identify shadowed regions so that they receive a low trust score? (4) How is the pulse produced in the proposed method, compared with POS, CHROM or PhysNet followed by an FFT?</w:t>
       </w:r>
     </w:p>
     <w:p>
@@ -29099,7 +29069,7 @@
           <w:sz w:val="24"/>
           <w:szCs w:val="24"/>
         </w:rPr>
-        <w:t xml:space="preserve">Explain the proposed new method in simple language.</w:t>
+        <w:t xml:space="preserve">Confirm my understanding: the project compares two existing approaches with one new method built from existing techniques.</w:t>
       </w:r>
     </w:p>
     <w:p>
@@ -29119,7 +29089,7 @@
           <w:sz w:val="24"/>
           <w:szCs w:val="24"/>
         </w:rPr>
-        <w:t xml:space="preserve">Clarify the following: (1) What is the MMPD dataset? (2) What does the rhythm used in the trust score refer to? (3) Can MediaPipe identify shadowed regions so that they receive a low trust score? (4) How is the pulse produced in the proposed method, compared with POS, CHROM or PhysNet followed by an FFT?</w:t>
+        <w:t xml:space="preserve">Provide a block diagram of the system.</w:t>
       </w:r>
     </w:p>
     <w:p>
@@ -29139,7 +29109,7 @@
           <w:sz w:val="24"/>
           <w:szCs w:val="24"/>
         </w:rPr>
-        <w:t xml:space="preserve">Confirm my understanding: the project compares two existing approaches with one new method built from existing techniques.</w:t>
+        <w:t xml:space="preserve">Could we train our own neural network on the available datasets to replace POS, so that the core model is our own work?</w:t>
       </w:r>
     </w:p>
     <w:p>
@@ -29159,7 +29129,7 @@
           <w:sz w:val="24"/>
           <w:szCs w:val="24"/>
         </w:rPr>
-        <w:t xml:space="preserve">Provide a block diagram of the system.</w:t>
+        <w:t xml:space="preserve">Are existing deep networks such as PhysNet built on forehead and cheek regions, and on which datasets were they trained?</w:t>
       </w:r>
     </w:p>
     <w:p>
@@ -29179,7 +29149,7 @@
           <w:sz w:val="24"/>
           <w:szCs w:val="24"/>
         </w:rPr>
-        <w:t xml:space="preserve">Could we train our own neural network on the available datasets to replace POS, so that the core model is our own work?</w:t>
+        <w:t xml:space="preserve">Since existing networks are large and difficult to outperform, we will keep the planned method of applying POS to about 25 facial patches. Do not implement it yet; this is a design discussion only.</w:t>
       </w:r>
     </w:p>
     <w:p>
@@ -29199,7 +29169,7 @@
           <w:sz w:val="24"/>
           <w:szCs w:val="24"/>
         </w:rPr>
-        <w:t xml:space="preserve">Are existing deep networks such as PhysNet built on forehead and cheek regions, and on which datasets were they trained?</w:t>
+        <w:t xml:space="preserve">Keep the agreement check, add it to the diagram, and write a context paragraph that can be used to generate the block diagram with an AI tool.</w:t>
       </w:r>
     </w:p>
     <w:p>
@@ -29219,7 +29189,7 @@
           <w:sz w:val="24"/>
           <w:szCs w:val="24"/>
         </w:rPr>
-        <w:t xml:space="preserve">Since existing networks are large and difficult to outperform, we will keep the planned method of applying POS to about 25 facial patches. Do not implement it yet; this is a design discussion only.</w:t>
+        <w:t xml:space="preserve">Show the handcrafted equations that classical methods use to obtain the pulse signal, and explain how they differ between methods.</w:t>
       </w:r>
     </w:p>
     <w:p>
@@ -29239,7 +29209,7 @@
           <w:sz w:val="24"/>
           <w:szCs w:val="24"/>
         </w:rPr>
-        <w:t xml:space="preserve">Keep the agreement check, add it to the diagram, and write a context paragraph that can be used to generate the block diagram with an AI tool.</w:t>
+        <w:t xml:space="preserve">Explain how deep-learning models generate the pulse signal.</w:t>
       </w:r>
     </w:p>
     <w:p>
@@ -29259,7 +29229,7 @@
           <w:sz w:val="24"/>
           <w:szCs w:val="24"/>
         </w:rPr>
-        <w:t xml:space="preserve">Show the handcrafted equations that classical methods use to obtain the pulse signal, and explain how they differ between methods.</w:t>
+        <w:t xml:space="preserve">Provide content for a presentation of at most five slides based on the finalised architecture diagram.</w:t>
       </w:r>
     </w:p>
     <w:p>
@@ -29279,7 +29249,7 @@
           <w:sz w:val="24"/>
           <w:szCs w:val="24"/>
         </w:rPr>
-        <w:t xml:space="preserve">Explain how deep-learning models generate the pulse signal.</w:t>
+        <w:t xml:space="preserve">Revise the plan without implementing it: show only the proposed architecture in the diagram; add a research-backed, real-world output derived from the predicted heart rate; and research whether thermal imaging could make the method more precise and more novel.</w:t>
       </w:r>
     </w:p>
     <w:p>
@@ -29299,7 +29269,7 @@
           <w:sz w:val="24"/>
           <w:szCs w:val="24"/>
         </w:rPr>
-        <w:t xml:space="preserve">Provide content for a presentation of at most five slides based on the finalised architecture diagram.</w:t>
+        <w:t xml:space="preserve">Summarise the proposal in a short paragraph.</w:t>
       </w:r>
     </w:p>
     <w:p>
@@ -29319,7 +29289,7 @@
           <w:sz w:val="24"/>
           <w:szCs w:val="24"/>
         </w:rPr>
-        <w:t xml:space="preserve">Revise the plan without implementing it: show only the proposed architecture in the diagram; add a research-backed, real-world output derived from the predicted heart rate; and research whether thermal imaging could make the method more precise and more novel.</w:t>
+        <w:t xml:space="preserve">Would users of the application need a separate thermal camera in addition to a normal camera?</w:t>
       </w:r>
     </w:p>
     <w:p>
@@ -29339,7 +29309,7 @@
           <w:sz w:val="24"/>
           <w:szCs w:val="24"/>
         </w:rPr>
-        <w:t xml:space="preserve">Summarise the proposal in a short paragraph.</w:t>
+        <w:t xml:space="preserve">Remove the thermal component from the project.</w:t>
       </w:r>
     </w:p>
     <w:p>
@@ -29359,7 +29329,7 @@
           <w:sz w:val="24"/>
           <w:szCs w:val="24"/>
         </w:rPr>
-        <w:t xml:space="preserve">Would users of the application need a separate thermal camera in addition to a normal camera?</w:t>
+        <w:t xml:space="preserve">Suggest a more clinically useful output than the stress level.</w:t>
       </w:r>
     </w:p>
     <w:p>
@@ -29379,7 +29349,7 @@
           <w:sz w:val="24"/>
           <w:szCs w:val="24"/>
         </w:rPr>
-        <w:t xml:space="preserve">Remove the thermal component from the project.</w:t>
+        <w:t xml:space="preserve">Update the plan with atrial fibrillation screening as the primary output and stress as a secondary output.</w:t>
       </w:r>
     </w:p>
     <w:p>
@@ -29399,7 +29369,7 @@
           <w:sz w:val="24"/>
           <w:szCs w:val="24"/>
         </w:rPr>
-        <w:t xml:space="preserve">Suggest a more clinically useful output than the stress level.</w:t>
+        <w:t xml:space="preserve">Generate the updated implementation plan.</w:t>
       </w:r>
     </w:p>
     <w:p>
@@ -29419,7 +29389,7 @@
           <w:sz w:val="24"/>
           <w:szCs w:val="24"/>
         </w:rPr>
-        <w:t xml:space="preserve">Update the plan with atrial fibrillation screening as the primary output and stress as a secondary output.</w:t>
+        <w:t xml:space="preserve">Create a black-and-white architecture diagram and a prompt for generating it with an AI tool.</w:t>
       </w:r>
     </w:p>
     <w:p>
@@ -29439,7 +29409,7 @@
           <w:sz w:val="24"/>
           <w:szCs w:val="24"/>
         </w:rPr>
-        <w:t xml:space="preserve">Generate the updated implementation plan.</w:t>
+        <w:t xml:space="preserve">Explain how the model detects atrial fibrillation or estimates stress from the heart rate.</w:t>
       </w:r>
     </w:p>
     <w:p>
@@ -29459,7 +29429,7 @@
           <w:sz w:val="24"/>
           <w:szCs w:val="24"/>
         </w:rPr>
-        <w:t xml:space="preserve">Create a black-and-white architecture diagram and a prompt for generating it with an AI tool.</w:t>
+        <w:t xml:space="preserve">What are heart-rate variability and the LF/HF ratio, and how are they measured?</w:t>
       </w:r>
     </w:p>
     <w:p>
@@ -29479,7 +29449,7 @@
           <w:sz w:val="24"/>
           <w:szCs w:val="24"/>
         </w:rPr>
-        <w:t xml:space="preserve">Explain how the model detects atrial fibrillation or estimates stress from the heart rate.</w:t>
+        <w:t xml:space="preserve">What is the normal range of heart-rate variability, and how was it established?</w:t>
       </w:r>
     </w:p>
     <w:p>
@@ -29499,7 +29469,7 @@
           <w:sz w:val="24"/>
           <w:szCs w:val="24"/>
         </w:rPr>
-        <w:t xml:space="preserve">What are heart-rate variability and the LF/HF ratio, and how are they measured?</w:t>
+        <w:t xml:space="preserve">Explain atrial fibrillation in simple terms, how the model detects it, and what happens after it is detected.</w:t>
       </w:r>
     </w:p>
     <w:p>
@@ -29519,7 +29489,7 @@
           <w:sz w:val="24"/>
           <w:szCs w:val="24"/>
         </w:rPr>
-        <w:t xml:space="preserve">What is the normal range of heart-rate variability, and how was it established?</w:t>
+        <w:t xml:space="preserve">Are the beat-interval values used in the explanation supported by research?</w:t>
       </w:r>
     </w:p>
     <w:p>
@@ -29539,7 +29509,7 @@
           <w:sz w:val="24"/>
           <w:szCs w:val="24"/>
         </w:rPr>
-        <w:t xml:space="preserve">Explain atrial fibrillation in simple terms, how the model detects it, and what happens after it is detected.</w:t>
+        <w:t xml:space="preserve">Can other medical conditions be detected from the predicted heartbeat?</w:t>
       </w:r>
     </w:p>
     <w:p>
@@ -29559,7 +29529,7 @@
           <w:sz w:val="24"/>
           <w:szCs w:val="24"/>
         </w:rPr>
-        <w:t xml:space="preserve">Are the beat-interval values used in the explanation supported by research?</w:t>
+        <w:t xml:space="preserve">What do abnormally slow or fast heartbeats indicate?</w:t>
       </w:r>
     </w:p>
     <w:p>
@@ -29579,7 +29549,7 @@
           <w:sz w:val="24"/>
           <w:szCs w:val="24"/>
         </w:rPr>
-        <w:t xml:space="preserve">Can other medical conditions be detected from the predicted heartbeat?</w:t>
+        <w:t xml:space="preserve">Make abnormal heart-rate flags the secondary output, keep atrial fibrillation as the primary output, and assess the feasibility.</w:t>
       </w:r>
     </w:p>
     <w:p>
@@ -29599,7 +29569,7 @@
           <w:sz w:val="24"/>
           <w:szCs w:val="24"/>
         </w:rPr>
-        <w:t xml:space="preserve">What do abnormally slow or fast heartbeats indicate?</w:t>
+        <w:t xml:space="preserve">Explain the architecture in one paragraph, defining every technical term.</w:t>
       </w:r>
     </w:p>
     <w:p>
@@ -29619,7 +29589,7 @@
           <w:sz w:val="24"/>
           <w:szCs w:val="24"/>
         </w:rPr>
-        <w:t xml:space="preserve">Make abnormal heart-rate flags the secondary output, keep atrial fibrillation as the primary output, and assess the feasibility.</w:t>
+        <w:t xml:space="preserve">Answer the following design questions: (1) Can the face realistically be divided into 25 patches, or should the number be reduced? (2) How is the confidence of the weighted fusion computed? (3) How are the trust-score features computed? (4) How is motion removal performed? (5) Which of RMSSD, SDNN and LF/HF is most important for the project?</w:t>
       </w:r>
     </w:p>
     <w:p>
@@ -29639,107 +29609,7 @@
           <w:sz w:val="24"/>
           <w:szCs w:val="24"/>
         </w:rPr>
-        <w:t xml:space="preserve">Explain the architecture in one paragraph, defining every technical term.</w:t>
-      </w:r>
-    </w:p>
-    <w:p>
-      <w:pPr>
-        <w:pStyle w:val="ListParagraph"/>
-        <w:numPr>
-          <w:ilvl w:val="0"/>
-          <w:numId w:val="14"/>
-        </w:numPr>
-        <w:spacing w:after="80" w:line="300"/>
-        <w:jc w:val="both"/>
-      </w:pPr>
-      <w:r>
-        <w:rPr>
-          <w:rFonts w:ascii="Times New Roman" w:cs="Times New Roman" w:eastAsia="Times New Roman" w:hAnsi="Times New Roman"/>
-          <w:color w:val="000000"/>
-          <w:sz w:val="24"/>
-          <w:szCs w:val="24"/>
-        </w:rPr>
-        <w:t xml:space="preserve">Answer the following design questions: (1) Can the face realistically be divided into 25 patches, or should the number be reduced? (2) How is the confidence of the weighted fusion computed? (3) How are the trust-score features computed? (4) How is motion removal performed? (5) Which of RMSSD, SDNN and LF/HF is most important for the project?</w:t>
-      </w:r>
-    </w:p>
-    <w:p>
-      <w:pPr>
-        <w:pStyle w:val="ListParagraph"/>
-        <w:numPr>
-          <w:ilvl w:val="0"/>
-          <w:numId w:val="14"/>
-        </w:numPr>
-        <w:spacing w:after="80" w:line="300"/>
-        <w:jc w:val="both"/>
-      </w:pPr>
-      <w:r>
-        <w:rPr>
-          <w:rFonts w:ascii="Times New Roman" w:cs="Times New Roman" w:eastAsia="Times New Roman" w:hAnsi="Times New Roman"/>
-          <w:color w:val="000000"/>
-          <w:sz w:val="24"/>
-          <w:szCs w:val="24"/>
-        </w:rPr>
         <w:t xml:space="preserve">Update the implementation plan and create a simplified architecture diagram.</w:t>
-      </w:r>
-    </w:p>
-    <w:p>
-      <w:pPr>
-        <w:pStyle w:val="ListParagraph"/>
-        <w:numPr>
-          <w:ilvl w:val="0"/>
-          <w:numId w:val="14"/>
-        </w:numPr>
-        <w:spacing w:after="80" w:line="300"/>
-        <w:jc w:val="both"/>
-      </w:pPr>
-      <w:r>
-        <w:rPr>
-          <w:rFonts w:ascii="Times New Roman" w:cs="Times New Roman" w:eastAsia="Times New Roman" w:hAnsi="Times New Roman"/>
-          <w:color w:val="000000"/>
-          <w:sz w:val="24"/>
-          <w:szCs w:val="24"/>
-        </w:rPr>
-        <w:t xml:space="preserve">Remove the code of the earlier project from the repository and start implementing the new plan.</w:t>
-      </w:r>
-    </w:p>
-    <w:p>
-      <w:pPr>
-        <w:pStyle w:val="ListParagraph"/>
-        <w:numPr>
-          <w:ilvl w:val="0"/>
-          <w:numId w:val="14"/>
-        </w:numPr>
-        <w:spacing w:after="80" w:line="300"/>
-        <w:jc w:val="both"/>
-      </w:pPr>
-      <w:r>
-        <w:rPr>
-          <w:rFonts w:ascii="Times New Roman" w:cs="Times New Roman" w:eastAsia="Times New Roman" w:hAnsi="Times New Roman"/>
-          <w:color w:val="000000"/>
-          <w:sz w:val="24"/>
-          <w:szCs w:val="24"/>
-        </w:rPr>
-        <w:t xml:space="preserve">Generate the project report following the attached DA3 format, with all text in black.</w:t>
-      </w:r>
-    </w:p>
-    <w:p>
-      <w:pPr>
-        <w:pStyle w:val="ListParagraph"/>
-        <w:numPr>
-          <w:ilvl w:val="0"/>
-          <w:numId w:val="14"/>
-        </w:numPr>
-        <w:spacing w:after="80" w:line="300"/>
-        <w:jc w:val="both"/>
-      </w:pPr>
-      <w:r>
-        <w:rPr>
-          <w:rFonts w:ascii="Times New Roman" w:cs="Times New Roman" w:eastAsia="Times New Roman" w:hAnsi="Times New Roman"/>
-          <w:color w:val="000000"/>
-          <w:sz w:val="24"/>
-          <w:szCs w:val="24"/>
-        </w:rPr>
-        <w:t xml:space="preserve">Rewrite the prompts in professional language and verify that all information in the report is accurate and supported by research.</w:t>
       </w:r>
     </w:p>
     <w:p>
@@ -30241,7 +30111,7 @@
         </w:rPr>
         <w:t xml:space="preserve"> </w:t>
       </w:r>
-      <w:hyperlink w:history="1" r:id="rIdjv9qwjsg3xjeh9ow5i_in">
+      <w:hyperlink w:history="1" r:id="rIdqjiu16ceofgltcmqrreg9">
         <w:r>
           <w:rPr>
             <w:rFonts w:ascii="Times New Roman" w:cs="Times New Roman" w:eastAsia="Times New Roman" w:hAnsi="Times New Roman"/>
@@ -30296,7 +30166,7 @@
         </w:rPr>
         <w:t xml:space="preserve"> </w:t>
       </w:r>
-      <w:hyperlink w:history="1" r:id="rIdxnbfhlwfhkhw59xuyhrb9">
+      <w:hyperlink w:history="1" r:id="rIdw-xl8csjdmzgzhmw6hx7d">
         <w:r>
           <w:rPr>
             <w:rFonts w:ascii="Times New Roman" w:cs="Times New Roman" w:eastAsia="Times New Roman" w:hAnsi="Times New Roman"/>
@@ -30351,7 +30221,7 @@
         </w:rPr>
         <w:t xml:space="preserve"> </w:t>
       </w:r>
-      <w:hyperlink w:history="1" r:id="rIdppeie0ka_2nrzd_ok9j_r">
+      <w:hyperlink w:history="1" r:id="rIdwm9ynialgxvb53wcjuaxn">
         <w:r>
           <w:rPr>
             <w:rFonts w:ascii="Times New Roman" w:cs="Times New Roman" w:eastAsia="Times New Roman" w:hAnsi="Times New Roman"/>
@@ -30406,7 +30276,7 @@
         </w:rPr>
         <w:t xml:space="preserve"> </w:t>
       </w:r>
-      <w:hyperlink w:history="1" r:id="rIdqrsxlv-jbeki9oegledbl">
+      <w:hyperlink w:history="1" r:id="rId3ogm6l7girna6fhfrembd">
         <w:r>
           <w:rPr>
             <w:rFonts w:ascii="Times New Roman" w:cs="Times New Roman" w:eastAsia="Times New Roman" w:hAnsi="Times New Roman"/>
@@ -30461,7 +30331,7 @@
         </w:rPr>
         <w:t xml:space="preserve"> </w:t>
       </w:r>
-      <w:hyperlink w:history="1" r:id="rId5cj2z0rb9yg3pa4j9oifo">
+      <w:hyperlink w:history="1" r:id="rIdvecsgszyitebdkwrkq3ba">
         <w:r>
           <w:rPr>
             <w:rFonts w:ascii="Times New Roman" w:cs="Times New Roman" w:eastAsia="Times New Roman" w:hAnsi="Times New Roman"/>
@@ -30516,7 +30386,7 @@
         </w:rPr>
         <w:t xml:space="preserve"> </w:t>
       </w:r>
-      <w:hyperlink w:history="1" r:id="rIdcnhoe7kvkshzgwsllgaer">
+      <w:hyperlink w:history="1" r:id="rIdn9-mzh434n-ygf7jmt_db">
         <w:r>
           <w:rPr>
             <w:rFonts w:ascii="Times New Roman" w:cs="Times New Roman" w:eastAsia="Times New Roman" w:hAnsi="Times New Roman"/>
@@ -30571,7 +30441,7 @@
         </w:rPr>
         <w:t xml:space="preserve"> </w:t>
       </w:r>
-      <w:hyperlink w:history="1" r:id="rIdiweyfo0hmf9f_mx-c9prw">
+      <w:hyperlink w:history="1" r:id="rIdsufb16pu4zlkim08wfwhl">
         <w:r>
           <w:rPr>
             <w:rFonts w:ascii="Times New Roman" w:cs="Times New Roman" w:eastAsia="Times New Roman" w:hAnsi="Times New Roman"/>
@@ -30626,7 +30496,7 @@
         </w:rPr>
         <w:t xml:space="preserve"> </w:t>
       </w:r>
-      <w:hyperlink w:history="1" r:id="rIdbuhk_hgsbfiivmjz0q_qb">
+      <w:hyperlink w:history="1" r:id="rIdtmpqconbfilg9ikhw7cdg">
         <w:r>
           <w:rPr>
             <w:rFonts w:ascii="Times New Roman" w:cs="Times New Roman" w:eastAsia="Times New Roman" w:hAnsi="Times New Roman"/>
@@ -30681,7 +30551,7 @@
         </w:rPr>
         <w:t xml:space="preserve"> </w:t>
       </w:r>
-      <w:hyperlink w:history="1" r:id="rId7zv_vtaq534hqxcx7j5je">
+      <w:hyperlink w:history="1" r:id="rIdot9wgalcyjs9blw-c-qmg">
         <w:r>
           <w:rPr>
             <w:rFonts w:ascii="Times New Roman" w:cs="Times New Roman" w:eastAsia="Times New Roman" w:hAnsi="Times New Roman"/>
@@ -30736,7 +30606,7 @@
         </w:rPr>
         <w:t xml:space="preserve"> </w:t>
       </w:r>
-      <w:hyperlink w:history="1" r:id="rIdgjpc3cxm9meoxf_lvkxjg">
+      <w:hyperlink w:history="1" r:id="rIdgkawvdvd6661cb8a_ju6x">
         <w:r>
           <w:rPr>
             <w:rFonts w:ascii="Times New Roman" w:cs="Times New Roman" w:eastAsia="Times New Roman" w:hAnsi="Times New Roman"/>
@@ -30791,7 +30661,7 @@
         </w:rPr>
         <w:t xml:space="preserve"> </w:t>
       </w:r>
-      <w:hyperlink w:history="1" r:id="rId0mwrfuzc07khkyenrz8bc">
+      <w:hyperlink w:history="1" r:id="rIdjt6gt1wwgzothcvh8aal-">
         <w:r>
           <w:rPr>
             <w:rFonts w:ascii="Times New Roman" w:cs="Times New Roman" w:eastAsia="Times New Roman" w:hAnsi="Times New Roman"/>
@@ -30846,7 +30716,7 @@
         </w:rPr>
         <w:t xml:space="preserve"> </w:t>
       </w:r>
-      <w:hyperlink w:history="1" r:id="rIdgjntl08gmvhug8d5psnej">
+      <w:hyperlink w:history="1" r:id="rIdcztcgkm6oanvapiq8c5-c">
         <w:r>
           <w:rPr>
             <w:rFonts w:ascii="Times New Roman" w:cs="Times New Roman" w:eastAsia="Times New Roman" w:hAnsi="Times New Roman"/>
@@ -30901,7 +30771,7 @@
         </w:rPr>
         <w:t xml:space="preserve"> </w:t>
       </w:r>
-      <w:hyperlink w:history="1" r:id="rIdx7euxms25j1jfwoyzk7w1">
+      <w:hyperlink w:history="1" r:id="rIdusxq4zbiz1ozjrmj9rqbh">
         <w:r>
           <w:rPr>
             <w:rFonts w:ascii="Times New Roman" w:cs="Times New Roman" w:eastAsia="Times New Roman" w:hAnsi="Times New Roman"/>
@@ -30956,7 +30826,7 @@
         </w:rPr>
         <w:t xml:space="preserve"> </w:t>
       </w:r>
-      <w:hyperlink w:history="1" r:id="rIduf4vifamovddflinicfmu">
+      <w:hyperlink w:history="1" r:id="rIdit5rnfykmg_mv-izejxac">
         <w:r>
           <w:rPr>
             <w:rFonts w:ascii="Times New Roman" w:cs="Times New Roman" w:eastAsia="Times New Roman" w:hAnsi="Times New Roman"/>
@@ -31011,7 +30881,7 @@
         </w:rPr>
         <w:t xml:space="preserve"> </w:t>
       </w:r>
-      <w:hyperlink w:history="1" r:id="rIdnsifltb4xmf-nnllq38uy">
+      <w:hyperlink w:history="1" r:id="rIdvpmcj5vqpwyf7c6vny-5x">
         <w:r>
           <w:rPr>
             <w:rFonts w:ascii="Times New Roman" w:cs="Times New Roman" w:eastAsia="Times New Roman" w:hAnsi="Times New Roman"/>
@@ -31066,7 +30936,7 @@
         </w:rPr>
         <w:t xml:space="preserve"> </w:t>
       </w:r>
-      <w:hyperlink w:history="1" r:id="rIdgufemsasn4t94hycbta-8">
+      <w:hyperlink w:history="1" r:id="rIdush9zxw4_ricvkgxljpgk">
         <w:r>
           <w:rPr>
             <w:rFonts w:ascii="Times New Roman" w:cs="Times New Roman" w:eastAsia="Times New Roman" w:hAnsi="Times New Roman"/>
@@ -31121,7 +30991,7 @@
         </w:rPr>
         <w:t xml:space="preserve"> </w:t>
       </w:r>
-      <w:hyperlink w:history="1" r:id="rIdcvxotevpfy4r3ixm3plkk">
+      <w:hyperlink w:history="1" r:id="rIdtqu3x16wiiwygzivtvk5c">
         <w:r>
           <w:rPr>
             <w:rFonts w:ascii="Times New Roman" w:cs="Times New Roman" w:eastAsia="Times New Roman" w:hAnsi="Times New Roman"/>
@@ -31176,7 +31046,7 @@
         </w:rPr>
         <w:t xml:space="preserve"> </w:t>
       </w:r>
-      <w:hyperlink w:history="1" r:id="rIddj14gomuf39cf_fugivvx">
+      <w:hyperlink w:history="1" r:id="rId4xifyukbarkq5pffi3izv">
         <w:r>
           <w:rPr>
             <w:rFonts w:ascii="Times New Roman" w:cs="Times New Roman" w:eastAsia="Times New Roman" w:hAnsi="Times New Roman"/>
@@ -31231,7 +31101,7 @@
         </w:rPr>
         <w:t xml:space="preserve"> </w:t>
       </w:r>
-      <w:hyperlink w:history="1" r:id="rIdb1yli9lstoi8a1ae1iz4l">
+      <w:hyperlink w:history="1" r:id="rIdvbebxohrl62dsnkpj6k-6">
         <w:r>
           <w:rPr>
             <w:rFonts w:ascii="Times New Roman" w:cs="Times New Roman" w:eastAsia="Times New Roman" w:hAnsi="Times New Roman"/>
@@ -31286,7 +31156,7 @@
         </w:rPr>
         <w:t xml:space="preserve"> </w:t>
       </w:r>
-      <w:hyperlink w:history="1" r:id="rIdc9p_tjqwd5ex-l3wddgvf">
+      <w:hyperlink w:history="1" r:id="rIdjhgjnfnbw41vhwswpwnzw">
         <w:r>
           <w:rPr>
             <w:rFonts w:ascii="Times New Roman" w:cs="Times New Roman" w:eastAsia="Times New Roman" w:hAnsi="Times New Roman"/>
@@ -31341,7 +31211,7 @@
         </w:rPr>
         <w:t xml:space="preserve"> </w:t>
       </w:r>
-      <w:hyperlink w:history="1" r:id="rIdzex1p3tv852um6nkjisuk">
+      <w:hyperlink w:history="1" r:id="rIdmjvfzgzkjkgew-fnzk7t5">
         <w:r>
           <w:rPr>
             <w:rFonts w:ascii="Times New Roman" w:cs="Times New Roman" w:eastAsia="Times New Roman" w:hAnsi="Times New Roman"/>
@@ -31396,7 +31266,7 @@
         </w:rPr>
         <w:t xml:space="preserve"> </w:t>
       </w:r>
-      <w:hyperlink w:history="1" r:id="rIdqjgo-htckmyhi9peaudqt">
+      <w:hyperlink w:history="1" r:id="rId9wrbf3iiyud_5cw8mdmxv">
         <w:r>
           <w:rPr>
             <w:rFonts w:ascii="Times New Roman" w:cs="Times New Roman" w:eastAsia="Times New Roman" w:hAnsi="Times New Roman"/>
@@ -31451,7 +31321,7 @@
         </w:rPr>
         <w:t xml:space="preserve"> </w:t>
       </w:r>
-      <w:hyperlink w:history="1" r:id="rIdfo4dhvvh7vlpts5_5t5yw">
+      <w:hyperlink w:history="1" r:id="rId9bylstfgqofktnceri3sx">
         <w:r>
           <w:rPr>
             <w:rFonts w:ascii="Times New Roman" w:cs="Times New Roman" w:eastAsia="Times New Roman" w:hAnsi="Times New Roman"/>
@@ -31506,7 +31376,7 @@
         </w:rPr>
         <w:t xml:space="preserve"> </w:t>
       </w:r>
-      <w:hyperlink w:history="1" r:id="rIdwviktasw4qc5kgdirxail">
+      <w:hyperlink w:history="1" r:id="rIdjir21l7mroxxq-exew0k8">
         <w:r>
           <w:rPr>
             <w:rFonts w:ascii="Times New Roman" w:cs="Times New Roman" w:eastAsia="Times New Roman" w:hAnsi="Times New Roman"/>
@@ -31578,7 +31448,7 @@
         </w:rPr>
         <w:t xml:space="preserve"> </w:t>
       </w:r>
-      <w:hyperlink w:history="1" r:id="rIdq9dff5n7kvtn8ixmvwp2p">
+      <w:hyperlink w:history="1" r:id="rIdku9x4qdyar4tg2flw7vij">
         <w:r>
           <w:rPr>
             <w:rFonts w:ascii="Times New Roman" w:cs="Times New Roman" w:eastAsia="Times New Roman" w:hAnsi="Times New Roman"/>
@@ -31633,7 +31503,7 @@
         </w:rPr>
         <w:t xml:space="preserve"> </w:t>
       </w:r>
-      <w:hyperlink w:history="1" r:id="rId3q8ifii1ye-_fmj0u8bk8">
+      <w:hyperlink w:history="1" r:id="rId6rehcp6lzatps4zqvslwv">
         <w:r>
           <w:rPr>
             <w:rFonts w:ascii="Times New Roman" w:cs="Times New Roman" w:eastAsia="Times New Roman" w:hAnsi="Times New Roman"/>
@@ -31688,7 +31558,7 @@
         </w:rPr>
         <w:t xml:space="preserve"> </w:t>
       </w:r>
-      <w:hyperlink w:history="1" r:id="rId0vy6mjscsj8b_g311xxg3">
+      <w:hyperlink w:history="1" r:id="rIdwt-ljjwiw53mvf3nlugcd">
         <w:r>
           <w:rPr>
             <w:rFonts w:ascii="Times New Roman" w:cs="Times New Roman" w:eastAsia="Times New Roman" w:hAnsi="Times New Roman"/>
@@ -31743,7 +31613,7 @@
         </w:rPr>
         <w:t xml:space="preserve"> </w:t>
       </w:r>
-      <w:hyperlink w:history="1" r:id="rIdz0mlyrwnkz2vn256l1dlr">
+      <w:hyperlink w:history="1" r:id="rIdw697lv8e6uiwrhiqgvdvt">
         <w:r>
           <w:rPr>
             <w:rFonts w:ascii="Times New Roman" w:cs="Times New Roman" w:eastAsia="Times New Roman" w:hAnsi="Times New Roman"/>
@@ -31798,7 +31668,7 @@
         </w:rPr>
         <w:t xml:space="preserve"> </w:t>
       </w:r>
-      <w:hyperlink w:history="1" r:id="rIdwlqvaojm7yzoau2ju1_xc">
+      <w:hyperlink w:history="1" r:id="rIdqdkkvs00rvsfzcgbq5vrt">
         <w:r>
           <w:rPr>
             <w:rFonts w:ascii="Times New Roman" w:cs="Times New Roman" w:eastAsia="Times New Roman" w:hAnsi="Times New Roman"/>
@@ -31853,7 +31723,7 @@
         </w:rPr>
         <w:t xml:space="preserve"> </w:t>
       </w:r>
-      <w:hyperlink w:history="1" r:id="rIdunczvt5ffietl1qludiee">
+      <w:hyperlink w:history="1" r:id="rIdahq60vxcg3atsr9azm-oa">
         <w:r>
           <w:rPr>
             <w:rFonts w:ascii="Times New Roman" w:cs="Times New Roman" w:eastAsia="Times New Roman" w:hAnsi="Times New Roman"/>
@@ -31908,7 +31778,7 @@
         </w:rPr>
         <w:t xml:space="preserve"> </w:t>
       </w:r>
-      <w:hyperlink w:history="1" r:id="rIdkelvsmcg3ngifg7m2wlk5">
+      <w:hyperlink w:history="1" r:id="rId7qrrf389axuoefpekh07s">
         <w:r>
           <w:rPr>
             <w:rFonts w:ascii="Times New Roman" w:cs="Times New Roman" w:eastAsia="Times New Roman" w:hAnsi="Times New Roman"/>
@@ -31963,7 +31833,7 @@
         </w:rPr>
         <w:t xml:space="preserve"> </w:t>
       </w:r>
-      <w:hyperlink w:history="1" r:id="rId0h7xhbqox5etgoqqaufb6">
+      <w:hyperlink w:history="1" r:id="rId47knif0mgyjyc9csloo6x">
         <w:r>
           <w:rPr>
             <w:rFonts w:ascii="Times New Roman" w:cs="Times New Roman" w:eastAsia="Times New Roman" w:hAnsi="Times New Roman"/>
@@ -32018,7 +31888,7 @@
         </w:rPr>
         <w:t xml:space="preserve"> </w:t>
       </w:r>
-      <w:hyperlink w:history="1" r:id="rId7fdsfdvlu74_8zcdhnufo">
+      <w:hyperlink w:history="1" r:id="rIdewphul6aye6cwaql8fgbd">
         <w:r>
           <w:rPr>
             <w:rFonts w:ascii="Times New Roman" w:cs="Times New Roman" w:eastAsia="Times New Roman" w:hAnsi="Times New Roman"/>
@@ -32053,7 +31923,7 @@
         </w:rPr>
         <w:t xml:space="preserve"> </w:t>
       </w:r>
-      <w:hyperlink w:history="1" r:id="rId4ymimkt0scb1zkfsuokht">
+      <w:hyperlink w:history="1" r:id="rIdsjeu0lnt4j9xpv87u6qkg">
         <w:r>
           <w:rPr>
             <w:rFonts w:ascii="Times New Roman" w:cs="Times New Roman" w:eastAsia="Times New Roman" w:hAnsi="Times New Roman"/>
@@ -32108,7 +31978,7 @@
         </w:rPr>
         <w:t xml:space="preserve"> </w:t>
       </w:r>
-      <w:hyperlink w:history="1" r:id="rIdpsfkhdamuy8bm5zs59whp">
+      <w:hyperlink w:history="1" r:id="rIddgtffnpcr00wzkflzmfnh">
         <w:r>
           <w:rPr>
             <w:rFonts w:ascii="Times New Roman" w:cs="Times New Roman" w:eastAsia="Times New Roman" w:hAnsi="Times New Roman"/>
@@ -32163,7 +32033,7 @@
         </w:rPr>
         <w:t xml:space="preserve"> </w:t>
       </w:r>
-      <w:hyperlink w:history="1" r:id="rIddoto5q8z1elggxwigfo_p">
+      <w:hyperlink w:history="1" r:id="rIdmuumyeratylp9wpzci2pg">
         <w:r>
           <w:rPr>
             <w:rFonts w:ascii="Times New Roman" w:cs="Times New Roman" w:eastAsia="Times New Roman" w:hAnsi="Times New Roman"/>
@@ -32218,7 +32088,7 @@
         </w:rPr>
         <w:t xml:space="preserve"> </w:t>
       </w:r>
-      <w:hyperlink w:history="1" r:id="rIdo1nhb5eyeod35-_dfuudg">
+      <w:hyperlink w:history="1" r:id="rIdrypwqo9zqi5vokd7v2hma">
         <w:r>
           <w:rPr>
             <w:rFonts w:ascii="Times New Roman" w:cs="Times New Roman" w:eastAsia="Times New Roman" w:hAnsi="Times New Roman"/>
@@ -32290,7 +32160,7 @@
         </w:rPr>
         <w:t xml:space="preserve"> </w:t>
       </w:r>
-      <w:hyperlink w:history="1" r:id="rIdhkf849dr6xc3ytfqbjyxj">
+      <w:hyperlink w:history="1" r:id="rIdpuhhapjtvolgledvxsu9n">
         <w:r>
           <w:rPr>
             <w:rFonts w:ascii="Times New Roman" w:cs="Times New Roman" w:eastAsia="Times New Roman" w:hAnsi="Times New Roman"/>
@@ -32345,7 +32215,7 @@
         </w:rPr>
         <w:t xml:space="preserve"> </w:t>
       </w:r>
-      <w:hyperlink w:history="1" r:id="rIdztmcq_y3fugttfzabdnzj">
+      <w:hyperlink w:history="1" r:id="rIdvap-u6h5u3n37lqccbxfy">
         <w:r>
           <w:rPr>
             <w:rFonts w:ascii="Times New Roman" w:cs="Times New Roman" w:eastAsia="Times New Roman" w:hAnsi="Times New Roman"/>
@@ -32400,7 +32270,7 @@
         </w:rPr>
         <w:t xml:space="preserve"> </w:t>
       </w:r>
-      <w:hyperlink w:history="1" r:id="rIdlwlu02zgaiwzumrlwf-ue">
+      <w:hyperlink w:history="1" r:id="rIdr7iipjdehcair9n58ui7s">
         <w:r>
           <w:rPr>
             <w:rFonts w:ascii="Times New Roman" w:cs="Times New Roman" w:eastAsia="Times New Roman" w:hAnsi="Times New Roman"/>
@@ -32455,7 +32325,7 @@
         </w:rPr>
         <w:t xml:space="preserve"> </w:t>
       </w:r>
-      <w:hyperlink w:history="1" r:id="rIdsh94weti8pxdm5ctdbfqp">
+      <w:hyperlink w:history="1" r:id="rIdt1tkcjcy0-lg5qnyc21y7">
         <w:r>
           <w:rPr>
             <w:rFonts w:ascii="Times New Roman" w:cs="Times New Roman" w:eastAsia="Times New Roman" w:hAnsi="Times New Roman"/>
@@ -32510,7 +32380,7 @@
         </w:rPr>
         <w:t xml:space="preserve"> </w:t>
       </w:r>
-      <w:hyperlink w:history="1" r:id="rIdvc5b3gek7_tidjynlqw2p">
+      <w:hyperlink w:history="1" r:id="rIde7pldwkykgetouzlvjxpq">
         <w:r>
           <w:rPr>
             <w:rFonts w:ascii="Times New Roman" w:cs="Times New Roman" w:eastAsia="Times New Roman" w:hAnsi="Times New Roman"/>
@@ -32565,7 +32435,7 @@
         </w:rPr>
         <w:t xml:space="preserve"> </w:t>
       </w:r>
-      <w:hyperlink w:history="1" r:id="rId4wlxcr83foqyw5uvd4mlh">
+      <w:hyperlink w:history="1" r:id="rIdshiahequ8ze8hfplrzfb5">
         <w:r>
           <w:rPr>
             <w:rFonts w:ascii="Times New Roman" w:cs="Times New Roman" w:eastAsia="Times New Roman" w:hAnsi="Times New Roman"/>
@@ -32850,6 +32720,150 @@
     </w:lvl>
   </w:abstractNum>
   <w:abstractNum w:abstractNumId="3" w15:restartNumberingAfterBreak="0">
+    <w:multiLevelType w:val="hybridMultilevel"/>
+    <w:lvl w:ilvl="0" w15:tentative="1">
+      <w:start w:val="1"/>
+      <w:numFmt w:val="decimal"/>
+      <w:lvlText w:val="%1."/>
+      <w:lvlJc w:val="left"/>
+      <w:pPr>
+        <w:ind w:left="567" w:hanging="397"/>
+      </w:pPr>
+      <w:rPr>
+        <w:rFonts w:ascii="Times New Roman" w:cs="Times New Roman" w:eastAsia="Times New Roman" w:hAnsi="Times New Roman"/>
+        <w:color w:val="000000"/>
+      </w:rPr>
+    </w:lvl>
+  </w:abstractNum>
+  <w:abstractNum w:abstractNumId="4" w15:restartNumberingAfterBreak="0">
+    <w:multiLevelType w:val="hybridMultilevel"/>
+    <w:lvl w:ilvl="0" w15:tentative="1">
+      <w:start w:val="1"/>
+      <w:numFmt w:val="decimal"/>
+      <w:lvlText w:val="%1."/>
+      <w:lvlJc w:val="left"/>
+      <w:pPr>
+        <w:ind w:left="567" w:hanging="397"/>
+      </w:pPr>
+      <w:rPr>
+        <w:rFonts w:ascii="Times New Roman" w:cs="Times New Roman" w:eastAsia="Times New Roman" w:hAnsi="Times New Roman"/>
+        <w:color w:val="000000"/>
+      </w:rPr>
+    </w:lvl>
+  </w:abstractNum>
+  <w:abstractNum w:abstractNumId="5" w15:restartNumberingAfterBreak="0">
+    <w:multiLevelType w:val="hybridMultilevel"/>
+    <w:lvl w:ilvl="0" w15:tentative="1">
+      <w:start w:val="1"/>
+      <w:numFmt w:val="decimal"/>
+      <w:lvlText w:val="%1."/>
+      <w:lvlJc w:val="left"/>
+      <w:pPr>
+        <w:ind w:left="567" w:hanging="397"/>
+      </w:pPr>
+      <w:rPr>
+        <w:rFonts w:ascii="Times New Roman" w:cs="Times New Roman" w:eastAsia="Times New Roman" w:hAnsi="Times New Roman"/>
+        <w:color w:val="000000"/>
+      </w:rPr>
+    </w:lvl>
+  </w:abstractNum>
+  <w:abstractNum w:abstractNumId="6" w15:restartNumberingAfterBreak="0">
+    <w:multiLevelType w:val="hybridMultilevel"/>
+    <w:lvl w:ilvl="0" w15:tentative="1">
+      <w:start w:val="1"/>
+      <w:numFmt w:val="decimal"/>
+      <w:lvlText w:val="%1."/>
+      <w:lvlJc w:val="left"/>
+      <w:pPr>
+        <w:ind w:left="567" w:hanging="397"/>
+      </w:pPr>
+      <w:rPr>
+        <w:rFonts w:ascii="Times New Roman" w:cs="Times New Roman" w:eastAsia="Times New Roman" w:hAnsi="Times New Roman"/>
+        <w:color w:val="000000"/>
+      </w:rPr>
+    </w:lvl>
+  </w:abstractNum>
+  <w:abstractNum w:abstractNumId="7" w15:restartNumberingAfterBreak="0">
+    <w:multiLevelType w:val="hybridMultilevel"/>
+    <w:lvl w:ilvl="0" w15:tentative="1">
+      <w:start w:val="1"/>
+      <w:numFmt w:val="decimal"/>
+      <w:lvlText w:val="%1."/>
+      <w:lvlJc w:val="left"/>
+      <w:pPr>
+        <w:ind w:left="567" w:hanging="397"/>
+      </w:pPr>
+      <w:rPr>
+        <w:rFonts w:ascii="Times New Roman" w:cs="Times New Roman" w:eastAsia="Times New Roman" w:hAnsi="Times New Roman"/>
+        <w:color w:val="000000"/>
+      </w:rPr>
+    </w:lvl>
+  </w:abstractNum>
+  <w:abstractNum w:abstractNumId="8" w15:restartNumberingAfterBreak="0">
+    <w:multiLevelType w:val="hybridMultilevel"/>
+    <w:lvl w:ilvl="0" w15:tentative="1">
+      <w:start w:val="1"/>
+      <w:numFmt w:val="decimal"/>
+      <w:lvlText w:val="%1."/>
+      <w:lvlJc w:val="left"/>
+      <w:pPr>
+        <w:ind w:left="567" w:hanging="397"/>
+      </w:pPr>
+      <w:rPr>
+        <w:rFonts w:ascii="Times New Roman" w:cs="Times New Roman" w:eastAsia="Times New Roman" w:hAnsi="Times New Roman"/>
+        <w:color w:val="000000"/>
+      </w:rPr>
+    </w:lvl>
+  </w:abstractNum>
+  <w:abstractNum w:abstractNumId="9" w15:restartNumberingAfterBreak="0">
+    <w:multiLevelType w:val="hybridMultilevel"/>
+    <w:lvl w:ilvl="0" w15:tentative="1">
+      <w:start w:val="1"/>
+      <w:numFmt w:val="decimal"/>
+      <w:lvlText w:val="%1."/>
+      <w:lvlJc w:val="left"/>
+      <w:pPr>
+        <w:ind w:left="567" w:hanging="397"/>
+      </w:pPr>
+      <w:rPr>
+        <w:rFonts w:ascii="Times New Roman" w:cs="Times New Roman" w:eastAsia="Times New Roman" w:hAnsi="Times New Roman"/>
+        <w:color w:val="000000"/>
+      </w:rPr>
+    </w:lvl>
+  </w:abstractNum>
+  <w:abstractNum w:abstractNumId="10" w15:restartNumberingAfterBreak="0">
+    <w:multiLevelType w:val="hybridMultilevel"/>
+    <w:lvl w:ilvl="0" w15:tentative="1">
+      <w:start w:val="1"/>
+      <w:numFmt w:val="decimal"/>
+      <w:lvlText w:val="%1."/>
+      <w:lvlJc w:val="left"/>
+      <w:pPr>
+        <w:ind w:left="567" w:hanging="397"/>
+      </w:pPr>
+      <w:rPr>
+        <w:rFonts w:ascii="Times New Roman" w:cs="Times New Roman" w:eastAsia="Times New Roman" w:hAnsi="Times New Roman"/>
+        <w:color w:val="000000"/>
+      </w:rPr>
+    </w:lvl>
+  </w:abstractNum>
+  <w:abstractNum w:abstractNumId="11" w15:restartNumberingAfterBreak="0">
+    <w:multiLevelType w:val="hybridMultilevel"/>
+    <w:lvl w:ilvl="0" w15:tentative="1">
+      <w:start w:val="1"/>
+      <w:numFmt w:val="decimal"/>
+      <w:lvlText w:val="%1."/>
+      <w:lvlJc w:val="left"/>
+      <w:pPr>
+        <w:ind w:left="567" w:hanging="397"/>
+      </w:pPr>
+      <w:rPr>
+        <w:rFonts w:ascii="Times New Roman" w:cs="Times New Roman" w:eastAsia="Times New Roman" w:hAnsi="Times New Roman"/>
+        <w:color w:val="000000"/>
+      </w:rPr>
+    </w:lvl>
+  </w:abstractNum>
+  <w:abstractNum w:abstractNumId="12" w15:restartNumberingAfterBreak="0">
     <w:multiLevelType w:val="hybridMultilevel"/>
     <w:lvl w:ilvl="0" w15:tentative="1">
       <w:start w:val="1"/>
@@ -32878,85 +32892,85 @@
     </w:lvlOverride>
   </w:num>
   <w:num w:numId="3">
-    <w:abstractNumId w:val="2"/>
+    <w:abstractNumId w:val="3"/>
     <w:lvlOverride w:ilvl="0">
       <w:startOverride w:val="1"/>
     </w:lvlOverride>
   </w:num>
   <w:num w:numId="4">
-    <w:abstractNumId w:val="2"/>
+    <w:abstractNumId w:val="4"/>
     <w:lvlOverride w:ilvl="0">
       <w:startOverride w:val="1"/>
     </w:lvlOverride>
   </w:num>
   <w:num w:numId="5">
-    <w:abstractNumId w:val="2"/>
+    <w:abstractNumId w:val="5"/>
     <w:lvlOverride w:ilvl="0">
       <w:startOverride w:val="1"/>
     </w:lvlOverride>
   </w:num>
   <w:num w:numId="6">
-    <w:abstractNumId w:val="2"/>
+    <w:abstractNumId w:val="6"/>
     <w:lvlOverride w:ilvl="0">
       <w:startOverride w:val="1"/>
     </w:lvlOverride>
   </w:num>
   <w:num w:numId="7">
-    <w:abstractNumId w:val="3"/>
+    <w:abstractNumId w:val="12"/>
     <w:lvlOverride w:ilvl="0">
       <w:startOverride w:val="1"/>
     </w:lvlOverride>
   </w:num>
   <w:num w:numId="8">
-    <w:abstractNumId w:val="3"/>
+    <w:abstractNumId w:val="12"/>
     <w:lvlOverride w:ilvl="0">
       <w:startOverride w:val="1"/>
     </w:lvlOverride>
   </w:num>
   <w:num w:numId="9">
-    <w:abstractNumId w:val="2"/>
+    <w:abstractNumId w:val="7"/>
     <w:lvlOverride w:ilvl="0">
       <w:startOverride w:val="1"/>
     </w:lvlOverride>
   </w:num>
   <w:num w:numId="10">
-    <w:abstractNumId w:val="3"/>
+    <w:abstractNumId w:val="12"/>
     <w:lvlOverride w:ilvl="0">
       <w:startOverride w:val="1"/>
     </w:lvlOverride>
   </w:num>
   <w:num w:numId="11">
-    <w:abstractNumId w:val="2"/>
+    <w:abstractNumId w:val="8"/>
     <w:lvlOverride w:ilvl="0">
       <w:startOverride w:val="1"/>
     </w:lvlOverride>
   </w:num>
   <w:num w:numId="12">
-    <w:abstractNumId w:val="2"/>
+    <w:abstractNumId w:val="9"/>
     <w:lvlOverride w:ilvl="0">
       <w:startOverride w:val="1"/>
     </w:lvlOverride>
   </w:num>
   <w:num w:numId="13">
-    <w:abstractNumId w:val="2"/>
+    <w:abstractNumId w:val="10"/>
     <w:lvlOverride w:ilvl="0">
       <w:startOverride w:val="1"/>
     </w:lvlOverride>
   </w:num>
   <w:num w:numId="14">
-    <w:abstractNumId w:val="2"/>
+    <w:abstractNumId w:val="11"/>
     <w:lvlOverride w:ilvl="0">
       <w:startOverride w:val="1"/>
     </w:lvlOverride>
   </w:num>
   <w:num w:numId="15">
-    <w:abstractNumId w:val="3"/>
+    <w:abstractNumId w:val="12"/>
     <w:lvlOverride w:ilvl="0">
       <w:startOverride w:val="1"/>
     </w:lvlOverride>
   </w:num>
   <w:num w:numId="16">
-    <w:abstractNumId w:val="3"/>
+    <w:abstractNumId w:val="12"/>
     <w:lvlOverride w:ilvl="0">
       <w:startOverride w:val="1"/>
     </w:lvlOverride>

</xml_diff>

<commit_message>
Report: write list numbers as text so each list restarts at 1
Some viewers continue automatic numbering across all lists, which showed
items numbered 1 to 94 through the whole report. Numbers are now part of
the text, so every list under every heading starts at 1 in any viewer.

Co-Authored-By: Claude Opus 5.5 <noreply@anthropic.com>
Claude-Session: https://claude.ai/code/session_01G7W1FBPLoSQuhNKzvxRuhj
</commit_message>
<xml_diff>
--- a/docs/report/DA3_Report.docx
+++ b/docs/report/DA3_Report.docx
@@ -227,14 +227,22 @@
     </w:p>
     <w:p>
       <w:pPr>
-        <w:pStyle w:val="ListParagraph"/>
-        <w:numPr>
-          <w:ilvl w:val="0"/>
-          <w:numId w:val="2"/>
-        </w:numPr>
+        <w:tabs>
+          <w:tab w:val="left" w:pos="567"/>
+        </w:tabs>
         <w:spacing w:after="80" w:line="300"/>
+        <w:ind w:left="567" w:hanging="397"/>
         <w:jc w:val="both"/>
       </w:pPr>
+      <w:r>
+        <w:rPr>
+          <w:rFonts w:ascii="Times New Roman" w:cs="Times New Roman" w:eastAsia="Times New Roman" w:hAnsi="Times New Roman"/>
+          <w:color w:val="000000"/>
+          <w:sz w:val="24"/>
+          <w:szCs w:val="24"/>
+        </w:rPr>
+        <w:t xml:space="preserve">1.	</w:t>
+      </w:r>
       <w:r>
         <w:rPr>
           <w:rFonts w:ascii="Times New Roman" w:cs="Times New Roman" w:eastAsia="Times New Roman" w:hAnsi="Times New Roman"/>
@@ -258,14 +266,22 @@
     </w:p>
     <w:p>
       <w:pPr>
-        <w:pStyle w:val="ListParagraph"/>
-        <w:numPr>
-          <w:ilvl w:val="0"/>
-          <w:numId w:val="2"/>
-        </w:numPr>
+        <w:tabs>
+          <w:tab w:val="left" w:pos="567"/>
+        </w:tabs>
         <w:spacing w:after="80" w:line="300"/>
+        <w:ind w:left="567" w:hanging="397"/>
         <w:jc w:val="both"/>
       </w:pPr>
+      <w:r>
+        <w:rPr>
+          <w:rFonts w:ascii="Times New Roman" w:cs="Times New Roman" w:eastAsia="Times New Roman" w:hAnsi="Times New Roman"/>
+          <w:color w:val="000000"/>
+          <w:sz w:val="24"/>
+          <w:szCs w:val="24"/>
+        </w:rPr>
+        <w:t xml:space="preserve">2.	</w:t>
+      </w:r>
       <w:r>
         <w:rPr>
           <w:rFonts w:ascii="Times New Roman" w:cs="Times New Roman" w:eastAsia="Times New Roman" w:hAnsi="Times New Roman"/>
@@ -289,14 +305,22 @@
     </w:p>
     <w:p>
       <w:pPr>
-        <w:pStyle w:val="ListParagraph"/>
-        <w:numPr>
-          <w:ilvl w:val="0"/>
-          <w:numId w:val="2"/>
-        </w:numPr>
+        <w:tabs>
+          <w:tab w:val="left" w:pos="567"/>
+        </w:tabs>
         <w:spacing w:after="80" w:line="300"/>
+        <w:ind w:left="567" w:hanging="397"/>
         <w:jc w:val="both"/>
       </w:pPr>
+      <w:r>
+        <w:rPr>
+          <w:rFonts w:ascii="Times New Roman" w:cs="Times New Roman" w:eastAsia="Times New Roman" w:hAnsi="Times New Roman"/>
+          <w:color w:val="000000"/>
+          <w:sz w:val="24"/>
+          <w:szCs w:val="24"/>
+        </w:rPr>
+        <w:t xml:space="preserve">3.	</w:t>
+      </w:r>
       <w:r>
         <w:rPr>
           <w:rFonts w:ascii="Times New Roman" w:cs="Times New Roman" w:eastAsia="Times New Roman" w:hAnsi="Times New Roman"/>
@@ -320,14 +344,22 @@
     </w:p>
     <w:p>
       <w:pPr>
-        <w:pStyle w:val="ListParagraph"/>
-        <w:numPr>
-          <w:ilvl w:val="0"/>
-          <w:numId w:val="2"/>
-        </w:numPr>
+        <w:tabs>
+          <w:tab w:val="left" w:pos="567"/>
+        </w:tabs>
         <w:spacing w:after="80" w:line="300"/>
+        <w:ind w:left="567" w:hanging="397"/>
         <w:jc w:val="both"/>
       </w:pPr>
+      <w:r>
+        <w:rPr>
+          <w:rFonts w:ascii="Times New Roman" w:cs="Times New Roman" w:eastAsia="Times New Roman" w:hAnsi="Times New Roman"/>
+          <w:color w:val="000000"/>
+          <w:sz w:val="24"/>
+          <w:szCs w:val="24"/>
+        </w:rPr>
+        <w:t xml:space="preserve">4.	</w:t>
+      </w:r>
       <w:r>
         <w:rPr>
           <w:rFonts w:ascii="Times New Roman" w:cs="Times New Roman" w:eastAsia="Times New Roman" w:hAnsi="Times New Roman"/>
@@ -510,14 +542,22 @@
     </w:p>
     <w:p>
       <w:pPr>
-        <w:pStyle w:val="ListParagraph"/>
-        <w:numPr>
-          <w:ilvl w:val="0"/>
-          <w:numId w:val="3"/>
-        </w:numPr>
+        <w:tabs>
+          <w:tab w:val="left" w:pos="567"/>
+        </w:tabs>
         <w:spacing w:after="80" w:line="300"/>
+        <w:ind w:left="567" w:hanging="397"/>
         <w:jc w:val="both"/>
       </w:pPr>
+      <w:r>
+        <w:rPr>
+          <w:rFonts w:ascii="Times New Roman" w:cs="Times New Roman" w:eastAsia="Times New Roman" w:hAnsi="Times New Roman"/>
+          <w:color w:val="000000"/>
+          <w:sz w:val="24"/>
+          <w:szCs w:val="24"/>
+        </w:rPr>
+        <w:t xml:space="preserve">1.	</w:t>
+      </w:r>
       <w:r>
         <w:rPr>
           <w:rFonts w:ascii="Times New Roman" w:cs="Times New Roman" w:eastAsia="Times New Roman" w:hAnsi="Times New Roman"/>
@@ -541,14 +581,22 @@
     </w:p>
     <w:p>
       <w:pPr>
-        <w:pStyle w:val="ListParagraph"/>
-        <w:numPr>
-          <w:ilvl w:val="0"/>
-          <w:numId w:val="3"/>
-        </w:numPr>
+        <w:tabs>
+          <w:tab w:val="left" w:pos="567"/>
+        </w:tabs>
         <w:spacing w:after="80" w:line="300"/>
+        <w:ind w:left="567" w:hanging="397"/>
         <w:jc w:val="both"/>
       </w:pPr>
+      <w:r>
+        <w:rPr>
+          <w:rFonts w:ascii="Times New Roman" w:cs="Times New Roman" w:eastAsia="Times New Roman" w:hAnsi="Times New Roman"/>
+          <w:color w:val="000000"/>
+          <w:sz w:val="24"/>
+          <w:szCs w:val="24"/>
+        </w:rPr>
+        <w:t xml:space="preserve">2.	</w:t>
+      </w:r>
       <w:r>
         <w:rPr>
           <w:rFonts w:ascii="Times New Roman" w:cs="Times New Roman" w:eastAsia="Times New Roman" w:hAnsi="Times New Roman"/>
@@ -572,14 +620,22 @@
     </w:p>
     <w:p>
       <w:pPr>
-        <w:pStyle w:val="ListParagraph"/>
-        <w:numPr>
-          <w:ilvl w:val="0"/>
-          <w:numId w:val="3"/>
-        </w:numPr>
+        <w:tabs>
+          <w:tab w:val="left" w:pos="567"/>
+        </w:tabs>
         <w:spacing w:after="80" w:line="300"/>
+        <w:ind w:left="567" w:hanging="397"/>
         <w:jc w:val="both"/>
       </w:pPr>
+      <w:r>
+        <w:rPr>
+          <w:rFonts w:ascii="Times New Roman" w:cs="Times New Roman" w:eastAsia="Times New Roman" w:hAnsi="Times New Roman"/>
+          <w:color w:val="000000"/>
+          <w:sz w:val="24"/>
+          <w:szCs w:val="24"/>
+        </w:rPr>
+        <w:t xml:space="preserve">3.	</w:t>
+      </w:r>
       <w:r>
         <w:rPr>
           <w:rFonts w:ascii="Times New Roman" w:cs="Times New Roman" w:eastAsia="Times New Roman" w:hAnsi="Times New Roman"/>
@@ -603,14 +659,22 @@
     </w:p>
     <w:p>
       <w:pPr>
-        <w:pStyle w:val="ListParagraph"/>
-        <w:numPr>
-          <w:ilvl w:val="0"/>
-          <w:numId w:val="3"/>
-        </w:numPr>
+        <w:tabs>
+          <w:tab w:val="left" w:pos="567"/>
+        </w:tabs>
         <w:spacing w:after="80" w:line="300"/>
+        <w:ind w:left="567" w:hanging="397"/>
         <w:jc w:val="both"/>
       </w:pPr>
+      <w:r>
+        <w:rPr>
+          <w:rFonts w:ascii="Times New Roman" w:cs="Times New Roman" w:eastAsia="Times New Roman" w:hAnsi="Times New Roman"/>
+          <w:color w:val="000000"/>
+          <w:sz w:val="24"/>
+          <w:szCs w:val="24"/>
+        </w:rPr>
+        <w:t xml:space="preserve">4.	</w:t>
+      </w:r>
       <w:r>
         <w:rPr>
           <w:rFonts w:ascii="Times New Roman" w:cs="Times New Roman" w:eastAsia="Times New Roman" w:hAnsi="Times New Roman"/>
@@ -634,14 +698,22 @@
     </w:p>
     <w:p>
       <w:pPr>
-        <w:pStyle w:val="ListParagraph"/>
-        <w:numPr>
-          <w:ilvl w:val="0"/>
-          <w:numId w:val="3"/>
-        </w:numPr>
+        <w:tabs>
+          <w:tab w:val="left" w:pos="567"/>
+        </w:tabs>
         <w:spacing w:after="80" w:line="300"/>
+        <w:ind w:left="567" w:hanging="397"/>
         <w:jc w:val="both"/>
       </w:pPr>
+      <w:r>
+        <w:rPr>
+          <w:rFonts w:ascii="Times New Roman" w:cs="Times New Roman" w:eastAsia="Times New Roman" w:hAnsi="Times New Roman"/>
+          <w:color w:val="000000"/>
+          <w:sz w:val="24"/>
+          <w:szCs w:val="24"/>
+        </w:rPr>
+        <w:t xml:space="preserve">5.	</w:t>
+      </w:r>
       <w:r>
         <w:rPr>
           <w:rFonts w:ascii="Times New Roman" w:cs="Times New Roman" w:eastAsia="Times New Roman" w:hAnsi="Times New Roman"/>
@@ -9308,14 +9380,22 @@
     </w:p>
     <w:p>
       <w:pPr>
-        <w:pStyle w:val="ListParagraph"/>
-        <w:numPr>
-          <w:ilvl w:val="0"/>
-          <w:numId w:val="4"/>
-        </w:numPr>
+        <w:tabs>
+          <w:tab w:val="left" w:pos="567"/>
+        </w:tabs>
         <w:spacing w:after="80" w:line="300"/>
+        <w:ind w:left="567" w:hanging="397"/>
         <w:jc w:val="both"/>
       </w:pPr>
+      <w:r>
+        <w:rPr>
+          <w:rFonts w:ascii="Times New Roman" w:cs="Times New Roman" w:eastAsia="Times New Roman" w:hAnsi="Times New Roman"/>
+          <w:color w:val="000000"/>
+          <w:sz w:val="24"/>
+          <w:szCs w:val="24"/>
+        </w:rPr>
+        <w:t xml:space="preserve">1.	</w:t>
+      </w:r>
       <w:r>
         <w:rPr>
           <w:rFonts w:ascii="Times New Roman" w:cs="Times New Roman" w:eastAsia="Times New Roman" w:hAnsi="Times New Roman"/>
@@ -9339,14 +9419,22 @@
     </w:p>
     <w:p>
       <w:pPr>
-        <w:pStyle w:val="ListParagraph"/>
-        <w:numPr>
-          <w:ilvl w:val="0"/>
-          <w:numId w:val="4"/>
-        </w:numPr>
+        <w:tabs>
+          <w:tab w:val="left" w:pos="567"/>
+        </w:tabs>
         <w:spacing w:after="80" w:line="300"/>
+        <w:ind w:left="567" w:hanging="397"/>
         <w:jc w:val="both"/>
       </w:pPr>
+      <w:r>
+        <w:rPr>
+          <w:rFonts w:ascii="Times New Roman" w:cs="Times New Roman" w:eastAsia="Times New Roman" w:hAnsi="Times New Roman"/>
+          <w:color w:val="000000"/>
+          <w:sz w:val="24"/>
+          <w:szCs w:val="24"/>
+        </w:rPr>
+        <w:t xml:space="preserve">2.	</w:t>
+      </w:r>
       <w:r>
         <w:rPr>
           <w:rFonts w:ascii="Times New Roman" w:cs="Times New Roman" w:eastAsia="Times New Roman" w:hAnsi="Times New Roman"/>
@@ -9370,14 +9458,22 @@
     </w:p>
     <w:p>
       <w:pPr>
-        <w:pStyle w:val="ListParagraph"/>
-        <w:numPr>
-          <w:ilvl w:val="0"/>
-          <w:numId w:val="4"/>
-        </w:numPr>
+        <w:tabs>
+          <w:tab w:val="left" w:pos="567"/>
+        </w:tabs>
         <w:spacing w:after="80" w:line="300"/>
+        <w:ind w:left="567" w:hanging="397"/>
         <w:jc w:val="both"/>
       </w:pPr>
+      <w:r>
+        <w:rPr>
+          <w:rFonts w:ascii="Times New Roman" w:cs="Times New Roman" w:eastAsia="Times New Roman" w:hAnsi="Times New Roman"/>
+          <w:color w:val="000000"/>
+          <w:sz w:val="24"/>
+          <w:szCs w:val="24"/>
+        </w:rPr>
+        <w:t xml:space="preserve">3.	</w:t>
+      </w:r>
       <w:r>
         <w:rPr>
           <w:rFonts w:ascii="Times New Roman" w:cs="Times New Roman" w:eastAsia="Times New Roman" w:hAnsi="Times New Roman"/>
@@ -9401,14 +9497,22 @@
     </w:p>
     <w:p>
       <w:pPr>
-        <w:pStyle w:val="ListParagraph"/>
-        <w:numPr>
-          <w:ilvl w:val="0"/>
-          <w:numId w:val="4"/>
-        </w:numPr>
+        <w:tabs>
+          <w:tab w:val="left" w:pos="567"/>
+        </w:tabs>
         <w:spacing w:after="80" w:line="300"/>
+        <w:ind w:left="567" w:hanging="397"/>
         <w:jc w:val="both"/>
       </w:pPr>
+      <w:r>
+        <w:rPr>
+          <w:rFonts w:ascii="Times New Roman" w:cs="Times New Roman" w:eastAsia="Times New Roman" w:hAnsi="Times New Roman"/>
+          <w:color w:val="000000"/>
+          <w:sz w:val="24"/>
+          <w:szCs w:val="24"/>
+        </w:rPr>
+        <w:t xml:space="preserve">4.	</w:t>
+      </w:r>
       <w:r>
         <w:rPr>
           <w:rFonts w:ascii="Times New Roman" w:cs="Times New Roman" w:eastAsia="Times New Roman" w:hAnsi="Times New Roman"/>
@@ -9432,14 +9536,22 @@
     </w:p>
     <w:p>
       <w:pPr>
-        <w:pStyle w:val="ListParagraph"/>
-        <w:numPr>
-          <w:ilvl w:val="0"/>
-          <w:numId w:val="4"/>
-        </w:numPr>
+        <w:tabs>
+          <w:tab w:val="left" w:pos="567"/>
+        </w:tabs>
         <w:spacing w:after="80" w:line="300"/>
+        <w:ind w:left="567" w:hanging="397"/>
         <w:jc w:val="both"/>
       </w:pPr>
+      <w:r>
+        <w:rPr>
+          <w:rFonts w:ascii="Times New Roman" w:cs="Times New Roman" w:eastAsia="Times New Roman" w:hAnsi="Times New Roman"/>
+          <w:color w:val="000000"/>
+          <w:sz w:val="24"/>
+          <w:szCs w:val="24"/>
+        </w:rPr>
+        <w:t xml:space="preserve">5.	</w:t>
+      </w:r>
       <w:r>
         <w:rPr>
           <w:rFonts w:ascii="Times New Roman" w:cs="Times New Roman" w:eastAsia="Times New Roman" w:hAnsi="Times New Roman"/>
@@ -9463,14 +9575,22 @@
     </w:p>
     <w:p>
       <w:pPr>
-        <w:pStyle w:val="ListParagraph"/>
-        <w:numPr>
-          <w:ilvl w:val="0"/>
-          <w:numId w:val="4"/>
-        </w:numPr>
+        <w:tabs>
+          <w:tab w:val="left" w:pos="567"/>
+        </w:tabs>
         <w:spacing w:after="80" w:line="300"/>
+        <w:ind w:left="567" w:hanging="397"/>
         <w:jc w:val="both"/>
       </w:pPr>
+      <w:r>
+        <w:rPr>
+          <w:rFonts w:ascii="Times New Roman" w:cs="Times New Roman" w:eastAsia="Times New Roman" w:hAnsi="Times New Roman"/>
+          <w:color w:val="000000"/>
+          <w:sz w:val="24"/>
+          <w:szCs w:val="24"/>
+        </w:rPr>
+        <w:t xml:space="preserve">6.	</w:t>
+      </w:r>
       <w:r>
         <w:rPr>
           <w:rFonts w:ascii="Times New Roman" w:cs="Times New Roman" w:eastAsia="Times New Roman" w:hAnsi="Times New Roman"/>
@@ -9494,14 +9614,22 @@
     </w:p>
     <w:p>
       <w:pPr>
-        <w:pStyle w:val="ListParagraph"/>
-        <w:numPr>
-          <w:ilvl w:val="0"/>
-          <w:numId w:val="4"/>
-        </w:numPr>
+        <w:tabs>
+          <w:tab w:val="left" w:pos="567"/>
+        </w:tabs>
         <w:spacing w:after="80" w:line="300"/>
+        <w:ind w:left="567" w:hanging="397"/>
         <w:jc w:val="both"/>
       </w:pPr>
+      <w:r>
+        <w:rPr>
+          <w:rFonts w:ascii="Times New Roman" w:cs="Times New Roman" w:eastAsia="Times New Roman" w:hAnsi="Times New Roman"/>
+          <w:color w:val="000000"/>
+          <w:sz w:val="24"/>
+          <w:szCs w:val="24"/>
+        </w:rPr>
+        <w:t xml:space="preserve">7.	</w:t>
+      </w:r>
       <w:r>
         <w:rPr>
           <w:rFonts w:ascii="Times New Roman" w:cs="Times New Roman" w:eastAsia="Times New Roman" w:hAnsi="Times New Roman"/>
@@ -9525,14 +9653,22 @@
     </w:p>
     <w:p>
       <w:pPr>
-        <w:pStyle w:val="ListParagraph"/>
-        <w:numPr>
-          <w:ilvl w:val="0"/>
-          <w:numId w:val="4"/>
-        </w:numPr>
+        <w:tabs>
+          <w:tab w:val="left" w:pos="567"/>
+        </w:tabs>
         <w:spacing w:after="80" w:line="300"/>
+        <w:ind w:left="567" w:hanging="397"/>
         <w:jc w:val="both"/>
       </w:pPr>
+      <w:r>
+        <w:rPr>
+          <w:rFonts w:ascii="Times New Roman" w:cs="Times New Roman" w:eastAsia="Times New Roman" w:hAnsi="Times New Roman"/>
+          <w:color w:val="000000"/>
+          <w:sz w:val="24"/>
+          <w:szCs w:val="24"/>
+        </w:rPr>
+        <w:t xml:space="preserve">8.	</w:t>
+      </w:r>
       <w:r>
         <w:rPr>
           <w:rFonts w:ascii="Times New Roman" w:cs="Times New Roman" w:eastAsia="Times New Roman" w:hAnsi="Times New Roman"/>
@@ -9556,14 +9692,22 @@
     </w:p>
     <w:p>
       <w:pPr>
-        <w:pStyle w:val="ListParagraph"/>
-        <w:numPr>
-          <w:ilvl w:val="0"/>
-          <w:numId w:val="4"/>
-        </w:numPr>
+        <w:tabs>
+          <w:tab w:val="left" w:pos="567"/>
+        </w:tabs>
         <w:spacing w:after="80" w:line="300"/>
+        <w:ind w:left="567" w:hanging="397"/>
         <w:jc w:val="both"/>
       </w:pPr>
+      <w:r>
+        <w:rPr>
+          <w:rFonts w:ascii="Times New Roman" w:cs="Times New Roman" w:eastAsia="Times New Roman" w:hAnsi="Times New Roman"/>
+          <w:color w:val="000000"/>
+          <w:sz w:val="24"/>
+          <w:szCs w:val="24"/>
+        </w:rPr>
+        <w:t xml:space="preserve">9.	</w:t>
+      </w:r>
       <w:r>
         <w:rPr>
           <w:rFonts w:ascii="Times New Roman" w:cs="Times New Roman" w:eastAsia="Times New Roman" w:hAnsi="Times New Roman"/>
@@ -9587,14 +9731,22 @@
     </w:p>
     <w:p>
       <w:pPr>
-        <w:pStyle w:val="ListParagraph"/>
-        <w:numPr>
-          <w:ilvl w:val="0"/>
-          <w:numId w:val="4"/>
-        </w:numPr>
+        <w:tabs>
+          <w:tab w:val="left" w:pos="567"/>
+        </w:tabs>
         <w:spacing w:after="80" w:line="300"/>
+        <w:ind w:left="567" w:hanging="397"/>
         <w:jc w:val="both"/>
       </w:pPr>
+      <w:r>
+        <w:rPr>
+          <w:rFonts w:ascii="Times New Roman" w:cs="Times New Roman" w:eastAsia="Times New Roman" w:hAnsi="Times New Roman"/>
+          <w:color w:val="000000"/>
+          <w:sz w:val="24"/>
+          <w:szCs w:val="24"/>
+        </w:rPr>
+        <w:t xml:space="preserve">10.	</w:t>
+      </w:r>
       <w:r>
         <w:rPr>
           <w:rFonts w:ascii="Times New Roman" w:cs="Times New Roman" w:eastAsia="Times New Roman" w:hAnsi="Times New Roman"/>
@@ -9618,14 +9770,22 @@
     </w:p>
     <w:p>
       <w:pPr>
-        <w:pStyle w:val="ListParagraph"/>
-        <w:numPr>
-          <w:ilvl w:val="0"/>
-          <w:numId w:val="4"/>
-        </w:numPr>
+        <w:tabs>
+          <w:tab w:val="left" w:pos="567"/>
+        </w:tabs>
         <w:spacing w:after="80" w:line="300"/>
+        <w:ind w:left="567" w:hanging="397"/>
         <w:jc w:val="both"/>
       </w:pPr>
+      <w:r>
+        <w:rPr>
+          <w:rFonts w:ascii="Times New Roman" w:cs="Times New Roman" w:eastAsia="Times New Roman" w:hAnsi="Times New Roman"/>
+          <w:color w:val="000000"/>
+          <w:sz w:val="24"/>
+          <w:szCs w:val="24"/>
+        </w:rPr>
+        <w:t xml:space="preserve">11.	</w:t>
+      </w:r>
       <w:r>
         <w:rPr>
           <w:rFonts w:ascii="Times New Roman" w:cs="Times New Roman" w:eastAsia="Times New Roman" w:hAnsi="Times New Roman"/>
@@ -9649,14 +9809,22 @@
     </w:p>
     <w:p>
       <w:pPr>
-        <w:pStyle w:val="ListParagraph"/>
-        <w:numPr>
-          <w:ilvl w:val="0"/>
-          <w:numId w:val="4"/>
-        </w:numPr>
+        <w:tabs>
+          <w:tab w:val="left" w:pos="567"/>
+        </w:tabs>
         <w:spacing w:after="80" w:line="300"/>
+        <w:ind w:left="567" w:hanging="397"/>
         <w:jc w:val="both"/>
       </w:pPr>
+      <w:r>
+        <w:rPr>
+          <w:rFonts w:ascii="Times New Roman" w:cs="Times New Roman" w:eastAsia="Times New Roman" w:hAnsi="Times New Roman"/>
+          <w:color w:val="000000"/>
+          <w:sz w:val="24"/>
+          <w:szCs w:val="24"/>
+        </w:rPr>
+        <w:t xml:space="preserve">12.	</w:t>
+      </w:r>
       <w:r>
         <w:rPr>
           <w:rFonts w:ascii="Times New Roman" w:cs="Times New Roman" w:eastAsia="Times New Roman" w:hAnsi="Times New Roman"/>
@@ -9680,14 +9848,22 @@
     </w:p>
     <w:p>
       <w:pPr>
-        <w:pStyle w:val="ListParagraph"/>
-        <w:numPr>
-          <w:ilvl w:val="0"/>
-          <w:numId w:val="4"/>
-        </w:numPr>
+        <w:tabs>
+          <w:tab w:val="left" w:pos="567"/>
+        </w:tabs>
         <w:spacing w:after="80" w:line="300"/>
+        <w:ind w:left="567" w:hanging="397"/>
         <w:jc w:val="both"/>
       </w:pPr>
+      <w:r>
+        <w:rPr>
+          <w:rFonts w:ascii="Times New Roman" w:cs="Times New Roman" w:eastAsia="Times New Roman" w:hAnsi="Times New Roman"/>
+          <w:color w:val="000000"/>
+          <w:sz w:val="24"/>
+          <w:szCs w:val="24"/>
+        </w:rPr>
+        <w:t xml:space="preserve">13.	</w:t>
+      </w:r>
       <w:r>
         <w:rPr>
           <w:rFonts w:ascii="Times New Roman" w:cs="Times New Roman" w:eastAsia="Times New Roman" w:hAnsi="Times New Roman"/>
@@ -9884,14 +10060,22 @@
     </w:p>
     <w:p>
       <w:pPr>
-        <w:pStyle w:val="ListParagraph"/>
-        <w:numPr>
-          <w:ilvl w:val="0"/>
-          <w:numId w:val="5"/>
-        </w:numPr>
+        <w:tabs>
+          <w:tab w:val="left" w:pos="567"/>
+        </w:tabs>
         <w:spacing w:after="80" w:line="300"/>
+        <w:ind w:left="567" w:hanging="397"/>
         <w:jc w:val="both"/>
       </w:pPr>
+      <w:r>
+        <w:rPr>
+          <w:rFonts w:ascii="Times New Roman" w:cs="Times New Roman" w:eastAsia="Times New Roman" w:hAnsi="Times New Roman"/>
+          <w:color w:val="000000"/>
+          <w:sz w:val="24"/>
+          <w:szCs w:val="24"/>
+        </w:rPr>
+        <w:t xml:space="preserve">1.	</w:t>
+      </w:r>
       <w:r>
         <w:rPr>
           <w:rFonts w:ascii="Times New Roman" w:cs="Times New Roman" w:eastAsia="Times New Roman" w:hAnsi="Times New Roman"/>
@@ -9915,14 +10099,22 @@
     </w:p>
     <w:p>
       <w:pPr>
-        <w:pStyle w:val="ListParagraph"/>
-        <w:numPr>
-          <w:ilvl w:val="0"/>
-          <w:numId w:val="5"/>
-        </w:numPr>
+        <w:tabs>
+          <w:tab w:val="left" w:pos="567"/>
+        </w:tabs>
         <w:spacing w:after="80" w:line="300"/>
+        <w:ind w:left="567" w:hanging="397"/>
         <w:jc w:val="both"/>
       </w:pPr>
+      <w:r>
+        <w:rPr>
+          <w:rFonts w:ascii="Times New Roman" w:cs="Times New Roman" w:eastAsia="Times New Roman" w:hAnsi="Times New Roman"/>
+          <w:color w:val="000000"/>
+          <w:sz w:val="24"/>
+          <w:szCs w:val="24"/>
+        </w:rPr>
+        <w:t xml:space="preserve">2.	</w:t>
+      </w:r>
       <w:r>
         <w:rPr>
           <w:rFonts w:ascii="Times New Roman" w:cs="Times New Roman" w:eastAsia="Times New Roman" w:hAnsi="Times New Roman"/>
@@ -9946,14 +10138,22 @@
     </w:p>
     <w:p>
       <w:pPr>
-        <w:pStyle w:val="ListParagraph"/>
-        <w:numPr>
-          <w:ilvl w:val="0"/>
-          <w:numId w:val="5"/>
-        </w:numPr>
+        <w:tabs>
+          <w:tab w:val="left" w:pos="567"/>
+        </w:tabs>
         <w:spacing w:after="80" w:line="300"/>
+        <w:ind w:left="567" w:hanging="397"/>
         <w:jc w:val="both"/>
       </w:pPr>
+      <w:r>
+        <w:rPr>
+          <w:rFonts w:ascii="Times New Roman" w:cs="Times New Roman" w:eastAsia="Times New Roman" w:hAnsi="Times New Roman"/>
+          <w:color w:val="000000"/>
+          <w:sz w:val="24"/>
+          <w:szCs w:val="24"/>
+        </w:rPr>
+        <w:t xml:space="preserve">3.	</w:t>
+      </w:r>
       <w:r>
         <w:rPr>
           <w:rFonts w:ascii="Times New Roman" w:cs="Times New Roman" w:eastAsia="Times New Roman" w:hAnsi="Times New Roman"/>
@@ -9977,14 +10177,22 @@
     </w:p>
     <w:p>
       <w:pPr>
-        <w:pStyle w:val="ListParagraph"/>
-        <w:numPr>
-          <w:ilvl w:val="0"/>
-          <w:numId w:val="5"/>
-        </w:numPr>
+        <w:tabs>
+          <w:tab w:val="left" w:pos="567"/>
+        </w:tabs>
         <w:spacing w:after="80" w:line="300"/>
+        <w:ind w:left="567" w:hanging="397"/>
         <w:jc w:val="both"/>
       </w:pPr>
+      <w:r>
+        <w:rPr>
+          <w:rFonts w:ascii="Times New Roman" w:cs="Times New Roman" w:eastAsia="Times New Roman" w:hAnsi="Times New Roman"/>
+          <w:color w:val="000000"/>
+          <w:sz w:val="24"/>
+          <w:szCs w:val="24"/>
+        </w:rPr>
+        <w:t xml:space="preserve">4.	</w:t>
+      </w:r>
       <w:r>
         <w:rPr>
           <w:rFonts w:ascii="Times New Roman" w:cs="Times New Roman" w:eastAsia="Times New Roman" w:hAnsi="Times New Roman"/>
@@ -10312,14 +10520,22 @@
     </w:p>
     <w:p>
       <w:pPr>
-        <w:pStyle w:val="ListParagraph"/>
-        <w:numPr>
-          <w:ilvl w:val="0"/>
-          <w:numId w:val="6"/>
-        </w:numPr>
+        <w:tabs>
+          <w:tab w:val="left" w:pos="567"/>
+        </w:tabs>
         <w:spacing w:after="80" w:line="300"/>
+        <w:ind w:left="567" w:hanging="397"/>
         <w:jc w:val="both"/>
       </w:pPr>
+      <w:r>
+        <w:rPr>
+          <w:rFonts w:ascii="Times New Roman" w:cs="Times New Roman" w:eastAsia="Times New Roman" w:hAnsi="Times New Roman"/>
+          <w:color w:val="000000"/>
+          <w:sz w:val="24"/>
+          <w:szCs w:val="24"/>
+        </w:rPr>
+        <w:t xml:space="preserve">1.	</w:t>
+      </w:r>
       <w:r>
         <w:rPr>
           <w:rFonts w:ascii="Times New Roman" w:cs="Times New Roman" w:eastAsia="Times New Roman" w:hAnsi="Times New Roman"/>
@@ -10343,14 +10559,22 @@
     </w:p>
     <w:p>
       <w:pPr>
-        <w:pStyle w:val="ListParagraph"/>
-        <w:numPr>
-          <w:ilvl w:val="0"/>
-          <w:numId w:val="6"/>
-        </w:numPr>
+        <w:tabs>
+          <w:tab w:val="left" w:pos="567"/>
+        </w:tabs>
         <w:spacing w:after="80" w:line="300"/>
+        <w:ind w:left="567" w:hanging="397"/>
         <w:jc w:val="both"/>
       </w:pPr>
+      <w:r>
+        <w:rPr>
+          <w:rFonts w:ascii="Times New Roman" w:cs="Times New Roman" w:eastAsia="Times New Roman" w:hAnsi="Times New Roman"/>
+          <w:color w:val="000000"/>
+          <w:sz w:val="24"/>
+          <w:szCs w:val="24"/>
+        </w:rPr>
+        <w:t xml:space="preserve">2.	</w:t>
+      </w:r>
       <w:r>
         <w:rPr>
           <w:rFonts w:ascii="Times New Roman" w:cs="Times New Roman" w:eastAsia="Times New Roman" w:hAnsi="Times New Roman"/>
@@ -10374,14 +10598,22 @@
     </w:p>
     <w:p>
       <w:pPr>
-        <w:pStyle w:val="ListParagraph"/>
-        <w:numPr>
-          <w:ilvl w:val="0"/>
-          <w:numId w:val="6"/>
-        </w:numPr>
+        <w:tabs>
+          <w:tab w:val="left" w:pos="567"/>
+        </w:tabs>
         <w:spacing w:after="80" w:line="300"/>
+        <w:ind w:left="567" w:hanging="397"/>
         <w:jc w:val="both"/>
       </w:pPr>
+      <w:r>
+        <w:rPr>
+          <w:rFonts w:ascii="Times New Roman" w:cs="Times New Roman" w:eastAsia="Times New Roman" w:hAnsi="Times New Roman"/>
+          <w:color w:val="000000"/>
+          <w:sz w:val="24"/>
+          <w:szCs w:val="24"/>
+        </w:rPr>
+        <w:t xml:space="preserve">3.	</w:t>
+      </w:r>
       <w:r>
         <w:rPr>
           <w:rFonts w:ascii="Times New Roman" w:cs="Times New Roman" w:eastAsia="Times New Roman" w:hAnsi="Times New Roman"/>
@@ -10425,14 +10657,22 @@
     </w:p>
     <w:p>
       <w:pPr>
-        <w:pStyle w:val="ListParagraph"/>
-        <w:numPr>
-          <w:ilvl w:val="0"/>
-          <w:numId w:val="6"/>
-        </w:numPr>
+        <w:tabs>
+          <w:tab w:val="left" w:pos="567"/>
+        </w:tabs>
         <w:spacing w:after="80" w:line="300"/>
+        <w:ind w:left="567" w:hanging="397"/>
         <w:jc w:val="both"/>
       </w:pPr>
+      <w:r>
+        <w:rPr>
+          <w:rFonts w:ascii="Times New Roman" w:cs="Times New Roman" w:eastAsia="Times New Roman" w:hAnsi="Times New Roman"/>
+          <w:color w:val="000000"/>
+          <w:sz w:val="24"/>
+          <w:szCs w:val="24"/>
+        </w:rPr>
+        <w:t xml:space="preserve">4.	</w:t>
+      </w:r>
       <w:r>
         <w:rPr>
           <w:rFonts w:ascii="Times New Roman" w:cs="Times New Roman" w:eastAsia="Times New Roman" w:hAnsi="Times New Roman"/>
@@ -10527,7 +10767,7 @@
         <w:pStyle w:val="ListParagraph"/>
         <w:numPr>
           <w:ilvl w:val="0"/>
-          <w:numId w:val="7"/>
+          <w:numId w:val="2"/>
         </w:numPr>
         <w:spacing w:after="80" w:line="300"/>
         <w:jc w:val="both"/>
@@ -10558,7 +10798,7 @@
         <w:pStyle w:val="ListParagraph"/>
         <w:numPr>
           <w:ilvl w:val="0"/>
-          <w:numId w:val="7"/>
+          <w:numId w:val="2"/>
         </w:numPr>
         <w:spacing w:after="80" w:line="300"/>
         <w:jc w:val="both"/>
@@ -10589,7 +10829,7 @@
         <w:pStyle w:val="ListParagraph"/>
         <w:numPr>
           <w:ilvl w:val="0"/>
-          <w:numId w:val="7"/>
+          <w:numId w:val="2"/>
         </w:numPr>
         <w:spacing w:after="80" w:line="300"/>
         <w:jc w:val="both"/>
@@ -10620,7 +10860,7 @@
         <w:pStyle w:val="ListParagraph"/>
         <w:numPr>
           <w:ilvl w:val="0"/>
-          <w:numId w:val="7"/>
+          <w:numId w:val="2"/>
         </w:numPr>
         <w:spacing w:after="80" w:line="300"/>
         <w:jc w:val="both"/>
@@ -10889,7 +11129,7 @@
         <w:pStyle w:val="ListParagraph"/>
         <w:numPr>
           <w:ilvl w:val="0"/>
-          <w:numId w:val="8"/>
+          <w:numId w:val="3"/>
         </w:numPr>
         <w:spacing w:after="80" w:line="300"/>
         <w:jc w:val="both"/>
@@ -10940,7 +11180,7 @@
         <w:pStyle w:val="ListParagraph"/>
         <w:numPr>
           <w:ilvl w:val="0"/>
-          <w:numId w:val="8"/>
+          <w:numId w:val="3"/>
         </w:numPr>
         <w:spacing w:after="80" w:line="300"/>
         <w:jc w:val="both"/>
@@ -10971,7 +11211,7 @@
         <w:pStyle w:val="ListParagraph"/>
         <w:numPr>
           <w:ilvl w:val="0"/>
-          <w:numId w:val="8"/>
+          <w:numId w:val="3"/>
         </w:numPr>
         <w:spacing w:after="80" w:line="300"/>
         <w:jc w:val="both"/>
@@ -11002,7 +11242,7 @@
         <w:pStyle w:val="ListParagraph"/>
         <w:numPr>
           <w:ilvl w:val="0"/>
-          <w:numId w:val="8"/>
+          <w:numId w:val="3"/>
         </w:numPr>
         <w:spacing w:after="80" w:line="300"/>
         <w:jc w:val="both"/>
@@ -12063,14 +12303,22 @@
     </w:p>
     <w:p>
       <w:pPr>
-        <w:pStyle w:val="ListParagraph"/>
-        <w:numPr>
-          <w:ilvl w:val="0"/>
-          <w:numId w:val="9"/>
-        </w:numPr>
+        <w:tabs>
+          <w:tab w:val="left" w:pos="567"/>
+        </w:tabs>
         <w:spacing w:after="80" w:line="300"/>
+        <w:ind w:left="567" w:hanging="397"/>
         <w:jc w:val="both"/>
       </w:pPr>
+      <w:r>
+        <w:rPr>
+          <w:rFonts w:ascii="Times New Roman" w:cs="Times New Roman" w:eastAsia="Times New Roman" w:hAnsi="Times New Roman"/>
+          <w:color w:val="000000"/>
+          <w:sz w:val="24"/>
+          <w:szCs w:val="24"/>
+        </w:rPr>
+        <w:t xml:space="preserve">1.	</w:t>
+      </w:r>
       <w:r>
         <w:rPr>
           <w:rFonts w:ascii="Times New Roman" w:cs="Times New Roman" w:eastAsia="Times New Roman" w:hAnsi="Times New Roman"/>
@@ -12094,14 +12342,22 @@
     </w:p>
     <w:p>
       <w:pPr>
-        <w:pStyle w:val="ListParagraph"/>
-        <w:numPr>
-          <w:ilvl w:val="0"/>
-          <w:numId w:val="9"/>
-        </w:numPr>
+        <w:tabs>
+          <w:tab w:val="left" w:pos="567"/>
+        </w:tabs>
         <w:spacing w:after="80" w:line="300"/>
+        <w:ind w:left="567" w:hanging="397"/>
         <w:jc w:val="both"/>
       </w:pPr>
+      <w:r>
+        <w:rPr>
+          <w:rFonts w:ascii="Times New Roman" w:cs="Times New Roman" w:eastAsia="Times New Roman" w:hAnsi="Times New Roman"/>
+          <w:color w:val="000000"/>
+          <w:sz w:val="24"/>
+          <w:szCs w:val="24"/>
+        </w:rPr>
+        <w:t xml:space="preserve">2.	</w:t>
+      </w:r>
       <w:r>
         <w:rPr>
           <w:rFonts w:ascii="Times New Roman" w:cs="Times New Roman" w:eastAsia="Times New Roman" w:hAnsi="Times New Roman"/>
@@ -12125,14 +12381,22 @@
     </w:p>
     <w:p>
       <w:pPr>
-        <w:pStyle w:val="ListParagraph"/>
-        <w:numPr>
-          <w:ilvl w:val="0"/>
-          <w:numId w:val="9"/>
-        </w:numPr>
+        <w:tabs>
+          <w:tab w:val="left" w:pos="567"/>
+        </w:tabs>
         <w:spacing w:after="80" w:line="300"/>
+        <w:ind w:left="567" w:hanging="397"/>
         <w:jc w:val="both"/>
       </w:pPr>
+      <w:r>
+        <w:rPr>
+          <w:rFonts w:ascii="Times New Roman" w:cs="Times New Roman" w:eastAsia="Times New Roman" w:hAnsi="Times New Roman"/>
+          <w:color w:val="000000"/>
+          <w:sz w:val="24"/>
+          <w:szCs w:val="24"/>
+        </w:rPr>
+        <w:t xml:space="preserve">3.	</w:t>
+      </w:r>
       <w:r>
         <w:rPr>
           <w:rFonts w:ascii="Times New Roman" w:cs="Times New Roman" w:eastAsia="Times New Roman" w:hAnsi="Times New Roman"/>
@@ -12156,14 +12420,22 @@
     </w:p>
     <w:p>
       <w:pPr>
-        <w:pStyle w:val="ListParagraph"/>
-        <w:numPr>
-          <w:ilvl w:val="0"/>
-          <w:numId w:val="9"/>
-        </w:numPr>
+        <w:tabs>
+          <w:tab w:val="left" w:pos="567"/>
+        </w:tabs>
         <w:spacing w:after="80" w:line="300"/>
+        <w:ind w:left="567" w:hanging="397"/>
         <w:jc w:val="both"/>
       </w:pPr>
+      <w:r>
+        <w:rPr>
+          <w:rFonts w:ascii="Times New Roman" w:cs="Times New Roman" w:eastAsia="Times New Roman" w:hAnsi="Times New Roman"/>
+          <w:color w:val="000000"/>
+          <w:sz w:val="24"/>
+          <w:szCs w:val="24"/>
+        </w:rPr>
+        <w:t xml:space="preserve">4.	</w:t>
+      </w:r>
       <w:r>
         <w:rPr>
           <w:rFonts w:ascii="Times New Roman" w:cs="Times New Roman" w:eastAsia="Times New Roman" w:hAnsi="Times New Roman"/>
@@ -12187,14 +12459,22 @@
     </w:p>
     <w:p>
       <w:pPr>
-        <w:pStyle w:val="ListParagraph"/>
-        <w:numPr>
-          <w:ilvl w:val="0"/>
-          <w:numId w:val="9"/>
-        </w:numPr>
+        <w:tabs>
+          <w:tab w:val="left" w:pos="567"/>
+        </w:tabs>
         <w:spacing w:after="80" w:line="300"/>
+        <w:ind w:left="567" w:hanging="397"/>
         <w:jc w:val="both"/>
       </w:pPr>
+      <w:r>
+        <w:rPr>
+          <w:rFonts w:ascii="Times New Roman" w:cs="Times New Roman" w:eastAsia="Times New Roman" w:hAnsi="Times New Roman"/>
+          <w:color w:val="000000"/>
+          <w:sz w:val="24"/>
+          <w:szCs w:val="24"/>
+        </w:rPr>
+        <w:t xml:space="preserve">5.	</w:t>
+      </w:r>
       <w:r>
         <w:rPr>
           <w:rFonts w:ascii="Times New Roman" w:cs="Times New Roman" w:eastAsia="Times New Roman" w:hAnsi="Times New Roman"/>
@@ -15509,7 +15789,7 @@
         <w:pStyle w:val="ListParagraph"/>
         <w:numPr>
           <w:ilvl w:val="0"/>
-          <w:numId w:val="10"/>
+          <w:numId w:val="4"/>
         </w:numPr>
         <w:spacing w:after="80" w:line="300"/>
         <w:jc w:val="both"/>
@@ -15529,7 +15809,7 @@
         <w:pStyle w:val="ListParagraph"/>
         <w:numPr>
           <w:ilvl w:val="0"/>
-          <w:numId w:val="10"/>
+          <w:numId w:val="4"/>
         </w:numPr>
         <w:spacing w:after="80" w:line="300"/>
         <w:jc w:val="both"/>
@@ -15549,7 +15829,7 @@
         <w:pStyle w:val="ListParagraph"/>
         <w:numPr>
           <w:ilvl w:val="0"/>
-          <w:numId w:val="10"/>
+          <w:numId w:val="4"/>
         </w:numPr>
         <w:spacing w:after="80" w:line="300"/>
         <w:jc w:val="both"/>
@@ -25605,14 +25885,22 @@
     </w:p>
     <w:p>
       <w:pPr>
-        <w:pStyle w:val="ListParagraph"/>
-        <w:numPr>
-          <w:ilvl w:val="0"/>
-          <w:numId w:val="11"/>
-        </w:numPr>
+        <w:tabs>
+          <w:tab w:val="left" w:pos="567"/>
+        </w:tabs>
         <w:spacing w:after="80" w:line="300"/>
+        <w:ind w:left="567" w:hanging="397"/>
         <w:jc w:val="both"/>
       </w:pPr>
+      <w:r>
+        <w:rPr>
+          <w:rFonts w:ascii="Times New Roman" w:cs="Times New Roman" w:eastAsia="Times New Roman" w:hAnsi="Times New Roman"/>
+          <w:color w:val="000000"/>
+          <w:sz w:val="24"/>
+          <w:szCs w:val="24"/>
+        </w:rPr>
+        <w:t xml:space="preserve">1.	</w:t>
+      </w:r>
       <w:r>
         <w:rPr>
           <w:rFonts w:ascii="Times New Roman" w:cs="Times New Roman" w:eastAsia="Times New Roman" w:hAnsi="Times New Roman"/>
@@ -25636,14 +25924,22 @@
     </w:p>
     <w:p>
       <w:pPr>
-        <w:pStyle w:val="ListParagraph"/>
-        <w:numPr>
-          <w:ilvl w:val="0"/>
-          <w:numId w:val="11"/>
-        </w:numPr>
+        <w:tabs>
+          <w:tab w:val="left" w:pos="567"/>
+        </w:tabs>
         <w:spacing w:after="80" w:line="300"/>
+        <w:ind w:left="567" w:hanging="397"/>
         <w:jc w:val="both"/>
       </w:pPr>
+      <w:r>
+        <w:rPr>
+          <w:rFonts w:ascii="Times New Roman" w:cs="Times New Roman" w:eastAsia="Times New Roman" w:hAnsi="Times New Roman"/>
+          <w:color w:val="000000"/>
+          <w:sz w:val="24"/>
+          <w:szCs w:val="24"/>
+        </w:rPr>
+        <w:t xml:space="preserve">2.	</w:t>
+      </w:r>
       <w:r>
         <w:rPr>
           <w:rFonts w:ascii="Times New Roman" w:cs="Times New Roman" w:eastAsia="Times New Roman" w:hAnsi="Times New Roman"/>
@@ -25667,14 +25963,22 @@
     </w:p>
     <w:p>
       <w:pPr>
-        <w:pStyle w:val="ListParagraph"/>
-        <w:numPr>
-          <w:ilvl w:val="0"/>
-          <w:numId w:val="11"/>
-        </w:numPr>
+        <w:tabs>
+          <w:tab w:val="left" w:pos="567"/>
+        </w:tabs>
         <w:spacing w:after="80" w:line="300"/>
+        <w:ind w:left="567" w:hanging="397"/>
         <w:jc w:val="both"/>
       </w:pPr>
+      <w:r>
+        <w:rPr>
+          <w:rFonts w:ascii="Times New Roman" w:cs="Times New Roman" w:eastAsia="Times New Roman" w:hAnsi="Times New Roman"/>
+          <w:color w:val="000000"/>
+          <w:sz w:val="24"/>
+          <w:szCs w:val="24"/>
+        </w:rPr>
+        <w:t xml:space="preserve">3.	</w:t>
+      </w:r>
       <w:r>
         <w:rPr>
           <w:rFonts w:ascii="Times New Roman" w:cs="Times New Roman" w:eastAsia="Times New Roman" w:hAnsi="Times New Roman"/>
@@ -25698,14 +26002,22 @@
     </w:p>
     <w:p>
       <w:pPr>
-        <w:pStyle w:val="ListParagraph"/>
-        <w:numPr>
-          <w:ilvl w:val="0"/>
-          <w:numId w:val="11"/>
-        </w:numPr>
+        <w:tabs>
+          <w:tab w:val="left" w:pos="567"/>
+        </w:tabs>
         <w:spacing w:after="80" w:line="300"/>
+        <w:ind w:left="567" w:hanging="397"/>
         <w:jc w:val="both"/>
       </w:pPr>
+      <w:r>
+        <w:rPr>
+          <w:rFonts w:ascii="Times New Roman" w:cs="Times New Roman" w:eastAsia="Times New Roman" w:hAnsi="Times New Roman"/>
+          <w:color w:val="000000"/>
+          <w:sz w:val="24"/>
+          <w:szCs w:val="24"/>
+        </w:rPr>
+        <w:t xml:space="preserve">4.	</w:t>
+      </w:r>
       <w:r>
         <w:rPr>
           <w:rFonts w:ascii="Times New Roman" w:cs="Times New Roman" w:eastAsia="Times New Roman" w:hAnsi="Times New Roman"/>
@@ -25729,14 +26041,22 @@
     </w:p>
     <w:p>
       <w:pPr>
-        <w:pStyle w:val="ListParagraph"/>
-        <w:numPr>
-          <w:ilvl w:val="0"/>
-          <w:numId w:val="11"/>
-        </w:numPr>
+        <w:tabs>
+          <w:tab w:val="left" w:pos="567"/>
+        </w:tabs>
         <w:spacing w:after="80" w:line="300"/>
+        <w:ind w:left="567" w:hanging="397"/>
         <w:jc w:val="both"/>
       </w:pPr>
+      <w:r>
+        <w:rPr>
+          <w:rFonts w:ascii="Times New Roman" w:cs="Times New Roman" w:eastAsia="Times New Roman" w:hAnsi="Times New Roman"/>
+          <w:color w:val="000000"/>
+          <w:sz w:val="24"/>
+          <w:szCs w:val="24"/>
+        </w:rPr>
+        <w:t xml:space="preserve">5.	</w:t>
+      </w:r>
       <w:r>
         <w:rPr>
           <w:rFonts w:ascii="Times New Roman" w:cs="Times New Roman" w:eastAsia="Times New Roman" w:hAnsi="Times New Roman"/>
@@ -25760,14 +26080,22 @@
     </w:p>
     <w:p>
       <w:pPr>
-        <w:pStyle w:val="ListParagraph"/>
-        <w:numPr>
-          <w:ilvl w:val="0"/>
-          <w:numId w:val="11"/>
-        </w:numPr>
+        <w:tabs>
+          <w:tab w:val="left" w:pos="567"/>
+        </w:tabs>
         <w:spacing w:after="80" w:line="300"/>
+        <w:ind w:left="567" w:hanging="397"/>
         <w:jc w:val="both"/>
       </w:pPr>
+      <w:r>
+        <w:rPr>
+          <w:rFonts w:ascii="Times New Roman" w:cs="Times New Roman" w:eastAsia="Times New Roman" w:hAnsi="Times New Roman"/>
+          <w:color w:val="000000"/>
+          <w:sz w:val="24"/>
+          <w:szCs w:val="24"/>
+        </w:rPr>
+        <w:t xml:space="preserve">6.	</w:t>
+      </w:r>
       <w:r>
         <w:rPr>
           <w:rFonts w:ascii="Times New Roman" w:cs="Times New Roman" w:eastAsia="Times New Roman" w:hAnsi="Times New Roman"/>
@@ -25791,14 +26119,22 @@
     </w:p>
     <w:p>
       <w:pPr>
-        <w:pStyle w:val="ListParagraph"/>
-        <w:numPr>
-          <w:ilvl w:val="0"/>
-          <w:numId w:val="11"/>
-        </w:numPr>
+        <w:tabs>
+          <w:tab w:val="left" w:pos="567"/>
+        </w:tabs>
         <w:spacing w:after="80" w:line="300"/>
+        <w:ind w:left="567" w:hanging="397"/>
         <w:jc w:val="both"/>
       </w:pPr>
+      <w:r>
+        <w:rPr>
+          <w:rFonts w:ascii="Times New Roman" w:cs="Times New Roman" w:eastAsia="Times New Roman" w:hAnsi="Times New Roman"/>
+          <w:color w:val="000000"/>
+          <w:sz w:val="24"/>
+          <w:szCs w:val="24"/>
+        </w:rPr>
+        <w:t xml:space="preserve">7.	</w:t>
+      </w:r>
       <w:r>
         <w:rPr>
           <w:rFonts w:ascii="Times New Roman" w:cs="Times New Roman" w:eastAsia="Times New Roman" w:hAnsi="Times New Roman"/>
@@ -28510,10 +28846,1522 @@
     </w:p>
     <w:p>
       <w:pPr>
+        <w:tabs>
+          <w:tab w:val="left" w:pos="567"/>
+        </w:tabs>
+        <w:spacing w:after="80" w:line="300"/>
+        <w:ind w:left="567" w:hanging="397"/>
+        <w:jc w:val="both"/>
+      </w:pPr>
+      <w:r>
+        <w:rPr>
+          <w:rFonts w:ascii="Times New Roman" w:cs="Times New Roman" w:eastAsia="Times New Roman" w:hAnsi="Times New Roman"/>
+          <w:color w:val="000000"/>
+          <w:sz w:val="24"/>
+          <w:szCs w:val="24"/>
+        </w:rPr>
+        <w:t xml:space="preserve">1.	</w:t>
+      </w:r>
+      <w:r>
+        <w:rPr>
+          <w:rFonts w:ascii="Times New Roman" w:cs="Times New Roman" w:eastAsia="Times New Roman" w:hAnsi="Times New Roman"/>
+          <w:b/>
+          <w:bCs/>
+          <w:color w:val="000000"/>
+          <w:sz w:val="24"/>
+          <w:szCs w:val="24"/>
+        </w:rPr>
+        <w:t xml:space="preserve">Data access:</w:t>
+      </w:r>
+      <w:r>
+        <w:rPr>
+          <w:rFonts w:ascii="Times New Roman" w:cs="Times New Roman" w:eastAsia="Times New Roman" w:hAnsi="Times New Roman"/>
+          <w:color w:val="000000"/>
+          <w:sz w:val="24"/>
+          <w:szCs w:val="24"/>
+        </w:rPr>
+        <w:t xml:space="preserve"> the most important datasets (OBF for AF face videos, PURE, COHFACE) are available only on request, and the development environment could not download the public ones, so validation so far relies on synthetic data.</w:t>
+      </w:r>
+    </w:p>
+    <w:p>
+      <w:pPr>
+        <w:tabs>
+          <w:tab w:val="left" w:pos="567"/>
+        </w:tabs>
+        <w:spacing w:after="80" w:line="300"/>
+        <w:ind w:left="567" w:hanging="397"/>
+        <w:jc w:val="both"/>
+      </w:pPr>
+      <w:r>
+        <w:rPr>
+          <w:rFonts w:ascii="Times New Roman" w:cs="Times New Roman" w:eastAsia="Times New Roman" w:hAnsi="Times New Roman"/>
+          <w:color w:val="000000"/>
+          <w:sz w:val="24"/>
+          <w:szCs w:val="24"/>
+        </w:rPr>
+        <w:t xml:space="preserve">2.	</w:t>
+      </w:r>
+      <w:r>
+        <w:rPr>
+          <w:rFonts w:ascii="Times New Roman" w:cs="Times New Roman" w:eastAsia="Times New Roman" w:hAnsi="Times New Roman"/>
+          <w:b/>
+          <w:bCs/>
+          <w:color w:val="000000"/>
+          <w:sz w:val="24"/>
+          <w:szCs w:val="24"/>
+        </w:rPr>
+        <w:t xml:space="preserve">Unexpected coupling of head pose and pulse:</w:t>
+      </w:r>
+      <w:r>
+        <w:rPr>
+          <w:rFonts w:ascii="Times New Roman" w:cs="Times New Roman" w:eastAsia="Times New Roman" w:hAnsi="Times New Roman"/>
+          <w:color w:val="000000"/>
+          <w:sz w:val="24"/>
+          <w:szCs w:val="24"/>
+        </w:rPr>
+        <w:t xml:space="preserve"> MediaPipe's pose estimate moves with each heartbeat, so the first motion-removal design removed real pulse; this had to be diagnosed and solved by using only clearly moving pose channels.</w:t>
+      </w:r>
+    </w:p>
+    <w:p>
+      <w:pPr>
+        <w:tabs>
+          <w:tab w:val="left" w:pos="567"/>
+        </w:tabs>
+        <w:spacing w:after="80" w:line="300"/>
+        <w:ind w:left="567" w:hanging="397"/>
+        <w:jc w:val="both"/>
+      </w:pPr>
+      <w:r>
+        <w:rPr>
+          <w:rFonts w:ascii="Times New Roman" w:cs="Times New Roman" w:eastAsia="Times New Roman" w:hAnsi="Times New Roman"/>
+          <w:color w:val="000000"/>
+          <w:sz w:val="24"/>
+          <w:szCs w:val="24"/>
+        </w:rPr>
+        <w:t xml:space="preserve">3.	</w:t>
+      </w:r>
+      <w:r>
+        <w:rPr>
+          <w:rFonts w:ascii="Times New Roman" w:cs="Times New Roman" w:eastAsia="Times New Roman" w:hAnsi="Times New Roman"/>
+          <w:b/>
+          <w:bCs/>
+          <w:color w:val="000000"/>
+          <w:sz w:val="24"/>
+          <w:szCs w:val="24"/>
+        </w:rPr>
+        <w:t xml:space="preserve">Non-linearity introduced by POS:</w:t>
+      </w:r>
+      <w:r>
+        <w:rPr>
+          <w:rFonts w:ascii="Times New Roman" w:cs="Times New Roman" w:eastAsia="Times New Roman" w:hAnsi="Times New Roman"/>
+          <w:color w:val="000000"/>
+          <w:sz w:val="24"/>
+          <w:szCs w:val="24"/>
+        </w:rPr>
+        <w:t xml:space="preserve"> removing motion only after POS barely helped, because POS's per-window tuning distorts the artifact; motion removal had to be moved before POS as well.</w:t>
+      </w:r>
+    </w:p>
+    <w:p>
+      <w:pPr>
+        <w:tabs>
+          <w:tab w:val="left" w:pos="567"/>
+        </w:tabs>
+        <w:spacing w:after="80" w:line="300"/>
+        <w:ind w:left="567" w:hanging="397"/>
+        <w:jc w:val="both"/>
+      </w:pPr>
+      <w:r>
+        <w:rPr>
+          <w:rFonts w:ascii="Times New Roman" w:cs="Times New Roman" w:eastAsia="Times New Roman" w:hAnsi="Times New Roman"/>
+          <w:color w:val="000000"/>
+          <w:sz w:val="24"/>
+          <w:szCs w:val="24"/>
+        </w:rPr>
+        <w:t xml:space="preserve">4.	</w:t>
+      </w:r>
+      <w:r>
+        <w:rPr>
+          <w:rFonts w:ascii="Times New Roman" w:cs="Times New Roman" w:eastAsia="Times New Roman" w:hAnsi="Times New Roman"/>
+          <w:b/>
+          <w:bCs/>
+          <w:color w:val="000000"/>
+          <w:sz w:val="24"/>
+          <w:szCs w:val="24"/>
+        </w:rPr>
+        <w:t xml:space="preserve">Irregular rhythms break common tools:</w:t>
+      </w:r>
+      <w:r>
+        <w:rPr>
+          <w:rFonts w:ascii="Times New Roman" w:cs="Times New Roman" w:eastAsia="Times New Roman" w:hAnsi="Times New Roman"/>
+          <w:color w:val="000000"/>
+          <w:sz w:val="24"/>
+          <w:szCs w:val="24"/>
+        </w:rPr>
+        <w:t xml:space="preserve"> spectral quality measures and the FFT heart rate both fail on AF, so rhythm-independent quality measures and a beat-based heart rate were needed.</w:t>
+      </w:r>
+    </w:p>
+    <w:p>
+      <w:pPr>
+        <w:tabs>
+          <w:tab w:val="left" w:pos="567"/>
+        </w:tabs>
+        <w:spacing w:after="80" w:line="300"/>
+        <w:ind w:left="567" w:hanging="397"/>
+        <w:jc w:val="both"/>
+      </w:pPr>
+      <w:r>
+        <w:rPr>
+          <w:rFonts w:ascii="Times New Roman" w:cs="Times New Roman" w:eastAsia="Times New Roman" w:hAnsi="Times New Roman"/>
+          <w:color w:val="000000"/>
+          <w:sz w:val="24"/>
+          <w:szCs w:val="24"/>
+        </w:rPr>
+        <w:t xml:space="preserve">5.	</w:t>
+      </w:r>
+      <w:r>
+        <w:rPr>
+          <w:rFonts w:ascii="Times New Roman" w:cs="Times New Roman" w:eastAsia="Times New Roman" w:hAnsi="Times New Roman"/>
+          <w:b/>
+          <w:bCs/>
+          <w:color w:val="000000"/>
+          <w:sz w:val="24"/>
+          <w:szCs w:val="24"/>
+        </w:rPr>
+        <w:t xml:space="preserve">Changes of scope:</w:t>
+      </w:r>
+      <w:r>
+        <w:rPr>
+          <w:rFonts w:ascii="Times New Roman" w:cs="Times New Roman" w:eastAsia="Times New Roman" w:hAnsi="Times New Roman"/>
+          <w:color w:val="000000"/>
+          <w:sz w:val="24"/>
+          <w:szCs w:val="24"/>
+        </w:rPr>
+        <w:t xml:space="preserve"> the project moved from a benchmark of existing methods to a new method, and its output moved from stress (and a briefly considered thermal camera, dropped because it needs extra hardware) to AF screening with heart-rate flags, which required re-planning.</w:t>
+      </w:r>
+    </w:p>
+    <w:p>
+      <w:pPr>
+        <w:tabs>
+          <w:tab w:val="left" w:pos="567"/>
+        </w:tabs>
+        <w:spacing w:after="80" w:line="300"/>
+        <w:ind w:left="567" w:hanging="397"/>
+        <w:jc w:val="both"/>
+      </w:pPr>
+      <w:r>
+        <w:rPr>
+          <w:rFonts w:ascii="Times New Roman" w:cs="Times New Roman" w:eastAsia="Times New Roman" w:hAnsi="Times New Roman"/>
+          <w:color w:val="000000"/>
+          <w:sz w:val="24"/>
+          <w:szCs w:val="24"/>
+        </w:rPr>
+        <w:t xml:space="preserve">6.	</w:t>
+      </w:r>
+      <w:r>
+        <w:rPr>
+          <w:rFonts w:ascii="Times New Roman" w:cs="Times New Roman" w:eastAsia="Times New Roman" w:hAnsi="Times New Roman"/>
+          <w:b/>
+          <w:bCs/>
+          <w:color w:val="000000"/>
+          <w:sz w:val="24"/>
+          <w:szCs w:val="24"/>
+        </w:rPr>
+        <w:t xml:space="preserve">Practical issues:</w:t>
+      </w:r>
+      <w:r>
+        <w:rPr>
+          <w:rFonts w:ascii="Times New Roman" w:cs="Times New Roman" w:eastAsia="Times New Roman" w:hAnsi="Times New Roman"/>
+          <w:color w:val="000000"/>
+          <w:sz w:val="24"/>
+          <w:szCs w:val="24"/>
+        </w:rPr>
+        <w:t xml:space="preserve"> Windows-specific setup problems with the earlier toolbox environment, and phone videos in HEVC format that OpenCV cannot read.</w:t>
+      </w:r>
+    </w:p>
+    <w:p>
+      <w:pPr>
+        <w:pStyle w:val="Heading2"/>
+        <w:spacing w:after="120" w:before="240"/>
+      </w:pPr>
+      <w:r>
+        <w:rPr>
+          <w:rFonts w:ascii="Times New Roman" w:cs="Times New Roman" w:eastAsia="Times New Roman" w:hAnsi="Times New Roman"/>
+          <w:b/>
+          <w:bCs/>
+          <w:color w:val="000000"/>
+          <w:sz w:val="24"/>
+          <w:szCs w:val="24"/>
+        </w:rPr>
+        <w:t xml:space="preserve">4. Future work</w:t>
+      </w:r>
+    </w:p>
+    <w:p>
+      <w:pPr>
+        <w:tabs>
+          <w:tab w:val="left" w:pos="567"/>
+        </w:tabs>
+        <w:spacing w:after="80" w:line="300"/>
+        <w:ind w:left="567" w:hanging="397"/>
+        <w:jc w:val="both"/>
+      </w:pPr>
+      <w:r>
+        <w:rPr>
+          <w:rFonts w:ascii="Times New Roman" w:cs="Times New Roman" w:eastAsia="Times New Roman" w:hAnsi="Times New Roman"/>
+          <w:color w:val="000000"/>
+          <w:sz w:val="24"/>
+          <w:szCs w:val="24"/>
+        </w:rPr>
+        <w:t xml:space="preserve">1.	</w:t>
+      </w:r>
+      <w:r>
+        <w:rPr>
+          <w:rFonts w:ascii="Times New Roman" w:cs="Times New Roman" w:eastAsia="Times New Roman" w:hAnsi="Times New Roman"/>
+          <w:color w:val="000000"/>
+          <w:sz w:val="24"/>
+          <w:szCs w:val="24"/>
+        </w:rPr>
+        <w:t xml:space="preserve">Run the Phase 1 check on UBFC-rPPG and PURE: the proposed method against single-region POS, and the ablation of every ingredient on real faces.</w:t>
+      </w:r>
+    </w:p>
+    <w:p>
+      <w:pPr>
+        <w:tabs>
+          <w:tab w:val="left" w:pos="567"/>
+        </w:tabs>
+        <w:spacing w:after="80" w:line="300"/>
+        <w:ind w:left="567" w:hanging="397"/>
+        <w:jc w:val="both"/>
+      </w:pPr>
+      <w:r>
+        <w:rPr>
+          <w:rFonts w:ascii="Times New Roman" w:cs="Times New Roman" w:eastAsia="Times New Roman" w:hAnsi="Times New Roman"/>
+          <w:color w:val="000000"/>
+          <w:sz w:val="24"/>
+          <w:szCs w:val="24"/>
+        </w:rPr>
+        <w:t xml:space="preserve">2.	</w:t>
+      </w:r>
+      <w:r>
+        <w:rPr>
+          <w:rFonts w:ascii="Times New Roman" w:cs="Times New Roman" w:eastAsia="Times New Roman" w:hAnsi="Times New Roman"/>
+          <w:color w:val="000000"/>
+          <w:sz w:val="24"/>
+          <w:szCs w:val="24"/>
+        </w:rPr>
+        <w:t xml:space="preserve">Add breathing rate and breathing-aware heart-rate selection, and validate breathing on COHFACE (Phase 2).</w:t>
+      </w:r>
+    </w:p>
+    <w:p>
+      <w:pPr>
+        <w:tabs>
+          <w:tab w:val="left" w:pos="567"/>
+        </w:tabs>
+        <w:spacing w:after="80" w:line="300"/>
+        <w:ind w:left="567" w:hanging="397"/>
+        <w:jc w:val="both"/>
+      </w:pPr>
+      <w:r>
+        <w:rPr>
+          <w:rFonts w:ascii="Times New Roman" w:cs="Times New Roman" w:eastAsia="Times New Roman" w:hAnsi="Times New Roman"/>
+          <w:color w:val="000000"/>
+          <w:sz w:val="24"/>
+          <w:szCs w:val="24"/>
+        </w:rPr>
+        <w:t xml:space="preserve">3.	</w:t>
+      </w:r>
+      <w:r>
+        <w:rPr>
+          <w:rFonts w:ascii="Times New Roman" w:cs="Times New Roman" w:eastAsia="Times New Roman" w:hAnsi="Times New Roman"/>
+          <w:color w:val="000000"/>
+          <w:sz w:val="24"/>
+          <w:szCs w:val="24"/>
+        </w:rPr>
+        <w:t xml:space="preserve">Build the AF classifier on MIMIC PERform AF and test it on face videos: sensitivity and specificity on OBF if granted, and false-alarm rate and coverage with and without confidence gating on normal-rhythm videos (Phase 3).</w:t>
+      </w:r>
+    </w:p>
+    <w:p>
+      <w:pPr>
+        <w:tabs>
+          <w:tab w:val="left" w:pos="567"/>
+        </w:tabs>
+        <w:spacing w:after="80" w:line="300"/>
+        <w:ind w:left="567" w:hanging="397"/>
+        <w:jc w:val="both"/>
+      </w:pPr>
+      <w:r>
+        <w:rPr>
+          <w:rFonts w:ascii="Times New Roman" w:cs="Times New Roman" w:eastAsia="Times New Roman" w:hAnsi="Times New Roman"/>
+          <w:color w:val="000000"/>
+          <w:sz w:val="24"/>
+          <w:szCs w:val="24"/>
+        </w:rPr>
+        <w:t xml:space="preserve">4.	</w:t>
+      </w:r>
+      <w:r>
+        <w:rPr>
+          <w:rFonts w:ascii="Times New Roman" w:cs="Times New Roman" w:eastAsia="Times New Roman" w:hAnsi="Times New Roman"/>
+          <w:color w:val="000000"/>
+          <w:sz w:val="24"/>
+          <w:szCs w:val="24"/>
+        </w:rPr>
+        <w:t xml:space="preserve">Implement the slow, fast and extra-beat flags and test the extra-beat rule on MIT-BIH Arrhythmia (Phase 4).</w:t>
+      </w:r>
+    </w:p>
+    <w:p>
+      <w:pPr>
+        <w:tabs>
+          <w:tab w:val="left" w:pos="567"/>
+        </w:tabs>
+        <w:spacing w:after="80" w:line="300"/>
+        <w:ind w:left="567" w:hanging="397"/>
+        <w:jc w:val="both"/>
+      </w:pPr>
+      <w:r>
+        <w:rPr>
+          <w:rFonts w:ascii="Times New Roman" w:cs="Times New Roman" w:eastAsia="Times New Roman" w:hAnsi="Times New Roman"/>
+          <w:color w:val="000000"/>
+          <w:sz w:val="24"/>
+          <w:szCs w:val="24"/>
+        </w:rPr>
+        <w:t xml:space="preserve">5.	</w:t>
+      </w:r>
+      <w:r>
+        <w:rPr>
+          <w:rFonts w:ascii="Times New Roman" w:cs="Times New Roman" w:eastAsia="Times New Roman" w:hAnsi="Times New Roman"/>
+          <w:color w:val="000000"/>
+          <w:sz w:val="24"/>
+          <w:szCs w:val="24"/>
+        </w:rPr>
+        <w:t xml:space="preserve">Compare with pretrained deep networks through rPPG-Toolbox, measure robustness across skin tones and lighting, and build a live webcam demo with the trust map on the face (Phases 5–6).</w:t>
+      </w:r>
+    </w:p>
+    <w:p>
+      <w:pPr>
+        <w:tabs>
+          <w:tab w:val="left" w:pos="567"/>
+        </w:tabs>
+        <w:spacing w:after="80" w:line="300"/>
+        <w:ind w:left="567" w:hanging="397"/>
+        <w:jc w:val="both"/>
+      </w:pPr>
+      <w:r>
+        <w:rPr>
+          <w:rFonts w:ascii="Times New Roman" w:cs="Times New Roman" w:eastAsia="Times New Roman" w:hAnsi="Times New Roman"/>
+          <w:color w:val="000000"/>
+          <w:sz w:val="24"/>
+          <w:szCs w:val="24"/>
+        </w:rPr>
+        <w:t xml:space="preserve">6.	</w:t>
+      </w:r>
+      <w:r>
+        <w:rPr>
+          <w:rFonts w:ascii="Times New Roman" w:cs="Times New Roman" w:eastAsia="Times New Roman" w:hAnsi="Times New Roman"/>
+          <w:color w:val="000000"/>
+          <w:sz w:val="24"/>
+          <w:szCs w:val="24"/>
+        </w:rPr>
+        <w:t xml:space="preserve">Longer term, the method can be improved by learning the trust weights from data, adding near-infrared cameras for low light, and validating with clinicians on people with confirmed AF.</w:t>
+      </w:r>
+    </w:p>
+    <w:p>
+      <w:pPr>
+        <w:pStyle w:val="Heading1"/>
+        <w:spacing w:after="160" w:before="360"/>
+      </w:pPr>
+      <w:r>
+        <w:rPr>
+          <w:rFonts w:ascii="Times New Roman" w:cs="Times New Roman" w:eastAsia="Times New Roman" w:hAnsi="Times New Roman"/>
+          <w:b/>
+          <w:bCs/>
+          <w:color w:val="000000"/>
+          <w:sz w:val="28"/>
+          <w:szCs w:val="28"/>
+        </w:rPr>
+        <w:t xml:space="preserve">Prompt Engineering</w:t>
+      </w:r>
+    </w:p>
+    <w:p>
+      <w:pPr>
+        <w:pStyle w:val="Heading2"/>
+        <w:spacing w:after="120" w:before="240"/>
+      </w:pPr>
+      <w:r>
+        <w:rPr>
+          <w:rFonts w:ascii="Times New Roman" w:cs="Times New Roman" w:eastAsia="Times New Roman" w:hAnsi="Times New Roman"/>
+          <w:b/>
+          <w:bCs/>
+          <w:color w:val="000000"/>
+          <w:sz w:val="24"/>
+          <w:szCs w:val="24"/>
+        </w:rPr>
+        <w:t xml:space="preserve">1. Prompt source</w:t>
+      </w:r>
+    </w:p>
+    <w:p>
+      <w:pPr>
+        <w:spacing w:after="120" w:before="0" w:line="300"/>
+        <w:jc w:val="both"/>
+      </w:pPr>
+      <w:r>
+        <w:rPr>
+          <w:rFonts w:ascii="Times New Roman" w:cs="Times New Roman" w:eastAsia="Times New Roman" w:hAnsi="Times New Roman"/>
+          <w:color w:val="000000"/>
+          <w:sz w:val="24"/>
+          <w:szCs w:val="24"/>
+        </w:rPr>
+        <w:t xml:space="preserve">The prompts were written by the team and given to Claude, Anthropic's AI assistant, through Claude Code (a coding agent that can read the repository, run code and search the web). It was used to plan the phases, explain concepts, research the literature, draw the architecture diagrams, write and test the code, and draft this report. The team made the project decisions (changes of direction, scope, primary and secondary outputs), and the assistant's code was verified by running the automatic tests and the synthetic experiments reported above.</w:t>
+      </w:r>
+    </w:p>
+    <w:p>
+      <w:pPr>
+        <w:pStyle w:val="Heading2"/>
+        <w:spacing w:after="120" w:before="240"/>
+      </w:pPr>
+      <w:r>
+        <w:rPr>
+          <w:rFonts w:ascii="Times New Roman" w:cs="Times New Roman" w:eastAsia="Times New Roman" w:hAnsi="Times New Roman"/>
+          <w:b/>
+          <w:bCs/>
+          <w:color w:val="000000"/>
+          <w:sz w:val="24"/>
+          <w:szCs w:val="24"/>
+        </w:rPr>
+        <w:t xml:space="preserve">2. Prompts utilized</w:t>
+      </w:r>
+    </w:p>
+    <w:p>
+      <w:pPr>
+        <w:spacing w:after="120" w:before="0" w:line="300"/>
+        <w:jc w:val="both"/>
+      </w:pPr>
+      <w:r>
+        <w:rPr>
+          <w:rFonts w:ascii="Times New Roman" w:cs="Times New Roman" w:eastAsia="Times New Roman" w:hAnsi="Times New Roman"/>
+          <w:color w:val="000000"/>
+          <w:sz w:val="24"/>
+          <w:szCs w:val="24"/>
+        </w:rPr>
+        <w:t xml:space="preserve">The prompts below are listed in the order they were used. Their wording has been edited for clarity and grammar, and closely related follow-up questions are combined; the content of each request is unchanged.</w:t>
+      </w:r>
+    </w:p>
+    <w:p>
+      <w:pPr>
+        <w:tabs>
+          <w:tab w:val="left" w:pos="567"/>
+        </w:tabs>
+        <w:spacing w:after="80" w:line="300"/>
+        <w:ind w:left="567" w:hanging="397"/>
+        <w:jc w:val="both"/>
+      </w:pPr>
+      <w:r>
+        <w:rPr>
+          <w:rFonts w:ascii="Times New Roman" w:cs="Times New Roman" w:eastAsia="Times New Roman" w:hAnsi="Times New Roman"/>
+          <w:color w:val="000000"/>
+          <w:sz w:val="24"/>
+          <w:szCs w:val="24"/>
+        </w:rPr>
+        <w:t xml:space="preserve">1.	</w:t>
+      </w:r>
+      <w:r>
+        <w:rPr>
+          <w:rFonts w:ascii="Times New Roman" w:cs="Times New Roman" w:eastAsia="Times New Roman" w:hAnsi="Times New Roman"/>
+          <w:color w:val="000000"/>
+          <w:sz w:val="24"/>
+          <w:szCs w:val="24"/>
+        </w:rPr>
+        <w:t xml:space="preserve">Adapt the setup and scripts for Windows, run and demonstrate what has been built, and proceed with Phase 2.</w:t>
+      </w:r>
+    </w:p>
+    <w:p>
+      <w:pPr>
+        <w:tabs>
+          <w:tab w:val="left" w:pos="567"/>
+        </w:tabs>
+        <w:spacing w:after="80" w:line="300"/>
+        <w:ind w:left="567" w:hanging="397"/>
+        <w:jc w:val="both"/>
+      </w:pPr>
+      <w:r>
+        <w:rPr>
+          <w:rFonts w:ascii="Times New Roman" w:cs="Times New Roman" w:eastAsia="Times New Roman" w:hAnsi="Times New Roman"/>
+          <w:color w:val="000000"/>
+          <w:sz w:val="24"/>
+          <w:szCs w:val="24"/>
+        </w:rPr>
+        <w:t xml:space="preserve">2.	</w:t>
+      </w:r>
+      <w:r>
+        <w:rPr>
+          <w:rFonts w:ascii="Times New Roman" w:cs="Times New Roman" w:eastAsia="Times New Roman" w:hAnsi="Times New Roman"/>
+          <w:color w:val="000000"/>
+          <w:sz w:val="24"/>
+          <w:szCs w:val="24"/>
+        </w:rPr>
+        <w:t xml:space="preserve">The rPPG-Toolbox environment is now working. What is the next step?</w:t>
+      </w:r>
+    </w:p>
+    <w:p>
+      <w:pPr>
+        <w:tabs>
+          <w:tab w:val="left" w:pos="567"/>
+        </w:tabs>
+        <w:spacing w:after="80" w:line="300"/>
+        <w:ind w:left="567" w:hanging="397"/>
+        <w:jc w:val="both"/>
+      </w:pPr>
+      <w:r>
+        <w:rPr>
+          <w:rFonts w:ascii="Times New Roman" w:cs="Times New Roman" w:eastAsia="Times New Roman" w:hAnsi="Times New Roman"/>
+          <w:color w:val="000000"/>
+          <w:sz w:val="24"/>
+          <w:szCs w:val="24"/>
+        </w:rPr>
+        <w:t xml:space="preserve">3.	</w:t>
+      </w:r>
+      <w:r>
+        <w:rPr>
+          <w:rFonts w:ascii="Times New Roman" w:cs="Times New Roman" w:eastAsia="Times New Roman" w:hAnsi="Times New Roman"/>
+          <w:color w:val="000000"/>
+          <w:sz w:val="24"/>
+          <w:szCs w:val="24"/>
+        </w:rPr>
+        <w:t xml:space="preserve">We have not recorded our own face video yet. What can be done in the meantime?</w:t>
+      </w:r>
+    </w:p>
+    <w:p>
+      <w:pPr>
+        <w:tabs>
+          <w:tab w:val="left" w:pos="567"/>
+        </w:tabs>
+        <w:spacing w:after="80" w:line="300"/>
+        <w:ind w:left="567" w:hanging="397"/>
+        <w:jc w:val="both"/>
+      </w:pPr>
+      <w:r>
+        <w:rPr>
+          <w:rFonts w:ascii="Times New Roman" w:cs="Times New Roman" w:eastAsia="Times New Roman" w:hAnsi="Times New Roman"/>
+          <w:color w:val="000000"/>
+          <w:sz w:val="24"/>
+          <w:szCs w:val="24"/>
+        </w:rPr>
+        <w:t xml:space="preserve">4.	</w:t>
+      </w:r>
+      <w:r>
+        <w:rPr>
+          <w:rFonts w:ascii="Times New Roman" w:cs="Times New Roman" w:eastAsia="Times New Roman" w:hAnsi="Times New Roman"/>
+          <w:color w:val="000000"/>
+          <w:sz w:val="24"/>
+          <w:szCs w:val="24"/>
+        </w:rPr>
+        <w:t xml:space="preserve">Suggest an addition that would make the project more original, since it currently relies only on existing classical and deep-learning methods.</w:t>
+      </w:r>
+    </w:p>
+    <w:p>
+      <w:pPr>
+        <w:tabs>
+          <w:tab w:val="left" w:pos="567"/>
+        </w:tabs>
+        <w:spacing w:after="80" w:line="300"/>
+        <w:ind w:left="567" w:hanging="397"/>
+        <w:jc w:val="both"/>
+      </w:pPr>
+      <w:r>
+        <w:rPr>
+          <w:rFonts w:ascii="Times New Roman" w:cs="Times New Roman" w:eastAsia="Times New Roman" w:hAnsi="Times New Roman"/>
+          <w:color w:val="000000"/>
+          <w:sz w:val="24"/>
+          <w:szCs w:val="24"/>
+        </w:rPr>
+        <w:t xml:space="preserve">5.	</w:t>
+      </w:r>
+      <w:r>
+        <w:rPr>
+          <w:rFonts w:ascii="Times New Roman" w:cs="Times New Roman" w:eastAsia="Times New Roman" w:hAnsi="Times New Roman"/>
+          <w:color w:val="000000"/>
+          <w:sz w:val="24"/>
+          <w:szCs w:val="24"/>
+        </w:rPr>
+        <w:t xml:space="preserve">Are the deep-learning models already trained, so that only the datasets are needed to measure their accuracy? The question is meant in general terms.</w:t>
+      </w:r>
+    </w:p>
+    <w:p>
+      <w:pPr>
+        <w:tabs>
+          <w:tab w:val="left" w:pos="567"/>
+        </w:tabs>
+        <w:spacing w:after="80" w:line="300"/>
+        <w:ind w:left="567" w:hanging="397"/>
+        <w:jc w:val="both"/>
+      </w:pPr>
+      <w:r>
+        <w:rPr>
+          <w:rFonts w:ascii="Times New Roman" w:cs="Times New Roman" w:eastAsia="Times New Roman" w:hAnsi="Times New Roman"/>
+          <w:color w:val="000000"/>
+          <w:sz w:val="24"/>
+          <w:szCs w:val="24"/>
+        </w:rPr>
+        <w:t xml:space="preserve">6.	</w:t>
+      </w:r>
+      <w:r>
+        <w:rPr>
+          <w:rFonts w:ascii="Times New Roman" w:cs="Times New Roman" w:eastAsia="Times New Roman" w:hAnsi="Times New Roman"/>
+          <w:color w:val="000000"/>
+          <w:sz w:val="24"/>
+          <w:szCs w:val="24"/>
+        </w:rPr>
+        <w:t xml:space="preserve">Explain the proposed new method in simple language.</w:t>
+      </w:r>
+    </w:p>
+    <w:p>
+      <w:pPr>
+        <w:tabs>
+          <w:tab w:val="left" w:pos="567"/>
+        </w:tabs>
+        <w:spacing w:after="80" w:line="300"/>
+        <w:ind w:left="567" w:hanging="397"/>
+        <w:jc w:val="both"/>
+      </w:pPr>
+      <w:r>
+        <w:rPr>
+          <w:rFonts w:ascii="Times New Roman" w:cs="Times New Roman" w:eastAsia="Times New Roman" w:hAnsi="Times New Roman"/>
+          <w:color w:val="000000"/>
+          <w:sz w:val="24"/>
+          <w:szCs w:val="24"/>
+        </w:rPr>
+        <w:t xml:space="preserve">7.	</w:t>
+      </w:r>
+      <w:r>
+        <w:rPr>
+          <w:rFonts w:ascii="Times New Roman" w:cs="Times New Roman" w:eastAsia="Times New Roman" w:hAnsi="Times New Roman"/>
+          <w:color w:val="000000"/>
+          <w:sz w:val="24"/>
+          <w:szCs w:val="24"/>
+        </w:rPr>
+        <w:t xml:space="preserve">Clarify the following: (1) What is the MMPD dataset? (2) What does the rhythm used in the trust score refer to? (3) Can MediaPipe identify shadowed regions so that they receive a low trust score? (4) How is the pulse produced in the proposed method, compared with POS, CHROM or PhysNet followed by an FFT?</w:t>
+      </w:r>
+    </w:p>
+    <w:p>
+      <w:pPr>
+        <w:tabs>
+          <w:tab w:val="left" w:pos="567"/>
+        </w:tabs>
+        <w:spacing w:after="80" w:line="300"/>
+        <w:ind w:left="567" w:hanging="397"/>
+        <w:jc w:val="both"/>
+      </w:pPr>
+      <w:r>
+        <w:rPr>
+          <w:rFonts w:ascii="Times New Roman" w:cs="Times New Roman" w:eastAsia="Times New Roman" w:hAnsi="Times New Roman"/>
+          <w:color w:val="000000"/>
+          <w:sz w:val="24"/>
+          <w:szCs w:val="24"/>
+        </w:rPr>
+        <w:t xml:space="preserve">8.	</w:t>
+      </w:r>
+      <w:r>
+        <w:rPr>
+          <w:rFonts w:ascii="Times New Roman" w:cs="Times New Roman" w:eastAsia="Times New Roman" w:hAnsi="Times New Roman"/>
+          <w:color w:val="000000"/>
+          <w:sz w:val="24"/>
+          <w:szCs w:val="24"/>
+        </w:rPr>
+        <w:t xml:space="preserve">Confirm my understanding: the project compares two existing approaches with one new method built from existing techniques.</w:t>
+      </w:r>
+    </w:p>
+    <w:p>
+      <w:pPr>
+        <w:tabs>
+          <w:tab w:val="left" w:pos="567"/>
+        </w:tabs>
+        <w:spacing w:after="80" w:line="300"/>
+        <w:ind w:left="567" w:hanging="397"/>
+        <w:jc w:val="both"/>
+      </w:pPr>
+      <w:r>
+        <w:rPr>
+          <w:rFonts w:ascii="Times New Roman" w:cs="Times New Roman" w:eastAsia="Times New Roman" w:hAnsi="Times New Roman"/>
+          <w:color w:val="000000"/>
+          <w:sz w:val="24"/>
+          <w:szCs w:val="24"/>
+        </w:rPr>
+        <w:t xml:space="preserve">9.	</w:t>
+      </w:r>
+      <w:r>
+        <w:rPr>
+          <w:rFonts w:ascii="Times New Roman" w:cs="Times New Roman" w:eastAsia="Times New Roman" w:hAnsi="Times New Roman"/>
+          <w:color w:val="000000"/>
+          <w:sz w:val="24"/>
+          <w:szCs w:val="24"/>
+        </w:rPr>
+        <w:t xml:space="preserve">Provide a block diagram of the system.</w:t>
+      </w:r>
+    </w:p>
+    <w:p>
+      <w:pPr>
+        <w:tabs>
+          <w:tab w:val="left" w:pos="567"/>
+        </w:tabs>
+        <w:spacing w:after="80" w:line="300"/>
+        <w:ind w:left="567" w:hanging="397"/>
+        <w:jc w:val="both"/>
+      </w:pPr>
+      <w:r>
+        <w:rPr>
+          <w:rFonts w:ascii="Times New Roman" w:cs="Times New Roman" w:eastAsia="Times New Roman" w:hAnsi="Times New Roman"/>
+          <w:color w:val="000000"/>
+          <w:sz w:val="24"/>
+          <w:szCs w:val="24"/>
+        </w:rPr>
+        <w:t xml:space="preserve">10.	</w:t>
+      </w:r>
+      <w:r>
+        <w:rPr>
+          <w:rFonts w:ascii="Times New Roman" w:cs="Times New Roman" w:eastAsia="Times New Roman" w:hAnsi="Times New Roman"/>
+          <w:color w:val="000000"/>
+          <w:sz w:val="24"/>
+          <w:szCs w:val="24"/>
+        </w:rPr>
+        <w:t xml:space="preserve">Could we train our own neural network on the available datasets to replace POS, so that the core model is our own work?</w:t>
+      </w:r>
+    </w:p>
+    <w:p>
+      <w:pPr>
+        <w:tabs>
+          <w:tab w:val="left" w:pos="567"/>
+        </w:tabs>
+        <w:spacing w:after="80" w:line="300"/>
+        <w:ind w:left="567" w:hanging="397"/>
+        <w:jc w:val="both"/>
+      </w:pPr>
+      <w:r>
+        <w:rPr>
+          <w:rFonts w:ascii="Times New Roman" w:cs="Times New Roman" w:eastAsia="Times New Roman" w:hAnsi="Times New Roman"/>
+          <w:color w:val="000000"/>
+          <w:sz w:val="24"/>
+          <w:szCs w:val="24"/>
+        </w:rPr>
+        <w:t xml:space="preserve">11.	</w:t>
+      </w:r>
+      <w:r>
+        <w:rPr>
+          <w:rFonts w:ascii="Times New Roman" w:cs="Times New Roman" w:eastAsia="Times New Roman" w:hAnsi="Times New Roman"/>
+          <w:color w:val="000000"/>
+          <w:sz w:val="24"/>
+          <w:szCs w:val="24"/>
+        </w:rPr>
+        <w:t xml:space="preserve">Are existing deep networks such as PhysNet built on forehead and cheek regions, and on which datasets were they trained?</w:t>
+      </w:r>
+    </w:p>
+    <w:p>
+      <w:pPr>
+        <w:tabs>
+          <w:tab w:val="left" w:pos="567"/>
+        </w:tabs>
+        <w:spacing w:after="80" w:line="300"/>
+        <w:ind w:left="567" w:hanging="397"/>
+        <w:jc w:val="both"/>
+      </w:pPr>
+      <w:r>
+        <w:rPr>
+          <w:rFonts w:ascii="Times New Roman" w:cs="Times New Roman" w:eastAsia="Times New Roman" w:hAnsi="Times New Roman"/>
+          <w:color w:val="000000"/>
+          <w:sz w:val="24"/>
+          <w:szCs w:val="24"/>
+        </w:rPr>
+        <w:t xml:space="preserve">12.	</w:t>
+      </w:r>
+      <w:r>
+        <w:rPr>
+          <w:rFonts w:ascii="Times New Roman" w:cs="Times New Roman" w:eastAsia="Times New Roman" w:hAnsi="Times New Roman"/>
+          <w:color w:val="000000"/>
+          <w:sz w:val="24"/>
+          <w:szCs w:val="24"/>
+        </w:rPr>
+        <w:t xml:space="preserve">Since existing networks are large and difficult to outperform, we will keep the planned method of applying POS to about 25 facial patches. Do not implement it yet; this is a design discussion only.</w:t>
+      </w:r>
+    </w:p>
+    <w:p>
+      <w:pPr>
+        <w:tabs>
+          <w:tab w:val="left" w:pos="567"/>
+        </w:tabs>
+        <w:spacing w:after="80" w:line="300"/>
+        <w:ind w:left="567" w:hanging="397"/>
+        <w:jc w:val="both"/>
+      </w:pPr>
+      <w:r>
+        <w:rPr>
+          <w:rFonts w:ascii="Times New Roman" w:cs="Times New Roman" w:eastAsia="Times New Roman" w:hAnsi="Times New Roman"/>
+          <w:color w:val="000000"/>
+          <w:sz w:val="24"/>
+          <w:szCs w:val="24"/>
+        </w:rPr>
+        <w:t xml:space="preserve">13.	</w:t>
+      </w:r>
+      <w:r>
+        <w:rPr>
+          <w:rFonts w:ascii="Times New Roman" w:cs="Times New Roman" w:eastAsia="Times New Roman" w:hAnsi="Times New Roman"/>
+          <w:color w:val="000000"/>
+          <w:sz w:val="24"/>
+          <w:szCs w:val="24"/>
+        </w:rPr>
+        <w:t xml:space="preserve">Keep the agreement check, add it to the diagram, and write a context paragraph that can be used to generate the block diagram with an AI tool.</w:t>
+      </w:r>
+    </w:p>
+    <w:p>
+      <w:pPr>
+        <w:tabs>
+          <w:tab w:val="left" w:pos="567"/>
+        </w:tabs>
+        <w:spacing w:after="80" w:line="300"/>
+        <w:ind w:left="567" w:hanging="397"/>
+        <w:jc w:val="both"/>
+      </w:pPr>
+      <w:r>
+        <w:rPr>
+          <w:rFonts w:ascii="Times New Roman" w:cs="Times New Roman" w:eastAsia="Times New Roman" w:hAnsi="Times New Roman"/>
+          <w:color w:val="000000"/>
+          <w:sz w:val="24"/>
+          <w:szCs w:val="24"/>
+        </w:rPr>
+        <w:t xml:space="preserve">14.	</w:t>
+      </w:r>
+      <w:r>
+        <w:rPr>
+          <w:rFonts w:ascii="Times New Roman" w:cs="Times New Roman" w:eastAsia="Times New Roman" w:hAnsi="Times New Roman"/>
+          <w:color w:val="000000"/>
+          <w:sz w:val="24"/>
+          <w:szCs w:val="24"/>
+        </w:rPr>
+        <w:t xml:space="preserve">Show the handcrafted equations that classical methods use to obtain the pulse signal, and explain how they differ between methods.</w:t>
+      </w:r>
+    </w:p>
+    <w:p>
+      <w:pPr>
+        <w:tabs>
+          <w:tab w:val="left" w:pos="567"/>
+        </w:tabs>
+        <w:spacing w:after="80" w:line="300"/>
+        <w:ind w:left="567" w:hanging="397"/>
+        <w:jc w:val="both"/>
+      </w:pPr>
+      <w:r>
+        <w:rPr>
+          <w:rFonts w:ascii="Times New Roman" w:cs="Times New Roman" w:eastAsia="Times New Roman" w:hAnsi="Times New Roman"/>
+          <w:color w:val="000000"/>
+          <w:sz w:val="24"/>
+          <w:szCs w:val="24"/>
+        </w:rPr>
+        <w:t xml:space="preserve">15.	</w:t>
+      </w:r>
+      <w:r>
+        <w:rPr>
+          <w:rFonts w:ascii="Times New Roman" w:cs="Times New Roman" w:eastAsia="Times New Roman" w:hAnsi="Times New Roman"/>
+          <w:color w:val="000000"/>
+          <w:sz w:val="24"/>
+          <w:szCs w:val="24"/>
+        </w:rPr>
+        <w:t xml:space="preserve">Explain how deep-learning models generate the pulse signal.</w:t>
+      </w:r>
+    </w:p>
+    <w:p>
+      <w:pPr>
+        <w:tabs>
+          <w:tab w:val="left" w:pos="567"/>
+        </w:tabs>
+        <w:spacing w:after="80" w:line="300"/>
+        <w:ind w:left="567" w:hanging="397"/>
+        <w:jc w:val="both"/>
+      </w:pPr>
+      <w:r>
+        <w:rPr>
+          <w:rFonts w:ascii="Times New Roman" w:cs="Times New Roman" w:eastAsia="Times New Roman" w:hAnsi="Times New Roman"/>
+          <w:color w:val="000000"/>
+          <w:sz w:val="24"/>
+          <w:szCs w:val="24"/>
+        </w:rPr>
+        <w:t xml:space="preserve">16.	</w:t>
+      </w:r>
+      <w:r>
+        <w:rPr>
+          <w:rFonts w:ascii="Times New Roman" w:cs="Times New Roman" w:eastAsia="Times New Roman" w:hAnsi="Times New Roman"/>
+          <w:color w:val="000000"/>
+          <w:sz w:val="24"/>
+          <w:szCs w:val="24"/>
+        </w:rPr>
+        <w:t xml:space="preserve">Provide content for a presentation of at most five slides based on the finalised architecture diagram.</w:t>
+      </w:r>
+    </w:p>
+    <w:p>
+      <w:pPr>
+        <w:tabs>
+          <w:tab w:val="left" w:pos="567"/>
+        </w:tabs>
+        <w:spacing w:after="80" w:line="300"/>
+        <w:ind w:left="567" w:hanging="397"/>
+        <w:jc w:val="both"/>
+      </w:pPr>
+      <w:r>
+        <w:rPr>
+          <w:rFonts w:ascii="Times New Roman" w:cs="Times New Roman" w:eastAsia="Times New Roman" w:hAnsi="Times New Roman"/>
+          <w:color w:val="000000"/>
+          <w:sz w:val="24"/>
+          <w:szCs w:val="24"/>
+        </w:rPr>
+        <w:t xml:space="preserve">17.	</w:t>
+      </w:r>
+      <w:r>
+        <w:rPr>
+          <w:rFonts w:ascii="Times New Roman" w:cs="Times New Roman" w:eastAsia="Times New Roman" w:hAnsi="Times New Roman"/>
+          <w:color w:val="000000"/>
+          <w:sz w:val="24"/>
+          <w:szCs w:val="24"/>
+        </w:rPr>
+        <w:t xml:space="preserve">Revise the plan without implementing it: show only the proposed architecture in the diagram; add a research-backed, real-world output derived from the predicted heart rate; and research whether thermal imaging could make the method more precise and more novel.</w:t>
+      </w:r>
+    </w:p>
+    <w:p>
+      <w:pPr>
+        <w:tabs>
+          <w:tab w:val="left" w:pos="567"/>
+        </w:tabs>
+        <w:spacing w:after="80" w:line="300"/>
+        <w:ind w:left="567" w:hanging="397"/>
+        <w:jc w:val="both"/>
+      </w:pPr>
+      <w:r>
+        <w:rPr>
+          <w:rFonts w:ascii="Times New Roman" w:cs="Times New Roman" w:eastAsia="Times New Roman" w:hAnsi="Times New Roman"/>
+          <w:color w:val="000000"/>
+          <w:sz w:val="24"/>
+          <w:szCs w:val="24"/>
+        </w:rPr>
+        <w:t xml:space="preserve">18.	</w:t>
+      </w:r>
+      <w:r>
+        <w:rPr>
+          <w:rFonts w:ascii="Times New Roman" w:cs="Times New Roman" w:eastAsia="Times New Roman" w:hAnsi="Times New Roman"/>
+          <w:color w:val="000000"/>
+          <w:sz w:val="24"/>
+          <w:szCs w:val="24"/>
+        </w:rPr>
+        <w:t xml:space="preserve">Summarise the proposal in a short paragraph.</w:t>
+      </w:r>
+    </w:p>
+    <w:p>
+      <w:pPr>
+        <w:tabs>
+          <w:tab w:val="left" w:pos="567"/>
+        </w:tabs>
+        <w:spacing w:after="80" w:line="300"/>
+        <w:ind w:left="567" w:hanging="397"/>
+        <w:jc w:val="both"/>
+      </w:pPr>
+      <w:r>
+        <w:rPr>
+          <w:rFonts w:ascii="Times New Roman" w:cs="Times New Roman" w:eastAsia="Times New Roman" w:hAnsi="Times New Roman"/>
+          <w:color w:val="000000"/>
+          <w:sz w:val="24"/>
+          <w:szCs w:val="24"/>
+        </w:rPr>
+        <w:t xml:space="preserve">19.	</w:t>
+      </w:r>
+      <w:r>
+        <w:rPr>
+          <w:rFonts w:ascii="Times New Roman" w:cs="Times New Roman" w:eastAsia="Times New Roman" w:hAnsi="Times New Roman"/>
+          <w:color w:val="000000"/>
+          <w:sz w:val="24"/>
+          <w:szCs w:val="24"/>
+        </w:rPr>
+        <w:t xml:space="preserve">Would users of the application need a separate thermal camera in addition to a normal camera?</w:t>
+      </w:r>
+    </w:p>
+    <w:p>
+      <w:pPr>
+        <w:tabs>
+          <w:tab w:val="left" w:pos="567"/>
+        </w:tabs>
+        <w:spacing w:after="80" w:line="300"/>
+        <w:ind w:left="567" w:hanging="397"/>
+        <w:jc w:val="both"/>
+      </w:pPr>
+      <w:r>
+        <w:rPr>
+          <w:rFonts w:ascii="Times New Roman" w:cs="Times New Roman" w:eastAsia="Times New Roman" w:hAnsi="Times New Roman"/>
+          <w:color w:val="000000"/>
+          <w:sz w:val="24"/>
+          <w:szCs w:val="24"/>
+        </w:rPr>
+        <w:t xml:space="preserve">20.	</w:t>
+      </w:r>
+      <w:r>
+        <w:rPr>
+          <w:rFonts w:ascii="Times New Roman" w:cs="Times New Roman" w:eastAsia="Times New Roman" w:hAnsi="Times New Roman"/>
+          <w:color w:val="000000"/>
+          <w:sz w:val="24"/>
+          <w:szCs w:val="24"/>
+        </w:rPr>
+        <w:t xml:space="preserve">Remove the thermal component from the project.</w:t>
+      </w:r>
+    </w:p>
+    <w:p>
+      <w:pPr>
+        <w:tabs>
+          <w:tab w:val="left" w:pos="567"/>
+        </w:tabs>
+        <w:spacing w:after="80" w:line="300"/>
+        <w:ind w:left="567" w:hanging="397"/>
+        <w:jc w:val="both"/>
+      </w:pPr>
+      <w:r>
+        <w:rPr>
+          <w:rFonts w:ascii="Times New Roman" w:cs="Times New Roman" w:eastAsia="Times New Roman" w:hAnsi="Times New Roman"/>
+          <w:color w:val="000000"/>
+          <w:sz w:val="24"/>
+          <w:szCs w:val="24"/>
+        </w:rPr>
+        <w:t xml:space="preserve">21.	</w:t>
+      </w:r>
+      <w:r>
+        <w:rPr>
+          <w:rFonts w:ascii="Times New Roman" w:cs="Times New Roman" w:eastAsia="Times New Roman" w:hAnsi="Times New Roman"/>
+          <w:color w:val="000000"/>
+          <w:sz w:val="24"/>
+          <w:szCs w:val="24"/>
+        </w:rPr>
+        <w:t xml:space="preserve">Suggest a more clinically useful output than the stress level.</w:t>
+      </w:r>
+    </w:p>
+    <w:p>
+      <w:pPr>
+        <w:tabs>
+          <w:tab w:val="left" w:pos="567"/>
+        </w:tabs>
+        <w:spacing w:after="80" w:line="300"/>
+        <w:ind w:left="567" w:hanging="397"/>
+        <w:jc w:val="both"/>
+      </w:pPr>
+      <w:r>
+        <w:rPr>
+          <w:rFonts w:ascii="Times New Roman" w:cs="Times New Roman" w:eastAsia="Times New Roman" w:hAnsi="Times New Roman"/>
+          <w:color w:val="000000"/>
+          <w:sz w:val="24"/>
+          <w:szCs w:val="24"/>
+        </w:rPr>
+        <w:t xml:space="preserve">22.	</w:t>
+      </w:r>
+      <w:r>
+        <w:rPr>
+          <w:rFonts w:ascii="Times New Roman" w:cs="Times New Roman" w:eastAsia="Times New Roman" w:hAnsi="Times New Roman"/>
+          <w:color w:val="000000"/>
+          <w:sz w:val="24"/>
+          <w:szCs w:val="24"/>
+        </w:rPr>
+        <w:t xml:space="preserve">Update the plan with atrial fibrillation screening as the primary output and stress as a secondary output.</w:t>
+      </w:r>
+    </w:p>
+    <w:p>
+      <w:pPr>
+        <w:tabs>
+          <w:tab w:val="left" w:pos="567"/>
+        </w:tabs>
+        <w:spacing w:after="80" w:line="300"/>
+        <w:ind w:left="567" w:hanging="397"/>
+        <w:jc w:val="both"/>
+      </w:pPr>
+      <w:r>
+        <w:rPr>
+          <w:rFonts w:ascii="Times New Roman" w:cs="Times New Roman" w:eastAsia="Times New Roman" w:hAnsi="Times New Roman"/>
+          <w:color w:val="000000"/>
+          <w:sz w:val="24"/>
+          <w:szCs w:val="24"/>
+        </w:rPr>
+        <w:t xml:space="preserve">23.	</w:t>
+      </w:r>
+      <w:r>
+        <w:rPr>
+          <w:rFonts w:ascii="Times New Roman" w:cs="Times New Roman" w:eastAsia="Times New Roman" w:hAnsi="Times New Roman"/>
+          <w:color w:val="000000"/>
+          <w:sz w:val="24"/>
+          <w:szCs w:val="24"/>
+        </w:rPr>
+        <w:t xml:space="preserve">Generate the updated implementation plan.</w:t>
+      </w:r>
+    </w:p>
+    <w:p>
+      <w:pPr>
+        <w:tabs>
+          <w:tab w:val="left" w:pos="567"/>
+        </w:tabs>
+        <w:spacing w:after="80" w:line="300"/>
+        <w:ind w:left="567" w:hanging="397"/>
+        <w:jc w:val="both"/>
+      </w:pPr>
+      <w:r>
+        <w:rPr>
+          <w:rFonts w:ascii="Times New Roman" w:cs="Times New Roman" w:eastAsia="Times New Roman" w:hAnsi="Times New Roman"/>
+          <w:color w:val="000000"/>
+          <w:sz w:val="24"/>
+          <w:szCs w:val="24"/>
+        </w:rPr>
+        <w:t xml:space="preserve">24.	</w:t>
+      </w:r>
+      <w:r>
+        <w:rPr>
+          <w:rFonts w:ascii="Times New Roman" w:cs="Times New Roman" w:eastAsia="Times New Roman" w:hAnsi="Times New Roman"/>
+          <w:color w:val="000000"/>
+          <w:sz w:val="24"/>
+          <w:szCs w:val="24"/>
+        </w:rPr>
+        <w:t xml:space="preserve">Create a black-and-white architecture diagram and a prompt for generating it with an AI tool.</w:t>
+      </w:r>
+    </w:p>
+    <w:p>
+      <w:pPr>
+        <w:tabs>
+          <w:tab w:val="left" w:pos="567"/>
+        </w:tabs>
+        <w:spacing w:after="80" w:line="300"/>
+        <w:ind w:left="567" w:hanging="397"/>
+        <w:jc w:val="both"/>
+      </w:pPr>
+      <w:r>
+        <w:rPr>
+          <w:rFonts w:ascii="Times New Roman" w:cs="Times New Roman" w:eastAsia="Times New Roman" w:hAnsi="Times New Roman"/>
+          <w:color w:val="000000"/>
+          <w:sz w:val="24"/>
+          <w:szCs w:val="24"/>
+        </w:rPr>
+        <w:t xml:space="preserve">25.	</w:t>
+      </w:r>
+      <w:r>
+        <w:rPr>
+          <w:rFonts w:ascii="Times New Roman" w:cs="Times New Roman" w:eastAsia="Times New Roman" w:hAnsi="Times New Roman"/>
+          <w:color w:val="000000"/>
+          <w:sz w:val="24"/>
+          <w:szCs w:val="24"/>
+        </w:rPr>
+        <w:t xml:space="preserve">Explain how the model detects atrial fibrillation or estimates stress from the heart rate.</w:t>
+      </w:r>
+    </w:p>
+    <w:p>
+      <w:pPr>
+        <w:tabs>
+          <w:tab w:val="left" w:pos="567"/>
+        </w:tabs>
+        <w:spacing w:after="80" w:line="300"/>
+        <w:ind w:left="567" w:hanging="397"/>
+        <w:jc w:val="both"/>
+      </w:pPr>
+      <w:r>
+        <w:rPr>
+          <w:rFonts w:ascii="Times New Roman" w:cs="Times New Roman" w:eastAsia="Times New Roman" w:hAnsi="Times New Roman"/>
+          <w:color w:val="000000"/>
+          <w:sz w:val="24"/>
+          <w:szCs w:val="24"/>
+        </w:rPr>
+        <w:t xml:space="preserve">26.	</w:t>
+      </w:r>
+      <w:r>
+        <w:rPr>
+          <w:rFonts w:ascii="Times New Roman" w:cs="Times New Roman" w:eastAsia="Times New Roman" w:hAnsi="Times New Roman"/>
+          <w:color w:val="000000"/>
+          <w:sz w:val="24"/>
+          <w:szCs w:val="24"/>
+        </w:rPr>
+        <w:t xml:space="preserve">What are heart-rate variability and the LF/HF ratio, and how are they measured?</w:t>
+      </w:r>
+    </w:p>
+    <w:p>
+      <w:pPr>
+        <w:tabs>
+          <w:tab w:val="left" w:pos="567"/>
+        </w:tabs>
+        <w:spacing w:after="80" w:line="300"/>
+        <w:ind w:left="567" w:hanging="397"/>
+        <w:jc w:val="both"/>
+      </w:pPr>
+      <w:r>
+        <w:rPr>
+          <w:rFonts w:ascii="Times New Roman" w:cs="Times New Roman" w:eastAsia="Times New Roman" w:hAnsi="Times New Roman"/>
+          <w:color w:val="000000"/>
+          <w:sz w:val="24"/>
+          <w:szCs w:val="24"/>
+        </w:rPr>
+        <w:t xml:space="preserve">27.	</w:t>
+      </w:r>
+      <w:r>
+        <w:rPr>
+          <w:rFonts w:ascii="Times New Roman" w:cs="Times New Roman" w:eastAsia="Times New Roman" w:hAnsi="Times New Roman"/>
+          <w:color w:val="000000"/>
+          <w:sz w:val="24"/>
+          <w:szCs w:val="24"/>
+        </w:rPr>
+        <w:t xml:space="preserve">What is the normal range of heart-rate variability, and how was it established?</w:t>
+      </w:r>
+    </w:p>
+    <w:p>
+      <w:pPr>
+        <w:tabs>
+          <w:tab w:val="left" w:pos="567"/>
+        </w:tabs>
+        <w:spacing w:after="80" w:line="300"/>
+        <w:ind w:left="567" w:hanging="397"/>
+        <w:jc w:val="both"/>
+      </w:pPr>
+      <w:r>
+        <w:rPr>
+          <w:rFonts w:ascii="Times New Roman" w:cs="Times New Roman" w:eastAsia="Times New Roman" w:hAnsi="Times New Roman"/>
+          <w:color w:val="000000"/>
+          <w:sz w:val="24"/>
+          <w:szCs w:val="24"/>
+        </w:rPr>
+        <w:t xml:space="preserve">28.	</w:t>
+      </w:r>
+      <w:r>
+        <w:rPr>
+          <w:rFonts w:ascii="Times New Roman" w:cs="Times New Roman" w:eastAsia="Times New Roman" w:hAnsi="Times New Roman"/>
+          <w:color w:val="000000"/>
+          <w:sz w:val="24"/>
+          <w:szCs w:val="24"/>
+        </w:rPr>
+        <w:t xml:space="preserve">Explain atrial fibrillation in simple terms, how the model detects it, and what happens after it is detected.</w:t>
+      </w:r>
+    </w:p>
+    <w:p>
+      <w:pPr>
+        <w:tabs>
+          <w:tab w:val="left" w:pos="567"/>
+        </w:tabs>
+        <w:spacing w:after="80" w:line="300"/>
+        <w:ind w:left="567" w:hanging="397"/>
+        <w:jc w:val="both"/>
+      </w:pPr>
+      <w:r>
+        <w:rPr>
+          <w:rFonts w:ascii="Times New Roman" w:cs="Times New Roman" w:eastAsia="Times New Roman" w:hAnsi="Times New Roman"/>
+          <w:color w:val="000000"/>
+          <w:sz w:val="24"/>
+          <w:szCs w:val="24"/>
+        </w:rPr>
+        <w:t xml:space="preserve">29.	</w:t>
+      </w:r>
+      <w:r>
+        <w:rPr>
+          <w:rFonts w:ascii="Times New Roman" w:cs="Times New Roman" w:eastAsia="Times New Roman" w:hAnsi="Times New Roman"/>
+          <w:color w:val="000000"/>
+          <w:sz w:val="24"/>
+          <w:szCs w:val="24"/>
+        </w:rPr>
+        <w:t xml:space="preserve">Are the beat-interval values used in the explanation supported by research?</w:t>
+      </w:r>
+    </w:p>
+    <w:p>
+      <w:pPr>
+        <w:tabs>
+          <w:tab w:val="left" w:pos="567"/>
+        </w:tabs>
+        <w:spacing w:after="80" w:line="300"/>
+        <w:ind w:left="567" w:hanging="397"/>
+        <w:jc w:val="both"/>
+      </w:pPr>
+      <w:r>
+        <w:rPr>
+          <w:rFonts w:ascii="Times New Roman" w:cs="Times New Roman" w:eastAsia="Times New Roman" w:hAnsi="Times New Roman"/>
+          <w:color w:val="000000"/>
+          <w:sz w:val="24"/>
+          <w:szCs w:val="24"/>
+        </w:rPr>
+        <w:t xml:space="preserve">30.	</w:t>
+      </w:r>
+      <w:r>
+        <w:rPr>
+          <w:rFonts w:ascii="Times New Roman" w:cs="Times New Roman" w:eastAsia="Times New Roman" w:hAnsi="Times New Roman"/>
+          <w:color w:val="000000"/>
+          <w:sz w:val="24"/>
+          <w:szCs w:val="24"/>
+        </w:rPr>
+        <w:t xml:space="preserve">Can other medical conditions be detected from the predicted heartbeat?</w:t>
+      </w:r>
+    </w:p>
+    <w:p>
+      <w:pPr>
+        <w:tabs>
+          <w:tab w:val="left" w:pos="567"/>
+        </w:tabs>
+        <w:spacing w:after="80" w:line="300"/>
+        <w:ind w:left="567" w:hanging="397"/>
+        <w:jc w:val="both"/>
+      </w:pPr>
+      <w:r>
+        <w:rPr>
+          <w:rFonts w:ascii="Times New Roman" w:cs="Times New Roman" w:eastAsia="Times New Roman" w:hAnsi="Times New Roman"/>
+          <w:color w:val="000000"/>
+          <w:sz w:val="24"/>
+          <w:szCs w:val="24"/>
+        </w:rPr>
+        <w:t xml:space="preserve">31.	</w:t>
+      </w:r>
+      <w:r>
+        <w:rPr>
+          <w:rFonts w:ascii="Times New Roman" w:cs="Times New Roman" w:eastAsia="Times New Roman" w:hAnsi="Times New Roman"/>
+          <w:color w:val="000000"/>
+          <w:sz w:val="24"/>
+          <w:szCs w:val="24"/>
+        </w:rPr>
+        <w:t xml:space="preserve">What do abnormally slow or fast heartbeats indicate?</w:t>
+      </w:r>
+    </w:p>
+    <w:p>
+      <w:pPr>
+        <w:tabs>
+          <w:tab w:val="left" w:pos="567"/>
+        </w:tabs>
+        <w:spacing w:after="80" w:line="300"/>
+        <w:ind w:left="567" w:hanging="397"/>
+        <w:jc w:val="both"/>
+      </w:pPr>
+      <w:r>
+        <w:rPr>
+          <w:rFonts w:ascii="Times New Roman" w:cs="Times New Roman" w:eastAsia="Times New Roman" w:hAnsi="Times New Roman"/>
+          <w:color w:val="000000"/>
+          <w:sz w:val="24"/>
+          <w:szCs w:val="24"/>
+        </w:rPr>
+        <w:t xml:space="preserve">32.	</w:t>
+      </w:r>
+      <w:r>
+        <w:rPr>
+          <w:rFonts w:ascii="Times New Roman" w:cs="Times New Roman" w:eastAsia="Times New Roman" w:hAnsi="Times New Roman"/>
+          <w:color w:val="000000"/>
+          <w:sz w:val="24"/>
+          <w:szCs w:val="24"/>
+        </w:rPr>
+        <w:t xml:space="preserve">Make abnormal heart-rate flags the secondary output, keep atrial fibrillation as the primary output, and assess the feasibility.</w:t>
+      </w:r>
+    </w:p>
+    <w:p>
+      <w:pPr>
+        <w:tabs>
+          <w:tab w:val="left" w:pos="567"/>
+        </w:tabs>
+        <w:spacing w:after="80" w:line="300"/>
+        <w:ind w:left="567" w:hanging="397"/>
+        <w:jc w:val="both"/>
+      </w:pPr>
+      <w:r>
+        <w:rPr>
+          <w:rFonts w:ascii="Times New Roman" w:cs="Times New Roman" w:eastAsia="Times New Roman" w:hAnsi="Times New Roman"/>
+          <w:color w:val="000000"/>
+          <w:sz w:val="24"/>
+          <w:szCs w:val="24"/>
+        </w:rPr>
+        <w:t xml:space="preserve">33.	</w:t>
+      </w:r>
+      <w:r>
+        <w:rPr>
+          <w:rFonts w:ascii="Times New Roman" w:cs="Times New Roman" w:eastAsia="Times New Roman" w:hAnsi="Times New Roman"/>
+          <w:color w:val="000000"/>
+          <w:sz w:val="24"/>
+          <w:szCs w:val="24"/>
+        </w:rPr>
+        <w:t xml:space="preserve">Explain the architecture in one paragraph, defining every technical term.</w:t>
+      </w:r>
+    </w:p>
+    <w:p>
+      <w:pPr>
+        <w:tabs>
+          <w:tab w:val="left" w:pos="567"/>
+        </w:tabs>
+        <w:spacing w:after="80" w:line="300"/>
+        <w:ind w:left="567" w:hanging="397"/>
+        <w:jc w:val="both"/>
+      </w:pPr>
+      <w:r>
+        <w:rPr>
+          <w:rFonts w:ascii="Times New Roman" w:cs="Times New Roman" w:eastAsia="Times New Roman" w:hAnsi="Times New Roman"/>
+          <w:color w:val="000000"/>
+          <w:sz w:val="24"/>
+          <w:szCs w:val="24"/>
+        </w:rPr>
+        <w:t xml:space="preserve">34.	</w:t>
+      </w:r>
+      <w:r>
+        <w:rPr>
+          <w:rFonts w:ascii="Times New Roman" w:cs="Times New Roman" w:eastAsia="Times New Roman" w:hAnsi="Times New Roman"/>
+          <w:color w:val="000000"/>
+          <w:sz w:val="24"/>
+          <w:szCs w:val="24"/>
+        </w:rPr>
+        <w:t xml:space="preserve">Answer the following design questions: (1) Can the face realistically be divided into 25 patches, or should the number be reduced? (2) How is the confidence of the weighted fusion computed? (3) How are the trust-score features computed? (4) How is motion removal performed? (5) Which of RMSSD, SDNN and LF/HF is most important for the project?</w:t>
+      </w:r>
+    </w:p>
+    <w:p>
+      <w:pPr>
+        <w:tabs>
+          <w:tab w:val="left" w:pos="567"/>
+        </w:tabs>
+        <w:spacing w:after="80" w:line="300"/>
+        <w:ind w:left="567" w:hanging="397"/>
+        <w:jc w:val="both"/>
+      </w:pPr>
+      <w:r>
+        <w:rPr>
+          <w:rFonts w:ascii="Times New Roman" w:cs="Times New Roman" w:eastAsia="Times New Roman" w:hAnsi="Times New Roman"/>
+          <w:color w:val="000000"/>
+          <w:sz w:val="24"/>
+          <w:szCs w:val="24"/>
+        </w:rPr>
+        <w:t xml:space="preserve">35.	</w:t>
+      </w:r>
+      <w:r>
+        <w:rPr>
+          <w:rFonts w:ascii="Times New Roman" w:cs="Times New Roman" w:eastAsia="Times New Roman" w:hAnsi="Times New Roman"/>
+          <w:color w:val="000000"/>
+          <w:sz w:val="24"/>
+          <w:szCs w:val="24"/>
+        </w:rPr>
+        <w:t xml:space="preserve">Update the implementation plan and create a simplified architecture diagram.</w:t>
+      </w:r>
+    </w:p>
+    <w:p>
+      <w:pPr>
+        <w:pStyle w:val="Heading2"/>
+        <w:spacing w:after="120" w:before="240"/>
+      </w:pPr>
+      <w:r>
+        <w:rPr>
+          <w:rFonts w:ascii="Times New Roman" w:cs="Times New Roman" w:eastAsia="Times New Roman" w:hAnsi="Times New Roman"/>
+          <w:b/>
+          <w:bCs/>
+          <w:color w:val="000000"/>
+          <w:sz w:val="24"/>
+          <w:szCs w:val="24"/>
+        </w:rPr>
+        <w:t xml:space="preserve">3. Relevant search keywords</w:t>
+      </w:r>
+    </w:p>
+    <w:p>
+      <w:pPr>
+        <w:spacing w:after="120" w:before="0" w:line="300"/>
+        <w:jc w:val="both"/>
+      </w:pPr>
+      <w:r>
+        <w:rPr>
+          <w:rFonts w:ascii="Times New Roman" w:cs="Times New Roman" w:eastAsia="Times New Roman" w:hAnsi="Times New Roman"/>
+          <w:color w:val="000000"/>
+          <w:sz w:val="24"/>
+          <w:szCs w:val="24"/>
+        </w:rPr>
+        <w:t xml:space="preserve">The following keywords were used to search the literature, datasets and guidelines:</w:t>
+      </w:r>
+    </w:p>
+    <w:p>
+      <w:pPr>
         <w:pStyle w:val="ListParagraph"/>
         <w:numPr>
           <w:ilvl w:val="0"/>
-          <w:numId w:val="12"/>
+          <w:numId w:val="5"/>
         </w:numPr>
         <w:spacing w:after="80" w:line="300"/>
         <w:jc w:val="both"/>
@@ -28521,22 +30369,11 @@
       <w:r>
         <w:rPr>
           <w:rFonts w:ascii="Times New Roman" w:cs="Times New Roman" w:eastAsia="Times New Roman" w:hAnsi="Times New Roman"/>
-          <w:b/>
-          <w:bCs/>
-          <w:color w:val="000000"/>
-          <w:sz w:val="24"/>
-          <w:szCs w:val="24"/>
-        </w:rPr>
-        <w:t xml:space="preserve">Data access:</w:t>
-      </w:r>
-      <w:r>
-        <w:rPr>
-          <w:rFonts w:ascii="Times New Roman" w:cs="Times New Roman" w:eastAsia="Times New Roman" w:hAnsi="Times New Roman"/>
-          <w:color w:val="000000"/>
-          <w:sz w:val="24"/>
-          <w:szCs w:val="24"/>
-        </w:rPr>
-        <w:t xml:space="preserve"> the most important datasets (OBF for AF face videos, PURE, COHFACE) are available only on request, and the development environment could not download the public ones, so validation so far relies on synthetic data.</w:t>
+          <w:color w:val="000000"/>
+          <w:sz w:val="24"/>
+          <w:szCs w:val="24"/>
+        </w:rPr>
+        <w:t xml:space="preserve">remote photoplethysmography (rPPG); contactless heart rate from facial video</w:t>
       </w:r>
     </w:p>
     <w:p>
@@ -28544,7 +30381,7 @@
         <w:pStyle w:val="ListParagraph"/>
         <w:numPr>
           <w:ilvl w:val="0"/>
-          <w:numId w:val="12"/>
+          <w:numId w:val="5"/>
         </w:numPr>
         <w:spacing w:after="80" w:line="300"/>
         <w:jc w:val="both"/>
@@ -28552,22 +30389,11 @@
       <w:r>
         <w:rPr>
           <w:rFonts w:ascii="Times New Roman" w:cs="Times New Roman" w:eastAsia="Times New Roman" w:hAnsi="Times New Roman"/>
-          <w:b/>
-          <w:bCs/>
-          <w:color w:val="000000"/>
-          <w:sz w:val="24"/>
-          <w:szCs w:val="24"/>
-        </w:rPr>
-        <w:t xml:space="preserve">Unexpected coupling of head pose and pulse:</w:t>
-      </w:r>
-      <w:r>
-        <w:rPr>
-          <w:rFonts w:ascii="Times New Roman" w:cs="Times New Roman" w:eastAsia="Times New Roman" w:hAnsi="Times New Roman"/>
-          <w:color w:val="000000"/>
-          <w:sz w:val="24"/>
-          <w:szCs w:val="24"/>
-        </w:rPr>
-        <w:t xml:space="preserve"> MediaPipe's pose estimate moves with each heartbeat, so the first motion-removal design removed real pulse; this had to be diagnosed and solved by using only clearly moving pose channels.</w:t>
+          <w:color w:val="000000"/>
+          <w:sz w:val="24"/>
+          <w:szCs w:val="24"/>
+        </w:rPr>
+        <w:t xml:space="preserve">POS, CHROM, PBV and ICA rPPG methods; rPPG-Toolbox benchmark</w:t>
       </w:r>
     </w:p>
     <w:p>
@@ -28575,7 +30401,7 @@
         <w:pStyle w:val="ListParagraph"/>
         <w:numPr>
           <w:ilvl w:val="0"/>
-          <w:numId w:val="12"/>
+          <w:numId w:val="5"/>
         </w:numPr>
         <w:spacing w:after="80" w:line="300"/>
         <w:jc w:val="both"/>
@@ -28583,22 +30409,11 @@
       <w:r>
         <w:rPr>
           <w:rFonts w:ascii="Times New Roman" w:cs="Times New Roman" w:eastAsia="Times New Roman" w:hAnsi="Times New Roman"/>
-          <w:b/>
-          <w:bCs/>
-          <w:color w:val="000000"/>
-          <w:sz w:val="24"/>
-          <w:szCs w:val="24"/>
-        </w:rPr>
-        <w:t xml:space="preserve">Non-linearity introduced by POS:</w:t>
-      </w:r>
-      <w:r>
-        <w:rPr>
-          <w:rFonts w:ascii="Times New Roman" w:cs="Times New Roman" w:eastAsia="Times New Roman" w:hAnsi="Times New Roman"/>
-          <w:color w:val="000000"/>
-          <w:sz w:val="24"/>
-          <w:szCs w:val="24"/>
-        </w:rPr>
-        <w:t xml:space="preserve"> removing motion only after POS barely helped, because POS's per-window tuning distorts the artifact; motion removal had to be moved before POS as well.</w:t>
+          <w:color w:val="000000"/>
+          <w:sz w:val="24"/>
+          <w:szCs w:val="24"/>
+        </w:rPr>
+        <w:t xml:space="preserve">multi-region and patch-based rPPG; region weighting; DistancePPG; skin segmentation</w:t>
       </w:r>
     </w:p>
     <w:p>
@@ -28606,7 +30421,7 @@
         <w:pStyle w:val="ListParagraph"/>
         <w:numPr>
           <w:ilvl w:val="0"/>
-          <w:numId w:val="12"/>
+          <w:numId w:val="5"/>
         </w:numPr>
         <w:spacing w:after="80" w:line="300"/>
         <w:jc w:val="both"/>
@@ -28614,22 +30429,11 @@
       <w:r>
         <w:rPr>
           <w:rFonts w:ascii="Times New Roman" w:cs="Times New Roman" w:eastAsia="Times New Roman" w:hAnsi="Times New Roman"/>
-          <w:b/>
-          <w:bCs/>
-          <w:color w:val="000000"/>
-          <w:sz w:val="24"/>
-          <w:szCs w:val="24"/>
-        </w:rPr>
-        <w:t xml:space="preserve">Irregular rhythms break common tools:</w:t>
-      </w:r>
-      <w:r>
-        <w:rPr>
-          <w:rFonts w:ascii="Times New Roman" w:cs="Times New Roman" w:eastAsia="Times New Roman" w:hAnsi="Times New Roman"/>
-          <w:color w:val="000000"/>
-          <w:sz w:val="24"/>
-          <w:szCs w:val="24"/>
-        </w:rPr>
-        <w:t xml:space="preserve"> spectral quality measures and the FFT heart rate both fail on AF, so rhythm-independent quality measures and a beat-based heart rate were needed.</w:t>
+          <w:color w:val="000000"/>
+          <w:sz w:val="24"/>
+          <w:szCs w:val="24"/>
+        </w:rPr>
+        <w:t xml:space="preserve">rPPG head motion; face orientation; ballistocardiographic head motion</w:t>
       </w:r>
     </w:p>
     <w:p>
@@ -28637,7 +30441,7 @@
         <w:pStyle w:val="ListParagraph"/>
         <w:numPr>
           <w:ilvl w:val="0"/>
-          <w:numId w:val="12"/>
+          <w:numId w:val="5"/>
         </w:numPr>
         <w:spacing w:after="80" w:line="300"/>
         <w:jc w:val="both"/>
@@ -28645,22 +30449,11 @@
       <w:r>
         <w:rPr>
           <w:rFonts w:ascii="Times New Roman" w:cs="Times New Roman" w:eastAsia="Times New Roman" w:hAnsi="Times New Roman"/>
-          <w:b/>
-          <w:bCs/>
-          <w:color w:val="000000"/>
-          <w:sz w:val="24"/>
-          <w:szCs w:val="24"/>
-        </w:rPr>
-        <w:t xml:space="preserve">Changes of scope:</w:t>
-      </w:r>
-      <w:r>
-        <w:rPr>
-          <w:rFonts w:ascii="Times New Roman" w:cs="Times New Roman" w:eastAsia="Times New Roman" w:hAnsi="Times New Roman"/>
-          <w:color w:val="000000"/>
-          <w:sz w:val="24"/>
-          <w:szCs w:val="24"/>
-        </w:rPr>
-        <w:t xml:space="preserve"> the project moved from a benchmark of existing methods to a new method, and its output moved from stress (and a briefly considered thermal camera, dropped because it needs extra hardware) to AF screening with heart-rate flags, which required re-planning.</w:t>
+          <w:color w:val="000000"/>
+          <w:sz w:val="24"/>
+          <w:szCs w:val="24"/>
+        </w:rPr>
+        <w:t xml:space="preserve">deep learning rPPG: DeepPhys, PhysNet, TS-CAN, PhysFormer</w:t>
       </w:r>
     </w:p>
     <w:p>
@@ -28668,7 +30461,7 @@
         <w:pStyle w:val="ListParagraph"/>
         <w:numPr>
           <w:ilvl w:val="0"/>
-          <w:numId w:val="12"/>
+          <w:numId w:val="5"/>
         </w:numPr>
         <w:spacing w:after="80" w:line="300"/>
         <w:jc w:val="both"/>
@@ -28676,39 +30469,11 @@
       <w:r>
         <w:rPr>
           <w:rFonts w:ascii="Times New Roman" w:cs="Times New Roman" w:eastAsia="Times New Roman" w:hAnsi="Times New Roman"/>
-          <w:b/>
-          <w:bCs/>
-          <w:color w:val="000000"/>
-          <w:sz w:val="24"/>
-          <w:szCs w:val="24"/>
-        </w:rPr>
-        <w:t xml:space="preserve">Practical issues:</w:t>
-      </w:r>
-      <w:r>
-        <w:rPr>
-          <w:rFonts w:ascii="Times New Roman" w:cs="Times New Roman" w:eastAsia="Times New Roman" w:hAnsi="Times New Roman"/>
-          <w:color w:val="000000"/>
-          <w:sz w:val="24"/>
-          <w:szCs w:val="24"/>
-        </w:rPr>
-        <w:t xml:space="preserve"> Windows-specific setup problems with the earlier toolbox environment, and phone videos in HEVC format that OpenCV cannot read.</w:t>
-      </w:r>
-    </w:p>
-    <w:p>
-      <w:pPr>
-        <w:pStyle w:val="Heading2"/>
-        <w:spacing w:after="120" w:before="240"/>
-      </w:pPr>
-      <w:r>
-        <w:rPr>
-          <w:rFonts w:ascii="Times New Roman" w:cs="Times New Roman" w:eastAsia="Times New Roman" w:hAnsi="Times New Roman"/>
-          <w:b/>
-          <w:bCs/>
-          <w:color w:val="000000"/>
-          <w:sz w:val="24"/>
-          <w:szCs w:val="24"/>
-        </w:rPr>
-        <w:t xml:space="preserve">4. Future work</w:t>
+          <w:color w:val="000000"/>
+          <w:sz w:val="24"/>
+          <w:szCs w:val="24"/>
+        </w:rPr>
+        <w:t xml:space="preserve">atrial fibrillation detection from facial video; smartphone photoplethysmography atrial fibrillation</w:t>
       </w:r>
     </w:p>
     <w:p>
@@ -28716,7 +30481,7 @@
         <w:pStyle w:val="ListParagraph"/>
         <w:numPr>
           <w:ilvl w:val="0"/>
-          <w:numId w:val="13"/>
+          <w:numId w:val="5"/>
         </w:numPr>
         <w:spacing w:after="80" w:line="300"/>
         <w:jc w:val="both"/>
@@ -28728,7 +30493,7 @@
           <w:sz w:val="24"/>
           <w:szCs w:val="24"/>
         </w:rPr>
-        <w:t xml:space="preserve">Run the Phase 1 check on UBFC-rPPG and PURE: the proposed method against single-region POS, and the ablation of every ingredient on real faces.</w:t>
+        <w:t xml:space="preserve">atrial fibrillation RR-interval irregularity: RMSSD, Shannon entropy, turning-point ratio, Poincaré plot</w:t>
       </w:r>
     </w:p>
     <w:p>
@@ -28736,7 +30501,7 @@
         <w:pStyle w:val="ListParagraph"/>
         <w:numPr>
           <w:ilvl w:val="0"/>
-          <w:numId w:val="13"/>
+          <w:numId w:val="5"/>
         </w:numPr>
         <w:spacing w:after="80" w:line="300"/>
         <w:jc w:val="both"/>
@@ -28748,7 +30513,7 @@
           <w:sz w:val="24"/>
           <w:szCs w:val="24"/>
         </w:rPr>
-        <w:t xml:space="preserve">Add breathing rate and breathing-aware heart-rate selection, and validate breathing on COHFACE (Phase 2).</w:t>
+        <w:t xml:space="preserve">premature atrial and ventricular contractions versus atrial fibrillation in PPG</w:t>
       </w:r>
     </w:p>
     <w:p>
@@ -28756,7 +30521,7 @@
         <w:pStyle w:val="ListParagraph"/>
         <w:numPr>
           <w:ilvl w:val="0"/>
-          <w:numId w:val="13"/>
+          <w:numId w:val="5"/>
         </w:numPr>
         <w:spacing w:after="80" w:line="300"/>
         <w:jc w:val="both"/>
@@ -28768,7 +30533,7 @@
           <w:sz w:val="24"/>
           <w:szCs w:val="24"/>
         </w:rPr>
-        <w:t xml:space="preserve">Build the AF classifier on MIMIC PERform AF and test it on face videos: sensitivity and specificity on OBF if granted, and false-alarm rate and coverage with and without confidence gating on normal-rhythm videos (Phase 3).</w:t>
+        <w:t xml:space="preserve">PPG signal-quality index; PPG beat detection benchmark</w:t>
       </w:r>
     </w:p>
     <w:p>
@@ -28776,7 +30541,7 @@
         <w:pStyle w:val="ListParagraph"/>
         <w:numPr>
           <w:ilvl w:val="0"/>
-          <w:numId w:val="13"/>
+          <w:numId w:val="5"/>
         </w:numPr>
         <w:spacing w:after="80" w:line="300"/>
         <w:jc w:val="both"/>
@@ -28788,7 +30553,7 @@
           <w:sz w:val="24"/>
           <w:szCs w:val="24"/>
         </w:rPr>
-        <w:t xml:space="preserve">Implement the slow, fast and extra-beat flags and test the extra-beat rule on MIT-BIH Arrhythmia (Phase 4).</w:t>
+        <w:t xml:space="preserve">respiratory rate from the photoplethysmogram</w:t>
       </w:r>
     </w:p>
     <w:p>
@@ -28796,7 +30561,7 @@
         <w:pStyle w:val="ListParagraph"/>
         <w:numPr>
           <w:ilvl w:val="0"/>
-          <w:numId w:val="13"/>
+          <w:numId w:val="5"/>
         </w:numPr>
         <w:spacing w:after="80" w:line="300"/>
         <w:jc w:val="both"/>
@@ -28808,7 +30573,7 @@
           <w:sz w:val="24"/>
           <w:szCs w:val="24"/>
         </w:rPr>
-        <w:t xml:space="preserve">Compare with pretrained deep networks through rPPG-Toolbox, measure robustness across skin tones and lighting, and build a live webcam demo with the trust map on the face (Phases 5–6).</w:t>
+        <w:t xml:space="preserve">OBF database; MIMIC PERform AF; UBFC-rPPG; PURE; UBFC-Phys; COHFACE; MMPD; MIT-BIH Arrhythmia Database</w:t>
       </w:r>
     </w:p>
     <w:p>
@@ -28816,7 +30581,7 @@
         <w:pStyle w:val="ListParagraph"/>
         <w:numPr>
           <w:ilvl w:val="0"/>
-          <w:numId w:val="13"/>
+          <w:numId w:val="5"/>
         </w:numPr>
         <w:spacing w:after="80" w:line="300"/>
         <w:jc w:val="both"/>
@@ -28828,88 +30593,7 @@
           <w:sz w:val="24"/>
           <w:szCs w:val="24"/>
         </w:rPr>
-        <w:t xml:space="preserve">Longer term, the method can be improved by learning the trust weights from data, adding near-infrared cameras for low light, and validating with clinicians on people with confirmed AF.</w:t>
-      </w:r>
-    </w:p>
-    <w:p>
-      <w:pPr>
-        <w:pStyle w:val="Heading1"/>
-        <w:spacing w:after="160" w:before="360"/>
-      </w:pPr>
-      <w:r>
-        <w:rPr>
-          <w:rFonts w:ascii="Times New Roman" w:cs="Times New Roman" w:eastAsia="Times New Roman" w:hAnsi="Times New Roman"/>
-          <w:b/>
-          <w:bCs/>
-          <w:color w:val="000000"/>
-          <w:sz w:val="28"/>
-          <w:szCs w:val="28"/>
-        </w:rPr>
-        <w:t xml:space="preserve">Prompt Engineering</w:t>
-      </w:r>
-    </w:p>
-    <w:p>
-      <w:pPr>
-        <w:pStyle w:val="Heading2"/>
-        <w:spacing w:after="120" w:before="240"/>
-      </w:pPr>
-      <w:r>
-        <w:rPr>
-          <w:rFonts w:ascii="Times New Roman" w:cs="Times New Roman" w:eastAsia="Times New Roman" w:hAnsi="Times New Roman"/>
-          <w:b/>
-          <w:bCs/>
-          <w:color w:val="000000"/>
-          <w:sz w:val="24"/>
-          <w:szCs w:val="24"/>
-        </w:rPr>
-        <w:t xml:space="preserve">1. Prompt source</w:t>
-      </w:r>
-    </w:p>
-    <w:p>
-      <w:pPr>
-        <w:spacing w:after="120" w:before="0" w:line="300"/>
-        <w:jc w:val="both"/>
-      </w:pPr>
-      <w:r>
-        <w:rPr>
-          <w:rFonts w:ascii="Times New Roman" w:cs="Times New Roman" w:eastAsia="Times New Roman" w:hAnsi="Times New Roman"/>
-          <w:color w:val="000000"/>
-          <w:sz w:val="24"/>
-          <w:szCs w:val="24"/>
-        </w:rPr>
-        <w:t xml:space="preserve">The prompts were written by the team and given to Claude, Anthropic's AI assistant, through Claude Code (a coding agent that can read the repository, run code and search the web). It was used to plan the phases, explain concepts, research the literature, draw the architecture diagrams, write and test the code, and draft this report. The team made the project decisions (changes of direction, scope, primary and secondary outputs), and the assistant's code was verified by running the automatic tests and the synthetic experiments reported above.</w:t>
-      </w:r>
-    </w:p>
-    <w:p>
-      <w:pPr>
-        <w:pStyle w:val="Heading2"/>
-        <w:spacing w:after="120" w:before="240"/>
-      </w:pPr>
-      <w:r>
-        <w:rPr>
-          <w:rFonts w:ascii="Times New Roman" w:cs="Times New Roman" w:eastAsia="Times New Roman" w:hAnsi="Times New Roman"/>
-          <w:b/>
-          <w:bCs/>
-          <w:color w:val="000000"/>
-          <w:sz w:val="24"/>
-          <w:szCs w:val="24"/>
-        </w:rPr>
-        <w:t xml:space="preserve">2. Prompts utilized</w:t>
-      </w:r>
-    </w:p>
-    <w:p>
-      <w:pPr>
-        <w:spacing w:after="120" w:before="0" w:line="300"/>
-        <w:jc w:val="both"/>
-      </w:pPr>
-      <w:r>
-        <w:rPr>
-          <w:rFonts w:ascii="Times New Roman" w:cs="Times New Roman" w:eastAsia="Times New Roman" w:hAnsi="Times New Roman"/>
-          <w:color w:val="000000"/>
-          <w:sz w:val="24"/>
-          <w:szCs w:val="24"/>
-        </w:rPr>
-        <w:t xml:space="preserve">The prompts below are listed in the order they were used. Their wording has been edited for clarity and grammar, and closely related follow-up questions are combined; the content of each request is unchanged.</w:t>
+        <w:t xml:space="preserve">atrial fibrillation prevalence, stroke risk and screening (USPSTF); bradycardia guideline</w:t>
       </w:r>
     </w:p>
     <w:p>
@@ -28917,7 +30601,7 @@
         <w:pStyle w:val="ListParagraph"/>
         <w:numPr>
           <w:ilvl w:val="0"/>
-          <w:numId w:val="14"/>
+          <w:numId w:val="5"/>
         </w:numPr>
         <w:spacing w:after="80" w:line="300"/>
         <w:jc w:val="both"/>
@@ -28929,7 +30613,7 @@
           <w:sz w:val="24"/>
           <w:szCs w:val="24"/>
         </w:rPr>
-        <w:t xml:space="preserve">Adapt the setup and scripts for Windows, run and demonstrate what has been built, and proceed with Phase 2.</w:t>
+        <w:t xml:space="preserve">normal values of short-term heart-rate variability</w:t>
       </w:r>
     </w:p>
     <w:p>
@@ -28937,7 +30621,7 @@
         <w:pStyle w:val="ListParagraph"/>
         <w:numPr>
           <w:ilvl w:val="0"/>
-          <w:numId w:val="14"/>
+          <w:numId w:val="5"/>
         </w:numPr>
         <w:spacing w:after="80" w:line="300"/>
         <w:jc w:val="both"/>
@@ -28949,7 +30633,24 @@
           <w:sz w:val="24"/>
           <w:szCs w:val="24"/>
         </w:rPr>
-        <w:t xml:space="preserve">The rPPG-Toolbox environment is now working. What is the next step?</w:t>
+        <w:t xml:space="preserve">RGB and thermal imaging for stress detection (explored and not adopted)</w:t>
+      </w:r>
+    </w:p>
+    <w:p>
+      <w:pPr>
+        <w:pStyle w:val="Heading2"/>
+        <w:spacing w:after="120" w:before="240"/>
+      </w:pPr>
+      <w:r>
+        <w:rPr>
+          <w:rFonts w:ascii="Times New Roman" w:cs="Times New Roman" w:eastAsia="Times New Roman" w:hAnsi="Times New Roman"/>
+          <w:b/>
+          <w:bCs/>
+          <w:color w:val="000000"/>
+          <w:sz w:val="24"/>
+          <w:szCs w:val="24"/>
+        </w:rPr>
+        <w:t xml:space="preserve">4. Any other</w:t>
       </w:r>
     </w:p>
     <w:p>
@@ -28957,7 +30658,7 @@
         <w:pStyle w:val="ListParagraph"/>
         <w:numPr>
           <w:ilvl w:val="0"/>
-          <w:numId w:val="14"/>
+          <w:numId w:val="6"/>
         </w:numPr>
         <w:spacing w:after="80" w:line="300"/>
         <w:jc w:val="both"/>
@@ -28965,11 +30666,22 @@
       <w:r>
         <w:rPr>
           <w:rFonts w:ascii="Times New Roman" w:cs="Times New Roman" w:eastAsia="Times New Roman" w:hAnsi="Times New Roman"/>
-          <w:color w:val="000000"/>
-          <w:sz w:val="24"/>
-          <w:szCs w:val="24"/>
-        </w:rPr>
-        <w:t xml:space="preserve">We have not recorded our own face video yet. What can be done in the meantime?</w:t>
+          <w:b/>
+          <w:bCs/>
+          <w:color w:val="000000"/>
+          <w:sz w:val="24"/>
+          <w:szCs w:val="24"/>
+        </w:rPr>
+        <w:t xml:space="preserve">Verification:</w:t>
+      </w:r>
+      <w:r>
+        <w:rPr>
+          <w:rFonts w:ascii="Times New Roman" w:cs="Times New Roman" w:eastAsia="Times New Roman" w:hAnsi="Times New Roman"/>
+          <w:color w:val="000000"/>
+          <w:sz w:val="24"/>
+          <w:szCs w:val="24"/>
+        </w:rPr>
+        <w:t xml:space="preserve"> every numerical result in this report was produced by running the project code. Every published fact and number was checked against the paper's abstract, publisher record or an indexed summary, and statements that could not be confirmed were removed.</w:t>
       </w:r>
     </w:p>
     <w:p>
@@ -28977,7 +30689,7 @@
         <w:pStyle w:val="ListParagraph"/>
         <w:numPr>
           <w:ilvl w:val="0"/>
-          <w:numId w:val="14"/>
+          <w:numId w:val="6"/>
         </w:numPr>
         <w:spacing w:after="80" w:line="300"/>
         <w:jc w:val="both"/>
@@ -28985,11 +30697,22 @@
       <w:r>
         <w:rPr>
           <w:rFonts w:ascii="Times New Roman" w:cs="Times New Roman" w:eastAsia="Times New Roman" w:hAnsi="Times New Roman"/>
-          <w:color w:val="000000"/>
-          <w:sz w:val="24"/>
-          <w:szCs w:val="24"/>
-        </w:rPr>
-        <w:t xml:space="preserve">Suggest an addition that would make the project more original, since it currently relies only on existing classical and deep-learning methods.</w:t>
+          <w:b/>
+          <w:bCs/>
+          <w:color w:val="000000"/>
+          <w:sz w:val="24"/>
+          <w:szCs w:val="24"/>
+        </w:rPr>
+        <w:t xml:space="preserve">Iteration:</w:t>
+      </w:r>
+      <w:r>
+        <w:rPr>
+          <w:rFonts w:ascii="Times New Roman" w:cs="Times New Roman" w:eastAsia="Times New Roman" w:hAnsi="Times New Roman"/>
+          <w:color w:val="000000"/>
+          <w:sz w:val="24"/>
+          <w:szCs w:val="24"/>
+        </w:rPr>
+        <w:t xml:space="preserve"> design questions (patch count, confidence, trust features, motion removal, which HRV measure to keep) were asked explicitly, and the answers were turned into changes to the implementation plan before any code was written.</w:t>
       </w:r>
     </w:p>
     <w:p>
@@ -28997,7 +30720,7 @@
         <w:pStyle w:val="ListParagraph"/>
         <w:numPr>
           <w:ilvl w:val="0"/>
-          <w:numId w:val="14"/>
+          <w:numId w:val="6"/>
         </w:numPr>
         <w:spacing w:after="80" w:line="300"/>
         <w:jc w:val="both"/>
@@ -29005,1017 +30728,6 @@
       <w:r>
         <w:rPr>
           <w:rFonts w:ascii="Times New Roman" w:cs="Times New Roman" w:eastAsia="Times New Roman" w:hAnsi="Times New Roman"/>
-          <w:color w:val="000000"/>
-          <w:sz w:val="24"/>
-          <w:szCs w:val="24"/>
-        </w:rPr>
-        <w:t xml:space="preserve">Are the deep-learning models already trained, so that only the datasets are needed to measure their accuracy? The question is meant in general terms.</w:t>
-      </w:r>
-    </w:p>
-    <w:p>
-      <w:pPr>
-        <w:pStyle w:val="ListParagraph"/>
-        <w:numPr>
-          <w:ilvl w:val="0"/>
-          <w:numId w:val="14"/>
-        </w:numPr>
-        <w:spacing w:after="80" w:line="300"/>
-        <w:jc w:val="both"/>
-      </w:pPr>
-      <w:r>
-        <w:rPr>
-          <w:rFonts w:ascii="Times New Roman" w:cs="Times New Roman" w:eastAsia="Times New Roman" w:hAnsi="Times New Roman"/>
-          <w:color w:val="000000"/>
-          <w:sz w:val="24"/>
-          <w:szCs w:val="24"/>
-        </w:rPr>
-        <w:t xml:space="preserve">Explain the proposed new method in simple language.</w:t>
-      </w:r>
-    </w:p>
-    <w:p>
-      <w:pPr>
-        <w:pStyle w:val="ListParagraph"/>
-        <w:numPr>
-          <w:ilvl w:val="0"/>
-          <w:numId w:val="14"/>
-        </w:numPr>
-        <w:spacing w:after="80" w:line="300"/>
-        <w:jc w:val="both"/>
-      </w:pPr>
-      <w:r>
-        <w:rPr>
-          <w:rFonts w:ascii="Times New Roman" w:cs="Times New Roman" w:eastAsia="Times New Roman" w:hAnsi="Times New Roman"/>
-          <w:color w:val="000000"/>
-          <w:sz w:val="24"/>
-          <w:szCs w:val="24"/>
-        </w:rPr>
-        <w:t xml:space="preserve">Clarify the following: (1) What is the MMPD dataset? (2) What does the rhythm used in the trust score refer to? (3) Can MediaPipe identify shadowed regions so that they receive a low trust score? (4) How is the pulse produced in the proposed method, compared with POS, CHROM or PhysNet followed by an FFT?</w:t>
-      </w:r>
-    </w:p>
-    <w:p>
-      <w:pPr>
-        <w:pStyle w:val="ListParagraph"/>
-        <w:numPr>
-          <w:ilvl w:val="0"/>
-          <w:numId w:val="14"/>
-        </w:numPr>
-        <w:spacing w:after="80" w:line="300"/>
-        <w:jc w:val="both"/>
-      </w:pPr>
-      <w:r>
-        <w:rPr>
-          <w:rFonts w:ascii="Times New Roman" w:cs="Times New Roman" w:eastAsia="Times New Roman" w:hAnsi="Times New Roman"/>
-          <w:color w:val="000000"/>
-          <w:sz w:val="24"/>
-          <w:szCs w:val="24"/>
-        </w:rPr>
-        <w:t xml:space="preserve">Confirm my understanding: the project compares two existing approaches with one new method built from existing techniques.</w:t>
-      </w:r>
-    </w:p>
-    <w:p>
-      <w:pPr>
-        <w:pStyle w:val="ListParagraph"/>
-        <w:numPr>
-          <w:ilvl w:val="0"/>
-          <w:numId w:val="14"/>
-        </w:numPr>
-        <w:spacing w:after="80" w:line="300"/>
-        <w:jc w:val="both"/>
-      </w:pPr>
-      <w:r>
-        <w:rPr>
-          <w:rFonts w:ascii="Times New Roman" w:cs="Times New Roman" w:eastAsia="Times New Roman" w:hAnsi="Times New Roman"/>
-          <w:color w:val="000000"/>
-          <w:sz w:val="24"/>
-          <w:szCs w:val="24"/>
-        </w:rPr>
-        <w:t xml:space="preserve">Provide a block diagram of the system.</w:t>
-      </w:r>
-    </w:p>
-    <w:p>
-      <w:pPr>
-        <w:pStyle w:val="ListParagraph"/>
-        <w:numPr>
-          <w:ilvl w:val="0"/>
-          <w:numId w:val="14"/>
-        </w:numPr>
-        <w:spacing w:after="80" w:line="300"/>
-        <w:jc w:val="both"/>
-      </w:pPr>
-      <w:r>
-        <w:rPr>
-          <w:rFonts w:ascii="Times New Roman" w:cs="Times New Roman" w:eastAsia="Times New Roman" w:hAnsi="Times New Roman"/>
-          <w:color w:val="000000"/>
-          <w:sz w:val="24"/>
-          <w:szCs w:val="24"/>
-        </w:rPr>
-        <w:t xml:space="preserve">Could we train our own neural network on the available datasets to replace POS, so that the core model is our own work?</w:t>
-      </w:r>
-    </w:p>
-    <w:p>
-      <w:pPr>
-        <w:pStyle w:val="ListParagraph"/>
-        <w:numPr>
-          <w:ilvl w:val="0"/>
-          <w:numId w:val="14"/>
-        </w:numPr>
-        <w:spacing w:after="80" w:line="300"/>
-        <w:jc w:val="both"/>
-      </w:pPr>
-      <w:r>
-        <w:rPr>
-          <w:rFonts w:ascii="Times New Roman" w:cs="Times New Roman" w:eastAsia="Times New Roman" w:hAnsi="Times New Roman"/>
-          <w:color w:val="000000"/>
-          <w:sz w:val="24"/>
-          <w:szCs w:val="24"/>
-        </w:rPr>
-        <w:t xml:space="preserve">Are existing deep networks such as PhysNet built on forehead and cheek regions, and on which datasets were they trained?</w:t>
-      </w:r>
-    </w:p>
-    <w:p>
-      <w:pPr>
-        <w:pStyle w:val="ListParagraph"/>
-        <w:numPr>
-          <w:ilvl w:val="0"/>
-          <w:numId w:val="14"/>
-        </w:numPr>
-        <w:spacing w:after="80" w:line="300"/>
-        <w:jc w:val="both"/>
-      </w:pPr>
-      <w:r>
-        <w:rPr>
-          <w:rFonts w:ascii="Times New Roman" w:cs="Times New Roman" w:eastAsia="Times New Roman" w:hAnsi="Times New Roman"/>
-          <w:color w:val="000000"/>
-          <w:sz w:val="24"/>
-          <w:szCs w:val="24"/>
-        </w:rPr>
-        <w:t xml:space="preserve">Since existing networks are large and difficult to outperform, we will keep the planned method of applying POS to about 25 facial patches. Do not implement it yet; this is a design discussion only.</w:t>
-      </w:r>
-    </w:p>
-    <w:p>
-      <w:pPr>
-        <w:pStyle w:val="ListParagraph"/>
-        <w:numPr>
-          <w:ilvl w:val="0"/>
-          <w:numId w:val="14"/>
-        </w:numPr>
-        <w:spacing w:after="80" w:line="300"/>
-        <w:jc w:val="both"/>
-      </w:pPr>
-      <w:r>
-        <w:rPr>
-          <w:rFonts w:ascii="Times New Roman" w:cs="Times New Roman" w:eastAsia="Times New Roman" w:hAnsi="Times New Roman"/>
-          <w:color w:val="000000"/>
-          <w:sz w:val="24"/>
-          <w:szCs w:val="24"/>
-        </w:rPr>
-        <w:t xml:space="preserve">Keep the agreement check, add it to the diagram, and write a context paragraph that can be used to generate the block diagram with an AI tool.</w:t>
-      </w:r>
-    </w:p>
-    <w:p>
-      <w:pPr>
-        <w:pStyle w:val="ListParagraph"/>
-        <w:numPr>
-          <w:ilvl w:val="0"/>
-          <w:numId w:val="14"/>
-        </w:numPr>
-        <w:spacing w:after="80" w:line="300"/>
-        <w:jc w:val="both"/>
-      </w:pPr>
-      <w:r>
-        <w:rPr>
-          <w:rFonts w:ascii="Times New Roman" w:cs="Times New Roman" w:eastAsia="Times New Roman" w:hAnsi="Times New Roman"/>
-          <w:color w:val="000000"/>
-          <w:sz w:val="24"/>
-          <w:szCs w:val="24"/>
-        </w:rPr>
-        <w:t xml:space="preserve">Show the handcrafted equations that classical methods use to obtain the pulse signal, and explain how they differ between methods.</w:t>
-      </w:r>
-    </w:p>
-    <w:p>
-      <w:pPr>
-        <w:pStyle w:val="ListParagraph"/>
-        <w:numPr>
-          <w:ilvl w:val="0"/>
-          <w:numId w:val="14"/>
-        </w:numPr>
-        <w:spacing w:after="80" w:line="300"/>
-        <w:jc w:val="both"/>
-      </w:pPr>
-      <w:r>
-        <w:rPr>
-          <w:rFonts w:ascii="Times New Roman" w:cs="Times New Roman" w:eastAsia="Times New Roman" w:hAnsi="Times New Roman"/>
-          <w:color w:val="000000"/>
-          <w:sz w:val="24"/>
-          <w:szCs w:val="24"/>
-        </w:rPr>
-        <w:t xml:space="preserve">Explain how deep-learning models generate the pulse signal.</w:t>
-      </w:r>
-    </w:p>
-    <w:p>
-      <w:pPr>
-        <w:pStyle w:val="ListParagraph"/>
-        <w:numPr>
-          <w:ilvl w:val="0"/>
-          <w:numId w:val="14"/>
-        </w:numPr>
-        <w:spacing w:after="80" w:line="300"/>
-        <w:jc w:val="both"/>
-      </w:pPr>
-      <w:r>
-        <w:rPr>
-          <w:rFonts w:ascii="Times New Roman" w:cs="Times New Roman" w:eastAsia="Times New Roman" w:hAnsi="Times New Roman"/>
-          <w:color w:val="000000"/>
-          <w:sz w:val="24"/>
-          <w:szCs w:val="24"/>
-        </w:rPr>
-        <w:t xml:space="preserve">Provide content for a presentation of at most five slides based on the finalised architecture diagram.</w:t>
-      </w:r>
-    </w:p>
-    <w:p>
-      <w:pPr>
-        <w:pStyle w:val="ListParagraph"/>
-        <w:numPr>
-          <w:ilvl w:val="0"/>
-          <w:numId w:val="14"/>
-        </w:numPr>
-        <w:spacing w:after="80" w:line="300"/>
-        <w:jc w:val="both"/>
-      </w:pPr>
-      <w:r>
-        <w:rPr>
-          <w:rFonts w:ascii="Times New Roman" w:cs="Times New Roman" w:eastAsia="Times New Roman" w:hAnsi="Times New Roman"/>
-          <w:color w:val="000000"/>
-          <w:sz w:val="24"/>
-          <w:szCs w:val="24"/>
-        </w:rPr>
-        <w:t xml:space="preserve">Revise the plan without implementing it: show only the proposed architecture in the diagram; add a research-backed, real-world output derived from the predicted heart rate; and research whether thermal imaging could make the method more precise and more novel.</w:t>
-      </w:r>
-    </w:p>
-    <w:p>
-      <w:pPr>
-        <w:pStyle w:val="ListParagraph"/>
-        <w:numPr>
-          <w:ilvl w:val="0"/>
-          <w:numId w:val="14"/>
-        </w:numPr>
-        <w:spacing w:after="80" w:line="300"/>
-        <w:jc w:val="both"/>
-      </w:pPr>
-      <w:r>
-        <w:rPr>
-          <w:rFonts w:ascii="Times New Roman" w:cs="Times New Roman" w:eastAsia="Times New Roman" w:hAnsi="Times New Roman"/>
-          <w:color w:val="000000"/>
-          <w:sz w:val="24"/>
-          <w:szCs w:val="24"/>
-        </w:rPr>
-        <w:t xml:space="preserve">Summarise the proposal in a short paragraph.</w:t>
-      </w:r>
-    </w:p>
-    <w:p>
-      <w:pPr>
-        <w:pStyle w:val="ListParagraph"/>
-        <w:numPr>
-          <w:ilvl w:val="0"/>
-          <w:numId w:val="14"/>
-        </w:numPr>
-        <w:spacing w:after="80" w:line="300"/>
-        <w:jc w:val="both"/>
-      </w:pPr>
-      <w:r>
-        <w:rPr>
-          <w:rFonts w:ascii="Times New Roman" w:cs="Times New Roman" w:eastAsia="Times New Roman" w:hAnsi="Times New Roman"/>
-          <w:color w:val="000000"/>
-          <w:sz w:val="24"/>
-          <w:szCs w:val="24"/>
-        </w:rPr>
-        <w:t xml:space="preserve">Would users of the application need a separate thermal camera in addition to a normal camera?</w:t>
-      </w:r>
-    </w:p>
-    <w:p>
-      <w:pPr>
-        <w:pStyle w:val="ListParagraph"/>
-        <w:numPr>
-          <w:ilvl w:val="0"/>
-          <w:numId w:val="14"/>
-        </w:numPr>
-        <w:spacing w:after="80" w:line="300"/>
-        <w:jc w:val="both"/>
-      </w:pPr>
-      <w:r>
-        <w:rPr>
-          <w:rFonts w:ascii="Times New Roman" w:cs="Times New Roman" w:eastAsia="Times New Roman" w:hAnsi="Times New Roman"/>
-          <w:color w:val="000000"/>
-          <w:sz w:val="24"/>
-          <w:szCs w:val="24"/>
-        </w:rPr>
-        <w:t xml:space="preserve">Remove the thermal component from the project.</w:t>
-      </w:r>
-    </w:p>
-    <w:p>
-      <w:pPr>
-        <w:pStyle w:val="ListParagraph"/>
-        <w:numPr>
-          <w:ilvl w:val="0"/>
-          <w:numId w:val="14"/>
-        </w:numPr>
-        <w:spacing w:after="80" w:line="300"/>
-        <w:jc w:val="both"/>
-      </w:pPr>
-      <w:r>
-        <w:rPr>
-          <w:rFonts w:ascii="Times New Roman" w:cs="Times New Roman" w:eastAsia="Times New Roman" w:hAnsi="Times New Roman"/>
-          <w:color w:val="000000"/>
-          <w:sz w:val="24"/>
-          <w:szCs w:val="24"/>
-        </w:rPr>
-        <w:t xml:space="preserve">Suggest a more clinically useful output than the stress level.</w:t>
-      </w:r>
-    </w:p>
-    <w:p>
-      <w:pPr>
-        <w:pStyle w:val="ListParagraph"/>
-        <w:numPr>
-          <w:ilvl w:val="0"/>
-          <w:numId w:val="14"/>
-        </w:numPr>
-        <w:spacing w:after="80" w:line="300"/>
-        <w:jc w:val="both"/>
-      </w:pPr>
-      <w:r>
-        <w:rPr>
-          <w:rFonts w:ascii="Times New Roman" w:cs="Times New Roman" w:eastAsia="Times New Roman" w:hAnsi="Times New Roman"/>
-          <w:color w:val="000000"/>
-          <w:sz w:val="24"/>
-          <w:szCs w:val="24"/>
-        </w:rPr>
-        <w:t xml:space="preserve">Update the plan with atrial fibrillation screening as the primary output and stress as a secondary output.</w:t>
-      </w:r>
-    </w:p>
-    <w:p>
-      <w:pPr>
-        <w:pStyle w:val="ListParagraph"/>
-        <w:numPr>
-          <w:ilvl w:val="0"/>
-          <w:numId w:val="14"/>
-        </w:numPr>
-        <w:spacing w:after="80" w:line="300"/>
-        <w:jc w:val="both"/>
-      </w:pPr>
-      <w:r>
-        <w:rPr>
-          <w:rFonts w:ascii="Times New Roman" w:cs="Times New Roman" w:eastAsia="Times New Roman" w:hAnsi="Times New Roman"/>
-          <w:color w:val="000000"/>
-          <w:sz w:val="24"/>
-          <w:szCs w:val="24"/>
-        </w:rPr>
-        <w:t xml:space="preserve">Generate the updated implementation plan.</w:t>
-      </w:r>
-    </w:p>
-    <w:p>
-      <w:pPr>
-        <w:pStyle w:val="ListParagraph"/>
-        <w:numPr>
-          <w:ilvl w:val="0"/>
-          <w:numId w:val="14"/>
-        </w:numPr>
-        <w:spacing w:after="80" w:line="300"/>
-        <w:jc w:val="both"/>
-      </w:pPr>
-      <w:r>
-        <w:rPr>
-          <w:rFonts w:ascii="Times New Roman" w:cs="Times New Roman" w:eastAsia="Times New Roman" w:hAnsi="Times New Roman"/>
-          <w:color w:val="000000"/>
-          <w:sz w:val="24"/>
-          <w:szCs w:val="24"/>
-        </w:rPr>
-        <w:t xml:space="preserve">Create a black-and-white architecture diagram and a prompt for generating it with an AI tool.</w:t>
-      </w:r>
-    </w:p>
-    <w:p>
-      <w:pPr>
-        <w:pStyle w:val="ListParagraph"/>
-        <w:numPr>
-          <w:ilvl w:val="0"/>
-          <w:numId w:val="14"/>
-        </w:numPr>
-        <w:spacing w:after="80" w:line="300"/>
-        <w:jc w:val="both"/>
-      </w:pPr>
-      <w:r>
-        <w:rPr>
-          <w:rFonts w:ascii="Times New Roman" w:cs="Times New Roman" w:eastAsia="Times New Roman" w:hAnsi="Times New Roman"/>
-          <w:color w:val="000000"/>
-          <w:sz w:val="24"/>
-          <w:szCs w:val="24"/>
-        </w:rPr>
-        <w:t xml:space="preserve">Explain how the model detects atrial fibrillation or estimates stress from the heart rate.</w:t>
-      </w:r>
-    </w:p>
-    <w:p>
-      <w:pPr>
-        <w:pStyle w:val="ListParagraph"/>
-        <w:numPr>
-          <w:ilvl w:val="0"/>
-          <w:numId w:val="14"/>
-        </w:numPr>
-        <w:spacing w:after="80" w:line="300"/>
-        <w:jc w:val="both"/>
-      </w:pPr>
-      <w:r>
-        <w:rPr>
-          <w:rFonts w:ascii="Times New Roman" w:cs="Times New Roman" w:eastAsia="Times New Roman" w:hAnsi="Times New Roman"/>
-          <w:color w:val="000000"/>
-          <w:sz w:val="24"/>
-          <w:szCs w:val="24"/>
-        </w:rPr>
-        <w:t xml:space="preserve">What are heart-rate variability and the LF/HF ratio, and how are they measured?</w:t>
-      </w:r>
-    </w:p>
-    <w:p>
-      <w:pPr>
-        <w:pStyle w:val="ListParagraph"/>
-        <w:numPr>
-          <w:ilvl w:val="0"/>
-          <w:numId w:val="14"/>
-        </w:numPr>
-        <w:spacing w:after="80" w:line="300"/>
-        <w:jc w:val="both"/>
-      </w:pPr>
-      <w:r>
-        <w:rPr>
-          <w:rFonts w:ascii="Times New Roman" w:cs="Times New Roman" w:eastAsia="Times New Roman" w:hAnsi="Times New Roman"/>
-          <w:color w:val="000000"/>
-          <w:sz w:val="24"/>
-          <w:szCs w:val="24"/>
-        </w:rPr>
-        <w:t xml:space="preserve">What is the normal range of heart-rate variability, and how was it established?</w:t>
-      </w:r>
-    </w:p>
-    <w:p>
-      <w:pPr>
-        <w:pStyle w:val="ListParagraph"/>
-        <w:numPr>
-          <w:ilvl w:val="0"/>
-          <w:numId w:val="14"/>
-        </w:numPr>
-        <w:spacing w:after="80" w:line="300"/>
-        <w:jc w:val="both"/>
-      </w:pPr>
-      <w:r>
-        <w:rPr>
-          <w:rFonts w:ascii="Times New Roman" w:cs="Times New Roman" w:eastAsia="Times New Roman" w:hAnsi="Times New Roman"/>
-          <w:color w:val="000000"/>
-          <w:sz w:val="24"/>
-          <w:szCs w:val="24"/>
-        </w:rPr>
-        <w:t xml:space="preserve">Explain atrial fibrillation in simple terms, how the model detects it, and what happens after it is detected.</w:t>
-      </w:r>
-    </w:p>
-    <w:p>
-      <w:pPr>
-        <w:pStyle w:val="ListParagraph"/>
-        <w:numPr>
-          <w:ilvl w:val="0"/>
-          <w:numId w:val="14"/>
-        </w:numPr>
-        <w:spacing w:after="80" w:line="300"/>
-        <w:jc w:val="both"/>
-      </w:pPr>
-      <w:r>
-        <w:rPr>
-          <w:rFonts w:ascii="Times New Roman" w:cs="Times New Roman" w:eastAsia="Times New Roman" w:hAnsi="Times New Roman"/>
-          <w:color w:val="000000"/>
-          <w:sz w:val="24"/>
-          <w:szCs w:val="24"/>
-        </w:rPr>
-        <w:t xml:space="preserve">Are the beat-interval values used in the explanation supported by research?</w:t>
-      </w:r>
-    </w:p>
-    <w:p>
-      <w:pPr>
-        <w:pStyle w:val="ListParagraph"/>
-        <w:numPr>
-          <w:ilvl w:val="0"/>
-          <w:numId w:val="14"/>
-        </w:numPr>
-        <w:spacing w:after="80" w:line="300"/>
-        <w:jc w:val="both"/>
-      </w:pPr>
-      <w:r>
-        <w:rPr>
-          <w:rFonts w:ascii="Times New Roman" w:cs="Times New Roman" w:eastAsia="Times New Roman" w:hAnsi="Times New Roman"/>
-          <w:color w:val="000000"/>
-          <w:sz w:val="24"/>
-          <w:szCs w:val="24"/>
-        </w:rPr>
-        <w:t xml:space="preserve">Can other medical conditions be detected from the predicted heartbeat?</w:t>
-      </w:r>
-    </w:p>
-    <w:p>
-      <w:pPr>
-        <w:pStyle w:val="ListParagraph"/>
-        <w:numPr>
-          <w:ilvl w:val="0"/>
-          <w:numId w:val="14"/>
-        </w:numPr>
-        <w:spacing w:after="80" w:line="300"/>
-        <w:jc w:val="both"/>
-      </w:pPr>
-      <w:r>
-        <w:rPr>
-          <w:rFonts w:ascii="Times New Roman" w:cs="Times New Roman" w:eastAsia="Times New Roman" w:hAnsi="Times New Roman"/>
-          <w:color w:val="000000"/>
-          <w:sz w:val="24"/>
-          <w:szCs w:val="24"/>
-        </w:rPr>
-        <w:t xml:space="preserve">What do abnormally slow or fast heartbeats indicate?</w:t>
-      </w:r>
-    </w:p>
-    <w:p>
-      <w:pPr>
-        <w:pStyle w:val="ListParagraph"/>
-        <w:numPr>
-          <w:ilvl w:val="0"/>
-          <w:numId w:val="14"/>
-        </w:numPr>
-        <w:spacing w:after="80" w:line="300"/>
-        <w:jc w:val="both"/>
-      </w:pPr>
-      <w:r>
-        <w:rPr>
-          <w:rFonts w:ascii="Times New Roman" w:cs="Times New Roman" w:eastAsia="Times New Roman" w:hAnsi="Times New Roman"/>
-          <w:color w:val="000000"/>
-          <w:sz w:val="24"/>
-          <w:szCs w:val="24"/>
-        </w:rPr>
-        <w:t xml:space="preserve">Make abnormal heart-rate flags the secondary output, keep atrial fibrillation as the primary output, and assess the feasibility.</w:t>
-      </w:r>
-    </w:p>
-    <w:p>
-      <w:pPr>
-        <w:pStyle w:val="ListParagraph"/>
-        <w:numPr>
-          <w:ilvl w:val="0"/>
-          <w:numId w:val="14"/>
-        </w:numPr>
-        <w:spacing w:after="80" w:line="300"/>
-        <w:jc w:val="both"/>
-      </w:pPr>
-      <w:r>
-        <w:rPr>
-          <w:rFonts w:ascii="Times New Roman" w:cs="Times New Roman" w:eastAsia="Times New Roman" w:hAnsi="Times New Roman"/>
-          <w:color w:val="000000"/>
-          <w:sz w:val="24"/>
-          <w:szCs w:val="24"/>
-        </w:rPr>
-        <w:t xml:space="preserve">Explain the architecture in one paragraph, defining every technical term.</w:t>
-      </w:r>
-    </w:p>
-    <w:p>
-      <w:pPr>
-        <w:pStyle w:val="ListParagraph"/>
-        <w:numPr>
-          <w:ilvl w:val="0"/>
-          <w:numId w:val="14"/>
-        </w:numPr>
-        <w:spacing w:after="80" w:line="300"/>
-        <w:jc w:val="both"/>
-      </w:pPr>
-      <w:r>
-        <w:rPr>
-          <w:rFonts w:ascii="Times New Roman" w:cs="Times New Roman" w:eastAsia="Times New Roman" w:hAnsi="Times New Roman"/>
-          <w:color w:val="000000"/>
-          <w:sz w:val="24"/>
-          <w:szCs w:val="24"/>
-        </w:rPr>
-        <w:t xml:space="preserve">Answer the following design questions: (1) Can the face realistically be divided into 25 patches, or should the number be reduced? (2) How is the confidence of the weighted fusion computed? (3) How are the trust-score features computed? (4) How is motion removal performed? (5) Which of RMSSD, SDNN and LF/HF is most important for the project?</w:t>
-      </w:r>
-    </w:p>
-    <w:p>
-      <w:pPr>
-        <w:pStyle w:val="ListParagraph"/>
-        <w:numPr>
-          <w:ilvl w:val="0"/>
-          <w:numId w:val="14"/>
-        </w:numPr>
-        <w:spacing w:after="80" w:line="300"/>
-        <w:jc w:val="both"/>
-      </w:pPr>
-      <w:r>
-        <w:rPr>
-          <w:rFonts w:ascii="Times New Roman" w:cs="Times New Roman" w:eastAsia="Times New Roman" w:hAnsi="Times New Roman"/>
-          <w:color w:val="000000"/>
-          <w:sz w:val="24"/>
-          <w:szCs w:val="24"/>
-        </w:rPr>
-        <w:t xml:space="preserve">Update the implementation plan and create a simplified architecture diagram.</w:t>
-      </w:r>
-    </w:p>
-    <w:p>
-      <w:pPr>
-        <w:pStyle w:val="Heading2"/>
-        <w:spacing w:after="120" w:before="240"/>
-      </w:pPr>
-      <w:r>
-        <w:rPr>
-          <w:rFonts w:ascii="Times New Roman" w:cs="Times New Roman" w:eastAsia="Times New Roman" w:hAnsi="Times New Roman"/>
-          <w:b/>
-          <w:bCs/>
-          <w:color w:val="000000"/>
-          <w:sz w:val="24"/>
-          <w:szCs w:val="24"/>
-        </w:rPr>
-        <w:t xml:space="preserve">3. Relevant search keywords</w:t>
-      </w:r>
-    </w:p>
-    <w:p>
-      <w:pPr>
-        <w:spacing w:after="120" w:before="0" w:line="300"/>
-        <w:jc w:val="both"/>
-      </w:pPr>
-      <w:r>
-        <w:rPr>
-          <w:rFonts w:ascii="Times New Roman" w:cs="Times New Roman" w:eastAsia="Times New Roman" w:hAnsi="Times New Roman"/>
-          <w:color w:val="000000"/>
-          <w:sz w:val="24"/>
-          <w:szCs w:val="24"/>
-        </w:rPr>
-        <w:t xml:space="preserve">The following keywords were used to search the literature, datasets and guidelines:</w:t>
-      </w:r>
-    </w:p>
-    <w:p>
-      <w:pPr>
-        <w:pStyle w:val="ListParagraph"/>
-        <w:numPr>
-          <w:ilvl w:val="0"/>
-          <w:numId w:val="15"/>
-        </w:numPr>
-        <w:spacing w:after="80" w:line="300"/>
-        <w:jc w:val="both"/>
-      </w:pPr>
-      <w:r>
-        <w:rPr>
-          <w:rFonts w:ascii="Times New Roman" w:cs="Times New Roman" w:eastAsia="Times New Roman" w:hAnsi="Times New Roman"/>
-          <w:color w:val="000000"/>
-          <w:sz w:val="24"/>
-          <w:szCs w:val="24"/>
-        </w:rPr>
-        <w:t xml:space="preserve">remote photoplethysmography (rPPG); contactless heart rate from facial video</w:t>
-      </w:r>
-    </w:p>
-    <w:p>
-      <w:pPr>
-        <w:pStyle w:val="ListParagraph"/>
-        <w:numPr>
-          <w:ilvl w:val="0"/>
-          <w:numId w:val="15"/>
-        </w:numPr>
-        <w:spacing w:after="80" w:line="300"/>
-        <w:jc w:val="both"/>
-      </w:pPr>
-      <w:r>
-        <w:rPr>
-          <w:rFonts w:ascii="Times New Roman" w:cs="Times New Roman" w:eastAsia="Times New Roman" w:hAnsi="Times New Roman"/>
-          <w:color w:val="000000"/>
-          <w:sz w:val="24"/>
-          <w:szCs w:val="24"/>
-        </w:rPr>
-        <w:t xml:space="preserve">POS, CHROM, PBV and ICA rPPG methods; rPPG-Toolbox benchmark</w:t>
-      </w:r>
-    </w:p>
-    <w:p>
-      <w:pPr>
-        <w:pStyle w:val="ListParagraph"/>
-        <w:numPr>
-          <w:ilvl w:val="0"/>
-          <w:numId w:val="15"/>
-        </w:numPr>
-        <w:spacing w:after="80" w:line="300"/>
-        <w:jc w:val="both"/>
-      </w:pPr>
-      <w:r>
-        <w:rPr>
-          <w:rFonts w:ascii="Times New Roman" w:cs="Times New Roman" w:eastAsia="Times New Roman" w:hAnsi="Times New Roman"/>
-          <w:color w:val="000000"/>
-          <w:sz w:val="24"/>
-          <w:szCs w:val="24"/>
-        </w:rPr>
-        <w:t xml:space="preserve">multi-region and patch-based rPPG; region weighting; DistancePPG; skin segmentation</w:t>
-      </w:r>
-    </w:p>
-    <w:p>
-      <w:pPr>
-        <w:pStyle w:val="ListParagraph"/>
-        <w:numPr>
-          <w:ilvl w:val="0"/>
-          <w:numId w:val="15"/>
-        </w:numPr>
-        <w:spacing w:after="80" w:line="300"/>
-        <w:jc w:val="both"/>
-      </w:pPr>
-      <w:r>
-        <w:rPr>
-          <w:rFonts w:ascii="Times New Roman" w:cs="Times New Roman" w:eastAsia="Times New Roman" w:hAnsi="Times New Roman"/>
-          <w:color w:val="000000"/>
-          <w:sz w:val="24"/>
-          <w:szCs w:val="24"/>
-        </w:rPr>
-        <w:t xml:space="preserve">rPPG head motion; face orientation; ballistocardiographic head motion</w:t>
-      </w:r>
-    </w:p>
-    <w:p>
-      <w:pPr>
-        <w:pStyle w:val="ListParagraph"/>
-        <w:numPr>
-          <w:ilvl w:val="0"/>
-          <w:numId w:val="15"/>
-        </w:numPr>
-        <w:spacing w:after="80" w:line="300"/>
-        <w:jc w:val="both"/>
-      </w:pPr>
-      <w:r>
-        <w:rPr>
-          <w:rFonts w:ascii="Times New Roman" w:cs="Times New Roman" w:eastAsia="Times New Roman" w:hAnsi="Times New Roman"/>
-          <w:color w:val="000000"/>
-          <w:sz w:val="24"/>
-          <w:szCs w:val="24"/>
-        </w:rPr>
-        <w:t xml:space="preserve">deep learning rPPG: DeepPhys, PhysNet, TS-CAN, PhysFormer</w:t>
-      </w:r>
-    </w:p>
-    <w:p>
-      <w:pPr>
-        <w:pStyle w:val="ListParagraph"/>
-        <w:numPr>
-          <w:ilvl w:val="0"/>
-          <w:numId w:val="15"/>
-        </w:numPr>
-        <w:spacing w:after="80" w:line="300"/>
-        <w:jc w:val="both"/>
-      </w:pPr>
-      <w:r>
-        <w:rPr>
-          <w:rFonts w:ascii="Times New Roman" w:cs="Times New Roman" w:eastAsia="Times New Roman" w:hAnsi="Times New Roman"/>
-          <w:color w:val="000000"/>
-          <w:sz w:val="24"/>
-          <w:szCs w:val="24"/>
-        </w:rPr>
-        <w:t xml:space="preserve">atrial fibrillation detection from facial video; smartphone photoplethysmography atrial fibrillation</w:t>
-      </w:r>
-    </w:p>
-    <w:p>
-      <w:pPr>
-        <w:pStyle w:val="ListParagraph"/>
-        <w:numPr>
-          <w:ilvl w:val="0"/>
-          <w:numId w:val="15"/>
-        </w:numPr>
-        <w:spacing w:after="80" w:line="300"/>
-        <w:jc w:val="both"/>
-      </w:pPr>
-      <w:r>
-        <w:rPr>
-          <w:rFonts w:ascii="Times New Roman" w:cs="Times New Roman" w:eastAsia="Times New Roman" w:hAnsi="Times New Roman"/>
-          <w:color w:val="000000"/>
-          <w:sz w:val="24"/>
-          <w:szCs w:val="24"/>
-        </w:rPr>
-        <w:t xml:space="preserve">atrial fibrillation RR-interval irregularity: RMSSD, Shannon entropy, turning-point ratio, Poincaré plot</w:t>
-      </w:r>
-    </w:p>
-    <w:p>
-      <w:pPr>
-        <w:pStyle w:val="ListParagraph"/>
-        <w:numPr>
-          <w:ilvl w:val="0"/>
-          <w:numId w:val="15"/>
-        </w:numPr>
-        <w:spacing w:after="80" w:line="300"/>
-        <w:jc w:val="both"/>
-      </w:pPr>
-      <w:r>
-        <w:rPr>
-          <w:rFonts w:ascii="Times New Roman" w:cs="Times New Roman" w:eastAsia="Times New Roman" w:hAnsi="Times New Roman"/>
-          <w:color w:val="000000"/>
-          <w:sz w:val="24"/>
-          <w:szCs w:val="24"/>
-        </w:rPr>
-        <w:t xml:space="preserve">premature atrial and ventricular contractions versus atrial fibrillation in PPG</w:t>
-      </w:r>
-    </w:p>
-    <w:p>
-      <w:pPr>
-        <w:pStyle w:val="ListParagraph"/>
-        <w:numPr>
-          <w:ilvl w:val="0"/>
-          <w:numId w:val="15"/>
-        </w:numPr>
-        <w:spacing w:after="80" w:line="300"/>
-        <w:jc w:val="both"/>
-      </w:pPr>
-      <w:r>
-        <w:rPr>
-          <w:rFonts w:ascii="Times New Roman" w:cs="Times New Roman" w:eastAsia="Times New Roman" w:hAnsi="Times New Roman"/>
-          <w:color w:val="000000"/>
-          <w:sz w:val="24"/>
-          <w:szCs w:val="24"/>
-        </w:rPr>
-        <w:t xml:space="preserve">PPG signal-quality index; PPG beat detection benchmark</w:t>
-      </w:r>
-    </w:p>
-    <w:p>
-      <w:pPr>
-        <w:pStyle w:val="ListParagraph"/>
-        <w:numPr>
-          <w:ilvl w:val="0"/>
-          <w:numId w:val="15"/>
-        </w:numPr>
-        <w:spacing w:after="80" w:line="300"/>
-        <w:jc w:val="both"/>
-      </w:pPr>
-      <w:r>
-        <w:rPr>
-          <w:rFonts w:ascii="Times New Roman" w:cs="Times New Roman" w:eastAsia="Times New Roman" w:hAnsi="Times New Roman"/>
-          <w:color w:val="000000"/>
-          <w:sz w:val="24"/>
-          <w:szCs w:val="24"/>
-        </w:rPr>
-        <w:t xml:space="preserve">respiratory rate from the photoplethysmogram</w:t>
-      </w:r>
-    </w:p>
-    <w:p>
-      <w:pPr>
-        <w:pStyle w:val="ListParagraph"/>
-        <w:numPr>
-          <w:ilvl w:val="0"/>
-          <w:numId w:val="15"/>
-        </w:numPr>
-        <w:spacing w:after="80" w:line="300"/>
-        <w:jc w:val="both"/>
-      </w:pPr>
-      <w:r>
-        <w:rPr>
-          <w:rFonts w:ascii="Times New Roman" w:cs="Times New Roman" w:eastAsia="Times New Roman" w:hAnsi="Times New Roman"/>
-          <w:color w:val="000000"/>
-          <w:sz w:val="24"/>
-          <w:szCs w:val="24"/>
-        </w:rPr>
-        <w:t xml:space="preserve">OBF database; MIMIC PERform AF; UBFC-rPPG; PURE; UBFC-Phys; COHFACE; MMPD; MIT-BIH Arrhythmia Database</w:t>
-      </w:r>
-    </w:p>
-    <w:p>
-      <w:pPr>
-        <w:pStyle w:val="ListParagraph"/>
-        <w:numPr>
-          <w:ilvl w:val="0"/>
-          <w:numId w:val="15"/>
-        </w:numPr>
-        <w:spacing w:after="80" w:line="300"/>
-        <w:jc w:val="both"/>
-      </w:pPr>
-      <w:r>
-        <w:rPr>
-          <w:rFonts w:ascii="Times New Roman" w:cs="Times New Roman" w:eastAsia="Times New Roman" w:hAnsi="Times New Roman"/>
-          <w:color w:val="000000"/>
-          <w:sz w:val="24"/>
-          <w:szCs w:val="24"/>
-        </w:rPr>
-        <w:t xml:space="preserve">atrial fibrillation prevalence, stroke risk and screening (USPSTF); bradycardia guideline</w:t>
-      </w:r>
-    </w:p>
-    <w:p>
-      <w:pPr>
-        <w:pStyle w:val="ListParagraph"/>
-        <w:numPr>
-          <w:ilvl w:val="0"/>
-          <w:numId w:val="15"/>
-        </w:numPr>
-        <w:spacing w:after="80" w:line="300"/>
-        <w:jc w:val="both"/>
-      </w:pPr>
-      <w:r>
-        <w:rPr>
-          <w:rFonts w:ascii="Times New Roman" w:cs="Times New Roman" w:eastAsia="Times New Roman" w:hAnsi="Times New Roman"/>
-          <w:color w:val="000000"/>
-          <w:sz w:val="24"/>
-          <w:szCs w:val="24"/>
-        </w:rPr>
-        <w:t xml:space="preserve">normal values of short-term heart-rate variability</w:t>
-      </w:r>
-    </w:p>
-    <w:p>
-      <w:pPr>
-        <w:pStyle w:val="ListParagraph"/>
-        <w:numPr>
-          <w:ilvl w:val="0"/>
-          <w:numId w:val="15"/>
-        </w:numPr>
-        <w:spacing w:after="80" w:line="300"/>
-        <w:jc w:val="both"/>
-      </w:pPr>
-      <w:r>
-        <w:rPr>
-          <w:rFonts w:ascii="Times New Roman" w:cs="Times New Roman" w:eastAsia="Times New Roman" w:hAnsi="Times New Roman"/>
-          <w:color w:val="000000"/>
-          <w:sz w:val="24"/>
-          <w:szCs w:val="24"/>
-        </w:rPr>
-        <w:t xml:space="preserve">RGB and thermal imaging for stress detection (explored and not adopted)</w:t>
-      </w:r>
-    </w:p>
-    <w:p>
-      <w:pPr>
-        <w:pStyle w:val="Heading2"/>
-        <w:spacing w:after="120" w:before="240"/>
-      </w:pPr>
-      <w:r>
-        <w:rPr>
-          <w:rFonts w:ascii="Times New Roman" w:cs="Times New Roman" w:eastAsia="Times New Roman" w:hAnsi="Times New Roman"/>
-          <w:b/>
-          <w:bCs/>
-          <w:color w:val="000000"/>
-          <w:sz w:val="24"/>
-          <w:szCs w:val="24"/>
-        </w:rPr>
-        <w:t xml:space="preserve">4. Any other</w:t>
-      </w:r>
-    </w:p>
-    <w:p>
-      <w:pPr>
-        <w:pStyle w:val="ListParagraph"/>
-        <w:numPr>
-          <w:ilvl w:val="0"/>
-          <w:numId w:val="16"/>
-        </w:numPr>
-        <w:spacing w:after="80" w:line="300"/>
-        <w:jc w:val="both"/>
-      </w:pPr>
-      <w:r>
-        <w:rPr>
-          <w:rFonts w:ascii="Times New Roman" w:cs="Times New Roman" w:eastAsia="Times New Roman" w:hAnsi="Times New Roman"/>
-          <w:b/>
-          <w:bCs/>
-          <w:color w:val="000000"/>
-          <w:sz w:val="24"/>
-          <w:szCs w:val="24"/>
-        </w:rPr>
-        <w:t xml:space="preserve">Verification:</w:t>
-      </w:r>
-      <w:r>
-        <w:rPr>
-          <w:rFonts w:ascii="Times New Roman" w:cs="Times New Roman" w:eastAsia="Times New Roman" w:hAnsi="Times New Roman"/>
-          <w:color w:val="000000"/>
-          <w:sz w:val="24"/>
-          <w:szCs w:val="24"/>
-        </w:rPr>
-        <w:t xml:space="preserve"> every numerical result in this report was produced by running the project code. Every published fact and number was checked against the paper's abstract, publisher record or an indexed summary, and statements that could not be confirmed were removed.</w:t>
-      </w:r>
-    </w:p>
-    <w:p>
-      <w:pPr>
-        <w:pStyle w:val="ListParagraph"/>
-        <w:numPr>
-          <w:ilvl w:val="0"/>
-          <w:numId w:val="16"/>
-        </w:numPr>
-        <w:spacing w:after="80" w:line="300"/>
-        <w:jc w:val="both"/>
-      </w:pPr>
-      <w:r>
-        <w:rPr>
-          <w:rFonts w:ascii="Times New Roman" w:cs="Times New Roman" w:eastAsia="Times New Roman" w:hAnsi="Times New Roman"/>
-          <w:b/>
-          <w:bCs/>
-          <w:color w:val="000000"/>
-          <w:sz w:val="24"/>
-          <w:szCs w:val="24"/>
-        </w:rPr>
-        <w:t xml:space="preserve">Iteration:</w:t>
-      </w:r>
-      <w:r>
-        <w:rPr>
-          <w:rFonts w:ascii="Times New Roman" w:cs="Times New Roman" w:eastAsia="Times New Roman" w:hAnsi="Times New Roman"/>
-          <w:color w:val="000000"/>
-          <w:sz w:val="24"/>
-          <w:szCs w:val="24"/>
-        </w:rPr>
-        <w:t xml:space="preserve"> design questions (patch count, confidence, trust features, motion removal, which HRV measure to keep) were asked explicitly, and the answers were turned into changes to the implementation plan before any code was written.</w:t>
-      </w:r>
-    </w:p>
-    <w:p>
-      <w:pPr>
-        <w:pStyle w:val="ListParagraph"/>
-        <w:numPr>
-          <w:ilvl w:val="0"/>
-          <w:numId w:val="16"/>
-        </w:numPr>
-        <w:spacing w:after="80" w:line="300"/>
-        <w:jc w:val="both"/>
-      </w:pPr>
-      <w:r>
-        <w:rPr>
-          <w:rFonts w:ascii="Times New Roman" w:cs="Times New Roman" w:eastAsia="Times New Roman" w:hAnsi="Times New Roman"/>
           <w:b/>
           <w:bCs/>
           <w:color w:val="000000"/>
@@ -30111,7 +30823,7 @@
         </w:rPr>
         <w:t xml:space="preserve"> </w:t>
       </w:r>
-      <w:hyperlink w:history="1" r:id="rIdqjiu16ceofgltcmqrreg9">
+      <w:hyperlink w:history="1" r:id="rIdbtv3vudljnlopyyar7a2j">
         <w:r>
           <w:rPr>
             <w:rFonts w:ascii="Times New Roman" w:cs="Times New Roman" w:eastAsia="Times New Roman" w:hAnsi="Times New Roman"/>
@@ -30166,7 +30878,7 @@
         </w:rPr>
         <w:t xml:space="preserve"> </w:t>
       </w:r>
-      <w:hyperlink w:history="1" r:id="rIdw-xl8csjdmzgzhmw6hx7d">
+      <w:hyperlink w:history="1" r:id="rIdkatxff-94jcdhvwuxkebl">
         <w:r>
           <w:rPr>
             <w:rFonts w:ascii="Times New Roman" w:cs="Times New Roman" w:eastAsia="Times New Roman" w:hAnsi="Times New Roman"/>
@@ -30221,7 +30933,7 @@
         </w:rPr>
         <w:t xml:space="preserve"> </w:t>
       </w:r>
-      <w:hyperlink w:history="1" r:id="rIdwm9ynialgxvb53wcjuaxn">
+      <w:hyperlink w:history="1" r:id="rIdbvzajxpomp_mhhf11ftt1">
         <w:r>
           <w:rPr>
             <w:rFonts w:ascii="Times New Roman" w:cs="Times New Roman" w:eastAsia="Times New Roman" w:hAnsi="Times New Roman"/>
@@ -30276,7 +30988,7 @@
         </w:rPr>
         <w:t xml:space="preserve"> </w:t>
       </w:r>
-      <w:hyperlink w:history="1" r:id="rId3ogm6l7girna6fhfrembd">
+      <w:hyperlink w:history="1" r:id="rIdmnvmjn0ygttubnbvq0i65">
         <w:r>
           <w:rPr>
             <w:rFonts w:ascii="Times New Roman" w:cs="Times New Roman" w:eastAsia="Times New Roman" w:hAnsi="Times New Roman"/>
@@ -30331,7 +31043,7 @@
         </w:rPr>
         <w:t xml:space="preserve"> </w:t>
       </w:r>
-      <w:hyperlink w:history="1" r:id="rIdvecsgszyitebdkwrkq3ba">
+      <w:hyperlink w:history="1" r:id="rIdrqige-rnee-_ngxbuyj0b">
         <w:r>
           <w:rPr>
             <w:rFonts w:ascii="Times New Roman" w:cs="Times New Roman" w:eastAsia="Times New Roman" w:hAnsi="Times New Roman"/>
@@ -30386,7 +31098,7 @@
         </w:rPr>
         <w:t xml:space="preserve"> </w:t>
       </w:r>
-      <w:hyperlink w:history="1" r:id="rIdn9-mzh434n-ygf7jmt_db">
+      <w:hyperlink w:history="1" r:id="rIdfnmuoqbvghoqqlue_gtz7">
         <w:r>
           <w:rPr>
             <w:rFonts w:ascii="Times New Roman" w:cs="Times New Roman" w:eastAsia="Times New Roman" w:hAnsi="Times New Roman"/>
@@ -30441,7 +31153,7 @@
         </w:rPr>
         <w:t xml:space="preserve"> </w:t>
       </w:r>
-      <w:hyperlink w:history="1" r:id="rIdsufb16pu4zlkim08wfwhl">
+      <w:hyperlink w:history="1" r:id="rId2ensgonsw9ckasgmd8b9j">
         <w:r>
           <w:rPr>
             <w:rFonts w:ascii="Times New Roman" w:cs="Times New Roman" w:eastAsia="Times New Roman" w:hAnsi="Times New Roman"/>
@@ -30496,7 +31208,7 @@
         </w:rPr>
         <w:t xml:space="preserve"> </w:t>
       </w:r>
-      <w:hyperlink w:history="1" r:id="rIdtmpqconbfilg9ikhw7cdg">
+      <w:hyperlink w:history="1" r:id="rIdepkfo9r3fev_6fuue5ynu">
         <w:r>
           <w:rPr>
             <w:rFonts w:ascii="Times New Roman" w:cs="Times New Roman" w:eastAsia="Times New Roman" w:hAnsi="Times New Roman"/>
@@ -30551,7 +31263,7 @@
         </w:rPr>
         <w:t xml:space="preserve"> </w:t>
       </w:r>
-      <w:hyperlink w:history="1" r:id="rIdot9wgalcyjs9blw-c-qmg">
+      <w:hyperlink w:history="1" r:id="rIdmxvhils92an4lo4fz2xg3">
         <w:r>
           <w:rPr>
             <w:rFonts w:ascii="Times New Roman" w:cs="Times New Roman" w:eastAsia="Times New Roman" w:hAnsi="Times New Roman"/>
@@ -30606,7 +31318,7 @@
         </w:rPr>
         <w:t xml:space="preserve"> </w:t>
       </w:r>
-      <w:hyperlink w:history="1" r:id="rIdgkawvdvd6661cb8a_ju6x">
+      <w:hyperlink w:history="1" r:id="rIdocay8bpb_yg3mt0nipxmk">
         <w:r>
           <w:rPr>
             <w:rFonts w:ascii="Times New Roman" w:cs="Times New Roman" w:eastAsia="Times New Roman" w:hAnsi="Times New Roman"/>
@@ -30661,7 +31373,7 @@
         </w:rPr>
         <w:t xml:space="preserve"> </w:t>
       </w:r>
-      <w:hyperlink w:history="1" r:id="rIdjt6gt1wwgzothcvh8aal-">
+      <w:hyperlink w:history="1" r:id="rIdhixi08d9yecli71_zyvfy">
         <w:r>
           <w:rPr>
             <w:rFonts w:ascii="Times New Roman" w:cs="Times New Roman" w:eastAsia="Times New Roman" w:hAnsi="Times New Roman"/>
@@ -30716,7 +31428,7 @@
         </w:rPr>
         <w:t xml:space="preserve"> </w:t>
       </w:r>
-      <w:hyperlink w:history="1" r:id="rIdcztcgkm6oanvapiq8c5-c">
+      <w:hyperlink w:history="1" r:id="rId2t22evbokvudmkisbaq6-">
         <w:r>
           <w:rPr>
             <w:rFonts w:ascii="Times New Roman" w:cs="Times New Roman" w:eastAsia="Times New Roman" w:hAnsi="Times New Roman"/>
@@ -30771,7 +31483,7 @@
         </w:rPr>
         <w:t xml:space="preserve"> </w:t>
       </w:r>
-      <w:hyperlink w:history="1" r:id="rIdusxq4zbiz1ozjrmj9rqbh">
+      <w:hyperlink w:history="1" r:id="rIdxyokoxupyl06oyw8qgswj">
         <w:r>
           <w:rPr>
             <w:rFonts w:ascii="Times New Roman" w:cs="Times New Roman" w:eastAsia="Times New Roman" w:hAnsi="Times New Roman"/>
@@ -30826,7 +31538,7 @@
         </w:rPr>
         <w:t xml:space="preserve"> </w:t>
       </w:r>
-      <w:hyperlink w:history="1" r:id="rIdit5rnfykmg_mv-izejxac">
+      <w:hyperlink w:history="1" r:id="rIdoza36odzm3xatjcv7weaj">
         <w:r>
           <w:rPr>
             <w:rFonts w:ascii="Times New Roman" w:cs="Times New Roman" w:eastAsia="Times New Roman" w:hAnsi="Times New Roman"/>
@@ -30881,7 +31593,7 @@
         </w:rPr>
         <w:t xml:space="preserve"> </w:t>
       </w:r>
-      <w:hyperlink w:history="1" r:id="rIdvpmcj5vqpwyf7c6vny-5x">
+      <w:hyperlink w:history="1" r:id="rIdj8qaupwxaoby8zl5ore1m">
         <w:r>
           <w:rPr>
             <w:rFonts w:ascii="Times New Roman" w:cs="Times New Roman" w:eastAsia="Times New Roman" w:hAnsi="Times New Roman"/>
@@ -30936,7 +31648,7 @@
         </w:rPr>
         <w:t xml:space="preserve"> </w:t>
       </w:r>
-      <w:hyperlink w:history="1" r:id="rIdush9zxw4_ricvkgxljpgk">
+      <w:hyperlink w:history="1" r:id="rIdihxb46os9zvgq1wlnui_k">
         <w:r>
           <w:rPr>
             <w:rFonts w:ascii="Times New Roman" w:cs="Times New Roman" w:eastAsia="Times New Roman" w:hAnsi="Times New Roman"/>
@@ -30991,7 +31703,7 @@
         </w:rPr>
         <w:t xml:space="preserve"> </w:t>
       </w:r>
-      <w:hyperlink w:history="1" r:id="rIdtqu3x16wiiwygzivtvk5c">
+      <w:hyperlink w:history="1" r:id="rIdnfx9ppxsomrkcamyi0kt1">
         <w:r>
           <w:rPr>
             <w:rFonts w:ascii="Times New Roman" w:cs="Times New Roman" w:eastAsia="Times New Roman" w:hAnsi="Times New Roman"/>
@@ -31046,7 +31758,7 @@
         </w:rPr>
         <w:t xml:space="preserve"> </w:t>
       </w:r>
-      <w:hyperlink w:history="1" r:id="rId4xifyukbarkq5pffi3izv">
+      <w:hyperlink w:history="1" r:id="rId-klryloyff1wejjlrfnvb">
         <w:r>
           <w:rPr>
             <w:rFonts w:ascii="Times New Roman" w:cs="Times New Roman" w:eastAsia="Times New Roman" w:hAnsi="Times New Roman"/>
@@ -31101,7 +31813,7 @@
         </w:rPr>
         <w:t xml:space="preserve"> </w:t>
       </w:r>
-      <w:hyperlink w:history="1" r:id="rIdvbebxohrl62dsnkpj6k-6">
+      <w:hyperlink w:history="1" r:id="rIdvlgg5yzxtmlm6uw02tx5f">
         <w:r>
           <w:rPr>
             <w:rFonts w:ascii="Times New Roman" w:cs="Times New Roman" w:eastAsia="Times New Roman" w:hAnsi="Times New Roman"/>
@@ -31156,7 +31868,7 @@
         </w:rPr>
         <w:t xml:space="preserve"> </w:t>
       </w:r>
-      <w:hyperlink w:history="1" r:id="rIdjhgjnfnbw41vhwswpwnzw">
+      <w:hyperlink w:history="1" r:id="rIdrjhauzftpsn9sj9jhc5tf">
         <w:r>
           <w:rPr>
             <w:rFonts w:ascii="Times New Roman" w:cs="Times New Roman" w:eastAsia="Times New Roman" w:hAnsi="Times New Roman"/>
@@ -31211,7 +31923,7 @@
         </w:rPr>
         <w:t xml:space="preserve"> </w:t>
       </w:r>
-      <w:hyperlink w:history="1" r:id="rIdmjvfzgzkjkgew-fnzk7t5">
+      <w:hyperlink w:history="1" r:id="rIdvp7xrpyib0zkbftxlaeay">
         <w:r>
           <w:rPr>
             <w:rFonts w:ascii="Times New Roman" w:cs="Times New Roman" w:eastAsia="Times New Roman" w:hAnsi="Times New Roman"/>
@@ -31266,7 +31978,7 @@
         </w:rPr>
         <w:t xml:space="preserve"> </w:t>
       </w:r>
-      <w:hyperlink w:history="1" r:id="rId9wrbf3iiyud_5cw8mdmxv">
+      <w:hyperlink w:history="1" r:id="rIdtdcua5oincneg2kqku6et">
         <w:r>
           <w:rPr>
             <w:rFonts w:ascii="Times New Roman" w:cs="Times New Roman" w:eastAsia="Times New Roman" w:hAnsi="Times New Roman"/>
@@ -31321,7 +32033,7 @@
         </w:rPr>
         <w:t xml:space="preserve"> </w:t>
       </w:r>
-      <w:hyperlink w:history="1" r:id="rId9bylstfgqofktnceri3sx">
+      <w:hyperlink w:history="1" r:id="rIddmgt_3hswbrrc4xwoajkf">
         <w:r>
           <w:rPr>
             <w:rFonts w:ascii="Times New Roman" w:cs="Times New Roman" w:eastAsia="Times New Roman" w:hAnsi="Times New Roman"/>
@@ -31376,7 +32088,7 @@
         </w:rPr>
         <w:t xml:space="preserve"> </w:t>
       </w:r>
-      <w:hyperlink w:history="1" r:id="rIdjir21l7mroxxq-exew0k8">
+      <w:hyperlink w:history="1" r:id="rIddf9laerxlqhn5qx5xfbj2">
         <w:r>
           <w:rPr>
             <w:rFonts w:ascii="Times New Roman" w:cs="Times New Roman" w:eastAsia="Times New Roman" w:hAnsi="Times New Roman"/>
@@ -31448,7 +32160,7 @@
         </w:rPr>
         <w:t xml:space="preserve"> </w:t>
       </w:r>
-      <w:hyperlink w:history="1" r:id="rIdku9x4qdyar4tg2flw7vij">
+      <w:hyperlink w:history="1" r:id="rIdjvpdihgun8wwwuketf3lp">
         <w:r>
           <w:rPr>
             <w:rFonts w:ascii="Times New Roman" w:cs="Times New Roman" w:eastAsia="Times New Roman" w:hAnsi="Times New Roman"/>
@@ -31503,7 +32215,7 @@
         </w:rPr>
         <w:t xml:space="preserve"> </w:t>
       </w:r>
-      <w:hyperlink w:history="1" r:id="rId6rehcp6lzatps4zqvslwv">
+      <w:hyperlink w:history="1" r:id="rIdfobwmlhbhcoa-f6ii20os">
         <w:r>
           <w:rPr>
             <w:rFonts w:ascii="Times New Roman" w:cs="Times New Roman" w:eastAsia="Times New Roman" w:hAnsi="Times New Roman"/>
@@ -31558,7 +32270,7 @@
         </w:rPr>
         <w:t xml:space="preserve"> </w:t>
       </w:r>
-      <w:hyperlink w:history="1" r:id="rIdwt-ljjwiw53mvf3nlugcd">
+      <w:hyperlink w:history="1" r:id="rIdxa_izzerdxmrgfvlzwxao">
         <w:r>
           <w:rPr>
             <w:rFonts w:ascii="Times New Roman" w:cs="Times New Roman" w:eastAsia="Times New Roman" w:hAnsi="Times New Roman"/>
@@ -31613,7 +32325,7 @@
         </w:rPr>
         <w:t xml:space="preserve"> </w:t>
       </w:r>
-      <w:hyperlink w:history="1" r:id="rIdw697lv8e6uiwrhiqgvdvt">
+      <w:hyperlink w:history="1" r:id="rIdw057ssgzimq4ggtndpi2l">
         <w:r>
           <w:rPr>
             <w:rFonts w:ascii="Times New Roman" w:cs="Times New Roman" w:eastAsia="Times New Roman" w:hAnsi="Times New Roman"/>
@@ -31668,7 +32380,7 @@
         </w:rPr>
         <w:t xml:space="preserve"> </w:t>
       </w:r>
-      <w:hyperlink w:history="1" r:id="rIdqdkkvs00rvsfzcgbq5vrt">
+      <w:hyperlink w:history="1" r:id="rIdoemshzj4q1drt8ds7u5md">
         <w:r>
           <w:rPr>
             <w:rFonts w:ascii="Times New Roman" w:cs="Times New Roman" w:eastAsia="Times New Roman" w:hAnsi="Times New Roman"/>
@@ -31723,7 +32435,7 @@
         </w:rPr>
         <w:t xml:space="preserve"> </w:t>
       </w:r>
-      <w:hyperlink w:history="1" r:id="rIdahq60vxcg3atsr9azm-oa">
+      <w:hyperlink w:history="1" r:id="rId-l8p0-qtbke7ga5difvqj">
         <w:r>
           <w:rPr>
             <w:rFonts w:ascii="Times New Roman" w:cs="Times New Roman" w:eastAsia="Times New Roman" w:hAnsi="Times New Roman"/>
@@ -31778,7 +32490,7 @@
         </w:rPr>
         <w:t xml:space="preserve"> </w:t>
       </w:r>
-      <w:hyperlink w:history="1" r:id="rId7qrrf389axuoefpekh07s">
+      <w:hyperlink w:history="1" r:id="rIdgpkftarbcfwiw0vw-nejw">
         <w:r>
           <w:rPr>
             <w:rFonts w:ascii="Times New Roman" w:cs="Times New Roman" w:eastAsia="Times New Roman" w:hAnsi="Times New Roman"/>
@@ -31833,7 +32545,7 @@
         </w:rPr>
         <w:t xml:space="preserve"> </w:t>
       </w:r>
-      <w:hyperlink w:history="1" r:id="rId47knif0mgyjyc9csloo6x">
+      <w:hyperlink w:history="1" r:id="rIdvgjs9n8k1sy0mzipg9hup">
         <w:r>
           <w:rPr>
             <w:rFonts w:ascii="Times New Roman" w:cs="Times New Roman" w:eastAsia="Times New Roman" w:hAnsi="Times New Roman"/>
@@ -31888,7 +32600,7 @@
         </w:rPr>
         <w:t xml:space="preserve"> </w:t>
       </w:r>
-      <w:hyperlink w:history="1" r:id="rIdewphul6aye6cwaql8fgbd">
+      <w:hyperlink w:history="1" r:id="rIdgjfzj9nmfevd-zq8qlfcd">
         <w:r>
           <w:rPr>
             <w:rFonts w:ascii="Times New Roman" w:cs="Times New Roman" w:eastAsia="Times New Roman" w:hAnsi="Times New Roman"/>
@@ -31923,7 +32635,7 @@
         </w:rPr>
         <w:t xml:space="preserve"> </w:t>
       </w:r>
-      <w:hyperlink w:history="1" r:id="rIdsjeu0lnt4j9xpv87u6qkg">
+      <w:hyperlink w:history="1" r:id="rIdtajoe3nsntgdenw-8h-v3">
         <w:r>
           <w:rPr>
             <w:rFonts w:ascii="Times New Roman" w:cs="Times New Roman" w:eastAsia="Times New Roman" w:hAnsi="Times New Roman"/>
@@ -31978,7 +32690,7 @@
         </w:rPr>
         <w:t xml:space="preserve"> </w:t>
       </w:r>
-      <w:hyperlink w:history="1" r:id="rIddgtffnpcr00wzkflzmfnh">
+      <w:hyperlink w:history="1" r:id="rIdihntz2c3je6ywtv7kpvy0">
         <w:r>
           <w:rPr>
             <w:rFonts w:ascii="Times New Roman" w:cs="Times New Roman" w:eastAsia="Times New Roman" w:hAnsi="Times New Roman"/>
@@ -32033,7 +32745,7 @@
         </w:rPr>
         <w:t xml:space="preserve"> </w:t>
       </w:r>
-      <w:hyperlink w:history="1" r:id="rIdmuumyeratylp9wpzci2pg">
+      <w:hyperlink w:history="1" r:id="rIdgb9syiny3vcllwtrivwst">
         <w:r>
           <w:rPr>
             <w:rFonts w:ascii="Times New Roman" w:cs="Times New Roman" w:eastAsia="Times New Roman" w:hAnsi="Times New Roman"/>
@@ -32088,7 +32800,7 @@
         </w:rPr>
         <w:t xml:space="preserve"> </w:t>
       </w:r>
-      <w:hyperlink w:history="1" r:id="rIdrypwqo9zqi5vokd7v2hma">
+      <w:hyperlink w:history="1" r:id="rId2hdmo79lsc15oo71bj6ju">
         <w:r>
           <w:rPr>
             <w:rFonts w:ascii="Times New Roman" w:cs="Times New Roman" w:eastAsia="Times New Roman" w:hAnsi="Times New Roman"/>
@@ -32160,7 +32872,7 @@
         </w:rPr>
         <w:t xml:space="preserve"> </w:t>
       </w:r>
-      <w:hyperlink w:history="1" r:id="rIdpuhhapjtvolgledvxsu9n">
+      <w:hyperlink w:history="1" r:id="rIdotugs3dwf108qo610wg9o">
         <w:r>
           <w:rPr>
             <w:rFonts w:ascii="Times New Roman" w:cs="Times New Roman" w:eastAsia="Times New Roman" w:hAnsi="Times New Roman"/>
@@ -32215,7 +32927,7 @@
         </w:rPr>
         <w:t xml:space="preserve"> </w:t>
       </w:r>
-      <w:hyperlink w:history="1" r:id="rIdvap-u6h5u3n37lqccbxfy">
+      <w:hyperlink w:history="1" r:id="rIdnfjau6kiku0lubnyuyzmd">
         <w:r>
           <w:rPr>
             <w:rFonts w:ascii="Times New Roman" w:cs="Times New Roman" w:eastAsia="Times New Roman" w:hAnsi="Times New Roman"/>
@@ -32270,7 +32982,7 @@
         </w:rPr>
         <w:t xml:space="preserve"> </w:t>
       </w:r>
-      <w:hyperlink w:history="1" r:id="rIdr7iipjdehcair9n58ui7s">
+      <w:hyperlink w:history="1" r:id="rIdto73vaelardwhxbzd9flk">
         <w:r>
           <w:rPr>
             <w:rFonts w:ascii="Times New Roman" w:cs="Times New Roman" w:eastAsia="Times New Roman" w:hAnsi="Times New Roman"/>
@@ -32325,7 +33037,7 @@
         </w:rPr>
         <w:t xml:space="preserve"> </w:t>
       </w:r>
-      <w:hyperlink w:history="1" r:id="rIdt1tkcjcy0-lg5qnyc21y7">
+      <w:hyperlink w:history="1" r:id="rIdrq9dcnjup5ndx0s8dpamz">
         <w:r>
           <w:rPr>
             <w:rFonts w:ascii="Times New Roman" w:cs="Times New Roman" w:eastAsia="Times New Roman" w:hAnsi="Times New Roman"/>
@@ -32380,7 +33092,7 @@
         </w:rPr>
         <w:t xml:space="preserve"> </w:t>
       </w:r>
-      <w:hyperlink w:history="1" r:id="rIde7pldwkykgetouzlvjxpq">
+      <w:hyperlink w:history="1" r:id="rIda5f4avynhmcj7ejvdcfni">
         <w:r>
           <w:rPr>
             <w:rFonts w:ascii="Times New Roman" w:cs="Times New Roman" w:eastAsia="Times New Roman" w:hAnsi="Times New Roman"/>
@@ -32435,7 +33147,7 @@
         </w:rPr>
         <w:t xml:space="preserve"> </w:t>
       </w:r>
-      <w:hyperlink w:history="1" r:id="rIdshiahequ8ze8hfplrzfb5">
+      <w:hyperlink w:history="1" r:id="rId_psoj0-g_rlibdrak-xy3">
         <w:r>
           <w:rPr>
             <w:rFonts w:ascii="Times New Roman" w:cs="Times New Roman" w:eastAsia="Times New Roman" w:hAnsi="Times New Roman"/>
@@ -32886,90 +33598,30 @@
     </w:lvlOverride>
   </w:num>
   <w:num w:numId="2">
-    <w:abstractNumId w:val="2"/>
+    <w:abstractNumId w:val="12"/>
     <w:lvlOverride w:ilvl="0">
       <w:startOverride w:val="1"/>
     </w:lvlOverride>
   </w:num>
   <w:num w:numId="3">
-    <w:abstractNumId w:val="3"/>
+    <w:abstractNumId w:val="12"/>
     <w:lvlOverride w:ilvl="0">
       <w:startOverride w:val="1"/>
     </w:lvlOverride>
   </w:num>
   <w:num w:numId="4">
-    <w:abstractNumId w:val="4"/>
+    <w:abstractNumId w:val="12"/>
     <w:lvlOverride w:ilvl="0">
       <w:startOverride w:val="1"/>
     </w:lvlOverride>
   </w:num>
   <w:num w:numId="5">
-    <w:abstractNumId w:val="5"/>
+    <w:abstractNumId w:val="12"/>
     <w:lvlOverride w:ilvl="0">
       <w:startOverride w:val="1"/>
     </w:lvlOverride>
   </w:num>
   <w:num w:numId="6">
-    <w:abstractNumId w:val="6"/>
-    <w:lvlOverride w:ilvl="0">
-      <w:startOverride w:val="1"/>
-    </w:lvlOverride>
-  </w:num>
-  <w:num w:numId="7">
-    <w:abstractNumId w:val="12"/>
-    <w:lvlOverride w:ilvl="0">
-      <w:startOverride w:val="1"/>
-    </w:lvlOverride>
-  </w:num>
-  <w:num w:numId="8">
-    <w:abstractNumId w:val="12"/>
-    <w:lvlOverride w:ilvl="0">
-      <w:startOverride w:val="1"/>
-    </w:lvlOverride>
-  </w:num>
-  <w:num w:numId="9">
-    <w:abstractNumId w:val="7"/>
-    <w:lvlOverride w:ilvl="0">
-      <w:startOverride w:val="1"/>
-    </w:lvlOverride>
-  </w:num>
-  <w:num w:numId="10">
-    <w:abstractNumId w:val="12"/>
-    <w:lvlOverride w:ilvl="0">
-      <w:startOverride w:val="1"/>
-    </w:lvlOverride>
-  </w:num>
-  <w:num w:numId="11">
-    <w:abstractNumId w:val="8"/>
-    <w:lvlOverride w:ilvl="0">
-      <w:startOverride w:val="1"/>
-    </w:lvlOverride>
-  </w:num>
-  <w:num w:numId="12">
-    <w:abstractNumId w:val="9"/>
-    <w:lvlOverride w:ilvl="0">
-      <w:startOverride w:val="1"/>
-    </w:lvlOverride>
-  </w:num>
-  <w:num w:numId="13">
-    <w:abstractNumId w:val="10"/>
-    <w:lvlOverride w:ilvl="0">
-      <w:startOverride w:val="1"/>
-    </w:lvlOverride>
-  </w:num>
-  <w:num w:numId="14">
-    <w:abstractNumId w:val="11"/>
-    <w:lvlOverride w:ilvl="0">
-      <w:startOverride w:val="1"/>
-    </w:lvlOverride>
-  </w:num>
-  <w:num w:numId="15">
-    <w:abstractNumId w:val="12"/>
-    <w:lvlOverride w:ilvl="0">
-      <w:startOverride w:val="1"/>
-    </w:lvlOverride>
-  </w:num>
-  <w:num w:numId="16">
     <w:abstractNumId w:val="12"/>
     <w:lvlOverride w:ilvl="0">
       <w:startOverride w:val="1"/>

</xml_diff>

<commit_message>
Report: put the logo and institute block above the title
Moves the VIT logo, school, institute, city and semester to the top of the
title page, and replaces the empty page-break paragraph (shown as a box in
some viewers) with a page break before the Abstract heading.

Co-Authored-By: Claude Opus 5.5 <noreply@anthropic.com>
Claude-Session: https://claude.ai/code/session_01G7W1FBPLoSQuhNKzvxRuhj
</commit_message>
<xml_diff>
--- a/docs/report/DA3_Report.docx
+++ b/docs/report/DA3_Report.docx
@@ -4,102 +4,7 @@
   <w:body>
     <w:p>
       <w:pPr>
-        <w:spacing w:before="1300"/>
-      </w:pPr>
-    </w:p>
-    <w:p>
-      <w:pPr>
-        <w:spacing w:after="360" w:before="0"/>
-        <w:jc w:val="center"/>
-      </w:pPr>
-      <w:r>
-        <w:rPr>
-          <w:rFonts w:ascii="Times New Roman" w:cs="Times New Roman" w:eastAsia="Times New Roman" w:hAnsi="Times New Roman"/>
-          <w:color w:val="000000"/>
-          <w:sz w:val="40"/>
-          <w:szCs w:val="40"/>
-        </w:rPr>
-        <w:t xml:space="preserve">Quality-Aware Multi-Patch Remote Photoplethysmography for Contactless Atrial Fibrillation Screening from Facial Video</w:t>
-      </w:r>
-    </w:p>
-    <w:p>
-      <w:pPr>
-        <w:spacing w:after="120" w:before="0"/>
-        <w:jc w:val="center"/>
-      </w:pPr>
-      <w:r>
-        <w:rPr>
-          <w:rFonts w:ascii="Times New Roman" w:cs="Times New Roman" w:eastAsia="Times New Roman" w:hAnsi="Times New Roman"/>
-          <w:color w:val="000000"/>
-          <w:sz w:val="28"/>
-          <w:szCs w:val="28"/>
-        </w:rPr>
-        <w:t xml:space="preserve">BCSE417L – Machine Vision</w:t>
-      </w:r>
-    </w:p>
-    <w:p>
-      <w:pPr>
-        <w:spacing w:after="1100" w:before="0"/>
-        <w:jc w:val="center"/>
-      </w:pPr>
-      <w:r>
-        <w:rPr>
-          <w:rFonts w:ascii="Times New Roman" w:cs="Times New Roman" w:eastAsia="Times New Roman" w:hAnsi="Times New Roman"/>
-          <w:color w:val="000000"/>
-          <w:sz w:val="28"/>
-          <w:szCs w:val="28"/>
-        </w:rPr>
-        <w:t xml:space="preserve">Digital Assignment 3</w:t>
-      </w:r>
-    </w:p>
-    <w:p>
-      <w:pPr>
-        <w:spacing w:after="120" w:before="0"/>
-        <w:jc w:val="center"/>
-      </w:pPr>
-      <w:r>
-        <w:rPr>
-          <w:rFonts w:ascii="Times New Roman" w:cs="Times New Roman" w:eastAsia="Times New Roman" w:hAnsi="Times New Roman"/>
-          <w:color w:val="000000"/>
-          <w:sz w:val="24"/>
-          <w:szCs w:val="24"/>
-        </w:rPr>
-        <w:t xml:space="preserve">Team Members</w:t>
-      </w:r>
-    </w:p>
-    <w:p>
-      <w:pPr>
-        <w:spacing w:after="60" w:before="0"/>
-        <w:jc w:val="center"/>
-      </w:pPr>
-      <w:r>
-        <w:rPr>
-          <w:rFonts w:ascii="Times New Roman" w:cs="Times New Roman" w:eastAsia="Times New Roman" w:hAnsi="Times New Roman"/>
-          <w:color w:val="000000"/>
-          <w:sz w:val="24"/>
-          <w:szCs w:val="24"/>
-        </w:rPr>
-        <w:t xml:space="preserve">Mayank, Vyomesh Pandita</w:t>
-      </w:r>
-    </w:p>
-    <w:p>
-      <w:pPr>
-        <w:spacing w:after="1500" w:before="0"/>
-        <w:jc w:val="center"/>
-      </w:pPr>
-      <w:r>
-        <w:rPr>
-          <w:rFonts w:ascii="Times New Roman" w:cs="Times New Roman" w:eastAsia="Times New Roman" w:hAnsi="Times New Roman"/>
-          <w:color w:val="000000"/>
-          <w:sz w:val="24"/>
-          <w:szCs w:val="24"/>
-        </w:rPr>
-        <w:t xml:space="preserve">23BAI0158, 23BAI0151</w:t>
-      </w:r>
-    </w:p>
-    <w:p>
-      <w:pPr>
-        <w:spacing w:after="240"/>
+        <w:spacing w:after="240" w:before="200"/>
         <w:jc w:val="center"/>
       </w:pPr>
       <w:r>
@@ -190,6 +95,96 @@
     </w:p>
     <w:p>
       <w:pPr>
+        <w:spacing w:after="1700" w:before="0"/>
+        <w:jc w:val="center"/>
+      </w:pPr>
+      <w:r>
+        <w:rPr>
+          <w:rFonts w:ascii="Times New Roman" w:cs="Times New Roman" w:eastAsia="Times New Roman" w:hAnsi="Times New Roman"/>
+          <w:color w:val="000000"/>
+          <w:sz w:val="30"/>
+          <w:szCs w:val="30"/>
+        </w:rPr>
+        <w:t xml:space="preserve">Fall Semester 2025-26</w:t>
+      </w:r>
+    </w:p>
+    <w:p>
+      <w:pPr>
+        <w:spacing w:after="360" w:before="0"/>
+        <w:jc w:val="center"/>
+      </w:pPr>
+      <w:r>
+        <w:rPr>
+          <w:rFonts w:ascii="Times New Roman" w:cs="Times New Roman" w:eastAsia="Times New Roman" w:hAnsi="Times New Roman"/>
+          <w:color w:val="000000"/>
+          <w:sz w:val="40"/>
+          <w:szCs w:val="40"/>
+        </w:rPr>
+        <w:t xml:space="preserve">Quality-Aware Multi-Patch Remote Photoplethysmography for Contactless Atrial Fibrillation Screening from Facial Video</w:t>
+      </w:r>
+    </w:p>
+    <w:p>
+      <w:pPr>
+        <w:spacing w:after="120" w:before="0"/>
+        <w:jc w:val="center"/>
+      </w:pPr>
+      <w:r>
+        <w:rPr>
+          <w:rFonts w:ascii="Times New Roman" w:cs="Times New Roman" w:eastAsia="Times New Roman" w:hAnsi="Times New Roman"/>
+          <w:color w:val="000000"/>
+          <w:sz w:val="28"/>
+          <w:szCs w:val="28"/>
+        </w:rPr>
+        <w:t xml:space="preserve">BCSE417L – Machine Vision</w:t>
+      </w:r>
+    </w:p>
+    <w:p>
+      <w:pPr>
+        <w:spacing w:after="1500" w:before="0"/>
+        <w:jc w:val="center"/>
+      </w:pPr>
+      <w:r>
+        <w:rPr>
+          <w:rFonts w:ascii="Times New Roman" w:cs="Times New Roman" w:eastAsia="Times New Roman" w:hAnsi="Times New Roman"/>
+          <w:color w:val="000000"/>
+          <w:sz w:val="28"/>
+          <w:szCs w:val="28"/>
+        </w:rPr>
+        <w:t xml:space="preserve">Digital Assignment 3</w:t>
+      </w:r>
+    </w:p>
+    <w:p>
+      <w:pPr>
+        <w:spacing w:after="120" w:before="0"/>
+        <w:jc w:val="center"/>
+      </w:pPr>
+      <w:r>
+        <w:rPr>
+          <w:rFonts w:ascii="Times New Roman" w:cs="Times New Roman" w:eastAsia="Times New Roman" w:hAnsi="Times New Roman"/>
+          <w:color w:val="000000"/>
+          <w:sz w:val="24"/>
+          <w:szCs w:val="24"/>
+        </w:rPr>
+        <w:t xml:space="preserve">Team Members</w:t>
+      </w:r>
+    </w:p>
+    <w:p>
+      <w:pPr>
+        <w:spacing w:after="60" w:before="0"/>
+        <w:jc w:val="center"/>
+      </w:pPr>
+      <w:r>
+        <w:rPr>
+          <w:rFonts w:ascii="Times New Roman" w:cs="Times New Roman" w:eastAsia="Times New Roman" w:hAnsi="Times New Roman"/>
+          <w:color w:val="000000"/>
+          <w:sz w:val="24"/>
+          <w:szCs w:val="24"/>
+        </w:rPr>
+        <w:t xml:space="preserve">Mayank, Vyomesh Pandita</w:t>
+      </w:r>
+    </w:p>
+    <w:p>
+      <w:pPr>
         <w:spacing w:after="0" w:before="0"/>
         <w:jc w:val="center"/>
       </w:pPr>
@@ -197,21 +192,17 @@
         <w:rPr>
           <w:rFonts w:ascii="Times New Roman" w:cs="Times New Roman" w:eastAsia="Times New Roman" w:hAnsi="Times New Roman"/>
           <w:color w:val="000000"/>
-          <w:sz w:val="30"/>
-          <w:szCs w:val="30"/>
-        </w:rPr>
-        <w:t xml:space="preserve">Fall Semester 2025-26</w:t>
-      </w:r>
-    </w:p>
-    <w:p>
-      <w:r>
-        <w:br w:type="page"/>
+          <w:sz w:val="24"/>
+          <w:szCs w:val="24"/>
+        </w:rPr>
+        <w:t xml:space="preserve">23BAI0158, 23BAI0151</w:t>
       </w:r>
     </w:p>
     <w:p>
       <w:pPr>
         <w:pStyle w:val="Heading1"/>
-        <w:spacing w:after="160" w:before="360"/>
+        <w:pageBreakBefore/>
+        <w:spacing w:after="160" w:before="0"/>
       </w:pPr>
       <w:r>
         <w:rPr>
@@ -30823,7 +30814,7 @@
         </w:rPr>
         <w:t xml:space="preserve"> </w:t>
       </w:r>
-      <w:hyperlink w:history="1" r:id="rIdbtv3vudljnlopyyar7a2j">
+      <w:hyperlink w:history="1" r:id="rIdnmjoaenwwvezxn_b1npkh">
         <w:r>
           <w:rPr>
             <w:rFonts w:ascii="Times New Roman" w:cs="Times New Roman" w:eastAsia="Times New Roman" w:hAnsi="Times New Roman"/>
@@ -30878,7 +30869,7 @@
         </w:rPr>
         <w:t xml:space="preserve"> </w:t>
       </w:r>
-      <w:hyperlink w:history="1" r:id="rIdkatxff-94jcdhvwuxkebl">
+      <w:hyperlink w:history="1" r:id="rId2i74t2ls-iozrtbm_ee9o">
         <w:r>
           <w:rPr>
             <w:rFonts w:ascii="Times New Roman" w:cs="Times New Roman" w:eastAsia="Times New Roman" w:hAnsi="Times New Roman"/>
@@ -30933,7 +30924,7 @@
         </w:rPr>
         <w:t xml:space="preserve"> </w:t>
       </w:r>
-      <w:hyperlink w:history="1" r:id="rIdbvzajxpomp_mhhf11ftt1">
+      <w:hyperlink w:history="1" r:id="rIdgtgurzkynvvgrtrun9ux4">
         <w:r>
           <w:rPr>
             <w:rFonts w:ascii="Times New Roman" w:cs="Times New Roman" w:eastAsia="Times New Roman" w:hAnsi="Times New Roman"/>
@@ -30988,7 +30979,7 @@
         </w:rPr>
         <w:t xml:space="preserve"> </w:t>
       </w:r>
-      <w:hyperlink w:history="1" r:id="rIdmnvmjn0ygttubnbvq0i65">
+      <w:hyperlink w:history="1" r:id="rIdsp8scpbsaibhrsklruhx-">
         <w:r>
           <w:rPr>
             <w:rFonts w:ascii="Times New Roman" w:cs="Times New Roman" w:eastAsia="Times New Roman" w:hAnsi="Times New Roman"/>
@@ -31043,7 +31034,7 @@
         </w:rPr>
         <w:t xml:space="preserve"> </w:t>
       </w:r>
-      <w:hyperlink w:history="1" r:id="rIdrqige-rnee-_ngxbuyj0b">
+      <w:hyperlink w:history="1" r:id="rIdpq_mznke3ahsisao0sq0o">
         <w:r>
           <w:rPr>
             <w:rFonts w:ascii="Times New Roman" w:cs="Times New Roman" w:eastAsia="Times New Roman" w:hAnsi="Times New Roman"/>
@@ -31098,7 +31089,7 @@
         </w:rPr>
         <w:t xml:space="preserve"> </w:t>
       </w:r>
-      <w:hyperlink w:history="1" r:id="rIdfnmuoqbvghoqqlue_gtz7">
+      <w:hyperlink w:history="1" r:id="rIdcrs9ayh7s4r0pi6_55dme">
         <w:r>
           <w:rPr>
             <w:rFonts w:ascii="Times New Roman" w:cs="Times New Roman" w:eastAsia="Times New Roman" w:hAnsi="Times New Roman"/>
@@ -31153,7 +31144,7 @@
         </w:rPr>
         <w:t xml:space="preserve"> </w:t>
       </w:r>
-      <w:hyperlink w:history="1" r:id="rId2ensgonsw9ckasgmd8b9j">
+      <w:hyperlink w:history="1" r:id="rIda9nflvbvq9hskn19hz0lu">
         <w:r>
           <w:rPr>
             <w:rFonts w:ascii="Times New Roman" w:cs="Times New Roman" w:eastAsia="Times New Roman" w:hAnsi="Times New Roman"/>
@@ -31208,7 +31199,7 @@
         </w:rPr>
         <w:t xml:space="preserve"> </w:t>
       </w:r>
-      <w:hyperlink w:history="1" r:id="rIdepkfo9r3fev_6fuue5ynu">
+      <w:hyperlink w:history="1" r:id="rIdzgyuac9mibvp1zkbl16cz">
         <w:r>
           <w:rPr>
             <w:rFonts w:ascii="Times New Roman" w:cs="Times New Roman" w:eastAsia="Times New Roman" w:hAnsi="Times New Roman"/>
@@ -31263,7 +31254,7 @@
         </w:rPr>
         <w:t xml:space="preserve"> </w:t>
       </w:r>
-      <w:hyperlink w:history="1" r:id="rIdmxvhils92an4lo4fz2xg3">
+      <w:hyperlink w:history="1" r:id="rIdb4dkzvs1mw41m31njjfuf">
         <w:r>
           <w:rPr>
             <w:rFonts w:ascii="Times New Roman" w:cs="Times New Roman" w:eastAsia="Times New Roman" w:hAnsi="Times New Roman"/>
@@ -31318,7 +31309,7 @@
         </w:rPr>
         <w:t xml:space="preserve"> </w:t>
       </w:r>
-      <w:hyperlink w:history="1" r:id="rIdocay8bpb_yg3mt0nipxmk">
+      <w:hyperlink w:history="1" r:id="rIdylaegwieq-1lsx2tkv7bu">
         <w:r>
           <w:rPr>
             <w:rFonts w:ascii="Times New Roman" w:cs="Times New Roman" w:eastAsia="Times New Roman" w:hAnsi="Times New Roman"/>
@@ -31373,7 +31364,7 @@
         </w:rPr>
         <w:t xml:space="preserve"> </w:t>
       </w:r>
-      <w:hyperlink w:history="1" r:id="rIdhixi08d9yecli71_zyvfy">
+      <w:hyperlink w:history="1" r:id="rIdybrjwax2ltnkxxgnw_m_s">
         <w:r>
           <w:rPr>
             <w:rFonts w:ascii="Times New Roman" w:cs="Times New Roman" w:eastAsia="Times New Roman" w:hAnsi="Times New Roman"/>
@@ -31428,7 +31419,7 @@
         </w:rPr>
         <w:t xml:space="preserve"> </w:t>
       </w:r>
-      <w:hyperlink w:history="1" r:id="rId2t22evbokvudmkisbaq6-">
+      <w:hyperlink w:history="1" r:id="rId5wel3nv5_wlrxbz8oflrz">
         <w:r>
           <w:rPr>
             <w:rFonts w:ascii="Times New Roman" w:cs="Times New Roman" w:eastAsia="Times New Roman" w:hAnsi="Times New Roman"/>
@@ -31483,7 +31474,7 @@
         </w:rPr>
         <w:t xml:space="preserve"> </w:t>
       </w:r>
-      <w:hyperlink w:history="1" r:id="rIdxyokoxupyl06oyw8qgswj">
+      <w:hyperlink w:history="1" r:id="rId4vsp2blbzdqmehpfqhhmi">
         <w:r>
           <w:rPr>
             <w:rFonts w:ascii="Times New Roman" w:cs="Times New Roman" w:eastAsia="Times New Roman" w:hAnsi="Times New Roman"/>
@@ -31538,7 +31529,7 @@
         </w:rPr>
         <w:t xml:space="preserve"> </w:t>
       </w:r>
-      <w:hyperlink w:history="1" r:id="rIdoza36odzm3xatjcv7weaj">
+      <w:hyperlink w:history="1" r:id="rId9fa0pa_txtynqgpendoba">
         <w:r>
           <w:rPr>
             <w:rFonts w:ascii="Times New Roman" w:cs="Times New Roman" w:eastAsia="Times New Roman" w:hAnsi="Times New Roman"/>
@@ -31593,7 +31584,7 @@
         </w:rPr>
         <w:t xml:space="preserve"> </w:t>
       </w:r>
-      <w:hyperlink w:history="1" r:id="rIdj8qaupwxaoby8zl5ore1m">
+      <w:hyperlink w:history="1" r:id="rIdlkfzmzc5f9kzd83rbmum6">
         <w:r>
           <w:rPr>
             <w:rFonts w:ascii="Times New Roman" w:cs="Times New Roman" w:eastAsia="Times New Roman" w:hAnsi="Times New Roman"/>
@@ -31648,7 +31639,7 @@
         </w:rPr>
         <w:t xml:space="preserve"> </w:t>
       </w:r>
-      <w:hyperlink w:history="1" r:id="rIdihxb46os9zvgq1wlnui_k">
+      <w:hyperlink w:history="1" r:id="rIdj5ume_tdzo4nmuspu4azk">
         <w:r>
           <w:rPr>
             <w:rFonts w:ascii="Times New Roman" w:cs="Times New Roman" w:eastAsia="Times New Roman" w:hAnsi="Times New Roman"/>
@@ -31703,7 +31694,7 @@
         </w:rPr>
         <w:t xml:space="preserve"> </w:t>
       </w:r>
-      <w:hyperlink w:history="1" r:id="rIdnfx9ppxsomrkcamyi0kt1">
+      <w:hyperlink w:history="1" r:id="rId-nr7xyexhti2wnzj_0a6v">
         <w:r>
           <w:rPr>
             <w:rFonts w:ascii="Times New Roman" w:cs="Times New Roman" w:eastAsia="Times New Roman" w:hAnsi="Times New Roman"/>
@@ -31758,7 +31749,7 @@
         </w:rPr>
         <w:t xml:space="preserve"> </w:t>
       </w:r>
-      <w:hyperlink w:history="1" r:id="rId-klryloyff1wejjlrfnvb">
+      <w:hyperlink w:history="1" r:id="rIdjx53aaafmqo44gzhzmeuf">
         <w:r>
           <w:rPr>
             <w:rFonts w:ascii="Times New Roman" w:cs="Times New Roman" w:eastAsia="Times New Roman" w:hAnsi="Times New Roman"/>
@@ -31813,7 +31804,7 @@
         </w:rPr>
         <w:t xml:space="preserve"> </w:t>
       </w:r>
-      <w:hyperlink w:history="1" r:id="rIdvlgg5yzxtmlm6uw02tx5f">
+      <w:hyperlink w:history="1" r:id="rIdzoplszacmlmeragieyqj9">
         <w:r>
           <w:rPr>
             <w:rFonts w:ascii="Times New Roman" w:cs="Times New Roman" w:eastAsia="Times New Roman" w:hAnsi="Times New Roman"/>
@@ -31868,7 +31859,7 @@
         </w:rPr>
         <w:t xml:space="preserve"> </w:t>
       </w:r>
-      <w:hyperlink w:history="1" r:id="rIdrjhauzftpsn9sj9jhc5tf">
+      <w:hyperlink w:history="1" r:id="rId1kxgdbwtpzz3ktadvzht_">
         <w:r>
           <w:rPr>
             <w:rFonts w:ascii="Times New Roman" w:cs="Times New Roman" w:eastAsia="Times New Roman" w:hAnsi="Times New Roman"/>
@@ -31923,7 +31914,7 @@
         </w:rPr>
         <w:t xml:space="preserve"> </w:t>
       </w:r>
-      <w:hyperlink w:history="1" r:id="rIdvp7xrpyib0zkbftxlaeay">
+      <w:hyperlink w:history="1" r:id="rIdfer89gfhlkchtnijjlyha">
         <w:r>
           <w:rPr>
             <w:rFonts w:ascii="Times New Roman" w:cs="Times New Roman" w:eastAsia="Times New Roman" w:hAnsi="Times New Roman"/>
@@ -31978,7 +31969,7 @@
         </w:rPr>
         <w:t xml:space="preserve"> </w:t>
       </w:r>
-      <w:hyperlink w:history="1" r:id="rIdtdcua5oincneg2kqku6et">
+      <w:hyperlink w:history="1" r:id="rIdzoqbawsdr7mp5dbd5pqgw">
         <w:r>
           <w:rPr>
             <w:rFonts w:ascii="Times New Roman" w:cs="Times New Roman" w:eastAsia="Times New Roman" w:hAnsi="Times New Roman"/>
@@ -32033,7 +32024,7 @@
         </w:rPr>
         <w:t xml:space="preserve"> </w:t>
       </w:r>
-      <w:hyperlink w:history="1" r:id="rIddmgt_3hswbrrc4xwoajkf">
+      <w:hyperlink w:history="1" r:id="rIdpm8txlij2wevg5r8ugx1v">
         <w:r>
           <w:rPr>
             <w:rFonts w:ascii="Times New Roman" w:cs="Times New Roman" w:eastAsia="Times New Roman" w:hAnsi="Times New Roman"/>
@@ -32088,7 +32079,7 @@
         </w:rPr>
         <w:t xml:space="preserve"> </w:t>
       </w:r>
-      <w:hyperlink w:history="1" r:id="rIddf9laerxlqhn5qx5xfbj2">
+      <w:hyperlink w:history="1" r:id="rId8jqq9u5h03qptvo4nnerz">
         <w:r>
           <w:rPr>
             <w:rFonts w:ascii="Times New Roman" w:cs="Times New Roman" w:eastAsia="Times New Roman" w:hAnsi="Times New Roman"/>
@@ -32160,7 +32151,7 @@
         </w:rPr>
         <w:t xml:space="preserve"> </w:t>
       </w:r>
-      <w:hyperlink w:history="1" r:id="rIdjvpdihgun8wwwuketf3lp">
+      <w:hyperlink w:history="1" r:id="rIdy7ztnttsfelwwpnynvrpt">
         <w:r>
           <w:rPr>
             <w:rFonts w:ascii="Times New Roman" w:cs="Times New Roman" w:eastAsia="Times New Roman" w:hAnsi="Times New Roman"/>
@@ -32215,7 +32206,7 @@
         </w:rPr>
         <w:t xml:space="preserve"> </w:t>
       </w:r>
-      <w:hyperlink w:history="1" r:id="rIdfobwmlhbhcoa-f6ii20os">
+      <w:hyperlink w:history="1" r:id="rIdzwvqd4ijlaswlvpfogznp">
         <w:r>
           <w:rPr>
             <w:rFonts w:ascii="Times New Roman" w:cs="Times New Roman" w:eastAsia="Times New Roman" w:hAnsi="Times New Roman"/>
@@ -32270,7 +32261,7 @@
         </w:rPr>
         <w:t xml:space="preserve"> </w:t>
       </w:r>
-      <w:hyperlink w:history="1" r:id="rIdxa_izzerdxmrgfvlzwxao">
+      <w:hyperlink w:history="1" r:id="rId9zoc3fwsal8yr9nzs0hc9">
         <w:r>
           <w:rPr>
             <w:rFonts w:ascii="Times New Roman" w:cs="Times New Roman" w:eastAsia="Times New Roman" w:hAnsi="Times New Roman"/>
@@ -32325,7 +32316,7 @@
         </w:rPr>
         <w:t xml:space="preserve"> </w:t>
       </w:r>
-      <w:hyperlink w:history="1" r:id="rIdw057ssgzimq4ggtndpi2l">
+      <w:hyperlink w:history="1" r:id="rIdjno2hiyohez5d-_sdf2hr">
         <w:r>
           <w:rPr>
             <w:rFonts w:ascii="Times New Roman" w:cs="Times New Roman" w:eastAsia="Times New Roman" w:hAnsi="Times New Roman"/>
@@ -32380,7 +32371,7 @@
         </w:rPr>
         <w:t xml:space="preserve"> </w:t>
       </w:r>
-      <w:hyperlink w:history="1" r:id="rIdoemshzj4q1drt8ds7u5md">
+      <w:hyperlink w:history="1" r:id="rIdbemyxocqqo8u13cc3ecu1">
         <w:r>
           <w:rPr>
             <w:rFonts w:ascii="Times New Roman" w:cs="Times New Roman" w:eastAsia="Times New Roman" w:hAnsi="Times New Roman"/>
@@ -32435,7 +32426,7 @@
         </w:rPr>
         <w:t xml:space="preserve"> </w:t>
       </w:r>
-      <w:hyperlink w:history="1" r:id="rId-l8p0-qtbke7ga5difvqj">
+      <w:hyperlink w:history="1" r:id="rIds4p5fh8plylaeamg5-eed">
         <w:r>
           <w:rPr>
             <w:rFonts w:ascii="Times New Roman" w:cs="Times New Roman" w:eastAsia="Times New Roman" w:hAnsi="Times New Roman"/>
@@ -32490,7 +32481,7 @@
         </w:rPr>
         <w:t xml:space="preserve"> </w:t>
       </w:r>
-      <w:hyperlink w:history="1" r:id="rIdgpkftarbcfwiw0vw-nejw">
+      <w:hyperlink w:history="1" r:id="rIdugdtadhn302f8ttfeaagk">
         <w:r>
           <w:rPr>
             <w:rFonts w:ascii="Times New Roman" w:cs="Times New Roman" w:eastAsia="Times New Roman" w:hAnsi="Times New Roman"/>
@@ -32545,7 +32536,7 @@
         </w:rPr>
         <w:t xml:space="preserve"> </w:t>
       </w:r>
-      <w:hyperlink w:history="1" r:id="rIdvgjs9n8k1sy0mzipg9hup">
+      <w:hyperlink w:history="1" r:id="rIdikvgwjnhlcr_giz0bhaoi">
         <w:r>
           <w:rPr>
             <w:rFonts w:ascii="Times New Roman" w:cs="Times New Roman" w:eastAsia="Times New Roman" w:hAnsi="Times New Roman"/>
@@ -32600,7 +32591,7 @@
         </w:rPr>
         <w:t xml:space="preserve"> </w:t>
       </w:r>
-      <w:hyperlink w:history="1" r:id="rIdgjfzj9nmfevd-zq8qlfcd">
+      <w:hyperlink w:history="1" r:id="rIdqjtpooa7zzlffcvpr9zfo">
         <w:r>
           <w:rPr>
             <w:rFonts w:ascii="Times New Roman" w:cs="Times New Roman" w:eastAsia="Times New Roman" w:hAnsi="Times New Roman"/>
@@ -32635,7 +32626,7 @@
         </w:rPr>
         <w:t xml:space="preserve"> </w:t>
       </w:r>
-      <w:hyperlink w:history="1" r:id="rIdtajoe3nsntgdenw-8h-v3">
+      <w:hyperlink w:history="1" r:id="rIdtb4rn4uw1kxe5slkt8nv4">
         <w:r>
           <w:rPr>
             <w:rFonts w:ascii="Times New Roman" w:cs="Times New Roman" w:eastAsia="Times New Roman" w:hAnsi="Times New Roman"/>
@@ -32690,7 +32681,7 @@
         </w:rPr>
         <w:t xml:space="preserve"> </w:t>
       </w:r>
-      <w:hyperlink w:history="1" r:id="rIdihntz2c3je6ywtv7kpvy0">
+      <w:hyperlink w:history="1" r:id="rIdjz9bk7triz59jt_yzucfy">
         <w:r>
           <w:rPr>
             <w:rFonts w:ascii="Times New Roman" w:cs="Times New Roman" w:eastAsia="Times New Roman" w:hAnsi="Times New Roman"/>
@@ -32745,7 +32736,7 @@
         </w:rPr>
         <w:t xml:space="preserve"> </w:t>
       </w:r>
-      <w:hyperlink w:history="1" r:id="rIdgb9syiny3vcllwtrivwst">
+      <w:hyperlink w:history="1" r:id="rIdr0mueddid8_wqpliba0ot">
         <w:r>
           <w:rPr>
             <w:rFonts w:ascii="Times New Roman" w:cs="Times New Roman" w:eastAsia="Times New Roman" w:hAnsi="Times New Roman"/>
@@ -32800,7 +32791,7 @@
         </w:rPr>
         <w:t xml:space="preserve"> </w:t>
       </w:r>
-      <w:hyperlink w:history="1" r:id="rId2hdmo79lsc15oo71bj6ju">
+      <w:hyperlink w:history="1" r:id="rIdlqxcbvpzu8dkscvmjtytf">
         <w:r>
           <w:rPr>
             <w:rFonts w:ascii="Times New Roman" w:cs="Times New Roman" w:eastAsia="Times New Roman" w:hAnsi="Times New Roman"/>
@@ -32872,7 +32863,7 @@
         </w:rPr>
         <w:t xml:space="preserve"> </w:t>
       </w:r>
-      <w:hyperlink w:history="1" r:id="rIdotugs3dwf108qo610wg9o">
+      <w:hyperlink w:history="1" r:id="rIdfg2kcni5drfwccomtarrg">
         <w:r>
           <w:rPr>
             <w:rFonts w:ascii="Times New Roman" w:cs="Times New Roman" w:eastAsia="Times New Roman" w:hAnsi="Times New Roman"/>
@@ -32927,7 +32918,7 @@
         </w:rPr>
         <w:t xml:space="preserve"> </w:t>
       </w:r>
-      <w:hyperlink w:history="1" r:id="rIdnfjau6kiku0lubnyuyzmd">
+      <w:hyperlink w:history="1" r:id="rIdsdezy0gbo45lczuiruu_b">
         <w:r>
           <w:rPr>
             <w:rFonts w:ascii="Times New Roman" w:cs="Times New Roman" w:eastAsia="Times New Roman" w:hAnsi="Times New Roman"/>
@@ -32982,7 +32973,7 @@
         </w:rPr>
         <w:t xml:space="preserve"> </w:t>
       </w:r>
-      <w:hyperlink w:history="1" r:id="rIdto73vaelardwhxbzd9flk">
+      <w:hyperlink w:history="1" r:id="rIduaznlqgcmddqdmccanz8k">
         <w:r>
           <w:rPr>
             <w:rFonts w:ascii="Times New Roman" w:cs="Times New Roman" w:eastAsia="Times New Roman" w:hAnsi="Times New Roman"/>
@@ -33037,7 +33028,7 @@
         </w:rPr>
         <w:t xml:space="preserve"> </w:t>
       </w:r>
-      <w:hyperlink w:history="1" r:id="rIdrq9dcnjup5ndx0s8dpamz">
+      <w:hyperlink w:history="1" r:id="rIdjewxqfp61ucst0n1tlzxu">
         <w:r>
           <w:rPr>
             <w:rFonts w:ascii="Times New Roman" w:cs="Times New Roman" w:eastAsia="Times New Roman" w:hAnsi="Times New Roman"/>
@@ -33092,7 +33083,7 @@
         </w:rPr>
         <w:t xml:space="preserve"> </w:t>
       </w:r>
-      <w:hyperlink w:history="1" r:id="rIda5f4avynhmcj7ejvdcfni">
+      <w:hyperlink w:history="1" r:id="rIdh6p8e7qktmblzzd1mbrpt">
         <w:r>
           <w:rPr>
             <w:rFonts w:ascii="Times New Roman" w:cs="Times New Roman" w:eastAsia="Times New Roman" w:hAnsi="Times New Roman"/>
@@ -33147,7 +33138,7 @@
         </w:rPr>
         <w:t xml:space="preserve"> </w:t>
       </w:r>
-      <w:hyperlink w:history="1" r:id="rId_psoj0-g_rlibdrak-xy3">
+      <w:hyperlink w:history="1" r:id="rIdiqrhh-kqqbidg2jdhffxc">
         <w:r>
           <w:rPr>
             <w:rFonts w:ascii="Times New Roman" w:cs="Times New Roman" w:eastAsia="Times New Roman" w:hAnsi="Times New Roman"/>

</xml_diff>

<commit_message>
Report: remove the appendix
Co-Authored-By: Claude Opus 5.5 <noreply@anthropic.com>
Claude-Session: https://claude.ai/code/session_01G7W1FBPLoSQuhNKzvxRuhj
</commit_message>
<xml_diff>
--- a/docs/report/DA3_Report.docx
+++ b/docs/report/DA3_Report.docx
@@ -30814,7 +30814,7 @@
         </w:rPr>
         <w:t xml:space="preserve"> </w:t>
       </w:r>
-      <w:hyperlink w:history="1" r:id="rIdnmjoaenwwvezxn_b1npkh">
+      <w:hyperlink w:history="1" r:id="rIdqbb_vyfqkxrvfd7rs0m-v">
         <w:r>
           <w:rPr>
             <w:rFonts w:ascii="Times New Roman" w:cs="Times New Roman" w:eastAsia="Times New Roman" w:hAnsi="Times New Roman"/>
@@ -30869,7 +30869,7 @@
         </w:rPr>
         <w:t xml:space="preserve"> </w:t>
       </w:r>
-      <w:hyperlink w:history="1" r:id="rId2i74t2ls-iozrtbm_ee9o">
+      <w:hyperlink w:history="1" r:id="rIdlvwd515ep_i-xrbvn0gbb">
         <w:r>
           <w:rPr>
             <w:rFonts w:ascii="Times New Roman" w:cs="Times New Roman" w:eastAsia="Times New Roman" w:hAnsi="Times New Roman"/>
@@ -30924,7 +30924,7 @@
         </w:rPr>
         <w:t xml:space="preserve"> </w:t>
       </w:r>
-      <w:hyperlink w:history="1" r:id="rIdgtgurzkynvvgrtrun9ux4">
+      <w:hyperlink w:history="1" r:id="rIde0aq5kg420ifi0hq23y5s">
         <w:r>
           <w:rPr>
             <w:rFonts w:ascii="Times New Roman" w:cs="Times New Roman" w:eastAsia="Times New Roman" w:hAnsi="Times New Roman"/>
@@ -30979,7 +30979,7 @@
         </w:rPr>
         <w:t xml:space="preserve"> </w:t>
       </w:r>
-      <w:hyperlink w:history="1" r:id="rIdsp8scpbsaibhrsklruhx-">
+      <w:hyperlink w:history="1" r:id="rIdvivqcpsedqwdmla4sict3">
         <w:r>
           <w:rPr>
             <w:rFonts w:ascii="Times New Roman" w:cs="Times New Roman" w:eastAsia="Times New Roman" w:hAnsi="Times New Roman"/>
@@ -31034,7 +31034,7 @@
         </w:rPr>
         <w:t xml:space="preserve"> </w:t>
       </w:r>
-      <w:hyperlink w:history="1" r:id="rIdpq_mznke3ahsisao0sq0o">
+      <w:hyperlink w:history="1" r:id="rIdxtzc6rcio-i95wikeakdi">
         <w:r>
           <w:rPr>
             <w:rFonts w:ascii="Times New Roman" w:cs="Times New Roman" w:eastAsia="Times New Roman" w:hAnsi="Times New Roman"/>
@@ -31089,7 +31089,7 @@
         </w:rPr>
         <w:t xml:space="preserve"> </w:t>
       </w:r>
-      <w:hyperlink w:history="1" r:id="rIdcrs9ayh7s4r0pi6_55dme">
+      <w:hyperlink w:history="1" r:id="rIduwiqusycxrnk1pmdaumvl">
         <w:r>
           <w:rPr>
             <w:rFonts w:ascii="Times New Roman" w:cs="Times New Roman" w:eastAsia="Times New Roman" w:hAnsi="Times New Roman"/>
@@ -31144,7 +31144,7 @@
         </w:rPr>
         <w:t xml:space="preserve"> </w:t>
       </w:r>
-      <w:hyperlink w:history="1" r:id="rIda9nflvbvq9hskn19hz0lu">
+      <w:hyperlink w:history="1" r:id="rId1yv0ufbpgbp9nkg5jya85">
         <w:r>
           <w:rPr>
             <w:rFonts w:ascii="Times New Roman" w:cs="Times New Roman" w:eastAsia="Times New Roman" w:hAnsi="Times New Roman"/>
@@ -31199,7 +31199,7 @@
         </w:rPr>
         <w:t xml:space="preserve"> </w:t>
       </w:r>
-      <w:hyperlink w:history="1" r:id="rIdzgyuac9mibvp1zkbl16cz">
+      <w:hyperlink w:history="1" r:id="rIdwuyrbtuugwhknxylr0tuz">
         <w:r>
           <w:rPr>
             <w:rFonts w:ascii="Times New Roman" w:cs="Times New Roman" w:eastAsia="Times New Roman" w:hAnsi="Times New Roman"/>
@@ -31254,7 +31254,7 @@
         </w:rPr>
         <w:t xml:space="preserve"> </w:t>
       </w:r>
-      <w:hyperlink w:history="1" r:id="rIdb4dkzvs1mw41m31njjfuf">
+      <w:hyperlink w:history="1" r:id="rIdy9qpvx4qyeynm-iyy3tif">
         <w:r>
           <w:rPr>
             <w:rFonts w:ascii="Times New Roman" w:cs="Times New Roman" w:eastAsia="Times New Roman" w:hAnsi="Times New Roman"/>
@@ -31309,7 +31309,7 @@
         </w:rPr>
         <w:t xml:space="preserve"> </w:t>
       </w:r>
-      <w:hyperlink w:history="1" r:id="rIdylaegwieq-1lsx2tkv7bu">
+      <w:hyperlink w:history="1" r:id="rIdposxb6rnekiiky6rm6dhs">
         <w:r>
           <w:rPr>
             <w:rFonts w:ascii="Times New Roman" w:cs="Times New Roman" w:eastAsia="Times New Roman" w:hAnsi="Times New Roman"/>
@@ -31364,7 +31364,7 @@
         </w:rPr>
         <w:t xml:space="preserve"> </w:t>
       </w:r>
-      <w:hyperlink w:history="1" r:id="rIdybrjwax2ltnkxxgnw_m_s">
+      <w:hyperlink w:history="1" r:id="rIdpycss1xnrhpdcjxqrgeco">
         <w:r>
           <w:rPr>
             <w:rFonts w:ascii="Times New Roman" w:cs="Times New Roman" w:eastAsia="Times New Roman" w:hAnsi="Times New Roman"/>
@@ -31419,7 +31419,7 @@
         </w:rPr>
         <w:t xml:space="preserve"> </w:t>
       </w:r>
-      <w:hyperlink w:history="1" r:id="rId5wel3nv5_wlrxbz8oflrz">
+      <w:hyperlink w:history="1" r:id="rIdiwxifpzao2jh621skymoh">
         <w:r>
           <w:rPr>
             <w:rFonts w:ascii="Times New Roman" w:cs="Times New Roman" w:eastAsia="Times New Roman" w:hAnsi="Times New Roman"/>
@@ -31474,7 +31474,7 @@
         </w:rPr>
         <w:t xml:space="preserve"> </w:t>
       </w:r>
-      <w:hyperlink w:history="1" r:id="rId4vsp2blbzdqmehpfqhhmi">
+      <w:hyperlink w:history="1" r:id="rIdm7hkocgzvg2t8ym6kuirm">
         <w:r>
           <w:rPr>
             <w:rFonts w:ascii="Times New Roman" w:cs="Times New Roman" w:eastAsia="Times New Roman" w:hAnsi="Times New Roman"/>
@@ -31529,7 +31529,7 @@
         </w:rPr>
         <w:t xml:space="preserve"> </w:t>
       </w:r>
-      <w:hyperlink w:history="1" r:id="rId9fa0pa_txtynqgpendoba">
+      <w:hyperlink w:history="1" r:id="rIdwcpnujianp-i54_540pcm">
         <w:r>
           <w:rPr>
             <w:rFonts w:ascii="Times New Roman" w:cs="Times New Roman" w:eastAsia="Times New Roman" w:hAnsi="Times New Roman"/>
@@ -31584,7 +31584,7 @@
         </w:rPr>
         <w:t xml:space="preserve"> </w:t>
       </w:r>
-      <w:hyperlink w:history="1" r:id="rIdlkfzmzc5f9kzd83rbmum6">
+      <w:hyperlink w:history="1" r:id="rIdo2qn9418yumkmyzfuc8cy">
         <w:r>
           <w:rPr>
             <w:rFonts w:ascii="Times New Roman" w:cs="Times New Roman" w:eastAsia="Times New Roman" w:hAnsi="Times New Roman"/>
@@ -31639,7 +31639,7 @@
         </w:rPr>
         <w:t xml:space="preserve"> </w:t>
       </w:r>
-      <w:hyperlink w:history="1" r:id="rIdj5ume_tdzo4nmuspu4azk">
+      <w:hyperlink w:history="1" r:id="rIdlnjpwvixu7jjzsundxmux">
         <w:r>
           <w:rPr>
             <w:rFonts w:ascii="Times New Roman" w:cs="Times New Roman" w:eastAsia="Times New Roman" w:hAnsi="Times New Roman"/>
@@ -31694,7 +31694,7 @@
         </w:rPr>
         <w:t xml:space="preserve"> </w:t>
       </w:r>
-      <w:hyperlink w:history="1" r:id="rId-nr7xyexhti2wnzj_0a6v">
+      <w:hyperlink w:history="1" r:id="rIdtonfkqux6y4p5tojlyhi4">
         <w:r>
           <w:rPr>
             <w:rFonts w:ascii="Times New Roman" w:cs="Times New Roman" w:eastAsia="Times New Roman" w:hAnsi="Times New Roman"/>
@@ -31749,7 +31749,7 @@
         </w:rPr>
         <w:t xml:space="preserve"> </w:t>
       </w:r>
-      <w:hyperlink w:history="1" r:id="rIdjx53aaafmqo44gzhzmeuf">
+      <w:hyperlink w:history="1" r:id="rIdzcu1dvwybb-1w7pl0m3of">
         <w:r>
           <w:rPr>
             <w:rFonts w:ascii="Times New Roman" w:cs="Times New Roman" w:eastAsia="Times New Roman" w:hAnsi="Times New Roman"/>
@@ -31804,7 +31804,7 @@
         </w:rPr>
         <w:t xml:space="preserve"> </w:t>
       </w:r>
-      <w:hyperlink w:history="1" r:id="rIdzoplszacmlmeragieyqj9">
+      <w:hyperlink w:history="1" r:id="rIdemzwlkuchdfnxiltlymtz">
         <w:r>
           <w:rPr>
             <w:rFonts w:ascii="Times New Roman" w:cs="Times New Roman" w:eastAsia="Times New Roman" w:hAnsi="Times New Roman"/>
@@ -31859,7 +31859,7 @@
         </w:rPr>
         <w:t xml:space="preserve"> </w:t>
       </w:r>
-      <w:hyperlink w:history="1" r:id="rId1kxgdbwtpzz3ktadvzht_">
+      <w:hyperlink w:history="1" r:id="rIdwibmalk7gv9z0noiefth4">
         <w:r>
           <w:rPr>
             <w:rFonts w:ascii="Times New Roman" w:cs="Times New Roman" w:eastAsia="Times New Roman" w:hAnsi="Times New Roman"/>
@@ -31914,7 +31914,7 @@
         </w:rPr>
         <w:t xml:space="preserve"> </w:t>
       </w:r>
-      <w:hyperlink w:history="1" r:id="rIdfer89gfhlkchtnijjlyha">
+      <w:hyperlink w:history="1" r:id="rIdeyafaxbfjt0dcdhmgoahz">
         <w:r>
           <w:rPr>
             <w:rFonts w:ascii="Times New Roman" w:cs="Times New Roman" w:eastAsia="Times New Roman" w:hAnsi="Times New Roman"/>
@@ -31969,7 +31969,7 @@
         </w:rPr>
         <w:t xml:space="preserve"> </w:t>
       </w:r>
-      <w:hyperlink w:history="1" r:id="rIdzoqbawsdr7mp5dbd5pqgw">
+      <w:hyperlink w:history="1" r:id="rId01eyv2hqvmq87pjzb1-yk">
         <w:r>
           <w:rPr>
             <w:rFonts w:ascii="Times New Roman" w:cs="Times New Roman" w:eastAsia="Times New Roman" w:hAnsi="Times New Roman"/>
@@ -32024,7 +32024,7 @@
         </w:rPr>
         <w:t xml:space="preserve"> </w:t>
       </w:r>
-      <w:hyperlink w:history="1" r:id="rIdpm8txlij2wevg5r8ugx1v">
+      <w:hyperlink w:history="1" r:id="rIdy6fum-n5zohvwfae40kwb">
         <w:r>
           <w:rPr>
             <w:rFonts w:ascii="Times New Roman" w:cs="Times New Roman" w:eastAsia="Times New Roman" w:hAnsi="Times New Roman"/>
@@ -32079,7 +32079,7 @@
         </w:rPr>
         <w:t xml:space="preserve"> </w:t>
       </w:r>
-      <w:hyperlink w:history="1" r:id="rId8jqq9u5h03qptvo4nnerz">
+      <w:hyperlink w:history="1" r:id="rIdjvjwjchvp4skph_g2w85s">
         <w:r>
           <w:rPr>
             <w:rFonts w:ascii="Times New Roman" w:cs="Times New Roman" w:eastAsia="Times New Roman" w:hAnsi="Times New Roman"/>
@@ -32151,7 +32151,7 @@
         </w:rPr>
         <w:t xml:space="preserve"> </w:t>
       </w:r>
-      <w:hyperlink w:history="1" r:id="rIdy7ztnttsfelwwpnynvrpt">
+      <w:hyperlink w:history="1" r:id="rIdp8skjckogwulgdaooicfp">
         <w:r>
           <w:rPr>
             <w:rFonts w:ascii="Times New Roman" w:cs="Times New Roman" w:eastAsia="Times New Roman" w:hAnsi="Times New Roman"/>
@@ -32206,7 +32206,7 @@
         </w:rPr>
         <w:t xml:space="preserve"> </w:t>
       </w:r>
-      <w:hyperlink w:history="1" r:id="rIdzwvqd4ijlaswlvpfogznp">
+      <w:hyperlink w:history="1" r:id="rIdpeuupt3zn1jmx88gkyk_a">
         <w:r>
           <w:rPr>
             <w:rFonts w:ascii="Times New Roman" w:cs="Times New Roman" w:eastAsia="Times New Roman" w:hAnsi="Times New Roman"/>
@@ -32261,7 +32261,7 @@
         </w:rPr>
         <w:t xml:space="preserve"> </w:t>
       </w:r>
-      <w:hyperlink w:history="1" r:id="rId9zoc3fwsal8yr9nzs0hc9">
+      <w:hyperlink w:history="1" r:id="rId2cvtb-lewnwrddnhsklzh">
         <w:r>
           <w:rPr>
             <w:rFonts w:ascii="Times New Roman" w:cs="Times New Roman" w:eastAsia="Times New Roman" w:hAnsi="Times New Roman"/>
@@ -32316,7 +32316,7 @@
         </w:rPr>
         <w:t xml:space="preserve"> </w:t>
       </w:r>
-      <w:hyperlink w:history="1" r:id="rIdjno2hiyohez5d-_sdf2hr">
+      <w:hyperlink w:history="1" r:id="rIdgffj9tc-cylmg5etu86wj">
         <w:r>
           <w:rPr>
             <w:rFonts w:ascii="Times New Roman" w:cs="Times New Roman" w:eastAsia="Times New Roman" w:hAnsi="Times New Roman"/>
@@ -32371,7 +32371,7 @@
         </w:rPr>
         <w:t xml:space="preserve"> </w:t>
       </w:r>
-      <w:hyperlink w:history="1" r:id="rIdbemyxocqqo8u13cc3ecu1">
+      <w:hyperlink w:history="1" r:id="rIdiapeurldqr9_zrarl7ocr">
         <w:r>
           <w:rPr>
             <w:rFonts w:ascii="Times New Roman" w:cs="Times New Roman" w:eastAsia="Times New Roman" w:hAnsi="Times New Roman"/>
@@ -32426,7 +32426,7 @@
         </w:rPr>
         <w:t xml:space="preserve"> </w:t>
       </w:r>
-      <w:hyperlink w:history="1" r:id="rIds4p5fh8plylaeamg5-eed">
+      <w:hyperlink w:history="1" r:id="rId0k4vmy19sikiwuncxetju">
         <w:r>
           <w:rPr>
             <w:rFonts w:ascii="Times New Roman" w:cs="Times New Roman" w:eastAsia="Times New Roman" w:hAnsi="Times New Roman"/>
@@ -32481,7 +32481,7 @@
         </w:rPr>
         <w:t xml:space="preserve"> </w:t>
       </w:r>
-      <w:hyperlink w:history="1" r:id="rIdugdtadhn302f8ttfeaagk">
+      <w:hyperlink w:history="1" r:id="rId-bbnbolaksinzoywopn_s">
         <w:r>
           <w:rPr>
             <w:rFonts w:ascii="Times New Roman" w:cs="Times New Roman" w:eastAsia="Times New Roman" w:hAnsi="Times New Roman"/>
@@ -32536,7 +32536,7 @@
         </w:rPr>
         <w:t xml:space="preserve"> </w:t>
       </w:r>
-      <w:hyperlink w:history="1" r:id="rIdikvgwjnhlcr_giz0bhaoi">
+      <w:hyperlink w:history="1" r:id="rIdyk9yyoqmfcclftw5kqgly">
         <w:r>
           <w:rPr>
             <w:rFonts w:ascii="Times New Roman" w:cs="Times New Roman" w:eastAsia="Times New Roman" w:hAnsi="Times New Roman"/>
@@ -32591,7 +32591,7 @@
         </w:rPr>
         <w:t xml:space="preserve"> </w:t>
       </w:r>
-      <w:hyperlink w:history="1" r:id="rIdqjtpooa7zzlffcvpr9zfo">
+      <w:hyperlink w:history="1" r:id="rId52fmgvafu1mr9bmphuuir">
         <w:r>
           <w:rPr>
             <w:rFonts w:ascii="Times New Roman" w:cs="Times New Roman" w:eastAsia="Times New Roman" w:hAnsi="Times New Roman"/>
@@ -32626,7 +32626,7 @@
         </w:rPr>
         <w:t xml:space="preserve"> </w:t>
       </w:r>
-      <w:hyperlink w:history="1" r:id="rIdtb4rn4uw1kxe5slkt8nv4">
+      <w:hyperlink w:history="1" r:id="rIdo_raiwc5fncqzji9waiyl">
         <w:r>
           <w:rPr>
             <w:rFonts w:ascii="Times New Roman" w:cs="Times New Roman" w:eastAsia="Times New Roman" w:hAnsi="Times New Roman"/>
@@ -32681,7 +32681,7 @@
         </w:rPr>
         <w:t xml:space="preserve"> </w:t>
       </w:r>
-      <w:hyperlink w:history="1" r:id="rIdjz9bk7triz59jt_yzucfy">
+      <w:hyperlink w:history="1" r:id="rIdc3u30pihqouj9p_mcqjbs">
         <w:r>
           <w:rPr>
             <w:rFonts w:ascii="Times New Roman" w:cs="Times New Roman" w:eastAsia="Times New Roman" w:hAnsi="Times New Roman"/>
@@ -32736,7 +32736,7 @@
         </w:rPr>
         <w:t xml:space="preserve"> </w:t>
       </w:r>
-      <w:hyperlink w:history="1" r:id="rIdr0mueddid8_wqpliba0ot">
+      <w:hyperlink w:history="1" r:id="rIdtuzcaywgzku1kibd6s5ck">
         <w:r>
           <w:rPr>
             <w:rFonts w:ascii="Times New Roman" w:cs="Times New Roman" w:eastAsia="Times New Roman" w:hAnsi="Times New Roman"/>
@@ -32791,7 +32791,7 @@
         </w:rPr>
         <w:t xml:space="preserve"> </w:t>
       </w:r>
-      <w:hyperlink w:history="1" r:id="rIdlqxcbvpzu8dkscvmjtytf">
+      <w:hyperlink w:history="1" r:id="rIdjqbyzf5htz2htgdjofpry">
         <w:r>
           <w:rPr>
             <w:rFonts w:ascii="Times New Roman" w:cs="Times New Roman" w:eastAsia="Times New Roman" w:hAnsi="Times New Roman"/>
@@ -32863,7 +32863,7 @@
         </w:rPr>
         <w:t xml:space="preserve"> </w:t>
       </w:r>
-      <w:hyperlink w:history="1" r:id="rIdfg2kcni5drfwccomtarrg">
+      <w:hyperlink w:history="1" r:id="rIdzipmqsazxarrihcvj64lw">
         <w:r>
           <w:rPr>
             <w:rFonts w:ascii="Times New Roman" w:cs="Times New Roman" w:eastAsia="Times New Roman" w:hAnsi="Times New Roman"/>
@@ -32918,7 +32918,7 @@
         </w:rPr>
         <w:t xml:space="preserve"> </w:t>
       </w:r>
-      <w:hyperlink w:history="1" r:id="rIdsdezy0gbo45lczuiruu_b">
+      <w:hyperlink w:history="1" r:id="rIdpfioba2cxhztlfuyc2sbn">
         <w:r>
           <w:rPr>
             <w:rFonts w:ascii="Times New Roman" w:cs="Times New Roman" w:eastAsia="Times New Roman" w:hAnsi="Times New Roman"/>
@@ -32973,7 +32973,7 @@
         </w:rPr>
         <w:t xml:space="preserve"> </w:t>
       </w:r>
-      <w:hyperlink w:history="1" r:id="rIduaznlqgcmddqdmccanz8k">
+      <w:hyperlink w:history="1" r:id="rIdimzmzwynex6uel9h41ung">
         <w:r>
           <w:rPr>
             <w:rFonts w:ascii="Times New Roman" w:cs="Times New Roman" w:eastAsia="Times New Roman" w:hAnsi="Times New Roman"/>
@@ -33028,7 +33028,7 @@
         </w:rPr>
         <w:t xml:space="preserve"> </w:t>
       </w:r>
-      <w:hyperlink w:history="1" r:id="rIdjewxqfp61ucst0n1tlzxu">
+      <w:hyperlink w:history="1" r:id="rIdofz9rkaompw9ehwlf6byp">
         <w:r>
           <w:rPr>
             <w:rFonts w:ascii="Times New Roman" w:cs="Times New Roman" w:eastAsia="Times New Roman" w:hAnsi="Times New Roman"/>
@@ -33083,7 +33083,7 @@
         </w:rPr>
         <w:t xml:space="preserve"> </w:t>
       </w:r>
-      <w:hyperlink w:history="1" r:id="rIdh6p8e7qktmblzzd1mbrpt">
+      <w:hyperlink w:history="1" r:id="rIdtxbzfnd0fq0dz4rtg3vdr">
         <w:r>
           <w:rPr>
             <w:rFonts w:ascii="Times New Roman" w:cs="Times New Roman" w:eastAsia="Times New Roman" w:hAnsi="Times New Roman"/>
@@ -33138,7 +33138,7 @@
         </w:rPr>
         <w:t xml:space="preserve"> </w:t>
       </w:r>
-      <w:hyperlink w:history="1" r:id="rIdiqrhh-kqqbidg2jdhffxc">
+      <w:hyperlink w:history="1" r:id="rIde-my20iw5h8f3m9quwydo">
         <w:r>
           <w:rPr>
             <w:rFonts w:ascii="Times New Roman" w:cs="Times New Roman" w:eastAsia="Times New Roman" w:hAnsi="Times New Roman"/>
@@ -33149,88 +33149,6 @@
           <w:t xml:space="preserve">https://github.com/mayankoff/vision</w:t>
         </w:r>
       </w:hyperlink>
-    </w:p>
-    <w:p>
-      <w:pPr>
-        <w:pStyle w:val="Heading1"/>
-        <w:spacing w:after="160" w:before="360"/>
-      </w:pPr>
-      <w:r>
-        <w:rPr>
-          <w:rFonts w:ascii="Times New Roman" w:cs="Times New Roman" w:eastAsia="Times New Roman" w:hAnsi="Times New Roman"/>
-          <w:b/>
-          <w:bCs/>
-          <w:color w:val="000000"/>
-          <w:sz w:val="28"/>
-          <w:szCs w:val="28"/>
-        </w:rPr>
-        <w:t xml:space="preserve">Appendix</w:t>
-      </w:r>
-    </w:p>
-    <w:p>
-      <w:pPr>
-        <w:pStyle w:val="Heading2"/>
-        <w:spacing w:after="120" w:before="240"/>
-      </w:pPr>
-      <w:r>
-        <w:rPr>
-          <w:rFonts w:ascii="Times New Roman" w:cs="Times New Roman" w:eastAsia="Times New Roman" w:hAnsi="Times New Roman"/>
-          <w:b/>
-          <w:bCs/>
-          <w:color w:val="000000"/>
-          <w:sz w:val="24"/>
-          <w:szCs w:val="24"/>
-        </w:rPr>
-        <w:t xml:space="preserve">Work done by each and every individual student</w:t>
-      </w:r>
-    </w:p>
-    <w:p>
-      <w:pPr>
-        <w:spacing w:after="120" w:before="0" w:line="300"/>
-        <w:jc w:val="both"/>
-      </w:pPr>
-      <w:r>
-        <w:rPr>
-          <w:rFonts w:ascii="Times New Roman" w:cs="Times New Roman" w:eastAsia="Times New Roman" w:hAnsi="Times New Roman"/>
-          <w:color w:val="000000"/>
-          <w:sz w:val="24"/>
-          <w:szCs w:val="24"/>
-        </w:rPr>
-        <w:t xml:space="preserve">Student Name 1: Mayank (23BAI0158)</w:t>
-      </w:r>
-      <w:r>
-        <w:rPr>
-          <w:rFonts w:ascii="Times New Roman" w:cs="Times New Roman" w:eastAsia="Times New Roman" w:hAnsi="Times New Roman"/>
-          <w:color w:val="000000"/>
-          <w:sz w:val="24"/>
-          <w:szCs w:val="24"/>
-        </w:rPr>
-        <w:t xml:space="preserve"> – [to be filled in by the team]</w:t>
-      </w:r>
-    </w:p>
-    <w:p>
-      <w:pPr>
-        <w:spacing w:after="120" w:before="0" w:line="300"/>
-        <w:jc w:val="both"/>
-      </w:pPr>
-      <w:r>
-        <w:rPr>
-          <w:rFonts w:ascii="Times New Roman" w:cs="Times New Roman" w:eastAsia="Times New Roman" w:hAnsi="Times New Roman"/>
-          <w:color w:val="000000"/>
-          <w:sz w:val="24"/>
-          <w:szCs w:val="24"/>
-        </w:rPr>
-        <w:t xml:space="preserve">Student Name 2: Vyomesh Pandita (23BAI0151)</w:t>
-      </w:r>
-      <w:r>
-        <w:rPr>
-          <w:rFonts w:ascii="Times New Roman" w:cs="Times New Roman" w:eastAsia="Times New Roman" w:hAnsi="Times New Roman"/>
-          <w:color w:val="000000"/>
-          <w:sz w:val="24"/>
-          <w:szCs w:val="24"/>
-        </w:rPr>
-        <w:t xml:space="preserve"> – [to be filled in by the team]</w:t>
-      </w:r>
     </w:p>
     <w:sectPr>
       <w:pgSz w:w="11906" w:h="16838" w:orient="portrait"/>

</xml_diff>

<commit_message>
Report: lay out the title page as in the course format
Title, course and assignment at the top, team members in the middle, logo
and institute block at the bottom, as in DA3_Document_Format.

Co-Authored-By: Claude Opus 5.5 <noreply@anthropic.com>
Claude-Session: https://claude.ai/code/session_01G7W1FBPLoSQuhNKzvxRuhj
</commit_message>
<xml_diff>
--- a/docs/report/DA3_Report.docx
+++ b/docs/report/DA3_Report.docx
@@ -4,7 +4,102 @@
   <w:body>
     <w:p>
       <w:pPr>
-        <w:spacing w:after="240" w:before="200"/>
+        <w:spacing w:before="240"/>
+      </w:pPr>
+    </w:p>
+    <w:p>
+      <w:pPr>
+        <w:spacing w:after="480" w:before="0"/>
+        <w:jc w:val="center"/>
+      </w:pPr>
+      <w:r>
+        <w:rPr>
+          <w:rFonts w:ascii="Times New Roman" w:cs="Times New Roman" w:eastAsia="Times New Roman" w:hAnsi="Times New Roman"/>
+          <w:color w:val="000000"/>
+          <w:sz w:val="40"/>
+          <w:szCs w:val="40"/>
+        </w:rPr>
+        <w:t xml:space="preserve">Quality-Aware Multi-Patch Remote Photoplethysmography for Contactless Atrial Fibrillation Screening from Facial Video</w:t>
+      </w:r>
+    </w:p>
+    <w:p>
+      <w:pPr>
+        <w:spacing w:after="240" w:before="0"/>
+        <w:jc w:val="center"/>
+      </w:pPr>
+      <w:r>
+        <w:rPr>
+          <w:rFonts w:ascii="Times New Roman" w:cs="Times New Roman" w:eastAsia="Times New Roman" w:hAnsi="Times New Roman"/>
+          <w:color w:val="000000"/>
+          <w:sz w:val="28"/>
+          <w:szCs w:val="28"/>
+        </w:rPr>
+        <w:t xml:space="preserve">BCSE417L – Machine Vision</w:t>
+      </w:r>
+    </w:p>
+    <w:p>
+      <w:pPr>
+        <w:spacing w:after="2400" w:before="0"/>
+        <w:jc w:val="center"/>
+      </w:pPr>
+      <w:r>
+        <w:rPr>
+          <w:rFonts w:ascii="Times New Roman" w:cs="Times New Roman" w:eastAsia="Times New Roman" w:hAnsi="Times New Roman"/>
+          <w:color w:val="000000"/>
+          <w:sz w:val="28"/>
+          <w:szCs w:val="28"/>
+        </w:rPr>
+        <w:t xml:space="preserve">Digital Assignment 3</w:t>
+      </w:r>
+    </w:p>
+    <w:p>
+      <w:pPr>
+        <w:spacing w:after="240" w:before="0"/>
+        <w:jc w:val="center"/>
+      </w:pPr>
+      <w:r>
+        <w:rPr>
+          <w:rFonts w:ascii="Times New Roman" w:cs="Times New Roman" w:eastAsia="Times New Roman" w:hAnsi="Times New Roman"/>
+          <w:color w:val="000000"/>
+          <w:sz w:val="24"/>
+          <w:szCs w:val="24"/>
+        </w:rPr>
+        <w:t xml:space="preserve">Team Members</w:t>
+      </w:r>
+    </w:p>
+    <w:p>
+      <w:pPr>
+        <w:spacing w:after="60" w:before="0"/>
+        <w:jc w:val="center"/>
+      </w:pPr>
+      <w:r>
+        <w:rPr>
+          <w:rFonts w:ascii="Times New Roman" w:cs="Times New Roman" w:eastAsia="Times New Roman" w:hAnsi="Times New Roman"/>
+          <w:color w:val="000000"/>
+          <w:sz w:val="24"/>
+          <w:szCs w:val="24"/>
+        </w:rPr>
+        <w:t xml:space="preserve">Mayank, Vyomesh Pandita</w:t>
+      </w:r>
+    </w:p>
+    <w:p>
+      <w:pPr>
+        <w:spacing w:after="2600" w:before="0"/>
+        <w:jc w:val="center"/>
+      </w:pPr>
+      <w:r>
+        <w:rPr>
+          <w:rFonts w:ascii="Times New Roman" w:cs="Times New Roman" w:eastAsia="Times New Roman" w:hAnsi="Times New Roman"/>
+          <w:color w:val="000000"/>
+          <w:sz w:val="24"/>
+          <w:szCs w:val="24"/>
+        </w:rPr>
+        <w:t xml:space="preserve">23BAI0158, 23BAI0151</w:t>
+      </w:r>
+    </w:p>
+    <w:p>
+      <w:pPr>
+        <w:spacing w:after="240"/>
         <w:jc w:val="center"/>
       </w:pPr>
       <w:r>
@@ -95,7 +190,7 @@
     </w:p>
     <w:p>
       <w:pPr>
-        <w:spacing w:after="1700" w:before="0"/>
+        <w:spacing w:after="0" w:before="0"/>
         <w:jc w:val="center"/>
       </w:pPr>
       <w:r>
@@ -106,96 +201,6 @@
           <w:szCs w:val="30"/>
         </w:rPr>
         <w:t xml:space="preserve">Fall Semester 2025-26</w:t>
-      </w:r>
-    </w:p>
-    <w:p>
-      <w:pPr>
-        <w:spacing w:after="360" w:before="0"/>
-        <w:jc w:val="center"/>
-      </w:pPr>
-      <w:r>
-        <w:rPr>
-          <w:rFonts w:ascii="Times New Roman" w:cs="Times New Roman" w:eastAsia="Times New Roman" w:hAnsi="Times New Roman"/>
-          <w:color w:val="000000"/>
-          <w:sz w:val="40"/>
-          <w:szCs w:val="40"/>
-        </w:rPr>
-        <w:t xml:space="preserve">Quality-Aware Multi-Patch Remote Photoplethysmography for Contactless Atrial Fibrillation Screening from Facial Video</w:t>
-      </w:r>
-    </w:p>
-    <w:p>
-      <w:pPr>
-        <w:spacing w:after="120" w:before="0"/>
-        <w:jc w:val="center"/>
-      </w:pPr>
-      <w:r>
-        <w:rPr>
-          <w:rFonts w:ascii="Times New Roman" w:cs="Times New Roman" w:eastAsia="Times New Roman" w:hAnsi="Times New Roman"/>
-          <w:color w:val="000000"/>
-          <w:sz w:val="28"/>
-          <w:szCs w:val="28"/>
-        </w:rPr>
-        <w:t xml:space="preserve">BCSE417L – Machine Vision</w:t>
-      </w:r>
-    </w:p>
-    <w:p>
-      <w:pPr>
-        <w:spacing w:after="1500" w:before="0"/>
-        <w:jc w:val="center"/>
-      </w:pPr>
-      <w:r>
-        <w:rPr>
-          <w:rFonts w:ascii="Times New Roman" w:cs="Times New Roman" w:eastAsia="Times New Roman" w:hAnsi="Times New Roman"/>
-          <w:color w:val="000000"/>
-          <w:sz w:val="28"/>
-          <w:szCs w:val="28"/>
-        </w:rPr>
-        <w:t xml:space="preserve">Digital Assignment 3</w:t>
-      </w:r>
-    </w:p>
-    <w:p>
-      <w:pPr>
-        <w:spacing w:after="120" w:before="0"/>
-        <w:jc w:val="center"/>
-      </w:pPr>
-      <w:r>
-        <w:rPr>
-          <w:rFonts w:ascii="Times New Roman" w:cs="Times New Roman" w:eastAsia="Times New Roman" w:hAnsi="Times New Roman"/>
-          <w:color w:val="000000"/>
-          <w:sz w:val="24"/>
-          <w:szCs w:val="24"/>
-        </w:rPr>
-        <w:t xml:space="preserve">Team Members</w:t>
-      </w:r>
-    </w:p>
-    <w:p>
-      <w:pPr>
-        <w:spacing w:after="60" w:before="0"/>
-        <w:jc w:val="center"/>
-      </w:pPr>
-      <w:r>
-        <w:rPr>
-          <w:rFonts w:ascii="Times New Roman" w:cs="Times New Roman" w:eastAsia="Times New Roman" w:hAnsi="Times New Roman"/>
-          <w:color w:val="000000"/>
-          <w:sz w:val="24"/>
-          <w:szCs w:val="24"/>
-        </w:rPr>
-        <w:t xml:space="preserve">Mayank, Vyomesh Pandita</w:t>
-      </w:r>
-    </w:p>
-    <w:p>
-      <w:pPr>
-        <w:spacing w:after="0" w:before="0"/>
-        <w:jc w:val="center"/>
-      </w:pPr>
-      <w:r>
-        <w:rPr>
-          <w:rFonts w:ascii="Times New Roman" w:cs="Times New Roman" w:eastAsia="Times New Roman" w:hAnsi="Times New Roman"/>
-          <w:color w:val="000000"/>
-          <w:sz w:val="24"/>
-          <w:szCs w:val="24"/>
-        </w:rPr>
-        <w:t xml:space="preserve">23BAI0158, 23BAI0151</w:t>
       </w:r>
     </w:p>
     <w:p>
@@ -30814,7 +30819,7 @@
         </w:rPr>
         <w:t xml:space="preserve"> </w:t>
       </w:r>
-      <w:hyperlink w:history="1" r:id="rIdqbb_vyfqkxrvfd7rs0m-v">
+      <w:hyperlink w:history="1" r:id="rIdwu2qh-8b8yen-wpp0losb">
         <w:r>
           <w:rPr>
             <w:rFonts w:ascii="Times New Roman" w:cs="Times New Roman" w:eastAsia="Times New Roman" w:hAnsi="Times New Roman"/>
@@ -30869,7 +30874,7 @@
         </w:rPr>
         <w:t xml:space="preserve"> </w:t>
       </w:r>
-      <w:hyperlink w:history="1" r:id="rIdlvwd515ep_i-xrbvn0gbb">
+      <w:hyperlink w:history="1" r:id="rIdumb5_t_prnna3p4mwc_-5">
         <w:r>
           <w:rPr>
             <w:rFonts w:ascii="Times New Roman" w:cs="Times New Roman" w:eastAsia="Times New Roman" w:hAnsi="Times New Roman"/>
@@ -30924,7 +30929,7 @@
         </w:rPr>
         <w:t xml:space="preserve"> </w:t>
       </w:r>
-      <w:hyperlink w:history="1" r:id="rIde0aq5kg420ifi0hq23y5s">
+      <w:hyperlink w:history="1" r:id="rIduhjh3rtg2wkn-diczhsmj">
         <w:r>
           <w:rPr>
             <w:rFonts w:ascii="Times New Roman" w:cs="Times New Roman" w:eastAsia="Times New Roman" w:hAnsi="Times New Roman"/>
@@ -30979,7 +30984,7 @@
         </w:rPr>
         <w:t xml:space="preserve"> </w:t>
       </w:r>
-      <w:hyperlink w:history="1" r:id="rIdvivqcpsedqwdmla4sict3">
+      <w:hyperlink w:history="1" r:id="rId03qcits5qelyvohddzqwf">
         <w:r>
           <w:rPr>
             <w:rFonts w:ascii="Times New Roman" w:cs="Times New Roman" w:eastAsia="Times New Roman" w:hAnsi="Times New Roman"/>
@@ -31034,7 +31039,7 @@
         </w:rPr>
         <w:t xml:space="preserve"> </w:t>
       </w:r>
-      <w:hyperlink w:history="1" r:id="rIdxtzc6rcio-i95wikeakdi">
+      <w:hyperlink w:history="1" r:id="rIdqrn5zf4bsbtdjx5uuhoek">
         <w:r>
           <w:rPr>
             <w:rFonts w:ascii="Times New Roman" w:cs="Times New Roman" w:eastAsia="Times New Roman" w:hAnsi="Times New Roman"/>
@@ -31089,7 +31094,7 @@
         </w:rPr>
         <w:t xml:space="preserve"> </w:t>
       </w:r>
-      <w:hyperlink w:history="1" r:id="rIduwiqusycxrnk1pmdaumvl">
+      <w:hyperlink w:history="1" r:id="rIdjeqqruvh2zfsigdezbmuo">
         <w:r>
           <w:rPr>
             <w:rFonts w:ascii="Times New Roman" w:cs="Times New Roman" w:eastAsia="Times New Roman" w:hAnsi="Times New Roman"/>
@@ -31144,7 +31149,7 @@
         </w:rPr>
         <w:t xml:space="preserve"> </w:t>
       </w:r>
-      <w:hyperlink w:history="1" r:id="rId1yv0ufbpgbp9nkg5jya85">
+      <w:hyperlink w:history="1" r:id="rIddwwnjjoz_olbydrdda0wy">
         <w:r>
           <w:rPr>
             <w:rFonts w:ascii="Times New Roman" w:cs="Times New Roman" w:eastAsia="Times New Roman" w:hAnsi="Times New Roman"/>
@@ -31199,7 +31204,7 @@
         </w:rPr>
         <w:t xml:space="preserve"> </w:t>
       </w:r>
-      <w:hyperlink w:history="1" r:id="rIdwuyrbtuugwhknxylr0tuz">
+      <w:hyperlink w:history="1" r:id="rIdzv4edkdplo2lxxp6c9r1i">
         <w:r>
           <w:rPr>
             <w:rFonts w:ascii="Times New Roman" w:cs="Times New Roman" w:eastAsia="Times New Roman" w:hAnsi="Times New Roman"/>
@@ -31254,7 +31259,7 @@
         </w:rPr>
         <w:t xml:space="preserve"> </w:t>
       </w:r>
-      <w:hyperlink w:history="1" r:id="rIdy9qpvx4qyeynm-iyy3tif">
+      <w:hyperlink w:history="1" r:id="rIdfs6a_rifutqne_3e2d6ne">
         <w:r>
           <w:rPr>
             <w:rFonts w:ascii="Times New Roman" w:cs="Times New Roman" w:eastAsia="Times New Roman" w:hAnsi="Times New Roman"/>
@@ -31309,7 +31314,7 @@
         </w:rPr>
         <w:t xml:space="preserve"> </w:t>
       </w:r>
-      <w:hyperlink w:history="1" r:id="rIdposxb6rnekiiky6rm6dhs">
+      <w:hyperlink w:history="1" r:id="rId40xsvsfwf5a2badoqs0p_">
         <w:r>
           <w:rPr>
             <w:rFonts w:ascii="Times New Roman" w:cs="Times New Roman" w:eastAsia="Times New Roman" w:hAnsi="Times New Roman"/>
@@ -31364,7 +31369,7 @@
         </w:rPr>
         <w:t xml:space="preserve"> </w:t>
       </w:r>
-      <w:hyperlink w:history="1" r:id="rIdpycss1xnrhpdcjxqrgeco">
+      <w:hyperlink w:history="1" r:id="rId6i4qsrptapnq_3sqhycwc">
         <w:r>
           <w:rPr>
             <w:rFonts w:ascii="Times New Roman" w:cs="Times New Roman" w:eastAsia="Times New Roman" w:hAnsi="Times New Roman"/>
@@ -31419,7 +31424,7 @@
         </w:rPr>
         <w:t xml:space="preserve"> </w:t>
       </w:r>
-      <w:hyperlink w:history="1" r:id="rIdiwxifpzao2jh621skymoh">
+      <w:hyperlink w:history="1" r:id="rIdfbglzshhg1tmmuihvvh6y">
         <w:r>
           <w:rPr>
             <w:rFonts w:ascii="Times New Roman" w:cs="Times New Roman" w:eastAsia="Times New Roman" w:hAnsi="Times New Roman"/>
@@ -31474,7 +31479,7 @@
         </w:rPr>
         <w:t xml:space="preserve"> </w:t>
       </w:r>
-      <w:hyperlink w:history="1" r:id="rIdm7hkocgzvg2t8ym6kuirm">
+      <w:hyperlink w:history="1" r:id="rIdygp3jxml3h3k9ba7p3chu">
         <w:r>
           <w:rPr>
             <w:rFonts w:ascii="Times New Roman" w:cs="Times New Roman" w:eastAsia="Times New Roman" w:hAnsi="Times New Roman"/>
@@ -31529,7 +31534,7 @@
         </w:rPr>
         <w:t xml:space="preserve"> </w:t>
       </w:r>
-      <w:hyperlink w:history="1" r:id="rIdwcpnujianp-i54_540pcm">
+      <w:hyperlink w:history="1" r:id="rIduaebyatpttq9nbgin5vgy">
         <w:r>
           <w:rPr>
             <w:rFonts w:ascii="Times New Roman" w:cs="Times New Roman" w:eastAsia="Times New Roman" w:hAnsi="Times New Roman"/>
@@ -31584,7 +31589,7 @@
         </w:rPr>
         <w:t xml:space="preserve"> </w:t>
       </w:r>
-      <w:hyperlink w:history="1" r:id="rIdo2qn9418yumkmyzfuc8cy">
+      <w:hyperlink w:history="1" r:id="rIdziikfhoydpptkdy4dbsnl">
         <w:r>
           <w:rPr>
             <w:rFonts w:ascii="Times New Roman" w:cs="Times New Roman" w:eastAsia="Times New Roman" w:hAnsi="Times New Roman"/>
@@ -31639,7 +31644,7 @@
         </w:rPr>
         <w:t xml:space="preserve"> </w:t>
       </w:r>
-      <w:hyperlink w:history="1" r:id="rIdlnjpwvixu7jjzsundxmux">
+      <w:hyperlink w:history="1" r:id="rIdxfg1ybcaxotzaenlaiusm">
         <w:r>
           <w:rPr>
             <w:rFonts w:ascii="Times New Roman" w:cs="Times New Roman" w:eastAsia="Times New Roman" w:hAnsi="Times New Roman"/>
@@ -31694,7 +31699,7 @@
         </w:rPr>
         <w:t xml:space="preserve"> </w:t>
       </w:r>
-      <w:hyperlink w:history="1" r:id="rIdtonfkqux6y4p5tojlyhi4">
+      <w:hyperlink w:history="1" r:id="rIdyuy6vdqtho8nldt1dtpy8">
         <w:r>
           <w:rPr>
             <w:rFonts w:ascii="Times New Roman" w:cs="Times New Roman" w:eastAsia="Times New Roman" w:hAnsi="Times New Roman"/>
@@ -31749,7 +31754,7 @@
         </w:rPr>
         <w:t xml:space="preserve"> </w:t>
       </w:r>
-      <w:hyperlink w:history="1" r:id="rIdzcu1dvwybb-1w7pl0m3of">
+      <w:hyperlink w:history="1" r:id="rId7_za0c-kinga8rj5dm_vq">
         <w:r>
           <w:rPr>
             <w:rFonts w:ascii="Times New Roman" w:cs="Times New Roman" w:eastAsia="Times New Roman" w:hAnsi="Times New Roman"/>
@@ -31804,7 +31809,7 @@
         </w:rPr>
         <w:t xml:space="preserve"> </w:t>
       </w:r>
-      <w:hyperlink w:history="1" r:id="rIdemzwlkuchdfnxiltlymtz">
+      <w:hyperlink w:history="1" r:id="rId5tzcyfpfn8t35f0lvjsrv">
         <w:r>
           <w:rPr>
             <w:rFonts w:ascii="Times New Roman" w:cs="Times New Roman" w:eastAsia="Times New Roman" w:hAnsi="Times New Roman"/>
@@ -31859,7 +31864,7 @@
         </w:rPr>
         <w:t xml:space="preserve"> </w:t>
       </w:r>
-      <w:hyperlink w:history="1" r:id="rIdwibmalk7gv9z0noiefth4">
+      <w:hyperlink w:history="1" r:id="rIdap5bttwdpk3liarqabz3d">
         <w:r>
           <w:rPr>
             <w:rFonts w:ascii="Times New Roman" w:cs="Times New Roman" w:eastAsia="Times New Roman" w:hAnsi="Times New Roman"/>
@@ -31914,7 +31919,7 @@
         </w:rPr>
         <w:t xml:space="preserve"> </w:t>
       </w:r>
-      <w:hyperlink w:history="1" r:id="rIdeyafaxbfjt0dcdhmgoahz">
+      <w:hyperlink w:history="1" r:id="rIdg4nyk24qcqhv7_x9t199a">
         <w:r>
           <w:rPr>
             <w:rFonts w:ascii="Times New Roman" w:cs="Times New Roman" w:eastAsia="Times New Roman" w:hAnsi="Times New Roman"/>
@@ -31969,7 +31974,7 @@
         </w:rPr>
         <w:t xml:space="preserve"> </w:t>
       </w:r>
-      <w:hyperlink w:history="1" r:id="rId01eyv2hqvmq87pjzb1-yk">
+      <w:hyperlink w:history="1" r:id="rIdgu0fuaishi9tn7mwlbddu">
         <w:r>
           <w:rPr>
             <w:rFonts w:ascii="Times New Roman" w:cs="Times New Roman" w:eastAsia="Times New Roman" w:hAnsi="Times New Roman"/>
@@ -32024,7 +32029,7 @@
         </w:rPr>
         <w:t xml:space="preserve"> </w:t>
       </w:r>
-      <w:hyperlink w:history="1" r:id="rIdy6fum-n5zohvwfae40kwb">
+      <w:hyperlink w:history="1" r:id="rIdqbkxeaosznxmjz5zsrely">
         <w:r>
           <w:rPr>
             <w:rFonts w:ascii="Times New Roman" w:cs="Times New Roman" w:eastAsia="Times New Roman" w:hAnsi="Times New Roman"/>
@@ -32079,7 +32084,7 @@
         </w:rPr>
         <w:t xml:space="preserve"> </w:t>
       </w:r>
-      <w:hyperlink w:history="1" r:id="rIdjvjwjchvp4skph_g2w85s">
+      <w:hyperlink w:history="1" r:id="rId1p11a08mmjljcjgeb8rl5">
         <w:r>
           <w:rPr>
             <w:rFonts w:ascii="Times New Roman" w:cs="Times New Roman" w:eastAsia="Times New Roman" w:hAnsi="Times New Roman"/>
@@ -32151,7 +32156,7 @@
         </w:rPr>
         <w:t xml:space="preserve"> </w:t>
       </w:r>
-      <w:hyperlink w:history="1" r:id="rIdp8skjckogwulgdaooicfp">
+      <w:hyperlink w:history="1" r:id="rIdsc5tt12hn3pagv44jobwp">
         <w:r>
           <w:rPr>
             <w:rFonts w:ascii="Times New Roman" w:cs="Times New Roman" w:eastAsia="Times New Roman" w:hAnsi="Times New Roman"/>
@@ -32206,7 +32211,7 @@
         </w:rPr>
         <w:t xml:space="preserve"> </w:t>
       </w:r>
-      <w:hyperlink w:history="1" r:id="rIdpeuupt3zn1jmx88gkyk_a">
+      <w:hyperlink w:history="1" r:id="rId9bibcp_oapquq5r8eu6u8">
         <w:r>
           <w:rPr>
             <w:rFonts w:ascii="Times New Roman" w:cs="Times New Roman" w:eastAsia="Times New Roman" w:hAnsi="Times New Roman"/>
@@ -32261,7 +32266,7 @@
         </w:rPr>
         <w:t xml:space="preserve"> </w:t>
       </w:r>
-      <w:hyperlink w:history="1" r:id="rId2cvtb-lewnwrddnhsklzh">
+      <w:hyperlink w:history="1" r:id="rIdjmvjwm-00qxh4tbvxa7xb">
         <w:r>
           <w:rPr>
             <w:rFonts w:ascii="Times New Roman" w:cs="Times New Roman" w:eastAsia="Times New Roman" w:hAnsi="Times New Roman"/>
@@ -32316,7 +32321,7 @@
         </w:rPr>
         <w:t xml:space="preserve"> </w:t>
       </w:r>
-      <w:hyperlink w:history="1" r:id="rIdgffj9tc-cylmg5etu86wj">
+      <w:hyperlink w:history="1" r:id="rIdrdrs9qymaj0wzn007ywhh">
         <w:r>
           <w:rPr>
             <w:rFonts w:ascii="Times New Roman" w:cs="Times New Roman" w:eastAsia="Times New Roman" w:hAnsi="Times New Roman"/>
@@ -32371,7 +32376,7 @@
         </w:rPr>
         <w:t xml:space="preserve"> </w:t>
       </w:r>
-      <w:hyperlink w:history="1" r:id="rIdiapeurldqr9_zrarl7ocr">
+      <w:hyperlink w:history="1" r:id="rIdfndtgfbihwf2mevrxuf-2">
         <w:r>
           <w:rPr>
             <w:rFonts w:ascii="Times New Roman" w:cs="Times New Roman" w:eastAsia="Times New Roman" w:hAnsi="Times New Roman"/>
@@ -32426,7 +32431,7 @@
         </w:rPr>
         <w:t xml:space="preserve"> </w:t>
       </w:r>
-      <w:hyperlink w:history="1" r:id="rId0k4vmy19sikiwuncxetju">
+      <w:hyperlink w:history="1" r:id="rIdbc1eqiagr4cv5_tieicba">
         <w:r>
           <w:rPr>
             <w:rFonts w:ascii="Times New Roman" w:cs="Times New Roman" w:eastAsia="Times New Roman" w:hAnsi="Times New Roman"/>
@@ -32481,7 +32486,7 @@
         </w:rPr>
         <w:t xml:space="preserve"> </w:t>
       </w:r>
-      <w:hyperlink w:history="1" r:id="rId-bbnbolaksinzoywopn_s">
+      <w:hyperlink w:history="1" r:id="rIdyindkk5q63de0naii4j5f">
         <w:r>
           <w:rPr>
             <w:rFonts w:ascii="Times New Roman" w:cs="Times New Roman" w:eastAsia="Times New Roman" w:hAnsi="Times New Roman"/>
@@ -32536,7 +32541,7 @@
         </w:rPr>
         <w:t xml:space="preserve"> </w:t>
       </w:r>
-      <w:hyperlink w:history="1" r:id="rIdyk9yyoqmfcclftw5kqgly">
+      <w:hyperlink w:history="1" r:id="rIduv6kwuw1hewfyyb9fjzbr">
         <w:r>
           <w:rPr>
             <w:rFonts w:ascii="Times New Roman" w:cs="Times New Roman" w:eastAsia="Times New Roman" w:hAnsi="Times New Roman"/>
@@ -32591,7 +32596,7 @@
         </w:rPr>
         <w:t xml:space="preserve"> </w:t>
       </w:r>
-      <w:hyperlink w:history="1" r:id="rId52fmgvafu1mr9bmphuuir">
+      <w:hyperlink w:history="1" r:id="rIdqwy12w3ksj5ffhb2puzrk">
         <w:r>
           <w:rPr>
             <w:rFonts w:ascii="Times New Roman" w:cs="Times New Roman" w:eastAsia="Times New Roman" w:hAnsi="Times New Roman"/>
@@ -32626,7 +32631,7 @@
         </w:rPr>
         <w:t xml:space="preserve"> </w:t>
       </w:r>
-      <w:hyperlink w:history="1" r:id="rIdo_raiwc5fncqzji9waiyl">
+      <w:hyperlink w:history="1" r:id="rIdoe5nzjb9vtgssaigz3j4y">
         <w:r>
           <w:rPr>
             <w:rFonts w:ascii="Times New Roman" w:cs="Times New Roman" w:eastAsia="Times New Roman" w:hAnsi="Times New Roman"/>
@@ -32681,7 +32686,7 @@
         </w:rPr>
         <w:t xml:space="preserve"> </w:t>
       </w:r>
-      <w:hyperlink w:history="1" r:id="rIdc3u30pihqouj9p_mcqjbs">
+      <w:hyperlink w:history="1" r:id="rIdqzyxp90ms92e9wns6wbs8">
         <w:r>
           <w:rPr>
             <w:rFonts w:ascii="Times New Roman" w:cs="Times New Roman" w:eastAsia="Times New Roman" w:hAnsi="Times New Roman"/>
@@ -32736,7 +32741,7 @@
         </w:rPr>
         <w:t xml:space="preserve"> </w:t>
       </w:r>
-      <w:hyperlink w:history="1" r:id="rIdtuzcaywgzku1kibd6s5ck">
+      <w:hyperlink w:history="1" r:id="rId2podmteyjb_m1kgyrnd7a">
         <w:r>
           <w:rPr>
             <w:rFonts w:ascii="Times New Roman" w:cs="Times New Roman" w:eastAsia="Times New Roman" w:hAnsi="Times New Roman"/>
@@ -32791,7 +32796,7 @@
         </w:rPr>
         <w:t xml:space="preserve"> </w:t>
       </w:r>
-      <w:hyperlink w:history="1" r:id="rIdjqbyzf5htz2htgdjofpry">
+      <w:hyperlink w:history="1" r:id="rIdyplt6usitbx-0_gusodxc">
         <w:r>
           <w:rPr>
             <w:rFonts w:ascii="Times New Roman" w:cs="Times New Roman" w:eastAsia="Times New Roman" w:hAnsi="Times New Roman"/>
@@ -32863,7 +32868,7 @@
         </w:rPr>
         <w:t xml:space="preserve"> </w:t>
       </w:r>
-      <w:hyperlink w:history="1" r:id="rIdzipmqsazxarrihcvj64lw">
+      <w:hyperlink w:history="1" r:id="rIdfzmgl-g25g0uuukv669id">
         <w:r>
           <w:rPr>
             <w:rFonts w:ascii="Times New Roman" w:cs="Times New Roman" w:eastAsia="Times New Roman" w:hAnsi="Times New Roman"/>
@@ -32918,7 +32923,7 @@
         </w:rPr>
         <w:t xml:space="preserve"> </w:t>
       </w:r>
-      <w:hyperlink w:history="1" r:id="rIdpfioba2cxhztlfuyc2sbn">
+      <w:hyperlink w:history="1" r:id="rIdv8i3yr1dw6lr9tn1ibal6">
         <w:r>
           <w:rPr>
             <w:rFonts w:ascii="Times New Roman" w:cs="Times New Roman" w:eastAsia="Times New Roman" w:hAnsi="Times New Roman"/>
@@ -32973,7 +32978,7 @@
         </w:rPr>
         <w:t xml:space="preserve"> </w:t>
       </w:r>
-      <w:hyperlink w:history="1" r:id="rIdimzmzwynex6uel9h41ung">
+      <w:hyperlink w:history="1" r:id="rId7s_fdm3mkn5lqg1uzbiff">
         <w:r>
           <w:rPr>
             <w:rFonts w:ascii="Times New Roman" w:cs="Times New Roman" w:eastAsia="Times New Roman" w:hAnsi="Times New Roman"/>
@@ -33028,7 +33033,7 @@
         </w:rPr>
         <w:t xml:space="preserve"> </w:t>
       </w:r>
-      <w:hyperlink w:history="1" r:id="rIdofz9rkaompw9ehwlf6byp">
+      <w:hyperlink w:history="1" r:id="rIdtif6lz_imubptmyydmmh-">
         <w:r>
           <w:rPr>
             <w:rFonts w:ascii="Times New Roman" w:cs="Times New Roman" w:eastAsia="Times New Roman" w:hAnsi="Times New Roman"/>
@@ -33083,7 +33088,7 @@
         </w:rPr>
         <w:t xml:space="preserve"> </w:t>
       </w:r>
-      <w:hyperlink w:history="1" r:id="rIdtxbzfnd0fq0dz4rtg3vdr">
+      <w:hyperlink w:history="1" r:id="rIdgi4rpmpwq198f_kk6hw69">
         <w:r>
           <w:rPr>
             <w:rFonts w:ascii="Times New Roman" w:cs="Times New Roman" w:eastAsia="Times New Roman" w:hAnsi="Times New Roman"/>
@@ -33138,7 +33143,7 @@
         </w:rPr>
         <w:t xml:space="preserve"> </w:t>
       </w:r>
-      <w:hyperlink w:history="1" r:id="rIde-my20iw5h8f3m9quwydo">
+      <w:hyperlink w:history="1" r:id="rIdapxsg8lpewakbcclva2yk">
         <w:r>
           <w:rPr>
             <w:rFonts w:ascii="Times New Roman" w:cs="Times New Roman" w:eastAsia="Times New Roman" w:hAnsi="Times New Roman"/>

</xml_diff>